<commit_message>
Doc: remove unverified peak-timing claims; tie them to what the biometric logs will show
Co-Authored-By: Claude Opus 5.5 <noreply@anthropic.com>
Claude-Session: https://claude.ai/code/session_013JwSYm4UV7vKHqaUukbU1G
</commit_message>
<xml_diff>
--- a/docs/MDS_Queuing_Theory_and_Simulation.docx
+++ b/docs/MDS_Queuing_Theory_and_Simulation.docx
@@ -830,7 +830,7 @@
                 <w:sz w:val="19"/>
                 <w:szCs w:val="19"/>
               </w:rPr>
-              <w:t xml:space="preserve">Students finish class at slightly different times; some come in groups</w:t>
+              <w:t xml:space="preserve">Students arrive at irregular times (for example, classes ending at different times, or friends arriving together). The biometric logs will show the actual pattern</w:t>
             </w:r>
           </w:p>
         </w:tc>
@@ -938,7 +938,7 @@
                 <w:sz w:val="19"/>
                 <w:szCs w:val="19"/>
               </w:rPr>
-              <w:t xml:space="preserve">Most of the ~2,960 plates are served in about 60–80 minutes around 13:00</w:t>
+              <w:t xml:space="preserve">About 2,960 plates are served within the 12:00–14:00 window (measured). Our field visit saw a full hall and a long queue around 13:18–13:23 (observed). How arrivals spread across the two hours is not yet measured: that is what the biometric logs will show</w:t>
             </w:r>
           </w:p>
         </w:tc>
@@ -1088,7 +1088,7 @@
         <w:t xml:space="preserve">variation</w:t>
       </w:r>
       <w:r>
-        <w:t xml:space="preserve"> still creates queues. A mess that could serve everyone over two hours still builds a queue if half of them arrive in 30 minutes.</w:t>
+        <w:t xml:space="preserve"> still creates queues. For example (hypothetically), a mess that could serve everyone if they arrived evenly over two hours would still build a queue if half of them arrived within the same 30 minutes.</w:t>
       </w:r>
     </w:p>
     <w:p>
@@ -1339,7 +1339,7 @@
                 <w:sz w:val="19"/>
                 <w:szCs w:val="19"/>
               </w:rPr>
-              <w:t xml:space="preserve">Enrolment; ~2,960 plates/day (measured)</w:t>
+              <w:t xml:space="preserve">~2,960 plates per lunch (measured, Phase 1)</w:t>
             </w:r>
           </w:p>
         </w:tc>
@@ -5916,7 +5916,7 @@
         <w:t xml:space="preserve">temporarily unstable</w:t>
       </w:r>
       <w:r>
-        <w:t xml:space="preserve">. For 20–40 minutes around 13:00, arrivals can exceed serving capacity, and the queue grows by roughly (λ − cμ) students every minute. When demand repeatedly exceeds capacity, waiting becomes a structural problem rather than a temporary inconvenience. That is the 'Two-Hour Bottleneck'.</w:t>
+        <w:t xml:space="preserve">. For part of the peak, arrivals can exceed serving capacity, and the queue then grows by roughly (λ − cμ) students every minute. Our observations (long queue, run-outs around 13:20) suggest this happens; the biometric logs will show when it starts and how long it lasts. When demand repeatedly exceeds capacity, waiting becomes a structural problem rather than a temporary inconvenience. That is the 'Two-Hour Bottleneck'.</w:t>
       </w:r>
     </w:p>
     <w:p>
@@ -8224,7 +8224,7 @@
                 <w:sz w:val="19"/>
                 <w:szCs w:val="19"/>
               </w:rPr>
-              <w:t xml:space="preserve">The rate rises sharply around 12:45–13:30 (a non-stationary peak)</w:t>
+              <w:t xml:space="preserve">The rate changes through the window, with a peak (a non-stationary process). Its exact timing is not yet measured; the field visit saw full load around 13:18</w:t>
             </w:r>
           </w:p>
         </w:tc>
@@ -12120,7 +12120,7 @@
         <w:spacing w:after="60"/>
       </w:pPr>
       <w:r>
-        <w:t xml:space="preserve">Why is it above capacity? Because arrivals are concentrated around 13:00, and service stops when a dish runs out.</w:t>
+        <w:t xml:space="preserve">Why is it above capacity? Because arrivals cluster at peak times (timing to be confirmed by the logs), and service stops when a dish runs out.</w:t>
       </w:r>
     </w:p>
     <w:p>
@@ -14187,7 +14187,7 @@
         <w:spacing w:after="120"/>
       </w:pPr>
       <w:r>
-        <w:t xml:space="preserve">Consistency ratio ≈ 0.002 (well below the 0.10 limit), so these judgements are consistent. The weights then score alternatives such as: A1 status quo; A2 extra serving line at 12:45–13:30; A3 pre-staged replenishment of AZ items; A4 door screens and routing; A5 staggered class end times. Queuing results (section 3) supply the service-level score of each alternative.</w:t>
+        <w:t xml:space="preserve">Consistency ratio ≈ 0.002 (well below the 0.10 limit), so these judgements are consistent. The weights then score alternatives such as: A1 status quo; A2 extra serving line during the peak (timing set from the logs); A3 pre-staged replenishment of AZ items; A4 door screens and routing; A5 staggered class end times. Queuing results (section 3) supply the service-level score of each alternative.</w:t>
       </w:r>
     </w:p>
     <w:p>

</xml_diff>

<commit_message>
Doc: corrected inputs (2,960 students, 85% habit, 2 stations + 1 scanner, 11:30-14:30) and new simulator results
Co-Authored-By: Claude Opus 5.5 <noreply@anthropic.com>
Claude-Session: https://claude.ai/code/session_013JwSYm4UV7vKHqaUukbU1G
</commit_message>
<xml_diff>
--- a/docs/MDS_Queuing_Theory_and_Simulation.docx
+++ b/docs/MDS_Queuing_Theory_and_Simulation.docx
@@ -85,7 +85,7 @@
         <w:t xml:space="preserve">Focus centres:</w:t>
       </w:r>
       <w:r>
-        <w:t xml:space="preserve"> Central CT (Chefs Touch) and Munch Mess, lunch 12:00–14:00</w:t>
+        <w:t xml:space="preserve"> Central CT (Chefs Touch) and Munch Mess, lunch 11:30–14:30</w:t>
       </w:r>
     </w:p>
     <w:p>
@@ -310,7 +310,7 @@
         <w:spacing w:after="120"/>
       </w:pPr>
       <w:r>
-        <w:t xml:space="preserve">Chefs Touch (CT) cooks lunch in a central kitchen and supplies five centres: Central CT, AB2, AB3, AB4 and New Mess. Lunch (12:00–14:00) is the busiest two hours on campus. Demand is concentrated into a short window while kitchen, delivery and serving capacity are fixed, so small mismatches turn into queues, run-outs and waste.</w:t>
+        <w:t xml:space="preserve">Chefs Touch (CT) cooks lunch in a central kitchen and supplies five centres: Central CT, AB2, AB3, AB4 and New Mess. Lunch (11:30–14:30) is the busiest three hours on campus. Demand is concentrated into a short window while kitchen, delivery and serving capacity are fixed, so small mismatches turn into queues, run-outs and waste.</w:t>
       </w:r>
     </w:p>
     <w:p>
@@ -490,138 +490,37 @@
         <w:spacing w:after="60"/>
       </w:pPr>
       <w:r>
-        <w:t xml:space="preserve">Field notes: the queue builds </w:t>
+        <w:t xml:space="preserve">Each mess has </w:t>
       </w:r>
       <w:r>
         <w:rPr>
           <w:b/>
           <w:bCs/>
         </w:rPr>
-        <w:t xml:space="preserve">at the serving counter</w:t>
-      </w:r>
-      <w:r>
-        <w:t xml:space="preserve">, not at the entrance. One serving line can serve a whole hall.</w:t>
-      </w:r>
-    </w:p>
-    <w:p>
-      <w:pPr>
-        <w:spacing w:after="120"/>
-      </w:pPr>
-      <w:r>
-        <w:t xml:space="preserve">This is a </w:t>
+        <w:t xml:space="preserve">2 serving stations</w:t>
+      </w:r>
+      <w:r>
+        <w:t xml:space="preserve"> and </w:t>
       </w:r>
       <w:r>
         <w:rPr>
           <w:b/>
           <w:bCs/>
         </w:rPr>
-        <w:t xml:space="preserve">waiting-line problem</w:t>
-      </w:r>
-      <w:r>
-        <w:t xml:space="preserve"> (how long students wait and why) inside an </w:t>
+        <w:t xml:space="preserve">1 face scanner</w:t>
+      </w:r>
+      <w:r>
+        <w:t xml:space="preserve"> at the entrance (measured). Field notes: the queue builds </w:t>
       </w:r>
       <w:r>
         <w:rPr>
           <w:b/>
           <w:bCs/>
         </w:rPr>
-        <w:t xml:space="preserve">allocation problem</w:t>
-      </w:r>
-      <w:r>
-        <w:t xml:space="preserve"> (where food and students should go). Queuing theory explains the first part; section 7 shows how the other course topics handle the second.</w:t>
-      </w:r>
-    </w:p>
-    <w:p>
-      <w:pPr>
-        <w:pStyle w:val="Heading1"/>
-        <w:pageBreakBefore/>
-      </w:pPr>
-      <w:r>
-        <w:t xml:space="preserve">2. Queuing theory: concepts and notation</w:t>
-      </w:r>
-    </w:p>
-    <w:p>
-      <w:pPr>
-        <w:pStyle w:val="Heading2"/>
-      </w:pPr>
-      <w:r>
-        <w:t xml:space="preserve">2.1 What queuing theory is for</w:t>
-      </w:r>
-    </w:p>
-    <w:p>
-      <w:pPr>
-        <w:spacing w:after="120"/>
-      </w:pPr>
-      <w:r>
-        <w:t xml:space="preserve">Queuing theory is the mathematical study of waiting lines. It models </w:t>
-      </w:r>
-      <w:r>
-        <w:rPr>
-          <w:b/>
-          <w:bCs/>
-        </w:rPr>
-        <w:t xml:space="preserve">arrivals</w:t>
-      </w:r>
-      <w:r>
-        <w:t xml:space="preserve">, </w:t>
-      </w:r>
-      <w:r>
-        <w:rPr>
-          <w:b/>
-          <w:bCs/>
-        </w:rPr>
-        <w:t xml:space="preserve">waiting time</w:t>
-      </w:r>
-      <w:r>
-        <w:t xml:space="preserve">, </w:t>
-      </w:r>
-      <w:r>
-        <w:rPr>
-          <w:b/>
-          <w:bCs/>
-        </w:rPr>
-        <w:t xml:space="preserve">service capacity</w:t>
-      </w:r>
-      <w:r>
-        <w:t xml:space="preserve">, </w:t>
-      </w:r>
-      <w:r>
-        <w:rPr>
-          <w:b/>
-          <w:bCs/>
-        </w:rPr>
-        <w:t xml:space="preserve">queue length</w:t>
-      </w:r>
-      <w:r>
-        <w:t xml:space="preserve"> and </w:t>
-      </w:r>
-      <w:r>
-        <w:rPr>
-          <w:b/>
-          <w:bCs/>
-        </w:rPr>
-        <w:t xml:space="preserve">server utilisation</w:t>
-      </w:r>
-      <w:r>
-        <w:t xml:space="preserve">. Its goal is </w:t>
-      </w:r>
-      <w:r>
-        <w:rPr>
-          <w:b/>
-          <w:bCs/>
-        </w:rPr>
-        <w:t xml:space="preserve">not</w:t>
-      </w:r>
-      <w:r>
-        <w:t xml:space="preserve"> to eliminate waiting. It is to find an acceptable balance between how long customers wait and how much service capacity costs.</w:t>
-      </w:r>
-    </w:p>
-    <w:p>
-      <w:pPr>
-        <w:spacing w:after="120"/>
-      </w:pPr>
-      <w:r>
-        <w:t xml:space="preserve">It helps a manager answer four questions, each of which applies directly to a mess:</w:t>
+        <w:t xml:space="preserve">at the serving stations</w:t>
+      </w:r>
+      <w:r>
+        <w:t xml:space="preserve">; the single scanner can also become a bottleneck at peak (section 6).</w:t>
       </w:r>
     </w:p>
     <w:p>
@@ -634,7 +533,171 @@
         <w:spacing w:after="60"/>
       </w:pPr>
       <w:r>
-        <w:t xml:space="preserve">How much service capacity is needed? (How many serving lines at peak?)</w:t>
+        <w:t xml:space="preserve">All </w:t>
+      </w:r>
+      <w:r>
+        <w:rPr>
+          <w:b/>
+          <w:bCs/>
+        </w:rPr>
+        <w:t xml:space="preserve">2,960 students</w:t>
+      </w:r>
+      <w:r>
+        <w:t xml:space="preserve"> (one plate each) eat at Central CT or Munch Mess. How they split by habit is </w:t>
+      </w:r>
+      <w:r>
+        <w:rPr>
+          <w:b/>
+          <w:bCs/>
+        </w:rPr>
+        <w:t xml:space="preserve">not measured</w:t>
+      </w:r>
+      <w:r>
+        <w:t xml:space="preserve">; we assume </w:t>
+      </w:r>
+      <w:r>
+        <w:rPr>
+          <w:b/>
+          <w:bCs/>
+        </w:rPr>
+        <w:t xml:space="preserve">85% go to Central</w:t>
+      </w:r>
+      <w:r>
+        <w:t xml:space="preserve">.</w:t>
+      </w:r>
+    </w:p>
+    <w:p>
+      <w:pPr>
+        <w:spacing w:after="120"/>
+      </w:pPr>
+      <w:r>
+        <w:t xml:space="preserve">This is a </w:t>
+      </w:r>
+      <w:r>
+        <w:rPr>
+          <w:b/>
+          <w:bCs/>
+        </w:rPr>
+        <w:t xml:space="preserve">waiting-line problem</w:t>
+      </w:r>
+      <w:r>
+        <w:t xml:space="preserve"> (how long students wait and why) inside an </w:t>
+      </w:r>
+      <w:r>
+        <w:rPr>
+          <w:b/>
+          <w:bCs/>
+        </w:rPr>
+        <w:t xml:space="preserve">allocation problem</w:t>
+      </w:r>
+      <w:r>
+        <w:t xml:space="preserve"> (where food and students should go). Queuing theory explains the first part; section 7 shows how the other course topics handle the second.</w:t>
+      </w:r>
+    </w:p>
+    <w:p>
+      <w:pPr>
+        <w:pStyle w:val="Heading1"/>
+        <w:pageBreakBefore/>
+      </w:pPr>
+      <w:r>
+        <w:t xml:space="preserve">2. Queuing theory: concepts and notation</w:t>
+      </w:r>
+    </w:p>
+    <w:p>
+      <w:pPr>
+        <w:pStyle w:val="Heading2"/>
+      </w:pPr>
+      <w:r>
+        <w:t xml:space="preserve">2.1 What queuing theory is for</w:t>
+      </w:r>
+    </w:p>
+    <w:p>
+      <w:pPr>
+        <w:spacing w:after="120"/>
+      </w:pPr>
+      <w:r>
+        <w:t xml:space="preserve">Queuing theory is the mathematical study of waiting lines. It models </w:t>
+      </w:r>
+      <w:r>
+        <w:rPr>
+          <w:b/>
+          <w:bCs/>
+        </w:rPr>
+        <w:t xml:space="preserve">arrivals</w:t>
+      </w:r>
+      <w:r>
+        <w:t xml:space="preserve">, </w:t>
+      </w:r>
+      <w:r>
+        <w:rPr>
+          <w:b/>
+          <w:bCs/>
+        </w:rPr>
+        <w:t xml:space="preserve">waiting time</w:t>
+      </w:r>
+      <w:r>
+        <w:t xml:space="preserve">, </w:t>
+      </w:r>
+      <w:r>
+        <w:rPr>
+          <w:b/>
+          <w:bCs/>
+        </w:rPr>
+        <w:t xml:space="preserve">service capacity</w:t>
+      </w:r>
+      <w:r>
+        <w:t xml:space="preserve">, </w:t>
+      </w:r>
+      <w:r>
+        <w:rPr>
+          <w:b/>
+          <w:bCs/>
+        </w:rPr>
+        <w:t xml:space="preserve">queue length</w:t>
+      </w:r>
+      <w:r>
+        <w:t xml:space="preserve"> and </w:t>
+      </w:r>
+      <w:r>
+        <w:rPr>
+          <w:b/>
+          <w:bCs/>
+        </w:rPr>
+        <w:t xml:space="preserve">server utilisation</w:t>
+      </w:r>
+      <w:r>
+        <w:t xml:space="preserve">. Its goal is </w:t>
+      </w:r>
+      <w:r>
+        <w:rPr>
+          <w:b/>
+          <w:bCs/>
+        </w:rPr>
+        <w:t xml:space="preserve">not</w:t>
+      </w:r>
+      <w:r>
+        <w:t xml:space="preserve"> to eliminate waiting. It is to find an acceptable balance between how long customers wait and how much service capacity costs.</w:t>
+      </w:r>
+    </w:p>
+    <w:p>
+      <w:pPr>
+        <w:spacing w:after="120"/>
+      </w:pPr>
+      <w:r>
+        <w:t xml:space="preserve">It helps a manager answer four questions, each of which applies directly to a mess:</w:t>
+      </w:r>
+    </w:p>
+    <w:p>
+      <w:pPr>
+        <w:pStyle w:val="ListParagraph"/>
+        <w:numPr>
+          <w:ilvl w:val="0"/>
+          <w:numId w:val="3"/>
+        </w:numPr>
+        <w:spacing w:after="60"/>
+      </w:pPr>
+      <w:r>
+        <w:t xml:space="preserve">How much service capacity is needed? (How many serving stations at peak?)</w:t>
       </w:r>
     </w:p>
     <w:p>
@@ -938,7 +1001,7 @@
                 <w:sz w:val="19"/>
                 <w:szCs w:val="19"/>
               </w:rPr>
-              <w:t xml:space="preserve">About 2,960 plates are served within the 12:00–14:00 window (measured). Our field visit saw a full hall and a long queue around 13:18–13:23 (observed). How arrivals spread across the two hours is not yet measured: that is what the biometric logs will show</w:t>
+              <w:t xml:space="preserve">About 2,960 plates are served within the 11:30–14:30 window (measured). Our field visit saw a full hall and a long queue around 13:18–13:23 (observed). How arrivals spread across the three hours is not yet measured: that is what the biometric logs will show</w:t>
             </w:r>
           </w:p>
         </w:tc>
@@ -992,7 +1055,7 @@
                 <w:sz w:val="19"/>
                 <w:szCs w:val="19"/>
               </w:rPr>
-              <w:t xml:space="preserve">A fixed number of serving lines and staff</w:t>
+              <w:t xml:space="preserve">2 serving stations and 1 face scanner per mess (measured)</w:t>
             </w:r>
           </w:p>
         </w:tc>
@@ -1631,7 +1694,7 @@
                 <w:sz w:val="19"/>
                 <w:szCs w:val="19"/>
               </w:rPr>
-              <w:t xml:space="preserve">Staff serving food at each serving line</w:t>
+              <w:t xml:space="preserve">Staff serving food at each serving station</w:t>
             </w:r>
           </w:p>
         </w:tc>
@@ -2067,7 +2130,7 @@
                 <w:sz w:val="19"/>
                 <w:szCs w:val="19"/>
               </w:rPr>
-              <w:t xml:space="preserve">A single serving line with one server</w:t>
+              <w:t xml:space="preserve">A single serving station with one server</w:t>
             </w:r>
           </w:p>
         </w:tc>
@@ -2147,7 +2210,7 @@
                 <w:sz w:val="19"/>
                 <w:szCs w:val="19"/>
               </w:rPr>
-              <w:t xml:space="preserve">Several identical serving lines in one hall</w:t>
+              <w:t xml:space="preserve">Several identical serving stations in one hall</w:t>
             </w:r>
           </w:p>
         </w:tc>
@@ -2307,7 +2370,7 @@
                 <w:sz w:val="19"/>
                 <w:szCs w:val="19"/>
               </w:rPr>
-              <w:t xml:space="preserve">Tray counter → several food lines → seat (possibly Central CT)</w:t>
+              <w:t xml:space="preserve">Face scanner (1) → serving stations (2) → seat: Central CT and Munch Mess</w:t>
             </w:r>
           </w:p>
         </w:tc>
@@ -2328,7 +2391,7 @@
         <w:t xml:space="preserve">multiple-phase</w:t>
       </w:r>
       <w:r>
-        <w:t xml:space="preserve">: students pass the tray counter, then the food line, then a seat. In a multi-phase system the </w:t>
+        <w:t xml:space="preserve">: students pass the face scanner (1 per mess), then a serving station (2 per mess), then a seat. In a multi-phase system the </w:t>
       </w:r>
       <w:r>
         <w:rPr>
@@ -2338,17 +2401,17 @@
         <w:t xml:space="preserve">slowest phase is the bottleneck</w:t>
       </w:r>
       <w:r>
-        <w:t xml:space="preserve"> and sets the wait. Our field photos (queue at the food line, free trays, free seats) point to the </w:t>
+        <w:t xml:space="preserve"> and sets the wait. Our field photos (queue at the food line, free seats) point to the </w:t>
       </w:r>
       <w:r>
         <w:rPr>
           <w:b/>
           <w:bCs/>
         </w:rPr>
-        <w:t xml:space="preserve">food line</w:t>
-      </w:r>
-      <w:r>
-        <w:t xml:space="preserve">, so that is the phase we model as the service mechanism.</w:t>
+        <w:t xml:space="preserve">serving stations</w:t>
+      </w:r>
+      <w:r>
+        <w:t xml:space="preserve">, so they are the main service mechanism. The simulator also models the scanner as its own phase (an assumed 2 s per scan, so about 30 scans/min), because at peak it comes close to its limit.</w:t>
       </w:r>
     </w:p>
     <w:p>
@@ -2747,7 +2810,7 @@
                 <w:sz w:val="19"/>
                 <w:szCs w:val="19"/>
               </w:rPr>
-              <w:t xml:space="preserve">Average number of students ONE serving line can serve per unit time</w:t>
+              <w:t xml:space="preserve">Average number of students ONE serving station can serve per unit time</w:t>
             </w:r>
           </w:p>
         </w:tc>
@@ -2773,7 +2836,7 @@
                 <w:sz w:val="19"/>
                 <w:szCs w:val="19"/>
               </w:rPr>
-              <w:t xml:space="preserve">students/min per line</w:t>
+              <w:t xml:space="preserve">students/min per station</w:t>
             </w:r>
           </w:p>
         </w:tc>
@@ -2799,7 +2862,7 @@
                 <w:sz w:val="19"/>
                 <w:szCs w:val="19"/>
               </w:rPr>
-              <w:t xml:space="preserve">4/min (≈15 s each), </w:t>
+              <w:t xml:space="preserve">10/min (≈6 s each), </w:t>
             </w:r>
             <w:r>
               <w:rPr>
@@ -2888,7 +2951,7 @@
                 <w:sz w:val="19"/>
                 <w:szCs w:val="19"/>
               </w:rPr>
-              <w:t xml:space="preserve">Serving lines working in parallel</w:t>
+              <w:t xml:space="preserve">Serving stations working in parallel</w:t>
             </w:r>
           </w:p>
         </w:tc>
@@ -2940,7 +3003,7 @@
                 <w:sz w:val="19"/>
                 <w:szCs w:val="19"/>
               </w:rPr>
-              <w:t xml:space="preserve">3 per mess, </w:t>
+              <w:t xml:space="preserve">2 per mess, </w:t>
             </w:r>
             <w:r>
               <w:rPr>
@@ -2949,7 +3012,7 @@
                 <w:sz w:val="19"/>
                 <w:szCs w:val="19"/>
               </w:rPr>
-              <w:t xml:space="preserve">assumed</w:t>
+              <w:t xml:space="preserve">measured</w:t>
             </w:r>
           </w:p>
         </w:tc>
@@ -3081,7 +3144,535 @@
                 <w:sz w:val="19"/>
                 <w:szCs w:val="19"/>
               </w:rPr>
-              <w:t xml:space="preserve">12/min per mess, </w:t>
+              <w:t xml:space="preserve">20/min per mess (2 × 10)</w:t>
+            </w:r>
+          </w:p>
+        </w:tc>
+      </w:tr>
+      <w:tr>
+        <w:tc>
+          <w:tcPr>
+            <w:tcW w:type="dxa" w:w="1150"/>
+            <w:tcBorders>
+              <w:top w:val="single" w:color="D9D8D3" w:sz="4"/>
+              <w:left w:val="single" w:color="D9D8D3" w:sz="4"/>
+              <w:bottom w:val="single" w:color="D9D8D3" w:sz="4"/>
+              <w:right w:val="single" w:color="D9D8D3" w:sz="4"/>
+            </w:tcBorders>
+            <w:tcMar>
+              <w:top w:type="dxa" w:w="60"/>
+              <w:left w:type="dxa" w:w="100"/>
+              <w:bottom w:type="dxa" w:w="60"/>
+              <w:right w:type="dxa" w:w="100"/>
+            </w:tcMar>
+          </w:tcPr>
+          <w:p>
+            <w:r>
+              <w:rPr>
+                <w:sz w:val="19"/>
+                <w:szCs w:val="19"/>
+              </w:rPr>
+              <w:t xml:space="preserve">ρ (rho)</w:t>
+            </w:r>
+          </w:p>
+        </w:tc>
+        <w:tc>
+          <w:tcPr>
+            <w:tcW w:type="dxa" w:w="1350"/>
+            <w:tcBorders>
+              <w:top w:val="single" w:color="D9D8D3" w:sz="4"/>
+              <w:left w:val="single" w:color="D9D8D3" w:sz="4"/>
+              <w:bottom w:val="single" w:color="D9D8D3" w:sz="4"/>
+              <w:right w:val="single" w:color="D9D8D3" w:sz="4"/>
+            </w:tcBorders>
+            <w:tcMar>
+              <w:top w:type="dxa" w:w="60"/>
+              <w:left w:type="dxa" w:w="100"/>
+              <w:bottom w:type="dxa" w:w="60"/>
+              <w:right w:type="dxa" w:w="100"/>
+            </w:tcMar>
+          </w:tcPr>
+          <w:p>
+            <w:r>
+              <w:rPr>
+                <w:sz w:val="19"/>
+                <w:szCs w:val="19"/>
+              </w:rPr>
+              <w:t xml:space="preserve">Utilisation</w:t>
+            </w:r>
+          </w:p>
+        </w:tc>
+        <w:tc>
+          <w:tcPr>
+            <w:tcW w:type="dxa" w:w="3126"/>
+            <w:tcBorders>
+              <w:top w:val="single" w:color="D9D8D3" w:sz="4"/>
+              <w:left w:val="single" w:color="D9D8D3" w:sz="4"/>
+              <w:bottom w:val="single" w:color="D9D8D3" w:sz="4"/>
+              <w:right w:val="single" w:color="D9D8D3" w:sz="4"/>
+            </w:tcBorders>
+            <w:tcMar>
+              <w:top w:type="dxa" w:w="60"/>
+              <w:left w:type="dxa" w:w="100"/>
+              <w:bottom w:type="dxa" w:w="60"/>
+              <w:right w:type="dxa" w:w="100"/>
+            </w:tcMar>
+          </w:tcPr>
+          <w:p>
+            <w:r>
+              <w:rPr>
+                <w:sz w:val="19"/>
+                <w:szCs w:val="19"/>
+              </w:rPr>
+              <w:t xml:space="preserve">Share of serving capacity in use: ρ = λ / (cμ)</w:t>
+            </w:r>
+          </w:p>
+        </w:tc>
+        <w:tc>
+          <w:tcPr>
+            <w:tcW w:type="dxa" w:w="1500"/>
+            <w:tcBorders>
+              <w:top w:val="single" w:color="D9D8D3" w:sz="4"/>
+              <w:left w:val="single" w:color="D9D8D3" w:sz="4"/>
+              <w:bottom w:val="single" w:color="D9D8D3" w:sz="4"/>
+              <w:right w:val="single" w:color="D9D8D3" w:sz="4"/>
+            </w:tcBorders>
+            <w:tcMar>
+              <w:top w:type="dxa" w:w="60"/>
+              <w:left w:type="dxa" w:w="100"/>
+              <w:bottom w:type="dxa" w:w="60"/>
+              <w:right w:type="dxa" w:w="100"/>
+            </w:tcMar>
+          </w:tcPr>
+          <w:p>
+            <w:r>
+              <w:rPr>
+                <w:sz w:val="19"/>
+                <w:szCs w:val="19"/>
+              </w:rPr>
+              <w:t xml:space="preserve">fraction (0–1)</w:t>
+            </w:r>
+          </w:p>
+        </w:tc>
+        <w:tc>
+          <w:tcPr>
+            <w:tcW w:type="dxa" w:w="1900"/>
+            <w:tcBorders>
+              <w:top w:val="single" w:color="D9D8D3" w:sz="4"/>
+              <w:left w:val="single" w:color="D9D8D3" w:sz="4"/>
+              <w:bottom w:val="single" w:color="D9D8D3" w:sz="4"/>
+              <w:right w:val="single" w:color="D9D8D3" w:sz="4"/>
+            </w:tcBorders>
+            <w:tcMar>
+              <w:top w:type="dxa" w:w="60"/>
+              <w:left w:type="dxa" w:w="100"/>
+              <w:bottom w:type="dxa" w:w="60"/>
+              <w:right w:type="dxa" w:w="100"/>
+            </w:tcMar>
+          </w:tcPr>
+          <w:p>
+            <w:r>
+              <w:rPr>
+                <w:sz w:val="19"/>
+                <w:szCs w:val="19"/>
+              </w:rPr>
+              <w:t xml:space="preserve">Computed</w:t>
+            </w:r>
+          </w:p>
+        </w:tc>
+      </w:tr>
+      <w:tr>
+        <w:tc>
+          <w:tcPr>
+            <w:tcW w:type="dxa" w:w="1150"/>
+            <w:tcBorders>
+              <w:top w:val="single" w:color="D9D8D3" w:sz="4"/>
+              <w:left w:val="single" w:color="D9D8D3" w:sz="4"/>
+              <w:bottom w:val="single" w:color="D9D8D3" w:sz="4"/>
+              <w:right w:val="single" w:color="D9D8D3" w:sz="4"/>
+            </w:tcBorders>
+            <w:tcMar>
+              <w:top w:type="dxa" w:w="60"/>
+              <w:left w:type="dxa" w:w="100"/>
+              <w:bottom w:type="dxa" w:w="60"/>
+              <w:right w:type="dxa" w:w="100"/>
+            </w:tcMar>
+          </w:tcPr>
+          <w:p>
+            <w:r>
+              <w:rPr>
+                <w:sz w:val="19"/>
+                <w:szCs w:val="19"/>
+              </w:rPr>
+              <w:t xml:space="preserve">L</w:t>
+            </w:r>
+          </w:p>
+        </w:tc>
+        <w:tc>
+          <w:tcPr>
+            <w:tcW w:type="dxa" w:w="1350"/>
+            <w:tcBorders>
+              <w:top w:val="single" w:color="D9D8D3" w:sz="4"/>
+              <w:left w:val="single" w:color="D9D8D3" w:sz="4"/>
+              <w:bottom w:val="single" w:color="D9D8D3" w:sz="4"/>
+              <w:right w:val="single" w:color="D9D8D3" w:sz="4"/>
+            </w:tcBorders>
+            <w:tcMar>
+              <w:top w:type="dxa" w:w="60"/>
+              <w:left w:type="dxa" w:w="100"/>
+              <w:bottom w:type="dxa" w:w="60"/>
+              <w:right w:type="dxa" w:w="100"/>
+            </w:tcMar>
+          </w:tcPr>
+          <w:p>
+            <w:r>
+              <w:rPr>
+                <w:sz w:val="19"/>
+                <w:szCs w:val="19"/>
+              </w:rPr>
+              <w:t xml:space="preserve">Number in system</w:t>
+            </w:r>
+          </w:p>
+        </w:tc>
+        <w:tc>
+          <w:tcPr>
+            <w:tcW w:type="dxa" w:w="3126"/>
+            <w:tcBorders>
+              <w:top w:val="single" w:color="D9D8D3" w:sz="4"/>
+              <w:left w:val="single" w:color="D9D8D3" w:sz="4"/>
+              <w:bottom w:val="single" w:color="D9D8D3" w:sz="4"/>
+              <w:right w:val="single" w:color="D9D8D3" w:sz="4"/>
+            </w:tcBorders>
+            <w:tcMar>
+              <w:top w:type="dxa" w:w="60"/>
+              <w:left w:type="dxa" w:w="100"/>
+              <w:bottom w:type="dxa" w:w="60"/>
+              <w:right w:type="dxa" w:w="100"/>
+            </w:tcMar>
+          </w:tcPr>
+          <w:p>
+            <w:r>
+              <w:rPr>
+                <w:sz w:val="19"/>
+                <w:szCs w:val="19"/>
+              </w:rPr>
+              <w:t xml:space="preserve">Average students in the whole system (queueing + being served + eating)</w:t>
+            </w:r>
+          </w:p>
+        </w:tc>
+        <w:tc>
+          <w:tcPr>
+            <w:tcW w:type="dxa" w:w="1500"/>
+            <w:tcBorders>
+              <w:top w:val="single" w:color="D9D8D3" w:sz="4"/>
+              <w:left w:val="single" w:color="D9D8D3" w:sz="4"/>
+              <w:bottom w:val="single" w:color="D9D8D3" w:sz="4"/>
+              <w:right w:val="single" w:color="D9D8D3" w:sz="4"/>
+            </w:tcBorders>
+            <w:tcMar>
+              <w:top w:type="dxa" w:w="60"/>
+              <w:left w:type="dxa" w:w="100"/>
+              <w:bottom w:type="dxa" w:w="60"/>
+              <w:right w:type="dxa" w:w="100"/>
+            </w:tcMar>
+          </w:tcPr>
+          <w:p>
+            <w:r>
+              <w:rPr>
+                <w:sz w:val="19"/>
+                <w:szCs w:val="19"/>
+              </w:rPr>
+              <w:t xml:space="preserve">students</w:t>
+            </w:r>
+          </w:p>
+        </w:tc>
+        <w:tc>
+          <w:tcPr>
+            <w:tcW w:type="dxa" w:w="1900"/>
+            <w:tcBorders>
+              <w:top w:val="single" w:color="D9D8D3" w:sz="4"/>
+              <w:left w:val="single" w:color="D9D8D3" w:sz="4"/>
+              <w:bottom w:val="single" w:color="D9D8D3" w:sz="4"/>
+              <w:right w:val="single" w:color="D9D8D3" w:sz="4"/>
+            </w:tcBorders>
+            <w:tcMar>
+              <w:top w:type="dxa" w:w="60"/>
+              <w:left w:type="dxa" w:w="100"/>
+              <w:bottom w:type="dxa" w:w="60"/>
+              <w:right w:type="dxa" w:w="100"/>
+            </w:tcMar>
+          </w:tcPr>
+          <w:p>
+            <w:r>
+              <w:rPr>
+                <w:sz w:val="19"/>
+                <w:szCs w:val="19"/>
+              </w:rPr>
+              <w:t xml:space="preserve">Computed (Little's Law)</w:t>
+            </w:r>
+          </w:p>
+        </w:tc>
+      </w:tr>
+      <w:tr>
+        <w:tc>
+          <w:tcPr>
+            <w:tcW w:type="dxa" w:w="1150"/>
+            <w:tcBorders>
+              <w:top w:val="single" w:color="D9D8D3" w:sz="4"/>
+              <w:left w:val="single" w:color="D9D8D3" w:sz="4"/>
+              <w:bottom w:val="single" w:color="D9D8D3" w:sz="4"/>
+              <w:right w:val="single" w:color="D9D8D3" w:sz="4"/>
+            </w:tcBorders>
+            <w:tcMar>
+              <w:top w:type="dxa" w:w="60"/>
+              <w:left w:type="dxa" w:w="100"/>
+              <w:bottom w:type="dxa" w:w="60"/>
+              <w:right w:type="dxa" w:w="100"/>
+            </w:tcMar>
+          </w:tcPr>
+          <w:p>
+            <w:r>
+              <w:rPr>
+                <w:sz w:val="19"/>
+                <w:szCs w:val="19"/>
+              </w:rPr>
+              <w:t xml:space="preserve">Lq</w:t>
+            </w:r>
+          </w:p>
+        </w:tc>
+        <w:tc>
+          <w:tcPr>
+            <w:tcW w:type="dxa" w:w="1350"/>
+            <w:tcBorders>
+              <w:top w:val="single" w:color="D9D8D3" w:sz="4"/>
+              <w:left w:val="single" w:color="D9D8D3" w:sz="4"/>
+              <w:bottom w:val="single" w:color="D9D8D3" w:sz="4"/>
+              <w:right w:val="single" w:color="D9D8D3" w:sz="4"/>
+            </w:tcBorders>
+            <w:tcMar>
+              <w:top w:type="dxa" w:w="60"/>
+              <w:left w:type="dxa" w:w="100"/>
+              <w:bottom w:type="dxa" w:w="60"/>
+              <w:right w:type="dxa" w:w="100"/>
+            </w:tcMar>
+          </w:tcPr>
+          <w:p>
+            <w:r>
+              <w:rPr>
+                <w:sz w:val="19"/>
+                <w:szCs w:val="19"/>
+              </w:rPr>
+              <w:t xml:space="preserve">Number in queue</w:t>
+            </w:r>
+          </w:p>
+        </w:tc>
+        <w:tc>
+          <w:tcPr>
+            <w:tcW w:type="dxa" w:w="3126"/>
+            <w:tcBorders>
+              <w:top w:val="single" w:color="D9D8D3" w:sz="4"/>
+              <w:left w:val="single" w:color="D9D8D3" w:sz="4"/>
+              <w:bottom w:val="single" w:color="D9D8D3" w:sz="4"/>
+              <w:right w:val="single" w:color="D9D8D3" w:sz="4"/>
+            </w:tcBorders>
+            <w:tcMar>
+              <w:top w:type="dxa" w:w="60"/>
+              <w:left w:type="dxa" w:w="100"/>
+              <w:bottom w:type="dxa" w:w="60"/>
+              <w:right w:type="dxa" w:w="100"/>
+            </w:tcMar>
+          </w:tcPr>
+          <w:p>
+            <w:r>
+              <w:rPr>
+                <w:sz w:val="19"/>
+                <w:szCs w:val="19"/>
+              </w:rPr>
+              <w:t xml:space="preserve">Average students waiting before service</w:t>
+            </w:r>
+          </w:p>
+        </w:tc>
+        <w:tc>
+          <w:tcPr>
+            <w:tcW w:type="dxa" w:w="1500"/>
+            <w:tcBorders>
+              <w:top w:val="single" w:color="D9D8D3" w:sz="4"/>
+              <w:left w:val="single" w:color="D9D8D3" w:sz="4"/>
+              <w:bottom w:val="single" w:color="D9D8D3" w:sz="4"/>
+              <w:right w:val="single" w:color="D9D8D3" w:sz="4"/>
+            </w:tcBorders>
+            <w:tcMar>
+              <w:top w:type="dxa" w:w="60"/>
+              <w:left w:type="dxa" w:w="100"/>
+              <w:bottom w:type="dxa" w:w="60"/>
+              <w:right w:type="dxa" w:w="100"/>
+            </w:tcMar>
+          </w:tcPr>
+          <w:p>
+            <w:r>
+              <w:rPr>
+                <w:sz w:val="19"/>
+                <w:szCs w:val="19"/>
+              </w:rPr>
+              <w:t xml:space="preserve">students</w:t>
+            </w:r>
+          </w:p>
+        </w:tc>
+        <w:tc>
+          <w:tcPr>
+            <w:tcW w:type="dxa" w:w="1900"/>
+            <w:tcBorders>
+              <w:top w:val="single" w:color="D9D8D3" w:sz="4"/>
+              <w:left w:val="single" w:color="D9D8D3" w:sz="4"/>
+              <w:bottom w:val="single" w:color="D9D8D3" w:sz="4"/>
+              <w:right w:val="single" w:color="D9D8D3" w:sz="4"/>
+            </w:tcBorders>
+            <w:tcMar>
+              <w:top w:type="dxa" w:w="60"/>
+              <w:left w:type="dxa" w:w="100"/>
+              <w:bottom w:type="dxa" w:w="60"/>
+              <w:right w:type="dxa" w:w="100"/>
+            </w:tcMar>
+          </w:tcPr>
+          <w:p>
+            <w:r>
+              <w:rPr>
+                <w:sz w:val="19"/>
+                <w:szCs w:val="19"/>
+              </w:rPr>
+              <w:t xml:space="preserve">Computed</w:t>
+            </w:r>
+          </w:p>
+        </w:tc>
+      </w:tr>
+      <w:tr>
+        <w:tc>
+          <w:tcPr>
+            <w:tcW w:type="dxa" w:w="1150"/>
+            <w:tcBorders>
+              <w:top w:val="single" w:color="D9D8D3" w:sz="4"/>
+              <w:left w:val="single" w:color="D9D8D3" w:sz="4"/>
+              <w:bottom w:val="single" w:color="D9D8D3" w:sz="4"/>
+              <w:right w:val="single" w:color="D9D8D3" w:sz="4"/>
+            </w:tcBorders>
+            <w:tcMar>
+              <w:top w:type="dxa" w:w="60"/>
+              <w:left w:type="dxa" w:w="100"/>
+              <w:bottom w:type="dxa" w:w="60"/>
+              <w:right w:type="dxa" w:w="100"/>
+            </w:tcMar>
+          </w:tcPr>
+          <w:p>
+            <w:r>
+              <w:rPr>
+                <w:sz w:val="19"/>
+                <w:szCs w:val="19"/>
+              </w:rPr>
+              <w:t xml:space="preserve">W</w:t>
+            </w:r>
+          </w:p>
+        </w:tc>
+        <w:tc>
+          <w:tcPr>
+            <w:tcW w:type="dxa" w:w="1350"/>
+            <w:tcBorders>
+              <w:top w:val="single" w:color="D9D8D3" w:sz="4"/>
+              <w:left w:val="single" w:color="D9D8D3" w:sz="4"/>
+              <w:bottom w:val="single" w:color="D9D8D3" w:sz="4"/>
+              <w:right w:val="single" w:color="D9D8D3" w:sz="4"/>
+            </w:tcBorders>
+            <w:tcMar>
+              <w:top w:type="dxa" w:w="60"/>
+              <w:left w:type="dxa" w:w="100"/>
+              <w:bottom w:type="dxa" w:w="60"/>
+              <w:right w:type="dxa" w:w="100"/>
+            </w:tcMar>
+          </w:tcPr>
+          <w:p>
+            <w:r>
+              <w:rPr>
+                <w:sz w:val="19"/>
+                <w:szCs w:val="19"/>
+              </w:rPr>
+              <w:t xml:space="preserve">Time in system</w:t>
+            </w:r>
+          </w:p>
+        </w:tc>
+        <w:tc>
+          <w:tcPr>
+            <w:tcW w:type="dxa" w:w="3126"/>
+            <w:tcBorders>
+              <w:top w:val="single" w:color="D9D8D3" w:sz="4"/>
+              <w:left w:val="single" w:color="D9D8D3" w:sz="4"/>
+              <w:bottom w:val="single" w:color="D9D8D3" w:sz="4"/>
+              <w:right w:val="single" w:color="D9D8D3" w:sz="4"/>
+            </w:tcBorders>
+            <w:tcMar>
+              <w:top w:type="dxa" w:w="60"/>
+              <w:left w:type="dxa" w:w="100"/>
+              <w:bottom w:type="dxa" w:w="60"/>
+              <w:right w:type="dxa" w:w="100"/>
+            </w:tcMar>
+          </w:tcPr>
+          <w:p>
+            <w:r>
+              <w:rPr>
+                <w:sz w:val="19"/>
+                <w:szCs w:val="19"/>
+              </w:rPr>
+              <w:t xml:space="preserve">Average total time from arrival to leaving</w:t>
+            </w:r>
+          </w:p>
+        </w:tc>
+        <w:tc>
+          <w:tcPr>
+            <w:tcW w:type="dxa" w:w="1500"/>
+            <w:tcBorders>
+              <w:top w:val="single" w:color="D9D8D3" w:sz="4"/>
+              <w:left w:val="single" w:color="D9D8D3" w:sz="4"/>
+              <w:bottom w:val="single" w:color="D9D8D3" w:sz="4"/>
+              <w:right w:val="single" w:color="D9D8D3" w:sz="4"/>
+            </w:tcBorders>
+            <w:tcMar>
+              <w:top w:type="dxa" w:w="60"/>
+              <w:left w:type="dxa" w:w="100"/>
+              <w:bottom w:type="dxa" w:w="60"/>
+              <w:right w:type="dxa" w:w="100"/>
+            </w:tcMar>
+          </w:tcPr>
+          <w:p>
+            <w:r>
+              <w:rPr>
+                <w:sz w:val="19"/>
+                <w:szCs w:val="19"/>
+              </w:rPr>
+              <w:t xml:space="preserve">minutes</w:t>
+            </w:r>
+          </w:p>
+        </w:tc>
+        <w:tc>
+          <w:tcPr>
+            <w:tcW w:type="dxa" w:w="1900"/>
+            <w:tcBorders>
+              <w:top w:val="single" w:color="D9D8D3" w:sz="4"/>
+              <w:left w:val="single" w:color="D9D8D3" w:sz="4"/>
+              <w:bottom w:val="single" w:color="D9D8D3" w:sz="4"/>
+              <w:right w:val="single" w:color="D9D8D3" w:sz="4"/>
+            </w:tcBorders>
+            <w:tcMar>
+              <w:top w:type="dxa" w:w="60"/>
+              <w:left w:type="dxa" w:w="100"/>
+              <w:bottom w:type="dxa" w:w="60"/>
+              <w:right w:type="dxa" w:w="100"/>
+            </w:tcMar>
+          </w:tcPr>
+          <w:p>
+            <w:r>
+              <w:rPr>
+                <w:sz w:val="19"/>
+                <w:szCs w:val="19"/>
+              </w:rPr>
+              <w:t xml:space="preserve">~18 min on a normal day, </w:t>
             </w:r>
             <w:r>
               <w:rPr>
@@ -3090,7 +3681,7 @@
                 <w:sz w:val="19"/>
                 <w:szCs w:val="19"/>
               </w:rPr>
-              <w:t xml:space="preserve">assumed</w:t>
+              <w:t xml:space="preserve">measured</w:t>
             </w:r>
           </w:p>
         </w:tc>
@@ -3118,7 +3709,7 @@
                 <w:sz w:val="19"/>
                 <w:szCs w:val="19"/>
               </w:rPr>
-              <w:t xml:space="preserve">ρ (rho)</w:t>
+              <w:t xml:space="preserve">Wq</w:t>
             </w:r>
           </w:p>
         </w:tc>
@@ -3144,7 +3735,7 @@
                 <w:sz w:val="19"/>
                 <w:szCs w:val="19"/>
               </w:rPr>
-              <w:t xml:space="preserve">Utilisation</w:t>
+              <w:t xml:space="preserve">Time in queue</w:t>
             </w:r>
           </w:p>
         </w:tc>
@@ -3170,7 +3761,7 @@
                 <w:sz w:val="19"/>
                 <w:szCs w:val="19"/>
               </w:rPr>
-              <w:t xml:space="preserve">Share of serving capacity in use: ρ = λ / (cμ)</w:t>
+              <w:t xml:space="preserve">Average waiting time before service starts</w:t>
             </w:r>
           </w:p>
         </w:tc>
@@ -3196,7 +3787,7 @@
                 <w:sz w:val="19"/>
                 <w:szCs w:val="19"/>
               </w:rPr>
-              <w:t xml:space="preserve">fraction (0–1)</w:t>
+              <w:t xml:space="preserve">minutes</w:t>
             </w:r>
           </w:p>
         </w:tc>
@@ -3250,7 +3841,7 @@
                 <w:sz w:val="19"/>
                 <w:szCs w:val="19"/>
               </w:rPr>
-              <w:t xml:space="preserve">L</w:t>
+              <w:t xml:space="preserve">1/μ</w:t>
             </w:r>
           </w:p>
         </w:tc>
@@ -3276,7 +3867,7 @@
                 <w:sz w:val="19"/>
                 <w:szCs w:val="19"/>
               </w:rPr>
-              <w:t xml:space="preserve">Number in system</w:t>
+              <w:t xml:space="preserve">Service time</w:t>
             </w:r>
           </w:p>
         </w:tc>
@@ -3302,7 +3893,7 @@
                 <w:sz w:val="19"/>
                 <w:szCs w:val="19"/>
               </w:rPr>
-              <w:t xml:space="preserve">Average students in the whole system (queueing + being served + eating)</w:t>
+              <w:t xml:space="preserve">Average time to serve one student</w:t>
             </w:r>
           </w:p>
         </w:tc>
@@ -3328,7 +3919,7 @@
                 <w:sz w:val="19"/>
                 <w:szCs w:val="19"/>
               </w:rPr>
-              <w:t xml:space="preserve">students</w:t>
+              <w:t xml:space="preserve">minutes</w:t>
             </w:r>
           </w:p>
         </w:tc>
@@ -3354,544 +3945,7 @@
                 <w:sz w:val="19"/>
                 <w:szCs w:val="19"/>
               </w:rPr>
-              <w:t xml:space="preserve">Computed (Little's Law)</w:t>
-            </w:r>
-          </w:p>
-        </w:tc>
-      </w:tr>
-      <w:tr>
-        <w:tc>
-          <w:tcPr>
-            <w:tcW w:type="dxa" w:w="1150"/>
-            <w:tcBorders>
-              <w:top w:val="single" w:color="D9D8D3" w:sz="4"/>
-              <w:left w:val="single" w:color="D9D8D3" w:sz="4"/>
-              <w:bottom w:val="single" w:color="D9D8D3" w:sz="4"/>
-              <w:right w:val="single" w:color="D9D8D3" w:sz="4"/>
-            </w:tcBorders>
-            <w:tcMar>
-              <w:top w:type="dxa" w:w="60"/>
-              <w:left w:type="dxa" w:w="100"/>
-              <w:bottom w:type="dxa" w:w="60"/>
-              <w:right w:type="dxa" w:w="100"/>
-            </w:tcMar>
-          </w:tcPr>
-          <w:p>
-            <w:r>
-              <w:rPr>
-                <w:sz w:val="19"/>
-                <w:szCs w:val="19"/>
-              </w:rPr>
-              <w:t xml:space="preserve">Lq</w:t>
-            </w:r>
-          </w:p>
-        </w:tc>
-        <w:tc>
-          <w:tcPr>
-            <w:tcW w:type="dxa" w:w="1350"/>
-            <w:tcBorders>
-              <w:top w:val="single" w:color="D9D8D3" w:sz="4"/>
-              <w:left w:val="single" w:color="D9D8D3" w:sz="4"/>
-              <w:bottom w:val="single" w:color="D9D8D3" w:sz="4"/>
-              <w:right w:val="single" w:color="D9D8D3" w:sz="4"/>
-            </w:tcBorders>
-            <w:tcMar>
-              <w:top w:type="dxa" w:w="60"/>
-              <w:left w:type="dxa" w:w="100"/>
-              <w:bottom w:type="dxa" w:w="60"/>
-              <w:right w:type="dxa" w:w="100"/>
-            </w:tcMar>
-          </w:tcPr>
-          <w:p>
-            <w:r>
-              <w:rPr>
-                <w:sz w:val="19"/>
-                <w:szCs w:val="19"/>
-              </w:rPr>
-              <w:t xml:space="preserve">Number in queue</w:t>
-            </w:r>
-          </w:p>
-        </w:tc>
-        <w:tc>
-          <w:tcPr>
-            <w:tcW w:type="dxa" w:w="3126"/>
-            <w:tcBorders>
-              <w:top w:val="single" w:color="D9D8D3" w:sz="4"/>
-              <w:left w:val="single" w:color="D9D8D3" w:sz="4"/>
-              <w:bottom w:val="single" w:color="D9D8D3" w:sz="4"/>
-              <w:right w:val="single" w:color="D9D8D3" w:sz="4"/>
-            </w:tcBorders>
-            <w:tcMar>
-              <w:top w:type="dxa" w:w="60"/>
-              <w:left w:type="dxa" w:w="100"/>
-              <w:bottom w:type="dxa" w:w="60"/>
-              <w:right w:type="dxa" w:w="100"/>
-            </w:tcMar>
-          </w:tcPr>
-          <w:p>
-            <w:r>
-              <w:rPr>
-                <w:sz w:val="19"/>
-                <w:szCs w:val="19"/>
-              </w:rPr>
-              <w:t xml:space="preserve">Average students waiting before service</w:t>
-            </w:r>
-          </w:p>
-        </w:tc>
-        <w:tc>
-          <w:tcPr>
-            <w:tcW w:type="dxa" w:w="1500"/>
-            <w:tcBorders>
-              <w:top w:val="single" w:color="D9D8D3" w:sz="4"/>
-              <w:left w:val="single" w:color="D9D8D3" w:sz="4"/>
-              <w:bottom w:val="single" w:color="D9D8D3" w:sz="4"/>
-              <w:right w:val="single" w:color="D9D8D3" w:sz="4"/>
-            </w:tcBorders>
-            <w:tcMar>
-              <w:top w:type="dxa" w:w="60"/>
-              <w:left w:type="dxa" w:w="100"/>
-              <w:bottom w:type="dxa" w:w="60"/>
-              <w:right w:type="dxa" w:w="100"/>
-            </w:tcMar>
-          </w:tcPr>
-          <w:p>
-            <w:r>
-              <w:rPr>
-                <w:sz w:val="19"/>
-                <w:szCs w:val="19"/>
-              </w:rPr>
-              <w:t xml:space="preserve">students</w:t>
-            </w:r>
-          </w:p>
-        </w:tc>
-        <w:tc>
-          <w:tcPr>
-            <w:tcW w:type="dxa" w:w="1900"/>
-            <w:tcBorders>
-              <w:top w:val="single" w:color="D9D8D3" w:sz="4"/>
-              <w:left w:val="single" w:color="D9D8D3" w:sz="4"/>
-              <w:bottom w:val="single" w:color="D9D8D3" w:sz="4"/>
-              <w:right w:val="single" w:color="D9D8D3" w:sz="4"/>
-            </w:tcBorders>
-            <w:tcMar>
-              <w:top w:type="dxa" w:w="60"/>
-              <w:left w:type="dxa" w:w="100"/>
-              <w:bottom w:type="dxa" w:w="60"/>
-              <w:right w:type="dxa" w:w="100"/>
-            </w:tcMar>
-          </w:tcPr>
-          <w:p>
-            <w:r>
-              <w:rPr>
-                <w:sz w:val="19"/>
-                <w:szCs w:val="19"/>
-              </w:rPr>
-              <w:t xml:space="preserve">Computed</w:t>
-            </w:r>
-          </w:p>
-        </w:tc>
-      </w:tr>
-      <w:tr>
-        <w:tc>
-          <w:tcPr>
-            <w:tcW w:type="dxa" w:w="1150"/>
-            <w:tcBorders>
-              <w:top w:val="single" w:color="D9D8D3" w:sz="4"/>
-              <w:left w:val="single" w:color="D9D8D3" w:sz="4"/>
-              <w:bottom w:val="single" w:color="D9D8D3" w:sz="4"/>
-              <w:right w:val="single" w:color="D9D8D3" w:sz="4"/>
-            </w:tcBorders>
-            <w:tcMar>
-              <w:top w:type="dxa" w:w="60"/>
-              <w:left w:type="dxa" w:w="100"/>
-              <w:bottom w:type="dxa" w:w="60"/>
-              <w:right w:type="dxa" w:w="100"/>
-            </w:tcMar>
-          </w:tcPr>
-          <w:p>
-            <w:r>
-              <w:rPr>
-                <w:sz w:val="19"/>
-                <w:szCs w:val="19"/>
-              </w:rPr>
-              <w:t xml:space="preserve">W</w:t>
-            </w:r>
-          </w:p>
-        </w:tc>
-        <w:tc>
-          <w:tcPr>
-            <w:tcW w:type="dxa" w:w="1350"/>
-            <w:tcBorders>
-              <w:top w:val="single" w:color="D9D8D3" w:sz="4"/>
-              <w:left w:val="single" w:color="D9D8D3" w:sz="4"/>
-              <w:bottom w:val="single" w:color="D9D8D3" w:sz="4"/>
-              <w:right w:val="single" w:color="D9D8D3" w:sz="4"/>
-            </w:tcBorders>
-            <w:tcMar>
-              <w:top w:type="dxa" w:w="60"/>
-              <w:left w:type="dxa" w:w="100"/>
-              <w:bottom w:type="dxa" w:w="60"/>
-              <w:right w:type="dxa" w:w="100"/>
-            </w:tcMar>
-          </w:tcPr>
-          <w:p>
-            <w:r>
-              <w:rPr>
-                <w:sz w:val="19"/>
-                <w:szCs w:val="19"/>
-              </w:rPr>
-              <w:t xml:space="preserve">Time in system</w:t>
-            </w:r>
-          </w:p>
-        </w:tc>
-        <w:tc>
-          <w:tcPr>
-            <w:tcW w:type="dxa" w:w="3126"/>
-            <w:tcBorders>
-              <w:top w:val="single" w:color="D9D8D3" w:sz="4"/>
-              <w:left w:val="single" w:color="D9D8D3" w:sz="4"/>
-              <w:bottom w:val="single" w:color="D9D8D3" w:sz="4"/>
-              <w:right w:val="single" w:color="D9D8D3" w:sz="4"/>
-            </w:tcBorders>
-            <w:tcMar>
-              <w:top w:type="dxa" w:w="60"/>
-              <w:left w:type="dxa" w:w="100"/>
-              <w:bottom w:type="dxa" w:w="60"/>
-              <w:right w:type="dxa" w:w="100"/>
-            </w:tcMar>
-          </w:tcPr>
-          <w:p>
-            <w:r>
-              <w:rPr>
-                <w:sz w:val="19"/>
-                <w:szCs w:val="19"/>
-              </w:rPr>
-              <w:t xml:space="preserve">Average total time from arrival to leaving</w:t>
-            </w:r>
-          </w:p>
-        </w:tc>
-        <w:tc>
-          <w:tcPr>
-            <w:tcW w:type="dxa" w:w="1500"/>
-            <w:tcBorders>
-              <w:top w:val="single" w:color="D9D8D3" w:sz="4"/>
-              <w:left w:val="single" w:color="D9D8D3" w:sz="4"/>
-              <w:bottom w:val="single" w:color="D9D8D3" w:sz="4"/>
-              <w:right w:val="single" w:color="D9D8D3" w:sz="4"/>
-            </w:tcBorders>
-            <w:tcMar>
-              <w:top w:type="dxa" w:w="60"/>
-              <w:left w:type="dxa" w:w="100"/>
-              <w:bottom w:type="dxa" w:w="60"/>
-              <w:right w:type="dxa" w:w="100"/>
-            </w:tcMar>
-          </w:tcPr>
-          <w:p>
-            <w:r>
-              <w:rPr>
-                <w:sz w:val="19"/>
-                <w:szCs w:val="19"/>
-              </w:rPr>
-              <w:t xml:space="preserve">minutes</w:t>
-            </w:r>
-          </w:p>
-        </w:tc>
-        <w:tc>
-          <w:tcPr>
-            <w:tcW w:type="dxa" w:w="1900"/>
-            <w:tcBorders>
-              <w:top w:val="single" w:color="D9D8D3" w:sz="4"/>
-              <w:left w:val="single" w:color="D9D8D3" w:sz="4"/>
-              <w:bottom w:val="single" w:color="D9D8D3" w:sz="4"/>
-              <w:right w:val="single" w:color="D9D8D3" w:sz="4"/>
-            </w:tcBorders>
-            <w:tcMar>
-              <w:top w:type="dxa" w:w="60"/>
-              <w:left w:type="dxa" w:w="100"/>
-              <w:bottom w:type="dxa" w:w="60"/>
-              <w:right w:type="dxa" w:w="100"/>
-            </w:tcMar>
-          </w:tcPr>
-          <w:p>
-            <w:r>
-              <w:rPr>
-                <w:sz w:val="19"/>
-                <w:szCs w:val="19"/>
-              </w:rPr>
-              <w:t xml:space="preserve">~18 min on a normal day, </w:t>
-            </w:r>
-            <w:r>
-              <w:rPr>
-                <w:b/>
-                <w:bCs/>
-                <w:sz w:val="19"/>
-                <w:szCs w:val="19"/>
-              </w:rPr>
-              <w:t xml:space="preserve">measured</w:t>
-            </w:r>
-          </w:p>
-        </w:tc>
-      </w:tr>
-      <w:tr>
-        <w:tc>
-          <w:tcPr>
-            <w:tcW w:type="dxa" w:w="1150"/>
-            <w:tcBorders>
-              <w:top w:val="single" w:color="D9D8D3" w:sz="4"/>
-              <w:left w:val="single" w:color="D9D8D3" w:sz="4"/>
-              <w:bottom w:val="single" w:color="D9D8D3" w:sz="4"/>
-              <w:right w:val="single" w:color="D9D8D3" w:sz="4"/>
-            </w:tcBorders>
-            <w:tcMar>
-              <w:top w:type="dxa" w:w="60"/>
-              <w:left w:type="dxa" w:w="100"/>
-              <w:bottom w:type="dxa" w:w="60"/>
-              <w:right w:type="dxa" w:w="100"/>
-            </w:tcMar>
-          </w:tcPr>
-          <w:p>
-            <w:r>
-              <w:rPr>
-                <w:sz w:val="19"/>
-                <w:szCs w:val="19"/>
-              </w:rPr>
-              <w:t xml:space="preserve">Wq</w:t>
-            </w:r>
-          </w:p>
-        </w:tc>
-        <w:tc>
-          <w:tcPr>
-            <w:tcW w:type="dxa" w:w="1350"/>
-            <w:tcBorders>
-              <w:top w:val="single" w:color="D9D8D3" w:sz="4"/>
-              <w:left w:val="single" w:color="D9D8D3" w:sz="4"/>
-              <w:bottom w:val="single" w:color="D9D8D3" w:sz="4"/>
-              <w:right w:val="single" w:color="D9D8D3" w:sz="4"/>
-            </w:tcBorders>
-            <w:tcMar>
-              <w:top w:type="dxa" w:w="60"/>
-              <w:left w:type="dxa" w:w="100"/>
-              <w:bottom w:type="dxa" w:w="60"/>
-              <w:right w:type="dxa" w:w="100"/>
-            </w:tcMar>
-          </w:tcPr>
-          <w:p>
-            <w:r>
-              <w:rPr>
-                <w:sz w:val="19"/>
-                <w:szCs w:val="19"/>
-              </w:rPr>
-              <w:t xml:space="preserve">Time in queue</w:t>
-            </w:r>
-          </w:p>
-        </w:tc>
-        <w:tc>
-          <w:tcPr>
-            <w:tcW w:type="dxa" w:w="3126"/>
-            <w:tcBorders>
-              <w:top w:val="single" w:color="D9D8D3" w:sz="4"/>
-              <w:left w:val="single" w:color="D9D8D3" w:sz="4"/>
-              <w:bottom w:val="single" w:color="D9D8D3" w:sz="4"/>
-              <w:right w:val="single" w:color="D9D8D3" w:sz="4"/>
-            </w:tcBorders>
-            <w:tcMar>
-              <w:top w:type="dxa" w:w="60"/>
-              <w:left w:type="dxa" w:w="100"/>
-              <w:bottom w:type="dxa" w:w="60"/>
-              <w:right w:type="dxa" w:w="100"/>
-            </w:tcMar>
-          </w:tcPr>
-          <w:p>
-            <w:r>
-              <w:rPr>
-                <w:sz w:val="19"/>
-                <w:szCs w:val="19"/>
-              </w:rPr>
-              <w:t xml:space="preserve">Average waiting time before service starts</w:t>
-            </w:r>
-          </w:p>
-        </w:tc>
-        <w:tc>
-          <w:tcPr>
-            <w:tcW w:type="dxa" w:w="1500"/>
-            <w:tcBorders>
-              <w:top w:val="single" w:color="D9D8D3" w:sz="4"/>
-              <w:left w:val="single" w:color="D9D8D3" w:sz="4"/>
-              <w:bottom w:val="single" w:color="D9D8D3" w:sz="4"/>
-              <w:right w:val="single" w:color="D9D8D3" w:sz="4"/>
-            </w:tcBorders>
-            <w:tcMar>
-              <w:top w:type="dxa" w:w="60"/>
-              <w:left w:type="dxa" w:w="100"/>
-              <w:bottom w:type="dxa" w:w="60"/>
-              <w:right w:type="dxa" w:w="100"/>
-            </w:tcMar>
-          </w:tcPr>
-          <w:p>
-            <w:r>
-              <w:rPr>
-                <w:sz w:val="19"/>
-                <w:szCs w:val="19"/>
-              </w:rPr>
-              <w:t xml:space="preserve">minutes</w:t>
-            </w:r>
-          </w:p>
-        </w:tc>
-        <w:tc>
-          <w:tcPr>
-            <w:tcW w:type="dxa" w:w="1900"/>
-            <w:tcBorders>
-              <w:top w:val="single" w:color="D9D8D3" w:sz="4"/>
-              <w:left w:val="single" w:color="D9D8D3" w:sz="4"/>
-              <w:bottom w:val="single" w:color="D9D8D3" w:sz="4"/>
-              <w:right w:val="single" w:color="D9D8D3" w:sz="4"/>
-            </w:tcBorders>
-            <w:tcMar>
-              <w:top w:type="dxa" w:w="60"/>
-              <w:left w:type="dxa" w:w="100"/>
-              <w:bottom w:type="dxa" w:w="60"/>
-              <w:right w:type="dxa" w:w="100"/>
-            </w:tcMar>
-          </w:tcPr>
-          <w:p>
-            <w:r>
-              <w:rPr>
-                <w:sz w:val="19"/>
-                <w:szCs w:val="19"/>
-              </w:rPr>
-              <w:t xml:space="preserve">Computed</w:t>
-            </w:r>
-          </w:p>
-        </w:tc>
-      </w:tr>
-      <w:tr>
-        <w:tc>
-          <w:tcPr>
-            <w:tcW w:type="dxa" w:w="1150"/>
-            <w:tcBorders>
-              <w:top w:val="single" w:color="D9D8D3" w:sz="4"/>
-              <w:left w:val="single" w:color="D9D8D3" w:sz="4"/>
-              <w:bottom w:val="single" w:color="D9D8D3" w:sz="4"/>
-              <w:right w:val="single" w:color="D9D8D3" w:sz="4"/>
-            </w:tcBorders>
-            <w:tcMar>
-              <w:top w:type="dxa" w:w="60"/>
-              <w:left w:type="dxa" w:w="100"/>
-              <w:bottom w:type="dxa" w:w="60"/>
-              <w:right w:type="dxa" w:w="100"/>
-            </w:tcMar>
-          </w:tcPr>
-          <w:p>
-            <w:r>
-              <w:rPr>
-                <w:sz w:val="19"/>
-                <w:szCs w:val="19"/>
-              </w:rPr>
-              <w:t xml:space="preserve">1/μ</w:t>
-            </w:r>
-          </w:p>
-        </w:tc>
-        <w:tc>
-          <w:tcPr>
-            <w:tcW w:type="dxa" w:w="1350"/>
-            <w:tcBorders>
-              <w:top w:val="single" w:color="D9D8D3" w:sz="4"/>
-              <w:left w:val="single" w:color="D9D8D3" w:sz="4"/>
-              <w:bottom w:val="single" w:color="D9D8D3" w:sz="4"/>
-              <w:right w:val="single" w:color="D9D8D3" w:sz="4"/>
-            </w:tcBorders>
-            <w:tcMar>
-              <w:top w:type="dxa" w:w="60"/>
-              <w:left w:type="dxa" w:w="100"/>
-              <w:bottom w:type="dxa" w:w="60"/>
-              <w:right w:type="dxa" w:w="100"/>
-            </w:tcMar>
-          </w:tcPr>
-          <w:p>
-            <w:r>
-              <w:rPr>
-                <w:sz w:val="19"/>
-                <w:szCs w:val="19"/>
-              </w:rPr>
-              <w:t xml:space="preserve">Service time</w:t>
-            </w:r>
-          </w:p>
-        </w:tc>
-        <w:tc>
-          <w:tcPr>
-            <w:tcW w:type="dxa" w:w="3126"/>
-            <w:tcBorders>
-              <w:top w:val="single" w:color="D9D8D3" w:sz="4"/>
-              <w:left w:val="single" w:color="D9D8D3" w:sz="4"/>
-              <w:bottom w:val="single" w:color="D9D8D3" w:sz="4"/>
-              <w:right w:val="single" w:color="D9D8D3" w:sz="4"/>
-            </w:tcBorders>
-            <w:tcMar>
-              <w:top w:type="dxa" w:w="60"/>
-              <w:left w:type="dxa" w:w="100"/>
-              <w:bottom w:type="dxa" w:w="60"/>
-              <w:right w:type="dxa" w:w="100"/>
-            </w:tcMar>
-          </w:tcPr>
-          <w:p>
-            <w:r>
-              <w:rPr>
-                <w:sz w:val="19"/>
-                <w:szCs w:val="19"/>
-              </w:rPr>
-              <w:t xml:space="preserve">Average time to serve one student</w:t>
-            </w:r>
-          </w:p>
-        </w:tc>
-        <w:tc>
-          <w:tcPr>
-            <w:tcW w:type="dxa" w:w="1500"/>
-            <w:tcBorders>
-              <w:top w:val="single" w:color="D9D8D3" w:sz="4"/>
-              <w:left w:val="single" w:color="D9D8D3" w:sz="4"/>
-              <w:bottom w:val="single" w:color="D9D8D3" w:sz="4"/>
-              <w:right w:val="single" w:color="D9D8D3" w:sz="4"/>
-            </w:tcBorders>
-            <w:tcMar>
-              <w:top w:type="dxa" w:w="60"/>
-              <w:left w:type="dxa" w:w="100"/>
-              <w:bottom w:type="dxa" w:w="60"/>
-              <w:right w:type="dxa" w:w="100"/>
-            </w:tcMar>
-          </w:tcPr>
-          <w:p>
-            <w:r>
-              <w:rPr>
-                <w:sz w:val="19"/>
-                <w:szCs w:val="19"/>
-              </w:rPr>
-              <w:t xml:space="preserve">minutes</w:t>
-            </w:r>
-          </w:p>
-        </w:tc>
-        <w:tc>
-          <w:tcPr>
-            <w:tcW w:type="dxa" w:w="1900"/>
-            <w:tcBorders>
-              <w:top w:val="single" w:color="D9D8D3" w:sz="4"/>
-              <w:left w:val="single" w:color="D9D8D3" w:sz="4"/>
-              <w:bottom w:val="single" w:color="D9D8D3" w:sz="4"/>
-              <w:right w:val="single" w:color="D9D8D3" w:sz="4"/>
-            </w:tcBorders>
-            <w:tcMar>
-              <w:top w:type="dxa" w:w="60"/>
-              <w:left w:type="dxa" w:w="100"/>
-              <w:bottom w:type="dxa" w:w="60"/>
-              <w:right w:type="dxa" w:w="100"/>
-            </w:tcMar>
-          </w:tcPr>
-          <w:p>
-            <w:r>
-              <w:rPr>
-                <w:sz w:val="19"/>
-                <w:szCs w:val="19"/>
-              </w:rPr>
-              <w:t xml:space="preserve">0.25 min (15 s), </w:t>
+              <w:t xml:space="preserve">0.1 min (6 s), </w:t>
             </w:r>
             <w:r>
               <w:rPr>
@@ -5462,7 +5516,7 @@
                 <w:sz w:val="19"/>
                 <w:szCs w:val="19"/>
               </w:rPr>
-              <w:t xml:space="preserve">65% Central / 35% Munch, </w:t>
+              <w:t xml:space="preserve">85% Central / 15% Munch, </w:t>
             </w:r>
             <w:r>
               <w:rPr>
@@ -5473,6 +5527,13 @@
               </w:rPr>
               <w:t xml:space="preserve">assumed</w:t>
             </w:r>
+            <w:r>
+              <w:rPr>
+                <w:sz w:val="19"/>
+                <w:szCs w:val="19"/>
+              </w:rPr>
+              <w:t xml:space="preserve"> (not measured)</w:t>
+            </w:r>
           </w:p>
         </w:tc>
       </w:tr>
@@ -5578,6 +5639,137 @@
                 <w:szCs w:val="19"/>
               </w:rPr>
               <w:t xml:space="preserve">Computed</w:t>
+            </w:r>
+          </w:p>
+        </w:tc>
+      </w:tr>
+      <w:tr>
+        <w:tc>
+          <w:tcPr>
+            <w:tcW w:type="dxa" w:w="1200"/>
+            <w:tcBorders>
+              <w:top w:val="single" w:color="D9D8D3" w:sz="4"/>
+              <w:left w:val="single" w:color="D9D8D3" w:sz="4"/>
+              <w:bottom w:val="single" w:color="D9D8D3" w:sz="4"/>
+              <w:right w:val="single" w:color="D9D8D3" w:sz="4"/>
+            </w:tcBorders>
+            <w:tcMar>
+              <w:top w:type="dxa" w:w="60"/>
+              <w:left w:type="dxa" w:w="100"/>
+              <w:bottom w:type="dxa" w:w="60"/>
+              <w:right w:type="dxa" w:w="100"/>
+            </w:tcMar>
+          </w:tcPr>
+          <w:p>
+            <w:r>
+              <w:rPr>
+                <w:sz w:val="19"/>
+                <w:szCs w:val="19"/>
+              </w:rPr>
+              <w:t xml:space="preserve">s</w:t>
+            </w:r>
+          </w:p>
+        </w:tc>
+        <w:tc>
+          <w:tcPr>
+            <w:tcW w:type="dxa" w:w="1700"/>
+            <w:tcBorders>
+              <w:top w:val="single" w:color="D9D8D3" w:sz="4"/>
+              <w:left w:val="single" w:color="D9D8D3" w:sz="4"/>
+              <w:bottom w:val="single" w:color="D9D8D3" w:sz="4"/>
+              <w:right w:val="single" w:color="D9D8D3" w:sz="4"/>
+            </w:tcBorders>
+            <w:tcMar>
+              <w:top w:type="dxa" w:w="60"/>
+              <w:left w:type="dxa" w:w="100"/>
+              <w:bottom w:type="dxa" w:w="60"/>
+              <w:right w:type="dxa" w:w="100"/>
+            </w:tcMar>
+          </w:tcPr>
+          <w:p>
+            <w:r>
+              <w:rPr>
+                <w:sz w:val="19"/>
+                <w:szCs w:val="19"/>
+              </w:rPr>
+              <w:t xml:space="preserve">Scanners</w:t>
+            </w:r>
+          </w:p>
+        </w:tc>
+        <w:tc>
+          <w:tcPr>
+            <w:tcW w:type="dxa" w:w="3926"/>
+            <w:tcBorders>
+              <w:top w:val="single" w:color="D9D8D3" w:sz="4"/>
+              <w:left w:val="single" w:color="D9D8D3" w:sz="4"/>
+              <w:bottom w:val="single" w:color="D9D8D3" w:sz="4"/>
+              <w:right w:val="single" w:color="D9D8D3" w:sz="4"/>
+            </w:tcBorders>
+            <w:tcMar>
+              <w:top w:type="dxa" w:w="60"/>
+              <w:left w:type="dxa" w:w="100"/>
+              <w:bottom w:type="dxa" w:w="60"/>
+              <w:right w:type="dxa" w:w="100"/>
+            </w:tcMar>
+          </w:tcPr>
+          <w:p>
+            <w:r>
+              <w:rPr>
+                <w:sz w:val="19"/>
+                <w:szCs w:val="19"/>
+              </w:rPr>
+              <w:t xml:space="preserve">Face scanners at the entrance of each mess, one at a time</w:t>
+            </w:r>
+          </w:p>
+        </w:tc>
+        <w:tc>
+          <w:tcPr>
+            <w:tcW w:type="dxa" w:w="2200"/>
+            <w:tcBorders>
+              <w:top w:val="single" w:color="D9D8D3" w:sz="4"/>
+              <w:left w:val="single" w:color="D9D8D3" w:sz="4"/>
+              <w:bottom w:val="single" w:color="D9D8D3" w:sz="4"/>
+              <w:right w:val="single" w:color="D9D8D3" w:sz="4"/>
+            </w:tcBorders>
+            <w:tcMar>
+              <w:top w:type="dxa" w:w="60"/>
+              <w:left w:type="dxa" w:w="100"/>
+              <w:bottom w:type="dxa" w:w="60"/>
+              <w:right w:type="dxa" w:w="100"/>
+            </w:tcMar>
+          </w:tcPr>
+          <w:p>
+            <w:r>
+              <w:rPr>
+                <w:sz w:val="19"/>
+                <w:szCs w:val="19"/>
+              </w:rPr>
+              <w:t xml:space="preserve">1 per mess, </w:t>
+            </w:r>
+            <w:r>
+              <w:rPr>
+                <w:b/>
+                <w:bCs/>
+                <w:sz w:val="19"/>
+                <w:szCs w:val="19"/>
+              </w:rPr>
+              <w:t xml:space="preserve">measured</w:t>
+            </w:r>
+            <w:r>
+              <w:rPr>
+                <w:sz w:val="19"/>
+                <w:szCs w:val="19"/>
+              </w:rPr>
+              <w:t xml:space="preserve">; 2 s per scan, </w:t>
+            </w:r>
+            <w:r>
+              <w:rPr>
+                <w:b/>
+                <w:bCs/>
+                <w:sz w:val="19"/>
+                <w:szCs w:val="19"/>
+              </w:rPr>
+              <w:t xml:space="preserve">assumed</w:t>
             </w:r>
           </w:p>
         </w:tc>
@@ -6484,17 +6676,17 @@
         <w:spacing w:after="120"/>
       </w:pPr>
       <w:r>
-        <w:t xml:space="preserve">In a surge, W grows because of queueing. If 40 students/min arrive at Central CT and the visit stretches to 24 minutes, L = 40 × 24 = </w:t>
+        <w:t xml:space="preserve">In a surge, W grows because of queueing. If about 29 students/min arrive at Central CT at peak (our simulated peak, close to the single scanner's ~30/min) and the visit stretches to 25 minutes, L ≈ 29 × 25 ≈ </w:t>
       </w:r>
       <w:r>
         <w:rPr>
           <w:b/>
           <w:bCs/>
         </w:rPr>
-        <w:t xml:space="preserve">960 &gt; 900 seats</w:t>
-      </w:r>
-      <w:r>
-        <w:t xml:space="preserve">. The hall can fill (photo O1 at 13:18) even though the seats are enough on average.</w:t>
+        <w:t xml:space="preserve">725</w:t>
+      </w:r>
+      <w:r>
+        <w:t xml:space="preserve"> people inside: below 900 seats. So with these inputs Central's bottleneck is the serving stations and the scanner, not the seats. If the visit stretched past 31 minutes, L would exceed 900 and the hall would fill (as in photo O1 at 13:18).</w:t>
       </w:r>
     </w:p>
     <w:p>
@@ -6518,7 +6710,7 @@
         <w:pStyle w:val="Heading2"/>
       </w:pPr>
       <w:r>
-        <w:t xml:space="preserve">3.3 The M/M/1 model (one serving line)</w:t>
+        <w:t xml:space="preserve">3.3 The M/M/1 model (one serving station)</w:t>
       </w:r>
     </w:p>
     <w:p>
@@ -6623,7 +6815,7 @@
         <w:pStyle w:val="Heading3"/>
       </w:pPr>
       <w:r>
-        <w:t xml:space="preserve">Mess example (illustrative: one serving line, μ = 240 students/hour, i.e. 15 s each)</w:t>
+        <w:t xml:space="preserve">Mess example (illustrative: one serving station, μ = 240 students/hour, i.e. 15 s each)</w:t>
       </w:r>
     </w:p>
     <w:p>
@@ -7247,7 +7439,7 @@
         <w:pStyle w:val="Heading2"/>
       </w:pPr>
       <w:r>
-        <w:t xml:space="preserve">3.4 The M/M/c model (several serving lines)</w:t>
+        <w:t xml:space="preserve">3.4 The M/M/c model (several serving stations)</w:t>
       </w:r>
     </w:p>
     <w:p>
@@ -7255,7 +7447,7 @@
         <w:spacing w:after="120"/>
       </w:pPr>
       <w:r>
-        <w:t xml:space="preserve">When a hall has c identical serving lines fed from one queue, we use </w:t>
+        <w:t xml:space="preserve">When a hall has c identical serving stations fed from one queue, we use </w:t>
       </w:r>
       <w:r>
         <w:rPr>
@@ -7329,10 +7521,10 @@
           <w:b/>
           <w:bCs/>
         </w:rPr>
-        <w:t xml:space="preserve">Illustrative example:</w:t>
-      </w:r>
-      <w:r>
-        <w:t xml:space="preserve"> a mess with c = 3 lines, μ = 4 students/min per line (capacity 12/min):</w:t>
+        <w:t xml:space="preserve">Example with our mess inputs:</w:t>
+      </w:r>
+      <w:r>
+        <w:t xml:space="preserve"> c = 2 serving stations (measured), μ = 10 students/min per station (assumed), so capacity 20/min:</w:t>
       </w:r>
     </w:p>
     <w:tbl>
@@ -7527,7 +7719,7 @@
                 <w:sz w:val="19"/>
                 <w:szCs w:val="19"/>
               </w:rPr>
-              <w:t xml:space="preserve">10/min</w:t>
+              <w:t xml:space="preserve">15/min</w:t>
             </w:r>
           </w:p>
         </w:tc>
@@ -7553,7 +7745,7 @@
                 <w:sz w:val="19"/>
                 <w:szCs w:val="19"/>
               </w:rPr>
-              <w:t xml:space="preserve">83%</w:t>
+              <w:t xml:space="preserve">75%</w:t>
             </w:r>
           </w:p>
         </w:tc>
@@ -7579,7 +7771,7 @@
                 <w:sz w:val="19"/>
                 <w:szCs w:val="19"/>
               </w:rPr>
-              <w:t xml:space="preserve">0.70</w:t>
+              <w:t xml:space="preserve">0.64</w:t>
             </w:r>
           </w:p>
         </w:tc>
@@ -7605,7 +7797,7 @@
                 <w:sz w:val="19"/>
                 <w:szCs w:val="19"/>
               </w:rPr>
-              <w:t xml:space="preserve">0.35 min (21 s)</w:t>
+              <w:t xml:space="preserve">0.13 min (8 s)</w:t>
             </w:r>
           </w:p>
         </w:tc>
@@ -7631,7 +7823,7 @@
                 <w:sz w:val="19"/>
                 <w:szCs w:val="19"/>
               </w:rPr>
-              <w:t xml:space="preserve">3.5</w:t>
+              <w:t xml:space="preserve">1.9</w:t>
             </w:r>
           </w:p>
         </w:tc>
@@ -7659,7 +7851,7 @@
                 <w:sz w:val="19"/>
                 <w:szCs w:val="19"/>
               </w:rPr>
-              <w:t xml:space="preserve">11/min</w:t>
+              <w:t xml:space="preserve">17/min</w:t>
             </w:r>
           </w:p>
         </w:tc>
@@ -7685,7 +7877,7 @@
                 <w:sz w:val="19"/>
                 <w:szCs w:val="19"/>
               </w:rPr>
-              <w:t xml:space="preserve">92%</w:t>
+              <w:t xml:space="preserve">85%</w:t>
             </w:r>
           </w:p>
         </w:tc>
@@ -7711,7 +7903,7 @@
                 <w:sz w:val="19"/>
                 <w:szCs w:val="19"/>
               </w:rPr>
-              <w:t xml:space="preserve">0.85</w:t>
+              <w:t xml:space="preserve">0.78</w:t>
             </w:r>
           </w:p>
         </w:tc>
@@ -7737,7 +7929,7 @@
                 <w:sz w:val="19"/>
                 <w:szCs w:val="19"/>
               </w:rPr>
-              <w:t xml:space="preserve">0.85 min (51 s)</w:t>
+              <w:t xml:space="preserve">0.26 min (16 s)</w:t>
             </w:r>
           </w:p>
         </w:tc>
@@ -7763,7 +7955,7 @@
                 <w:sz w:val="19"/>
                 <w:szCs w:val="19"/>
               </w:rPr>
-              <w:t xml:space="preserve">9.3</w:t>
+              <w:t xml:space="preserve">4.4</w:t>
             </w:r>
           </w:p>
         </w:tc>
@@ -7791,7 +7983,7 @@
                 <w:sz w:val="19"/>
                 <w:szCs w:val="19"/>
               </w:rPr>
-              <w:t xml:space="preserve">11.5/min</w:t>
+              <w:t xml:space="preserve">19/min</w:t>
             </w:r>
           </w:p>
         </w:tc>
@@ -7817,7 +8009,7 @@
                 <w:sz w:val="19"/>
                 <w:szCs w:val="19"/>
               </w:rPr>
-              <w:t xml:space="preserve">96%</w:t>
+              <w:t xml:space="preserve">95%</w:t>
             </w:r>
           </w:p>
         </w:tc>
@@ -7843,7 +8035,7 @@
                 <w:sz w:val="19"/>
                 <w:szCs w:val="19"/>
               </w:rPr>
-              <w:t xml:space="preserve">0.92</w:t>
+              <w:t xml:space="preserve">0.93</w:t>
             </w:r>
           </w:p>
         </w:tc>
@@ -7869,7 +8061,7 @@
                 <w:sz w:val="19"/>
                 <w:szCs w:val="19"/>
               </w:rPr>
-              <w:t xml:space="preserve">1.84 min (111 s)</w:t>
+              <w:t xml:space="preserve">0.93 min (56 s)</w:t>
             </w:r>
           </w:p>
         </w:tc>
@@ -7895,7 +8087,7 @@
                 <w:sz w:val="19"/>
                 <w:szCs w:val="19"/>
               </w:rPr>
-              <w:t xml:space="preserve">21.2</w:t>
+              <w:t xml:space="preserve">17.6</w:t>
             </w:r>
           </w:p>
         </w:tc>
@@ -7923,7 +8115,7 @@
                 <w:sz w:val="19"/>
                 <w:szCs w:val="19"/>
               </w:rPr>
-              <w:t xml:space="preserve">13/min</w:t>
+              <w:t xml:space="preserve">24/min</w:t>
             </w:r>
           </w:p>
         </w:tc>
@@ -7949,7 +8141,7 @@
                 <w:sz w:val="19"/>
                 <w:szCs w:val="19"/>
               </w:rPr>
-              <w:t xml:space="preserve">108%</w:t>
+              <w:t xml:space="preserve">120%</w:t>
             </w:r>
           </w:p>
         </w:tc>
@@ -8001,7 +8193,7 @@
                 <w:sz w:val="19"/>
                 <w:szCs w:val="19"/>
               </w:rPr>
-              <w:t xml:space="preserve">unstable: queue grows by 1 student/min</w:t>
+              <w:t xml:space="preserve">unstable: queue grows by 4 students/min</w:t>
             </w:r>
           </w:p>
         </w:tc>
@@ -8038,7 +8230,7 @@
         <w:spacing w:after="120"/>
       </w:pPr>
       <w:r>
-        <w:t xml:space="preserve">Three lines pooled into one queue wait much less than three separate M/M/1 lines at the same utilisation. That is the case for one shared queue feeding several serving points.</w:t>
+        <w:t xml:space="preserve">Two stations pooled into one queue wait much less than two separate M/M/1 lines at the same utilisation. That is the case for one shared queue feeding both serving stations. Why μ = 10/min: with only 2 stations, Central must serve about 2,500 students (85% of 2,960) in three hours, which is impossible at slower speeds; it must be about this fast. A stopwatch check is the most valuable next measurement.</w:t>
       </w:r>
     </w:p>
     <w:p>
@@ -8608,7 +8800,7 @@
                 <w:sz w:val="19"/>
                 <w:szCs w:val="19"/>
               </w:rPr>
-              <w:t xml:space="preserve"> sets μ to 0 until the refill arrives (25–30 min prep + 7–8 min delivery)</w:t>
+              <w:t xml:space="preserve"> sets μ to 0 until the refill arrives (25–30 min prep + 7–8 min delivery, about 35 min)</w:t>
             </w:r>
           </w:p>
         </w:tc>
@@ -8688,7 +8880,7 @@
                 <w:sz w:val="19"/>
                 <w:szCs w:val="19"/>
               </w:rPr>
-              <w:t xml:space="preserve">Tray counter → food line → seat</w:t>
+              <w:t xml:space="preserve">Face scanner → serving stations → seat</w:t>
             </w:r>
           </w:p>
         </w:tc>
@@ -8714,7 +8906,7 @@
                 <w:sz w:val="19"/>
                 <w:szCs w:val="19"/>
               </w:rPr>
-              <w:t xml:space="preserve">Model the bottleneck phase (food line) as the server; add a seat wait</w:t>
+              <w:t xml:space="preserve">Model the scanner and the serving stations as two phases; add a seat wait</w:t>
             </w:r>
           </w:p>
         </w:tc>
@@ -8767,7 +8959,7 @@
         <w:spacing w:after="120"/>
       </w:pPr>
       <w:r>
-        <w:t xml:space="preserve">Each step, the queue grows by the scans that arrived and shrinks by what the counters can serve. If 15 students/min arrive at a hall that serves 12/min, the queue grows by 3/min: after 20 minutes, 60 students are waiting, a 5-minute wait at 12/min.</w:t>
+        <w:t xml:space="preserve">Each step, the queue grows by the scans that arrived and shrinks by what the counters can serve. If 24 students/min arrive at a hall that serves 20/min, the queue grows by 4/min: after 20 minutes, 80 students are waiting, a 4-minute wait at 20/min.</w:t>
       </w:r>
     </w:p>
     <w:p>
@@ -8855,7 +9047,7 @@
         <w:t xml:space="preserve">Service rate μ:</w:t>
       </w:r>
       <w:r>
-        <w:t xml:space="preserve"> time 20–30 students at one serving line with a stopwatch, or count trays issued per minute at the tray counter.</w:t>
+        <w:t xml:space="preserve"> time 20–30 students at one serving station with a stopwatch, or count trays issued per minute at the tray counter.</w:t>
       </w:r>
     </w:p>
     <w:p>
@@ -9143,7 +9335,7 @@
                 <w:sz w:val="19"/>
                 <w:szCs w:val="19"/>
               </w:rPr>
-              <w:t xml:space="preserve">Serving</w:t>
+              <w:t xml:space="preserve">Scanning</w:t>
             </w:r>
           </w:p>
         </w:tc>
@@ -9169,7 +9361,7 @@
                 <w:sz w:val="19"/>
                 <w:szCs w:val="19"/>
               </w:rPr>
-              <w:t xml:space="preserve">c = 3 lines per mess; each student's service time is random with mean 15 s and cv 0.6</w:t>
+              <w:t xml:space="preserve">1 face scanner per mess, 2 s per student (assumed). Students who cannot scan yet wait OUTSIDE, unseen by the system</w:t>
             </w:r>
           </w:p>
         </w:tc>
@@ -9195,7 +9387,7 @@
                 <w:sz w:val="19"/>
                 <w:szCs w:val="19"/>
               </w:rPr>
-              <w:t xml:space="preserve">Multiple-channel service, general service times (M/G/c)</w:t>
+              <w:t xml:space="preserve">Single-channel first phase</w:t>
             </w:r>
           </w:p>
         </w:tc>
@@ -9223,7 +9415,7 @@
                 <w:sz w:val="19"/>
                 <w:szCs w:val="19"/>
               </w:rPr>
-              <w:t xml:space="preserve">Queue discipline</w:t>
+              <w:t xml:space="preserve">Serving</w:t>
             </w:r>
           </w:p>
         </w:tc>
@@ -9249,7 +9441,7 @@
                 <w:sz w:val="19"/>
                 <w:szCs w:val="19"/>
               </w:rPr>
-              <w:t xml:space="preserve">First come, first served</w:t>
+              <w:t xml:space="preserve">c = 2 stations per mess (measured); each student's service time is random with mean 6 s (assumed) and cv 0.6</w:t>
             </w:r>
           </w:p>
         </w:tc>
@@ -9275,7 +9467,7 @@
                 <w:sz w:val="19"/>
                 <w:szCs w:val="19"/>
               </w:rPr>
-              <w:t xml:space="preserve">FCFS</w:t>
+              <w:t xml:space="preserve">Multiple-channel service, general service times (M/G/c)</w:t>
             </w:r>
           </w:p>
         </w:tc>
@@ -9303,6 +9495,86 @@
                 <w:sz w:val="19"/>
                 <w:szCs w:val="19"/>
               </w:rPr>
+              <w:t xml:space="preserve">Queue discipline</w:t>
+            </w:r>
+          </w:p>
+        </w:tc>
+        <w:tc>
+          <w:tcPr>
+            <w:tcW w:type="dxa" w:w="4526"/>
+            <w:tcBorders>
+              <w:top w:val="single" w:color="D9D8D3" w:sz="4"/>
+              <w:left w:val="single" w:color="D9D8D3" w:sz="4"/>
+              <w:bottom w:val="single" w:color="D9D8D3" w:sz="4"/>
+              <w:right w:val="single" w:color="D9D8D3" w:sz="4"/>
+            </w:tcBorders>
+            <w:tcMar>
+              <w:top w:type="dxa" w:w="60"/>
+              <w:left w:type="dxa" w:w="100"/>
+              <w:bottom w:type="dxa" w:w="60"/>
+              <w:right w:type="dxa" w:w="100"/>
+            </w:tcMar>
+          </w:tcPr>
+          <w:p>
+            <w:r>
+              <w:rPr>
+                <w:sz w:val="19"/>
+                <w:szCs w:val="19"/>
+              </w:rPr>
+              <w:t xml:space="preserve">First come, first served</w:t>
+            </w:r>
+          </w:p>
+        </w:tc>
+        <w:tc>
+          <w:tcPr>
+            <w:tcW w:type="dxa" w:w="2900"/>
+            <w:tcBorders>
+              <w:top w:val="single" w:color="D9D8D3" w:sz="4"/>
+              <w:left w:val="single" w:color="D9D8D3" w:sz="4"/>
+              <w:bottom w:val="single" w:color="D9D8D3" w:sz="4"/>
+              <w:right w:val="single" w:color="D9D8D3" w:sz="4"/>
+            </w:tcBorders>
+            <w:tcMar>
+              <w:top w:type="dxa" w:w="60"/>
+              <w:left w:type="dxa" w:w="100"/>
+              <w:bottom w:type="dxa" w:w="60"/>
+              <w:right w:type="dxa" w:w="100"/>
+            </w:tcMar>
+          </w:tcPr>
+          <w:p>
+            <w:r>
+              <w:rPr>
+                <w:sz w:val="19"/>
+                <w:szCs w:val="19"/>
+              </w:rPr>
+              <w:t xml:space="preserve">FCFS</w:t>
+            </w:r>
+          </w:p>
+        </w:tc>
+      </w:tr>
+      <w:tr>
+        <w:tc>
+          <w:tcPr>
+            <w:tcW w:type="dxa" w:w="1600"/>
+            <w:tcBorders>
+              <w:top w:val="single" w:color="D9D8D3" w:sz="4"/>
+              <w:left w:val="single" w:color="D9D8D3" w:sz="4"/>
+              <w:bottom w:val="single" w:color="D9D8D3" w:sz="4"/>
+              <w:right w:val="single" w:color="D9D8D3" w:sz="4"/>
+            </w:tcBorders>
+            <w:tcMar>
+              <w:top w:type="dxa" w:w="60"/>
+              <w:left w:type="dxa" w:w="100"/>
+              <w:bottom w:type="dxa" w:w="60"/>
+              <w:right w:type="dxa" w:w="100"/>
+            </w:tcMar>
+          </w:tcPr>
+          <w:p>
+            <w:r>
+              <w:rPr>
+                <w:sz w:val="19"/>
+                <w:szCs w:val="19"/>
+              </w:rPr>
               <w:t xml:space="preserve">Food stock</w:t>
             </w:r>
           </w:p>
@@ -9329,7 +9601,7 @@
                 <w:sz w:val="19"/>
                 <w:szCs w:val="19"/>
               </w:rPr>
-              <w:t xml:space="preserve">Batches of the main dish; the kitchen starts the next batch at a reorder level and it arrives 10 min later; if stock hits 0, the counters stop</w:t>
+              <w:t xml:space="preserve">Batches of the main dish (900 at Central, 500 at Munch, assumed); the kitchen starts the next batch at a reorder level and it arrives 35 min later (measured); if stock hits 0, the stations stop</w:t>
             </w:r>
           </w:p>
         </w:tc>
@@ -9927,17 +10199,17 @@
         <w:t xml:space="preserve">Simulated, not measured.  </w:t>
       </w:r>
       <w:r>
-        <w:t xml:space="preserve">These results come from 30 simulated lunches per setting with 1,600 students, using measured seats and visit time but </w:t>
+        <w:t xml:space="preserve">These results come from 20 simulated lunches per setting with 2,960 students over 11:30–14:30. Measured: students, seats, 2 stations and 1 scanner per mess, the 18-min visit and the 35-min restock. </w:t>
       </w:r>
       <w:r>
         <w:rPr>
           <w:b/>
           <w:bCs/>
         </w:rPr>
-        <w:t xml:space="preserve">assumed</w:t>
-      </w:r>
-      <w:r>
-        <w:t xml:space="preserve"> serving speed, food batches and arrival pattern. They show what the method can do; the pilot will show what actually happens.</w:t>
+        <w:t xml:space="preserve">Assumed:</w:t>
+      </w:r>
+      <w:r>
+        <w:t xml:space="preserve"> the 85/15 habit split, 10 students/min per station, 2 s per scan, food batches and the arrival curve. They show what the method can do; the pilot will show what actually happens.</w:t>
       </w:r>
     </w:p>
     <w:tbl>
@@ -9953,12 +10225,13 @@
         </w:tblBorders>
       </w:tblPr>
       <w:tblGrid>
-        <w:gridCol w:w="2226"/>
-        <w:gridCol w:w="1400"/>
+        <w:gridCol w:w="1926"/>
+        <w:gridCol w:w="1200"/>
+        <w:gridCol w:w="1100"/>
         <w:gridCol w:w="1300"/>
-        <w:gridCol w:w="1500"/>
-        <w:gridCol w:w="1200"/>
-        <w:gridCol w:w="1400"/>
+        <w:gridCol w:w="1100"/>
+        <w:gridCol w:w="1100"/>
+        <w:gridCol w:w="1300"/>
       </w:tblGrid>
       <w:tr>
         <w:trPr>
@@ -9966,7 +10239,7 @@
         </w:trPr>
         <w:tc>
           <w:tcPr>
-            <w:tcW w:type="dxa" w:w="2226"/>
+            <w:tcW w:type="dxa" w:w="1926"/>
             <w:tcBorders>
               <w:top w:val="single" w:color="D9D8D3" w:sz="4"/>
               <w:left w:val="single" w:color="D9D8D3" w:sz="4"/>
@@ -9995,7 +10268,7 @@
         </w:tc>
         <w:tc>
           <w:tcPr>
-            <w:tcW w:type="dxa" w:w="1400"/>
+            <w:tcW w:type="dxa" w:w="1200"/>
             <w:tcBorders>
               <w:top w:val="single" w:color="D9D8D3" w:sz="4"/>
               <w:left w:val="single" w:color="D9D8D3" w:sz="4"/>
@@ -10024,7 +10297,7 @@
         </w:tc>
         <w:tc>
           <w:tcPr>
-            <w:tcW w:type="dxa" w:w="1300"/>
+            <w:tcW w:type="dxa" w:w="1100"/>
             <w:tcBorders>
               <w:top w:val="single" w:color="D9D8D3" w:sz="4"/>
               <w:left w:val="single" w:color="D9D8D3" w:sz="4"/>
@@ -10053,7 +10326,7 @@
         </w:tc>
         <w:tc>
           <w:tcPr>
-            <w:tcW w:type="dxa" w:w="1500"/>
+            <w:tcW w:type="dxa" w:w="1300"/>
             <w:tcBorders>
               <w:top w:val="single" w:color="D9D8D3" w:sz="4"/>
               <w:left w:val="single" w:color="D9D8D3" w:sz="4"/>
@@ -10082,7 +10355,7 @@
         </w:tc>
         <w:tc>
           <w:tcPr>
-            <w:tcW w:type="dxa" w:w="1200"/>
+            <w:tcW w:type="dxa" w:w="1100"/>
             <w:tcBorders>
               <w:top w:val="single" w:color="D9D8D3" w:sz="4"/>
               <w:left w:val="single" w:color="D9D8D3" w:sz="4"/>
@@ -10111,7 +10384,7 @@
         </w:tc>
         <w:tc>
           <w:tcPr>
-            <w:tcW w:type="dxa" w:w="1400"/>
+            <w:tcW w:type="dxa" w:w="1100"/>
             <w:tcBorders>
               <w:top w:val="single" w:color="D9D8D3" w:sz="4"/>
               <w:left w:val="single" w:color="D9D8D3" w:sz="4"/>
@@ -10134,6 +10407,35 @@
                 <w:sz w:val="19"/>
                 <w:szCs w:val="19"/>
               </w:rPr>
+              <w:t xml:space="preserve">Food run-outs</w:t>
+            </w:r>
+          </w:p>
+        </w:tc>
+        <w:tc>
+          <w:tcPr>
+            <w:tcW w:type="dxa" w:w="1300"/>
+            <w:tcBorders>
+              <w:top w:val="single" w:color="D9D8D3" w:sz="4"/>
+              <w:left w:val="single" w:color="D9D8D3" w:sz="4"/>
+              <w:bottom w:val="single" w:color="D9D8D3" w:sz="4"/>
+              <w:right w:val="single" w:color="D9D8D3" w:sz="4"/>
+            </w:tcBorders>
+            <w:shd w:fill="ECEBE7" w:color="auto" w:val="clear"/>
+            <w:tcMar>
+              <w:top w:type="dxa" w:w="60"/>
+              <w:left w:type="dxa" w:w="100"/>
+              <w:bottom w:type="dxa" w:w="60"/>
+              <w:right w:type="dxa" w:w="100"/>
+            </w:tcMar>
+          </w:tcPr>
+          <w:p>
+            <w:r>
+              <w:rPr>
+                <w:b/>
+                <w:bCs/>
+                <w:sz w:val="19"/>
+                <w:szCs w:val="19"/>
+              </w:rPr>
               <w:t xml:space="preserve">Walked to the other mess</w:t>
             </w:r>
           </w:p>
@@ -10142,7 +10444,7 @@
       <w:tr>
         <w:tc>
           <w:tcPr>
-            <w:tcW w:type="dxa" w:w="2226"/>
+            <w:tcW w:type="dxa" w:w="1926"/>
             <w:tcBorders>
               <w:top w:val="single" w:color="D9D8D3" w:sz="4"/>
               <w:left w:val="single" w:color="D9D8D3" w:sz="4"/>
@@ -10168,7 +10470,7 @@
         </w:tc>
         <w:tc>
           <w:tcPr>
-            <w:tcW w:type="dxa" w:w="1400"/>
+            <w:tcW w:type="dxa" w:w="1200"/>
             <w:tcBorders>
               <w:top w:val="single" w:color="D9D8D3" w:sz="4"/>
               <w:left w:val="single" w:color="D9D8D3" w:sz="4"/>
@@ -10194,6 +10496,32 @@
         </w:tc>
         <w:tc>
           <w:tcPr>
+            <w:tcW w:type="dxa" w:w="1100"/>
+            <w:tcBorders>
+              <w:top w:val="single" w:color="D9D8D3" w:sz="4"/>
+              <w:left w:val="single" w:color="D9D8D3" w:sz="4"/>
+              <w:bottom w:val="single" w:color="D9D8D3" w:sz="4"/>
+              <w:right w:val="single" w:color="D9D8D3" w:sz="4"/>
+            </w:tcBorders>
+            <w:tcMar>
+              <w:top w:type="dxa" w:w="60"/>
+              <w:left w:type="dxa" w:w="100"/>
+              <w:bottom w:type="dxa" w:w="60"/>
+              <w:right w:type="dxa" w:w="100"/>
+            </w:tcMar>
+          </w:tcPr>
+          <w:p>
+            <w:r>
+              <w:rPr>
+                <w:sz w:val="19"/>
+                <w:szCs w:val="19"/>
+              </w:rPr>
+              <w:t xml:space="preserve">7.0 min</w:t>
+            </w:r>
+          </w:p>
+        </w:tc>
+        <w:tc>
+          <w:tcPr>
             <w:tcW w:type="dxa" w:w="1300"/>
             <w:tcBorders>
               <w:top w:val="single" w:color="D9D8D3" w:sz="4"/>
@@ -10214,65 +10542,65 @@
                 <w:sz w:val="19"/>
                 <w:szCs w:val="19"/>
               </w:rPr>
-              <w:t xml:space="preserve">5.4 min</w:t>
-            </w:r>
-          </w:p>
-        </w:tc>
-        <w:tc>
-          <w:tcPr>
-            <w:tcW w:type="dxa" w:w="1500"/>
-            <w:tcBorders>
-              <w:top w:val="single" w:color="D9D8D3" w:sz="4"/>
-              <w:left w:val="single" w:color="D9D8D3" w:sz="4"/>
-              <w:bottom w:val="single" w:color="D9D8D3" w:sz="4"/>
-              <w:right w:val="single" w:color="D9D8D3" w:sz="4"/>
-            </w:tcBorders>
-            <w:tcMar>
-              <w:top w:type="dxa" w:w="60"/>
-              <w:left w:type="dxa" w:w="100"/>
-              <w:bottom w:type="dxa" w:w="60"/>
-              <w:right w:type="dxa" w:w="100"/>
-            </w:tcMar>
-          </w:tcPr>
-          <w:p>
-            <w:r>
-              <w:rPr>
-                <w:sz w:val="19"/>
-                <w:szCs w:val="19"/>
-              </w:rPr>
-              <w:t xml:space="preserve">14.8 min</w:t>
-            </w:r>
-          </w:p>
-        </w:tc>
-        <w:tc>
-          <w:tcPr>
-            <w:tcW w:type="dxa" w:w="1200"/>
-            <w:tcBorders>
-              <w:top w:val="single" w:color="D9D8D3" w:sz="4"/>
-              <w:left w:val="single" w:color="D9D8D3" w:sz="4"/>
-              <w:bottom w:val="single" w:color="D9D8D3" w:sz="4"/>
-              <w:right w:val="single" w:color="D9D8D3" w:sz="4"/>
-            </w:tcBorders>
-            <w:tcMar>
-              <w:top w:type="dxa" w:w="60"/>
-              <w:left w:type="dxa" w:w="100"/>
-              <w:bottom w:type="dxa" w:w="60"/>
-              <w:right w:type="dxa" w:w="100"/>
-            </w:tcMar>
-          </w:tcPr>
-          <w:p>
-            <w:r>
-              <w:rPr>
-                <w:sz w:val="19"/>
-                <w:szCs w:val="19"/>
-              </w:rPr>
-              <w:t xml:space="preserve">192</w:t>
-            </w:r>
-          </w:p>
-        </w:tc>
-        <w:tc>
-          <w:tcPr>
-            <w:tcW w:type="dxa" w:w="1400"/>
+              <w:t xml:space="preserve">17.2 min</w:t>
+            </w:r>
+          </w:p>
+        </w:tc>
+        <w:tc>
+          <w:tcPr>
+            <w:tcW w:type="dxa" w:w="1100"/>
+            <w:tcBorders>
+              <w:top w:val="single" w:color="D9D8D3" w:sz="4"/>
+              <w:left w:val="single" w:color="D9D8D3" w:sz="4"/>
+              <w:bottom w:val="single" w:color="D9D8D3" w:sz="4"/>
+              <w:right w:val="single" w:color="D9D8D3" w:sz="4"/>
+            </w:tcBorders>
+            <w:tcMar>
+              <w:top w:type="dxa" w:w="60"/>
+              <w:left w:type="dxa" w:w="100"/>
+              <w:bottom w:type="dxa" w:w="60"/>
+              <w:right w:type="dxa" w:w="100"/>
+            </w:tcMar>
+          </w:tcPr>
+          <w:p>
+            <w:r>
+              <w:rPr>
+                <w:sz w:val="19"/>
+                <w:szCs w:val="19"/>
+              </w:rPr>
+              <w:t xml:space="preserve">495</w:t>
+            </w:r>
+          </w:p>
+        </w:tc>
+        <w:tc>
+          <w:tcPr>
+            <w:tcW w:type="dxa" w:w="1100"/>
+            <w:tcBorders>
+              <w:top w:val="single" w:color="D9D8D3" w:sz="4"/>
+              <w:left w:val="single" w:color="D9D8D3" w:sz="4"/>
+              <w:bottom w:val="single" w:color="D9D8D3" w:sz="4"/>
+              <w:right w:val="single" w:color="D9D8D3" w:sz="4"/>
+            </w:tcBorders>
+            <w:tcMar>
+              <w:top w:type="dxa" w:w="60"/>
+              <w:left w:type="dxa" w:w="100"/>
+              <w:bottom w:type="dxa" w:w="60"/>
+              <w:right w:type="dxa" w:w="100"/>
+            </w:tcMar>
+          </w:tcPr>
+          <w:p>
+            <w:r>
+              <w:rPr>
+                <w:sz w:val="19"/>
+                <w:szCs w:val="19"/>
+              </w:rPr>
+              <w:t xml:space="preserve">2.0</w:t>
+            </w:r>
+          </w:p>
+        </w:tc>
+        <w:tc>
+          <w:tcPr>
+            <w:tcW w:type="dxa" w:w="1300"/>
             <w:tcBorders>
               <w:top w:val="single" w:color="D9D8D3" w:sz="4"/>
               <w:left w:val="single" w:color="D9D8D3" w:sz="4"/>
@@ -10300,7 +10628,7 @@
       <w:tr>
         <w:tc>
           <w:tcPr>
-            <w:tcW w:type="dxa" w:w="2226"/>
+            <w:tcW w:type="dxa" w:w="1926"/>
             <w:tcBorders>
               <w:top w:val="single" w:color="D9D8D3" w:sz="4"/>
               <w:left w:val="single" w:color="D9D8D3" w:sz="4"/>
@@ -10326,7 +10654,7 @@
         </w:tc>
         <w:tc>
           <w:tcPr>
-            <w:tcW w:type="dxa" w:w="1400"/>
+            <w:tcW w:type="dxa" w:w="1200"/>
             <w:tcBorders>
               <w:top w:val="single" w:color="D9D8D3" w:sz="4"/>
               <w:left w:val="single" w:color="D9D8D3" w:sz="4"/>
@@ -10352,6 +10680,32 @@
         </w:tc>
         <w:tc>
           <w:tcPr>
+            <w:tcW w:type="dxa" w:w="1100"/>
+            <w:tcBorders>
+              <w:top w:val="single" w:color="D9D8D3" w:sz="4"/>
+              <w:left w:val="single" w:color="D9D8D3" w:sz="4"/>
+              <w:bottom w:val="single" w:color="D9D8D3" w:sz="4"/>
+              <w:right w:val="single" w:color="D9D8D3" w:sz="4"/>
+            </w:tcBorders>
+            <w:tcMar>
+              <w:top w:type="dxa" w:w="60"/>
+              <w:left w:type="dxa" w:w="100"/>
+              <w:bottom w:type="dxa" w:w="60"/>
+              <w:right w:type="dxa" w:w="100"/>
+            </w:tcMar>
+          </w:tcPr>
+          <w:p>
+            <w:r>
+              <w:rPr>
+                <w:sz w:val="19"/>
+                <w:szCs w:val="19"/>
+              </w:rPr>
+              <w:t xml:space="preserve">1.5 min</w:t>
+            </w:r>
+          </w:p>
+        </w:tc>
+        <w:tc>
+          <w:tcPr>
             <w:tcW w:type="dxa" w:w="1300"/>
             <w:tcBorders>
               <w:top w:val="single" w:color="D9D8D3" w:sz="4"/>
@@ -10372,85 +10726,85 @@
                 <w:sz w:val="19"/>
                 <w:szCs w:val="19"/>
               </w:rPr>
-              <w:t xml:space="preserve">2.4 min</w:t>
-            </w:r>
-          </w:p>
-        </w:tc>
-        <w:tc>
-          <w:tcPr>
-            <w:tcW w:type="dxa" w:w="1500"/>
-            <w:tcBorders>
-              <w:top w:val="single" w:color="D9D8D3" w:sz="4"/>
-              <w:left w:val="single" w:color="D9D8D3" w:sz="4"/>
-              <w:bottom w:val="single" w:color="D9D8D3" w:sz="4"/>
-              <w:right w:val="single" w:color="D9D8D3" w:sz="4"/>
-            </w:tcBorders>
-            <w:tcMar>
-              <w:top w:type="dxa" w:w="60"/>
-              <w:left w:type="dxa" w:w="100"/>
-              <w:bottom w:type="dxa" w:w="60"/>
-              <w:right w:type="dxa" w:w="100"/>
-            </w:tcMar>
-          </w:tcPr>
-          <w:p>
-            <w:r>
-              <w:rPr>
-                <w:sz w:val="19"/>
-                <w:szCs w:val="19"/>
-              </w:rPr>
-              <w:t xml:space="preserve">6.3 min</w:t>
-            </w:r>
-          </w:p>
-        </w:tc>
-        <w:tc>
-          <w:tcPr>
-            <w:tcW w:type="dxa" w:w="1200"/>
-            <w:tcBorders>
-              <w:top w:val="single" w:color="D9D8D3" w:sz="4"/>
-              <w:left w:val="single" w:color="D9D8D3" w:sz="4"/>
-              <w:bottom w:val="single" w:color="D9D8D3" w:sz="4"/>
-              <w:right w:val="single" w:color="D9D8D3" w:sz="4"/>
-            </w:tcBorders>
-            <w:tcMar>
-              <w:top w:type="dxa" w:w="60"/>
-              <w:left w:type="dxa" w:w="100"/>
-              <w:bottom w:type="dxa" w:w="60"/>
-              <w:right w:type="dxa" w:w="100"/>
-            </w:tcMar>
-          </w:tcPr>
-          <w:p>
-            <w:r>
-              <w:rPr>
-                <w:sz w:val="19"/>
-                <w:szCs w:val="19"/>
-              </w:rPr>
-              <w:t xml:space="preserve">88</w:t>
-            </w:r>
-          </w:p>
-        </w:tc>
-        <w:tc>
-          <w:tcPr>
-            <w:tcW w:type="dxa" w:w="1400"/>
-            <w:tcBorders>
-              <w:top w:val="single" w:color="D9D8D3" w:sz="4"/>
-              <w:left w:val="single" w:color="D9D8D3" w:sz="4"/>
-              <w:bottom w:val="single" w:color="D9D8D3" w:sz="4"/>
-              <w:right w:val="single" w:color="D9D8D3" w:sz="4"/>
-            </w:tcBorders>
-            <w:tcMar>
-              <w:top w:type="dxa" w:w="60"/>
-              <w:left w:type="dxa" w:w="100"/>
-              <w:bottom w:type="dxa" w:w="60"/>
-              <w:right w:type="dxa" w:w="100"/>
-            </w:tcMar>
-          </w:tcPr>
-          <w:p>
-            <w:r>
-              <w:rPr>
-                <w:sz w:val="19"/>
-                <w:szCs w:val="19"/>
-              </w:rPr>
-              <w:t xml:space="preserve">9%</w:t>
+              <w:t xml:space="preserve">4.5 min</w:t>
+            </w:r>
+          </w:p>
+        </w:tc>
+        <w:tc>
+          <w:tcPr>
+            <w:tcW w:type="dxa" w:w="1100"/>
+            <w:tcBorders>
+              <w:top w:val="single" w:color="D9D8D3" w:sz="4"/>
+              <w:left w:val="single" w:color="D9D8D3" w:sz="4"/>
+              <w:bottom w:val="single" w:color="D9D8D3" w:sz="4"/>
+              <w:right w:val="single" w:color="D9D8D3" w:sz="4"/>
+            </w:tcBorders>
+            <w:tcMar>
+              <w:top w:type="dxa" w:w="60"/>
+              <w:left w:type="dxa" w:w="100"/>
+              <w:bottom w:type="dxa" w:w="60"/>
+              <w:right w:type="dxa" w:w="100"/>
+            </w:tcMar>
+          </w:tcPr>
+          <w:p>
+            <w:r>
+              <w:rPr>
+                <w:sz w:val="19"/>
+                <w:szCs w:val="19"/>
+              </w:rPr>
+              <w:t xml:space="preserve">235</w:t>
+            </w:r>
+          </w:p>
+        </w:tc>
+        <w:tc>
+          <w:tcPr>
+            <w:tcW w:type="dxa" w:w="1100"/>
+            <w:tcBorders>
+              <w:top w:val="single" w:color="D9D8D3" w:sz="4"/>
+              <w:left w:val="single" w:color="D9D8D3" w:sz="4"/>
+              <w:bottom w:val="single" w:color="D9D8D3" w:sz="4"/>
+              <w:right w:val="single" w:color="D9D8D3" w:sz="4"/>
+            </w:tcBorders>
+            <w:tcMar>
+              <w:top w:type="dxa" w:w="60"/>
+              <w:left w:type="dxa" w:w="100"/>
+              <w:bottom w:type="dxa" w:w="60"/>
+              <w:right w:type="dxa" w:w="100"/>
+            </w:tcMar>
+          </w:tcPr>
+          <w:p>
+            <w:r>
+              <w:rPr>
+                <w:sz w:val="19"/>
+                <w:szCs w:val="19"/>
+              </w:rPr>
+              <w:t xml:space="preserve">3.0</w:t>
+            </w:r>
+          </w:p>
+        </w:tc>
+        <w:tc>
+          <w:tcPr>
+            <w:tcW w:type="dxa" w:w="1300"/>
+            <w:tcBorders>
+              <w:top w:val="single" w:color="D9D8D3" w:sz="4"/>
+              <w:left w:val="single" w:color="D9D8D3" w:sz="4"/>
+              <w:bottom w:val="single" w:color="D9D8D3" w:sz="4"/>
+              <w:right w:val="single" w:color="D9D8D3" w:sz="4"/>
+            </w:tcBorders>
+            <w:tcMar>
+              <w:top w:type="dxa" w:w="60"/>
+              <w:left w:type="dxa" w:w="100"/>
+              <w:bottom w:type="dxa" w:w="60"/>
+              <w:right w:type="dxa" w:w="100"/>
+            </w:tcMar>
+          </w:tcPr>
+          <w:p>
+            <w:r>
+              <w:rPr>
+                <w:sz w:val="19"/>
+                <w:szCs w:val="19"/>
+              </w:rPr>
+              <w:t xml:space="preserve">15%</w:t>
             </w:r>
           </w:p>
         </w:tc>
@@ -10458,7 +10812,7 @@
       <w:tr>
         <w:tc>
           <w:tcPr>
-            <w:tcW w:type="dxa" w:w="2226"/>
+            <w:tcW w:type="dxa" w:w="1926"/>
             <w:tcBorders>
               <w:top w:val="single" w:color="D9D8D3" w:sz="4"/>
               <w:left w:val="single" w:color="D9D8D3" w:sz="4"/>
@@ -10484,7 +10838,7 @@
         </w:tc>
         <w:tc>
           <w:tcPr>
-            <w:tcW w:type="dxa" w:w="1400"/>
+            <w:tcW w:type="dxa" w:w="1200"/>
             <w:tcBorders>
               <w:top w:val="single" w:color="D9D8D3" w:sz="4"/>
               <w:left w:val="single" w:color="D9D8D3" w:sz="4"/>
@@ -10510,6 +10864,32 @@
         </w:tc>
         <w:tc>
           <w:tcPr>
+            <w:tcW w:type="dxa" w:w="1100"/>
+            <w:tcBorders>
+              <w:top w:val="single" w:color="D9D8D3" w:sz="4"/>
+              <w:left w:val="single" w:color="D9D8D3" w:sz="4"/>
+              <w:bottom w:val="single" w:color="D9D8D3" w:sz="4"/>
+              <w:right w:val="single" w:color="D9D8D3" w:sz="4"/>
+            </w:tcBorders>
+            <w:tcMar>
+              <w:top w:type="dxa" w:w="60"/>
+              <w:left w:type="dxa" w:w="100"/>
+              <w:bottom w:type="dxa" w:w="60"/>
+              <w:right w:type="dxa" w:w="100"/>
+            </w:tcMar>
+          </w:tcPr>
+          <w:p>
+            <w:r>
+              <w:rPr>
+                <w:sz w:val="19"/>
+                <w:szCs w:val="19"/>
+              </w:rPr>
+              <w:t xml:space="preserve">1.1 min</w:t>
+            </w:r>
+          </w:p>
+        </w:tc>
+        <w:tc>
+          <w:tcPr>
             <w:tcW w:type="dxa" w:w="1300"/>
             <w:tcBorders>
               <w:top w:val="single" w:color="D9D8D3" w:sz="4"/>
@@ -10530,85 +10910,85 @@
                 <w:sz w:val="19"/>
                 <w:szCs w:val="19"/>
               </w:rPr>
-              <w:t xml:space="preserve">2.2 min</w:t>
-            </w:r>
-          </w:p>
-        </w:tc>
-        <w:tc>
-          <w:tcPr>
-            <w:tcW w:type="dxa" w:w="1500"/>
-            <w:tcBorders>
-              <w:top w:val="single" w:color="D9D8D3" w:sz="4"/>
-              <w:left w:val="single" w:color="D9D8D3" w:sz="4"/>
-              <w:bottom w:val="single" w:color="D9D8D3" w:sz="4"/>
-              <w:right w:val="single" w:color="D9D8D3" w:sz="4"/>
-            </w:tcBorders>
-            <w:tcMar>
-              <w:top w:type="dxa" w:w="60"/>
-              <w:left w:type="dxa" w:w="100"/>
-              <w:bottom w:type="dxa" w:w="60"/>
-              <w:right w:type="dxa" w:w="100"/>
-            </w:tcMar>
-          </w:tcPr>
-          <w:p>
-            <w:r>
-              <w:rPr>
-                <w:sz w:val="19"/>
-                <w:szCs w:val="19"/>
-              </w:rPr>
-              <w:t xml:space="preserve">5.5 min</w:t>
-            </w:r>
-          </w:p>
-        </w:tc>
-        <w:tc>
-          <w:tcPr>
-            <w:tcW w:type="dxa" w:w="1200"/>
-            <w:tcBorders>
-              <w:top w:val="single" w:color="D9D8D3" w:sz="4"/>
-              <w:left w:val="single" w:color="D9D8D3" w:sz="4"/>
-              <w:bottom w:val="single" w:color="D9D8D3" w:sz="4"/>
-              <w:right w:val="single" w:color="D9D8D3" w:sz="4"/>
-            </w:tcBorders>
-            <w:tcMar>
-              <w:top w:type="dxa" w:w="60"/>
-              <w:left w:type="dxa" w:w="100"/>
-              <w:bottom w:type="dxa" w:w="60"/>
-              <w:right w:type="dxa" w:w="100"/>
-            </w:tcMar>
-          </w:tcPr>
-          <w:p>
-            <w:r>
-              <w:rPr>
-                <w:sz w:val="19"/>
-                <w:szCs w:val="19"/>
-              </w:rPr>
-              <w:t xml:space="preserve">79</w:t>
-            </w:r>
-          </w:p>
-        </w:tc>
-        <w:tc>
-          <w:tcPr>
-            <w:tcW w:type="dxa" w:w="1400"/>
-            <w:tcBorders>
-              <w:top w:val="single" w:color="D9D8D3" w:sz="4"/>
-              <w:left w:val="single" w:color="D9D8D3" w:sz="4"/>
-              <w:bottom w:val="single" w:color="D9D8D3" w:sz="4"/>
-              <w:right w:val="single" w:color="D9D8D3" w:sz="4"/>
-            </w:tcBorders>
-            <w:tcMar>
-              <w:top w:type="dxa" w:w="60"/>
-              <w:left w:type="dxa" w:w="100"/>
-              <w:bottom w:type="dxa" w:w="60"/>
-              <w:right w:type="dxa" w:w="100"/>
-            </w:tcMar>
-          </w:tcPr>
-          <w:p>
-            <w:r>
-              <w:rPr>
-                <w:sz w:val="19"/>
-                <w:szCs w:val="19"/>
-              </w:rPr>
-              <w:t xml:space="preserve">10%</w:t>
+              <w:t xml:space="preserve">3.7 min</w:t>
+            </w:r>
+          </w:p>
+        </w:tc>
+        <w:tc>
+          <w:tcPr>
+            <w:tcW w:type="dxa" w:w="1100"/>
+            <w:tcBorders>
+              <w:top w:val="single" w:color="D9D8D3" w:sz="4"/>
+              <w:left w:val="single" w:color="D9D8D3" w:sz="4"/>
+              <w:bottom w:val="single" w:color="D9D8D3" w:sz="4"/>
+              <w:right w:val="single" w:color="D9D8D3" w:sz="4"/>
+            </w:tcBorders>
+            <w:tcMar>
+              <w:top w:type="dxa" w:w="60"/>
+              <w:left w:type="dxa" w:w="100"/>
+              <w:bottom w:type="dxa" w:w="60"/>
+              <w:right w:type="dxa" w:w="100"/>
+            </w:tcMar>
+          </w:tcPr>
+          <w:p>
+            <w:r>
+              <w:rPr>
+                <w:sz w:val="19"/>
+                <w:szCs w:val="19"/>
+              </w:rPr>
+              <w:t xml:space="preserve">190</w:t>
+            </w:r>
+          </w:p>
+        </w:tc>
+        <w:tc>
+          <w:tcPr>
+            <w:tcW w:type="dxa" w:w="1100"/>
+            <w:tcBorders>
+              <w:top w:val="single" w:color="D9D8D3" w:sz="4"/>
+              <w:left w:val="single" w:color="D9D8D3" w:sz="4"/>
+              <w:bottom w:val="single" w:color="D9D8D3" w:sz="4"/>
+              <w:right w:val="single" w:color="D9D8D3" w:sz="4"/>
+            </w:tcBorders>
+            <w:tcMar>
+              <w:top w:type="dxa" w:w="60"/>
+              <w:left w:type="dxa" w:w="100"/>
+              <w:bottom w:type="dxa" w:w="60"/>
+              <w:right w:type="dxa" w:w="100"/>
+            </w:tcMar>
+          </w:tcPr>
+          <w:p>
+            <w:r>
+              <w:rPr>
+                <w:sz w:val="19"/>
+                <w:szCs w:val="19"/>
+              </w:rPr>
+              <w:t xml:space="preserve">3.0</w:t>
+            </w:r>
+          </w:p>
+        </w:tc>
+        <w:tc>
+          <w:tcPr>
+            <w:tcW w:type="dxa" w:w="1300"/>
+            <w:tcBorders>
+              <w:top w:val="single" w:color="D9D8D3" w:sz="4"/>
+              <w:left w:val="single" w:color="D9D8D3" w:sz="4"/>
+              <w:bottom w:val="single" w:color="D9D8D3" w:sz="4"/>
+              <w:right w:val="single" w:color="D9D8D3" w:sz="4"/>
+            </w:tcBorders>
+            <w:tcMar>
+              <w:top w:type="dxa" w:w="60"/>
+              <w:left w:type="dxa" w:w="100"/>
+              <w:bottom w:type="dxa" w:w="60"/>
+              <w:right w:type="dxa" w:w="100"/>
+            </w:tcMar>
+          </w:tcPr>
+          <w:p>
+            <w:r>
+              <w:rPr>
+                <w:sz w:val="19"/>
+                <w:szCs w:val="19"/>
+              </w:rPr>
+              <w:t xml:space="preserve">20%</w:t>
             </w:r>
           </w:p>
         </w:tc>
@@ -10616,7 +10996,7 @@
       <w:tr>
         <w:tc>
           <w:tcPr>
-            <w:tcW w:type="dxa" w:w="2226"/>
+            <w:tcW w:type="dxa" w:w="1926"/>
             <w:tcBorders>
               <w:top w:val="single" w:color="D9D8D3" w:sz="4"/>
               <w:left w:val="single" w:color="D9D8D3" w:sz="4"/>
@@ -10642,7 +11022,7 @@
         </w:tc>
         <w:tc>
           <w:tcPr>
-            <w:tcW w:type="dxa" w:w="1400"/>
+            <w:tcW w:type="dxa" w:w="1200"/>
             <w:tcBorders>
               <w:top w:val="single" w:color="D9D8D3" w:sz="4"/>
               <w:left w:val="single" w:color="D9D8D3" w:sz="4"/>
@@ -10668,6 +11048,32 @@
         </w:tc>
         <w:tc>
           <w:tcPr>
+            <w:tcW w:type="dxa" w:w="1100"/>
+            <w:tcBorders>
+              <w:top w:val="single" w:color="D9D8D3" w:sz="4"/>
+              <w:left w:val="single" w:color="D9D8D3" w:sz="4"/>
+              <w:bottom w:val="single" w:color="D9D8D3" w:sz="4"/>
+              <w:right w:val="single" w:color="D9D8D3" w:sz="4"/>
+            </w:tcBorders>
+            <w:tcMar>
+              <w:top w:type="dxa" w:w="60"/>
+              <w:left w:type="dxa" w:w="100"/>
+              <w:bottom w:type="dxa" w:w="60"/>
+              <w:right w:type="dxa" w:w="100"/>
+            </w:tcMar>
+          </w:tcPr>
+          <w:p>
+            <w:r>
+              <w:rPr>
+                <w:sz w:val="19"/>
+                <w:szCs w:val="19"/>
+              </w:rPr>
+              <w:t xml:space="preserve">1.5 min</w:t>
+            </w:r>
+          </w:p>
+        </w:tc>
+        <w:tc>
+          <w:tcPr>
             <w:tcW w:type="dxa" w:w="1300"/>
             <w:tcBorders>
               <w:top w:val="single" w:color="D9D8D3" w:sz="4"/>
@@ -10688,85 +11094,85 @@
                 <w:sz w:val="19"/>
                 <w:szCs w:val="19"/>
               </w:rPr>
-              <w:t xml:space="preserve">2.2 min</w:t>
-            </w:r>
-          </w:p>
-        </w:tc>
-        <w:tc>
-          <w:tcPr>
-            <w:tcW w:type="dxa" w:w="1500"/>
-            <w:tcBorders>
-              <w:top w:val="single" w:color="D9D8D3" w:sz="4"/>
-              <w:left w:val="single" w:color="D9D8D3" w:sz="4"/>
-              <w:bottom w:val="single" w:color="D9D8D3" w:sz="4"/>
-              <w:right w:val="single" w:color="D9D8D3" w:sz="4"/>
-            </w:tcBorders>
-            <w:tcMar>
-              <w:top w:type="dxa" w:w="60"/>
-              <w:left w:type="dxa" w:w="100"/>
-              <w:bottom w:type="dxa" w:w="60"/>
-              <w:right w:type="dxa" w:w="100"/>
-            </w:tcMar>
-          </w:tcPr>
-          <w:p>
-            <w:r>
-              <w:rPr>
-                <w:sz w:val="19"/>
-                <w:szCs w:val="19"/>
-              </w:rPr>
-              <w:t xml:space="preserve">5.4 min</w:t>
-            </w:r>
-          </w:p>
-        </w:tc>
-        <w:tc>
-          <w:tcPr>
-            <w:tcW w:type="dxa" w:w="1200"/>
-            <w:tcBorders>
-              <w:top w:val="single" w:color="D9D8D3" w:sz="4"/>
-              <w:left w:val="single" w:color="D9D8D3" w:sz="4"/>
-              <w:bottom w:val="single" w:color="D9D8D3" w:sz="4"/>
-              <w:right w:val="single" w:color="D9D8D3" w:sz="4"/>
-            </w:tcBorders>
-            <w:tcMar>
-              <w:top w:type="dxa" w:w="60"/>
-              <w:left w:type="dxa" w:w="100"/>
-              <w:bottom w:type="dxa" w:w="60"/>
-              <w:right w:type="dxa" w:w="100"/>
-            </w:tcMar>
-          </w:tcPr>
-          <w:p>
-            <w:r>
-              <w:rPr>
-                <w:sz w:val="19"/>
-                <w:szCs w:val="19"/>
-              </w:rPr>
-              <w:t xml:space="preserve">78</w:t>
-            </w:r>
-          </w:p>
-        </w:tc>
-        <w:tc>
-          <w:tcPr>
-            <w:tcW w:type="dxa" w:w="1400"/>
-            <w:tcBorders>
-              <w:top w:val="single" w:color="D9D8D3" w:sz="4"/>
-              <w:left w:val="single" w:color="D9D8D3" w:sz="4"/>
-              <w:bottom w:val="single" w:color="D9D8D3" w:sz="4"/>
-              <w:right w:val="single" w:color="D9D8D3" w:sz="4"/>
-            </w:tcBorders>
-            <w:tcMar>
-              <w:top w:type="dxa" w:w="60"/>
-              <w:left w:type="dxa" w:w="100"/>
-              <w:bottom w:type="dxa" w:w="60"/>
-              <w:right w:type="dxa" w:w="100"/>
-            </w:tcMar>
-          </w:tcPr>
-          <w:p>
-            <w:r>
-              <w:rPr>
-                <w:sz w:val="19"/>
-                <w:szCs w:val="19"/>
-              </w:rPr>
-              <w:t xml:space="preserve">11%</w:t>
+              <w:t xml:space="preserve">4.5 min</w:t>
+            </w:r>
+          </w:p>
+        </w:tc>
+        <w:tc>
+          <w:tcPr>
+            <w:tcW w:type="dxa" w:w="1100"/>
+            <w:tcBorders>
+              <w:top w:val="single" w:color="D9D8D3" w:sz="4"/>
+              <w:left w:val="single" w:color="D9D8D3" w:sz="4"/>
+              <w:bottom w:val="single" w:color="D9D8D3" w:sz="4"/>
+              <w:right w:val="single" w:color="D9D8D3" w:sz="4"/>
+            </w:tcBorders>
+            <w:tcMar>
+              <w:top w:type="dxa" w:w="60"/>
+              <w:left w:type="dxa" w:w="100"/>
+              <w:bottom w:type="dxa" w:w="60"/>
+              <w:right w:type="dxa" w:w="100"/>
+            </w:tcMar>
+          </w:tcPr>
+          <w:p>
+            <w:r>
+              <w:rPr>
+                <w:sz w:val="19"/>
+                <w:szCs w:val="19"/>
+              </w:rPr>
+              <w:t xml:space="preserve">187</w:t>
+            </w:r>
+          </w:p>
+        </w:tc>
+        <w:tc>
+          <w:tcPr>
+            <w:tcW w:type="dxa" w:w="1100"/>
+            <w:tcBorders>
+              <w:top w:val="single" w:color="D9D8D3" w:sz="4"/>
+              <w:left w:val="single" w:color="D9D8D3" w:sz="4"/>
+              <w:bottom w:val="single" w:color="D9D8D3" w:sz="4"/>
+              <w:right w:val="single" w:color="D9D8D3" w:sz="4"/>
+            </w:tcBorders>
+            <w:tcMar>
+              <w:top w:type="dxa" w:w="60"/>
+              <w:left w:type="dxa" w:w="100"/>
+              <w:bottom w:type="dxa" w:w="60"/>
+              <w:right w:type="dxa" w:w="100"/>
+            </w:tcMar>
+          </w:tcPr>
+          <w:p>
+            <w:r>
+              <w:rPr>
+                <w:sz w:val="19"/>
+                <w:szCs w:val="19"/>
+              </w:rPr>
+              <w:t xml:space="preserve">3.2</w:t>
+            </w:r>
+          </w:p>
+        </w:tc>
+        <w:tc>
+          <w:tcPr>
+            <w:tcW w:type="dxa" w:w="1300"/>
+            <w:tcBorders>
+              <w:top w:val="single" w:color="D9D8D3" w:sz="4"/>
+              <w:left w:val="single" w:color="D9D8D3" w:sz="4"/>
+              <w:bottom w:val="single" w:color="D9D8D3" w:sz="4"/>
+              <w:right w:val="single" w:color="D9D8D3" w:sz="4"/>
+            </w:tcBorders>
+            <w:tcMar>
+              <w:top w:type="dxa" w:w="60"/>
+              <w:left w:type="dxa" w:w="100"/>
+              <w:bottom w:type="dxa" w:w="60"/>
+              <w:right w:type="dxa" w:w="100"/>
+            </w:tcMar>
+          </w:tcPr>
+          <w:p>
+            <w:r>
+              <w:rPr>
+                <w:sz w:val="19"/>
+                <w:szCs w:val="19"/>
+              </w:rPr>
+              <w:t xml:space="preserve">23%</w:t>
             </w:r>
           </w:p>
         </w:tc>
@@ -10935,7 +11341,7 @@
                 <w:sz w:val="19"/>
                 <w:szCs w:val="19"/>
               </w:rPr>
-              <w:t xml:space="preserve">≈ 17.5 min</w:t>
+              <w:t xml:space="preserve">≈ 20.0 min</w:t>
             </w:r>
           </w:p>
         </w:tc>
@@ -10961,7 +11367,7 @@
                 <w:sz w:val="19"/>
                 <w:szCs w:val="19"/>
               </w:rPr>
-              <w:t xml:space="preserve">≈ 17.5 min</w:t>
+              <w:t xml:space="preserve">≈ 17.2 min</w:t>
             </w:r>
           </w:p>
         </w:tc>
@@ -10989,7 +11395,7 @@
                 <w:sz w:val="19"/>
                 <w:szCs w:val="19"/>
               </w:rPr>
-              <w:t xml:space="preserve">Peak (12:55–13:20)</w:t>
+              <w:t xml:space="preserve">Peak</w:t>
             </w:r>
           </w:p>
         </w:tc>
@@ -11015,7 +11421,7 @@
                 <w:sz w:val="19"/>
                 <w:szCs w:val="19"/>
               </w:rPr>
-              <w:t xml:space="preserve">≈ 24 min</w:t>
+              <w:t xml:space="preserve">≈ 25.4 min</w:t>
             </w:r>
           </w:p>
         </w:tc>
@@ -11041,7 +11447,7 @@
                 <w:sz w:val="19"/>
                 <w:szCs w:val="19"/>
               </w:rPr>
-              <w:t xml:space="preserve">≈ 20 min</w:t>
+              <w:t xml:space="preserve">≈ 19.6 min</w:t>
             </w:r>
           </w:p>
         </w:tc>
@@ -11069,17 +11475,7 @@
         <w:spacing w:after="60"/>
       </w:pPr>
       <w:r>
-        <w:t xml:space="preserve">Spreading students between the two messes roughly </w:t>
-      </w:r>
-      <w:r>
-        <w:rPr>
-          <w:b/>
-          <w:bCs/>
-        </w:rPr>
-        <w:t xml:space="preserve">halves the average wait</w:t>
-      </w:r>
-      <w:r>
-        <w:t xml:space="preserve"> and cuts long waits (90th percentile) from about 15 to about 5–6 minutes.</w:t>
+        <w:t xml:space="preserve">Without screens the simulated 90th-percentile wait (about 17 min) is close to the ~15 min delay observed in Phase 1, which suggests the assumed inputs are in the right range.</w:t>
       </w:r>
     </w:p>
     <w:p>
@@ -11092,17 +11488,17 @@
         <w:spacing w:after="60"/>
       </w:pPr>
       <w:r>
-        <w:t xml:space="preserve">Only about </w:t>
+        <w:t xml:space="preserve">Spreading students between the two messes cuts the </w:t>
       </w:r>
       <w:r>
         <w:rPr>
           <w:b/>
           <w:bCs/>
         </w:rPr>
-        <w:t xml:space="preserve">1 in 10 students</w:t>
-      </w:r>
-      <w:r>
-        <w:t xml:space="preserve"> needs to walk to the other mess for this. The gain comes from keeping both messes below the steep part of the utilisation curve.</w:t>
+        <w:t xml:space="preserve">average wait from about 7 to about 1–1.5 minutes</w:t>
+      </w:r>
+      <w:r>
+        <w:t xml:space="preserve"> and long waits (90th percentile) from about 17 to about 4 minutes.</w:t>
       </w:r>
     </w:p>
     <w:p>
@@ -11115,17 +11511,57 @@
         <w:spacing w:after="60"/>
       </w:pPr>
       <w:r>
-        <w:t xml:space="preserve">Food run-outs did </w:t>
+        <w:t xml:space="preserve">About </w:t>
       </w:r>
       <w:r>
         <w:rPr>
           <w:b/>
           <w:bCs/>
         </w:rPr>
-        <w:t xml:space="preserve">not</w:t>
-      </w:r>
-      <w:r>
-        <w:t xml:space="preserve"> fall in the model: total consumption is unchanged. Fewer run-outs need kitchen-side changes (reorder levels and forecasting; see sections 7.4 and 7.5).</w:t>
+        <w:t xml:space="preserve">1 in 5 students</w:t>
+      </w:r>
+      <w:r>
+        <w:t xml:space="preserve"> has to walk to the other mess for this (15–23%). Because 85% start at Central, rebalancing needs more movement than a more even habit split would.</w:t>
+      </w:r>
+    </w:p>
+    <w:p>
+      <w:pPr>
+        <w:pStyle w:val="ListParagraph"/>
+        <w:numPr>
+          <w:ilvl w:val="0"/>
+          <w:numId w:val="3"/>
+        </w:numPr>
+        <w:spacing w:after="60"/>
+      </w:pPr>
+      <w:r>
+        <w:rPr>
+          <w:b/>
+          <w:bCs/>
+        </w:rPr>
+        <w:t xml:space="preserve">Moving students moves the run-outs.</w:t>
+      </w:r>
+      <w:r>
+        <w:t xml:space="preserve"> Food run-outs rise slightly with screens (about 2 → 3 per lunch) because Munch now feeds more students and a restock takes 35 minutes. Student routing and food allocation must be planned together (sections 7.4–7.6).</w:t>
+      </w:r>
+    </w:p>
+    <w:p>
+      <w:pPr>
+        <w:pStyle w:val="ListParagraph"/>
+        <w:numPr>
+          <w:ilvl w:val="0"/>
+          <w:numId w:val="3"/>
+        </w:numPr>
+        <w:spacing w:after="60"/>
+      </w:pPr>
+      <w:r>
+        <w:rPr>
+          <w:b/>
+          <w:bCs/>
+        </w:rPr>
+        <w:t xml:space="preserve">The single face scanner is close to its limit at peak.</w:t>
+      </w:r>
+      <w:r>
+        <w:t xml:space="preserve"> At an assumed 2 s per scan it handles about 30 students/min, close to Central's peak arrival rate, so a queue of 20–25 people can form outside the scanner. The biometric data cannot see that queue, so the scan time should be measured.</w:t>
       </w:r>
     </w:p>
     <w:p>
@@ -11809,7 +12245,7 @@
                 <w:sz w:val="19"/>
                 <w:szCs w:val="19"/>
               </w:rPr>
-              <w:t xml:space="preserve">How many serving lines to open; when to schedule replenishment trips</w:t>
+              <w:t xml:space="preserve">How many serving stations to open; when to schedule replenishment trips</w:t>
             </w:r>
           </w:p>
         </w:tc>
@@ -12107,7 +12543,7 @@
         <w:spacing w:after="60"/>
       </w:pPr>
       <w:r>
-        <w:t xml:space="preserve">Why do students wait ~15 minutes? Because the serving line runs at or above capacity at peak.</w:t>
+        <w:t xml:space="preserve">Why do students wait ~15 minutes? Because the serving station runs at or above capacity at peak.</w:t>
       </w:r>
     </w:p>
     <w:p>
@@ -12245,7 +12681,7 @@
         <w:t xml:space="preserve">Status-quo / habit bias:</w:t>
       </w:r>
       <w:r>
-        <w:t xml:space="preserve"> students return to the same mess (we assume 65/35) even when the other is quicker. The screen design uses defaults, concrete gains ('Enough time for a chai') and fresh-food cues to counter this.</w:t>
+        <w:t xml:space="preserve"> students return to the same mess (we assume 85/15) even when the other is quicker. The screen design uses defaults, concrete gains ('Enough time for a chai') and fresh-food cues to counter this.</w:t>
       </w:r>
     </w:p>
     <w:p>
@@ -12946,7 +13382,7 @@
         <w:t xml:space="preserve">Decision:</w:t>
       </w:r>
       <w:r>
-        <w:t xml:space="preserve"> at 12:50, should the kitchen send an extra batch of the star dish </w:t>
+        <w:t xml:space="preserve"> at 12:30 (before the peak), should the kitchen send an extra batch of the star dish </w:t>
       </w:r>
       <w:r>
         <w:rPr>
@@ -13257,7 +13693,7 @@
         <w:t xml:space="preserve">Link to queuing:</w:t>
       </w:r>
       <w:r>
-        <w:t xml:space="preserve"> the same LP can staff counters. Choosing serving lines c_i to keep utilisation at most 85% gives the linear constraint λ_i ≤ 0.85 · μ · c_i.</w:t>
+        <w:t xml:space="preserve"> the same LP can staff counters. Choosing serving stations c_i to keep utilisation at most 85% gives the linear constraint λ_i ≤ 0.85 · μ · c_i.</w:t>
       </w:r>
     </w:p>
     <w:p>
@@ -13290,10 +13726,10 @@
           <w:b/>
           <w:bCs/>
         </w:rPr>
-        <w:t xml:space="preserve">Number of serving lines</w:t>
-      </w:r>
-      <w:r>
-        <w:t xml:space="preserve"> at each mess and time slot: c_{i,t} ∈ {1, 2, 3, …}. Minimise staff cost Σ cost · c_{i,t} subject to the queuing constraint λ_{i,t} ≤ ρ_max · μ · c_{i,t} and a total staff limit. The LP answer (for example 2.6 lines) is not usable; branch and bound finds the best integer staffing.</w:t>
+        <w:t xml:space="preserve">Number of serving stations</w:t>
+      </w:r>
+      <w:r>
+        <w:t xml:space="preserve"> at each mess and time slot: c_{i,t} ∈ {1, 2, 3, …} (today 2 per mess). Minimise staff cost Σ cost · c_{i,t} subject to the queuing constraint λ_{i,t} ≤ ρ_max · μ · c_{i,t} and a total staff limit. The LP answer (for example 2.6 stations) is not usable; branch and bound finds the best integer staffing.</w:t>
       </w:r>
     </w:p>
     <w:p>
@@ -14187,7 +14623,7 @@
         <w:spacing w:after="120"/>
       </w:pPr>
       <w:r>
-        <w:t xml:space="preserve">Consistency ratio ≈ 0.002 (well below the 0.10 limit), so these judgements are consistent. The weights then score alternatives such as: A1 status quo; A2 extra serving line during the peak (timing set from the logs); A3 pre-staged replenishment of AZ items; A4 door screens and routing; A5 staggered class end times. Queuing results (section 3) supply the service-level score of each alternative.</w:t>
+        <w:t xml:space="preserve">Consistency ratio ≈ 0.002 (well below the 0.10 limit), so these judgements are consistent. The weights then score alternatives such as: A1 status quo; A2 a 3rd serving station during the peak (timing set from the logs); A3 pre-staged replenishment of AZ items; A4 door screens and routing; A5 staggered class end times. Queuing results (section 3) supply the service-level score of each alternative.</w:t>
       </w:r>
     </w:p>
     <w:p>
@@ -15032,7 +15468,7 @@
                 <w:sz w:val="19"/>
                 <w:szCs w:val="19"/>
               </w:rPr>
-              <w:t xml:space="preserve">Service rate μ per line</w:t>
+              <w:t xml:space="preserve">Students per lunch</w:t>
             </w:r>
           </w:p>
         </w:tc>
@@ -15058,39 +15494,13 @@
                 <w:sz w:val="19"/>
                 <w:szCs w:val="19"/>
               </w:rPr>
-              <w:t xml:space="preserve">4 students/min (15 s)</w:t>
+              <w:t xml:space="preserve">2,960 (= plates)</w:t>
             </w:r>
           </w:p>
         </w:tc>
         <w:tc>
           <w:tcPr>
             <w:tcW w:type="dxa" w:w="1700"/>
-            <w:tcBorders>
-              <w:top w:val="single" w:color="D9D8D3" w:sz="4"/>
-              <w:left w:val="single" w:color="D9D8D3" w:sz="4"/>
-              <w:bottom w:val="single" w:color="D9D8D3" w:sz="4"/>
-              <w:right w:val="single" w:color="D9D8D3" w:sz="4"/>
-            </w:tcBorders>
-            <w:tcMar>
-              <w:top w:type="dxa" w:w="60"/>
-              <w:left w:type="dxa" w:w="100"/>
-              <w:bottom w:type="dxa" w:w="60"/>
-              <w:right w:type="dxa" w:w="100"/>
-            </w:tcMar>
-          </w:tcPr>
-          <w:p>
-            <w:r>
-              <w:rPr>
-                <w:sz w:val="19"/>
-                <w:szCs w:val="19"/>
-              </w:rPr>
-              <w:t xml:space="preserve">Assumed</w:t>
-            </w:r>
-          </w:p>
-        </w:tc>
-        <w:tc>
-          <w:tcPr>
-            <w:tcW w:type="dxa" w:w="2526"/>
             <w:tcBorders>
               <w:top w:val="single" w:color="D9D8D3" w:sz="4"/>
               <w:left w:val="single" w:color="D9D8D3" w:sz="4"/>
@@ -15112,14 +15522,33 @@
                 <w:sz w:val="19"/>
                 <w:szCs w:val="19"/>
               </w:rPr>
-              <w:t xml:space="preserve">Stopwatch</w:t>
-            </w:r>
-            <w:r>
-              <w:rPr>
-                <w:sz w:val="19"/>
-                <w:szCs w:val="19"/>
-              </w:rPr>
-              <w:t xml:space="preserve"> 20–30 students at peak</w:t>
+              <w:t xml:space="preserve">Measured</w:t>
+            </w:r>
+          </w:p>
+        </w:tc>
+        <w:tc>
+          <w:tcPr>
+            <w:tcW w:type="dxa" w:w="2526"/>
+            <w:tcBorders>
+              <w:top w:val="single" w:color="D9D8D3" w:sz="4"/>
+              <w:left w:val="single" w:color="D9D8D3" w:sz="4"/>
+              <w:bottom w:val="single" w:color="D9D8D3" w:sz="4"/>
+              <w:right w:val="single" w:color="D9D8D3" w:sz="4"/>
+            </w:tcBorders>
+            <w:tcMar>
+              <w:top w:type="dxa" w:w="60"/>
+              <w:left w:type="dxa" w:w="100"/>
+              <w:bottom w:type="dxa" w:w="60"/>
+              <w:right w:type="dxa" w:w="100"/>
+            </w:tcMar>
+          </w:tcPr>
+          <w:p>
+            <w:r>
+              <w:rPr>
+                <w:sz w:val="19"/>
+                <w:szCs w:val="19"/>
+              </w:rPr>
+              <w:t xml:space="preserve">Done (Phase 1)</w:t>
             </w:r>
           </w:p>
         </w:tc>
@@ -15147,7 +15576,7 @@
                 <w:sz w:val="19"/>
                 <w:szCs w:val="19"/>
               </w:rPr>
-              <w:t xml:space="preserve">Serving lines c</w:t>
+              <w:t xml:space="preserve">Lunch window</w:t>
             </w:r>
           </w:p>
         </w:tc>
@@ -15173,7 +15602,7 @@
                 <w:sz w:val="19"/>
                 <w:szCs w:val="19"/>
               </w:rPr>
-              <w:t xml:space="preserve">3 per mess</w:t>
+              <w:t xml:space="preserve">11:30–14:30</w:t>
             </w:r>
           </w:p>
         </w:tc>
@@ -15196,10 +15625,12 @@
           <w:p>
             <w:r>
               <w:rPr>
-                <w:sz w:val="19"/>
-                <w:szCs w:val="19"/>
-              </w:rPr>
-              <w:t xml:space="preserve">Assumed</w:t>
+                <w:b/>
+                <w:bCs/>
+                <w:sz w:val="19"/>
+                <w:szCs w:val="19"/>
+              </w:rPr>
+              <w:t xml:space="preserve">Measured</w:t>
             </w:r>
           </w:p>
         </w:tc>
@@ -15225,7 +15656,7 @@
                 <w:sz w:val="19"/>
                 <w:szCs w:val="19"/>
               </w:rPr>
-              <w:t xml:space="preserve">Count at each mess during peak</w:t>
+              <w:t xml:space="preserve">Done</w:t>
             </w:r>
           </w:p>
         </w:tc>
@@ -15253,7 +15684,7 @@
                 <w:sz w:val="19"/>
                 <w:szCs w:val="19"/>
               </w:rPr>
-              <w:t xml:space="preserve">Habit split between messes</w:t>
+              <w:t xml:space="preserve">Serving stations c</w:t>
             </w:r>
           </w:p>
         </w:tc>
@@ -15279,7 +15710,7 @@
                 <w:sz w:val="19"/>
                 <w:szCs w:val="19"/>
               </w:rPr>
-              <w:t xml:space="preserve">65% / 35%</w:t>
+              <w:t xml:space="preserve">2 per mess</w:t>
             </w:r>
           </w:p>
         </w:tc>
@@ -15302,10 +15733,12 @@
           <w:p>
             <w:r>
               <w:rPr>
-                <w:sz w:val="19"/>
-                <w:szCs w:val="19"/>
-              </w:rPr>
-              <w:t xml:space="preserve">Assumed</w:t>
+                <w:b/>
+                <w:bCs/>
+                <w:sz w:val="19"/>
+                <w:szCs w:val="19"/>
+              </w:rPr>
+              <w:t xml:space="preserve">Measured</w:t>
             </w:r>
           </w:p>
         </w:tc>
@@ -15331,7 +15764,7 @@
                 <w:sz w:val="19"/>
                 <w:szCs w:val="19"/>
               </w:rPr>
-              <w:t xml:space="preserve">Biometric logs (a no-screen baseline)</w:t>
+              <w:t xml:space="preserve">Done</w:t>
             </w:r>
           </w:p>
         </w:tc>
@@ -15359,7 +15792,7 @@
                 <w:sz w:val="19"/>
                 <w:szCs w:val="19"/>
               </w:rPr>
-              <w:t xml:space="preserve">Compliance κ</w:t>
+              <w:t xml:space="preserve">Face scanners</w:t>
             </w:r>
           </w:p>
         </w:tc>
@@ -15385,7 +15818,7 @@
                 <w:sz w:val="19"/>
                 <w:szCs w:val="19"/>
               </w:rPr>
-              <w:t xml:space="preserve">60%</w:t>
+              <w:t xml:space="preserve">1 per mess</w:t>
             </w:r>
           </w:p>
         </w:tc>
@@ -15408,10 +15841,12 @@
           <w:p>
             <w:r>
               <w:rPr>
-                <w:sz w:val="19"/>
-                <w:szCs w:val="19"/>
-              </w:rPr>
-              <w:t xml:space="preserve">Assumed</w:t>
+                <w:b/>
+                <w:bCs/>
+                <w:sz w:val="19"/>
+                <w:szCs w:val="19"/>
+              </w:rPr>
+              <w:t xml:space="preserve">Measured</w:t>
             </w:r>
           </w:p>
         </w:tc>
@@ -15437,7 +15872,7 @@
                 <w:sz w:val="19"/>
                 <w:szCs w:val="19"/>
               </w:rPr>
-              <w:t xml:space="preserve">Pilot</w:t>
+              <w:t xml:space="preserve">Done</w:t>
             </w:r>
           </w:p>
         </w:tc>
@@ -15465,7 +15900,7 @@
                 <w:sz w:val="19"/>
                 <w:szCs w:val="19"/>
               </w:rPr>
-              <w:t xml:space="preserve">Walk between doors</w:t>
+              <w:t xml:space="preserve">Service rate μ per station</w:t>
             </w:r>
           </w:p>
         </w:tc>
@@ -15491,7 +15926,7 @@
                 <w:sz w:val="19"/>
                 <w:szCs w:val="19"/>
               </w:rPr>
-              <w:t xml:space="preserve">30 s</w:t>
+              <w:t xml:space="preserve">10 students/min (6 s)</w:t>
             </w:r>
           </w:p>
         </w:tc>
@@ -15540,10 +15975,19 @@
           <w:p>
             <w:r>
               <w:rPr>
-                <w:sz w:val="19"/>
-                <w:szCs w:val="19"/>
-              </w:rPr>
-              <w:t xml:space="preserve">Walk it with a stopwatch</w:t>
+                <w:b/>
+                <w:bCs/>
+                <w:sz w:val="19"/>
+                <w:szCs w:val="19"/>
+              </w:rPr>
+              <w:t xml:space="preserve">Stopwatch</w:t>
+            </w:r>
+            <w:r>
+              <w:rPr>
+                <w:sz w:val="19"/>
+                <w:szCs w:val="19"/>
+              </w:rPr>
+              <w:t xml:space="preserve"> 20–30 students at peak</w:t>
             </w:r>
           </w:p>
         </w:tc>
@@ -15571,6 +16015,430 @@
                 <w:sz w:val="19"/>
                 <w:szCs w:val="19"/>
               </w:rPr>
+              <w:t xml:space="preserve">Scan time</w:t>
+            </w:r>
+          </w:p>
+        </w:tc>
+        <w:tc>
+          <w:tcPr>
+            <w:tcW w:type="dxa" w:w="2400"/>
+            <w:tcBorders>
+              <w:top w:val="single" w:color="D9D8D3" w:sz="4"/>
+              <w:left w:val="single" w:color="D9D8D3" w:sz="4"/>
+              <w:bottom w:val="single" w:color="D9D8D3" w:sz="4"/>
+              <w:right w:val="single" w:color="D9D8D3" w:sz="4"/>
+            </w:tcBorders>
+            <w:tcMar>
+              <w:top w:type="dxa" w:w="60"/>
+              <w:left w:type="dxa" w:w="100"/>
+              <w:bottom w:type="dxa" w:w="60"/>
+              <w:right w:type="dxa" w:w="100"/>
+            </w:tcMar>
+          </w:tcPr>
+          <w:p>
+            <w:r>
+              <w:rPr>
+                <w:sz w:val="19"/>
+                <w:szCs w:val="19"/>
+              </w:rPr>
+              <w:t xml:space="preserve">2 s per student</w:t>
+            </w:r>
+          </w:p>
+        </w:tc>
+        <w:tc>
+          <w:tcPr>
+            <w:tcW w:type="dxa" w:w="1700"/>
+            <w:tcBorders>
+              <w:top w:val="single" w:color="D9D8D3" w:sz="4"/>
+              <w:left w:val="single" w:color="D9D8D3" w:sz="4"/>
+              <w:bottom w:val="single" w:color="D9D8D3" w:sz="4"/>
+              <w:right w:val="single" w:color="D9D8D3" w:sz="4"/>
+            </w:tcBorders>
+            <w:tcMar>
+              <w:top w:type="dxa" w:w="60"/>
+              <w:left w:type="dxa" w:w="100"/>
+              <w:bottom w:type="dxa" w:w="60"/>
+              <w:right w:type="dxa" w:w="100"/>
+            </w:tcMar>
+          </w:tcPr>
+          <w:p>
+            <w:r>
+              <w:rPr>
+                <w:sz w:val="19"/>
+                <w:szCs w:val="19"/>
+              </w:rPr>
+              <w:t xml:space="preserve">Assumed</w:t>
+            </w:r>
+          </w:p>
+        </w:tc>
+        <w:tc>
+          <w:tcPr>
+            <w:tcW w:type="dxa" w:w="2526"/>
+            <w:tcBorders>
+              <w:top w:val="single" w:color="D9D8D3" w:sz="4"/>
+              <w:left w:val="single" w:color="D9D8D3" w:sz="4"/>
+              <w:bottom w:val="single" w:color="D9D8D3" w:sz="4"/>
+              <w:right w:val="single" w:color="D9D8D3" w:sz="4"/>
+            </w:tcBorders>
+            <w:tcMar>
+              <w:top w:type="dxa" w:w="60"/>
+              <w:left w:type="dxa" w:w="100"/>
+              <w:bottom w:type="dxa" w:w="60"/>
+              <w:right w:type="dxa" w:w="100"/>
+            </w:tcMar>
+          </w:tcPr>
+          <w:p>
+            <w:r>
+              <w:rPr>
+                <w:sz w:val="19"/>
+                <w:szCs w:val="19"/>
+              </w:rPr>
+              <w:t xml:space="preserve">Stopwatch at the scanner, or gaps between scans in the logs</w:t>
+            </w:r>
+          </w:p>
+        </w:tc>
+      </w:tr>
+      <w:tr>
+        <w:tc>
+          <w:tcPr>
+            <w:tcW w:type="dxa" w:w="2400"/>
+            <w:tcBorders>
+              <w:top w:val="single" w:color="D9D8D3" w:sz="4"/>
+              <w:left w:val="single" w:color="D9D8D3" w:sz="4"/>
+              <w:bottom w:val="single" w:color="D9D8D3" w:sz="4"/>
+              <w:right w:val="single" w:color="D9D8D3" w:sz="4"/>
+            </w:tcBorders>
+            <w:tcMar>
+              <w:top w:type="dxa" w:w="60"/>
+              <w:left w:type="dxa" w:w="100"/>
+              <w:bottom w:type="dxa" w:w="60"/>
+              <w:right w:type="dxa" w:w="100"/>
+            </w:tcMar>
+          </w:tcPr>
+          <w:p>
+            <w:r>
+              <w:rPr>
+                <w:sz w:val="19"/>
+                <w:szCs w:val="19"/>
+              </w:rPr>
+              <w:t xml:space="preserve">Habit split between messes</w:t>
+            </w:r>
+          </w:p>
+        </w:tc>
+        <w:tc>
+          <w:tcPr>
+            <w:tcW w:type="dxa" w:w="2400"/>
+            <w:tcBorders>
+              <w:top w:val="single" w:color="D9D8D3" w:sz="4"/>
+              <w:left w:val="single" w:color="D9D8D3" w:sz="4"/>
+              <w:bottom w:val="single" w:color="D9D8D3" w:sz="4"/>
+              <w:right w:val="single" w:color="D9D8D3" w:sz="4"/>
+            </w:tcBorders>
+            <w:tcMar>
+              <w:top w:type="dxa" w:w="60"/>
+              <w:left w:type="dxa" w:w="100"/>
+              <w:bottom w:type="dxa" w:w="60"/>
+              <w:right w:type="dxa" w:w="100"/>
+            </w:tcMar>
+          </w:tcPr>
+          <w:p>
+            <w:r>
+              <w:rPr>
+                <w:sz w:val="19"/>
+                <w:szCs w:val="19"/>
+              </w:rPr>
+              <w:t xml:space="preserve">85% Central / 15% Munch</w:t>
+            </w:r>
+          </w:p>
+        </w:tc>
+        <w:tc>
+          <w:tcPr>
+            <w:tcW w:type="dxa" w:w="1700"/>
+            <w:tcBorders>
+              <w:top w:val="single" w:color="D9D8D3" w:sz="4"/>
+              <w:left w:val="single" w:color="D9D8D3" w:sz="4"/>
+              <w:bottom w:val="single" w:color="D9D8D3" w:sz="4"/>
+              <w:right w:val="single" w:color="D9D8D3" w:sz="4"/>
+            </w:tcBorders>
+            <w:tcMar>
+              <w:top w:type="dxa" w:w="60"/>
+              <w:left w:type="dxa" w:w="100"/>
+              <w:bottom w:type="dxa" w:w="60"/>
+              <w:right w:type="dxa" w:w="100"/>
+            </w:tcMar>
+          </w:tcPr>
+          <w:p>
+            <w:r>
+              <w:rPr>
+                <w:sz w:val="19"/>
+                <w:szCs w:val="19"/>
+              </w:rPr>
+              <w:t xml:space="preserve">Assumed</w:t>
+            </w:r>
+          </w:p>
+        </w:tc>
+        <w:tc>
+          <w:tcPr>
+            <w:tcW w:type="dxa" w:w="2526"/>
+            <w:tcBorders>
+              <w:top w:val="single" w:color="D9D8D3" w:sz="4"/>
+              <w:left w:val="single" w:color="D9D8D3" w:sz="4"/>
+              <w:bottom w:val="single" w:color="D9D8D3" w:sz="4"/>
+              <w:right w:val="single" w:color="D9D8D3" w:sz="4"/>
+            </w:tcBorders>
+            <w:tcMar>
+              <w:top w:type="dxa" w:w="60"/>
+              <w:left w:type="dxa" w:w="100"/>
+              <w:bottom w:type="dxa" w:w="60"/>
+              <w:right w:type="dxa" w:w="100"/>
+            </w:tcMar>
+          </w:tcPr>
+          <w:p>
+            <w:r>
+              <w:rPr>
+                <w:sz w:val="19"/>
+                <w:szCs w:val="19"/>
+              </w:rPr>
+              <w:t xml:space="preserve">Biometric logs (a no-screen baseline)</w:t>
+            </w:r>
+          </w:p>
+        </w:tc>
+      </w:tr>
+      <w:tr>
+        <w:tc>
+          <w:tcPr>
+            <w:tcW w:type="dxa" w:w="2400"/>
+            <w:tcBorders>
+              <w:top w:val="single" w:color="D9D8D3" w:sz="4"/>
+              <w:left w:val="single" w:color="D9D8D3" w:sz="4"/>
+              <w:bottom w:val="single" w:color="D9D8D3" w:sz="4"/>
+              <w:right w:val="single" w:color="D9D8D3" w:sz="4"/>
+            </w:tcBorders>
+            <w:tcMar>
+              <w:top w:type="dxa" w:w="60"/>
+              <w:left w:type="dxa" w:w="100"/>
+              <w:bottom w:type="dxa" w:w="60"/>
+              <w:right w:type="dxa" w:w="100"/>
+            </w:tcMar>
+          </w:tcPr>
+          <w:p>
+            <w:r>
+              <w:rPr>
+                <w:sz w:val="19"/>
+                <w:szCs w:val="19"/>
+              </w:rPr>
+              <w:t xml:space="preserve">Compliance κ</w:t>
+            </w:r>
+          </w:p>
+        </w:tc>
+        <w:tc>
+          <w:tcPr>
+            <w:tcW w:type="dxa" w:w="2400"/>
+            <w:tcBorders>
+              <w:top w:val="single" w:color="D9D8D3" w:sz="4"/>
+              <w:left w:val="single" w:color="D9D8D3" w:sz="4"/>
+              <w:bottom w:val="single" w:color="D9D8D3" w:sz="4"/>
+              <w:right w:val="single" w:color="D9D8D3" w:sz="4"/>
+            </w:tcBorders>
+            <w:tcMar>
+              <w:top w:type="dxa" w:w="60"/>
+              <w:left w:type="dxa" w:w="100"/>
+              <w:bottom w:type="dxa" w:w="60"/>
+              <w:right w:type="dxa" w:w="100"/>
+            </w:tcMar>
+          </w:tcPr>
+          <w:p>
+            <w:r>
+              <w:rPr>
+                <w:sz w:val="19"/>
+                <w:szCs w:val="19"/>
+              </w:rPr>
+              <w:t xml:space="preserve">60%</w:t>
+            </w:r>
+          </w:p>
+        </w:tc>
+        <w:tc>
+          <w:tcPr>
+            <w:tcW w:type="dxa" w:w="1700"/>
+            <w:tcBorders>
+              <w:top w:val="single" w:color="D9D8D3" w:sz="4"/>
+              <w:left w:val="single" w:color="D9D8D3" w:sz="4"/>
+              <w:bottom w:val="single" w:color="D9D8D3" w:sz="4"/>
+              <w:right w:val="single" w:color="D9D8D3" w:sz="4"/>
+            </w:tcBorders>
+            <w:tcMar>
+              <w:top w:type="dxa" w:w="60"/>
+              <w:left w:type="dxa" w:w="100"/>
+              <w:bottom w:type="dxa" w:w="60"/>
+              <w:right w:type="dxa" w:w="100"/>
+            </w:tcMar>
+          </w:tcPr>
+          <w:p>
+            <w:r>
+              <w:rPr>
+                <w:sz w:val="19"/>
+                <w:szCs w:val="19"/>
+              </w:rPr>
+              <w:t xml:space="preserve">Assumed</w:t>
+            </w:r>
+          </w:p>
+        </w:tc>
+        <w:tc>
+          <w:tcPr>
+            <w:tcW w:type="dxa" w:w="2526"/>
+            <w:tcBorders>
+              <w:top w:val="single" w:color="D9D8D3" w:sz="4"/>
+              <w:left w:val="single" w:color="D9D8D3" w:sz="4"/>
+              <w:bottom w:val="single" w:color="D9D8D3" w:sz="4"/>
+              <w:right w:val="single" w:color="D9D8D3" w:sz="4"/>
+            </w:tcBorders>
+            <w:tcMar>
+              <w:top w:type="dxa" w:w="60"/>
+              <w:left w:type="dxa" w:w="100"/>
+              <w:bottom w:type="dxa" w:w="60"/>
+              <w:right w:type="dxa" w:w="100"/>
+            </w:tcMar>
+          </w:tcPr>
+          <w:p>
+            <w:r>
+              <w:rPr>
+                <w:sz w:val="19"/>
+                <w:szCs w:val="19"/>
+              </w:rPr>
+              <w:t xml:space="preserve">Pilot</w:t>
+            </w:r>
+          </w:p>
+        </w:tc>
+      </w:tr>
+      <w:tr>
+        <w:tc>
+          <w:tcPr>
+            <w:tcW w:type="dxa" w:w="2400"/>
+            <w:tcBorders>
+              <w:top w:val="single" w:color="D9D8D3" w:sz="4"/>
+              <w:left w:val="single" w:color="D9D8D3" w:sz="4"/>
+              <w:bottom w:val="single" w:color="D9D8D3" w:sz="4"/>
+              <w:right w:val="single" w:color="D9D8D3" w:sz="4"/>
+            </w:tcBorders>
+            <w:tcMar>
+              <w:top w:type="dxa" w:w="60"/>
+              <w:left w:type="dxa" w:w="100"/>
+              <w:bottom w:type="dxa" w:w="60"/>
+              <w:right w:type="dxa" w:w="100"/>
+            </w:tcMar>
+          </w:tcPr>
+          <w:p>
+            <w:r>
+              <w:rPr>
+                <w:sz w:val="19"/>
+                <w:szCs w:val="19"/>
+              </w:rPr>
+              <w:t xml:space="preserve">Walk between doors</w:t>
+            </w:r>
+          </w:p>
+        </w:tc>
+        <w:tc>
+          <w:tcPr>
+            <w:tcW w:type="dxa" w:w="2400"/>
+            <w:tcBorders>
+              <w:top w:val="single" w:color="D9D8D3" w:sz="4"/>
+              <w:left w:val="single" w:color="D9D8D3" w:sz="4"/>
+              <w:bottom w:val="single" w:color="D9D8D3" w:sz="4"/>
+              <w:right w:val="single" w:color="D9D8D3" w:sz="4"/>
+            </w:tcBorders>
+            <w:tcMar>
+              <w:top w:type="dxa" w:w="60"/>
+              <w:left w:type="dxa" w:w="100"/>
+              <w:bottom w:type="dxa" w:w="60"/>
+              <w:right w:type="dxa" w:w="100"/>
+            </w:tcMar>
+          </w:tcPr>
+          <w:p>
+            <w:r>
+              <w:rPr>
+                <w:sz w:val="19"/>
+                <w:szCs w:val="19"/>
+              </w:rPr>
+              <w:t xml:space="preserve">30 s</w:t>
+            </w:r>
+          </w:p>
+        </w:tc>
+        <w:tc>
+          <w:tcPr>
+            <w:tcW w:type="dxa" w:w="1700"/>
+            <w:tcBorders>
+              <w:top w:val="single" w:color="D9D8D3" w:sz="4"/>
+              <w:left w:val="single" w:color="D9D8D3" w:sz="4"/>
+              <w:bottom w:val="single" w:color="D9D8D3" w:sz="4"/>
+              <w:right w:val="single" w:color="D9D8D3" w:sz="4"/>
+            </w:tcBorders>
+            <w:tcMar>
+              <w:top w:type="dxa" w:w="60"/>
+              <w:left w:type="dxa" w:w="100"/>
+              <w:bottom w:type="dxa" w:w="60"/>
+              <w:right w:type="dxa" w:w="100"/>
+            </w:tcMar>
+          </w:tcPr>
+          <w:p>
+            <w:r>
+              <w:rPr>
+                <w:sz w:val="19"/>
+                <w:szCs w:val="19"/>
+              </w:rPr>
+              <w:t xml:space="preserve">Assumed</w:t>
+            </w:r>
+          </w:p>
+        </w:tc>
+        <w:tc>
+          <w:tcPr>
+            <w:tcW w:type="dxa" w:w="2526"/>
+            <w:tcBorders>
+              <w:top w:val="single" w:color="D9D8D3" w:sz="4"/>
+              <w:left w:val="single" w:color="D9D8D3" w:sz="4"/>
+              <w:bottom w:val="single" w:color="D9D8D3" w:sz="4"/>
+              <w:right w:val="single" w:color="D9D8D3" w:sz="4"/>
+            </w:tcBorders>
+            <w:tcMar>
+              <w:top w:type="dxa" w:w="60"/>
+              <w:left w:type="dxa" w:w="100"/>
+              <w:bottom w:type="dxa" w:w="60"/>
+              <w:right w:type="dxa" w:w="100"/>
+            </w:tcMar>
+          </w:tcPr>
+          <w:p>
+            <w:r>
+              <w:rPr>
+                <w:sz w:val="19"/>
+                <w:szCs w:val="19"/>
+              </w:rPr>
+              <w:t xml:space="preserve">Walk it with a stopwatch</w:t>
+            </w:r>
+          </w:p>
+        </w:tc>
+      </w:tr>
+      <w:tr>
+        <w:tc>
+          <w:tcPr>
+            <w:tcW w:type="dxa" w:w="2400"/>
+            <w:tcBorders>
+              <w:top w:val="single" w:color="D9D8D3" w:sz="4"/>
+              <w:left w:val="single" w:color="D9D8D3" w:sz="4"/>
+              <w:bottom w:val="single" w:color="D9D8D3" w:sz="4"/>
+              <w:right w:val="single" w:color="D9D8D3" w:sz="4"/>
+            </w:tcBorders>
+            <w:tcMar>
+              <w:top w:type="dxa" w:w="60"/>
+              <w:left w:type="dxa" w:w="100"/>
+              <w:bottom w:type="dxa" w:w="60"/>
+              <w:right w:type="dxa" w:w="100"/>
+            </w:tcMar>
+          </w:tcPr>
+          <w:p>
+            <w:r>
+              <w:rPr>
+                <w:sz w:val="19"/>
+                <w:szCs w:val="19"/>
+              </w:rPr>
               <w:t xml:space="preserve">Food batch and reorder level</w:t>
             </w:r>
           </w:p>
@@ -15597,7 +16465,7 @@
                 <w:sz w:val="19"/>
                 <w:szCs w:val="19"/>
               </w:rPr>
-              <w:t xml:space="preserve">350 portions, reorder at 120</w:t>
+              <w:t xml:space="preserve">Central 900 (reorder at 500), Munch 500 (reorder at 300)</w:t>
             </w:r>
           </w:p>
         </w:tc>
@@ -17516,7 +18384,7 @@
                 <w:sz w:val="19"/>
                 <w:szCs w:val="19"/>
               </w:rPr>
-              <w:t xml:space="preserve">Arrivals, serving lines, food stock, seats, eating time</w:t>
+              <w:t xml:space="preserve">Arrivals, face scanner, serving stations, food stock, seats, eating time</w:t>
             </w:r>
           </w:p>
         </w:tc>

</xml_diff>

<commit_message>
Workbook and doc: restock is 30 min after the running-low call (10-14 min if already made); updated results
Co-Authored-By: Claude Opus 5.5 <noreply@anthropic.com>
Claude-Session: https://claude.ai/code/session_013JwSYm4UV7vKHqaUukbU1G
</commit_message>
<xml_diff>
--- a/docs/MDS_Queuing_Theory_and_Simulation.docx
+++ b/docs/MDS_Queuing_Theory_and_Simulation.docx
@@ -368,27 +368,37 @@
         <w:spacing w:after="60"/>
       </w:pPr>
       <w:r>
-        <w:t xml:space="preserve">Replenishment needs </w:t>
+        <w:t xml:space="preserve">Replenishment starts only when the mess calls the kitchen because a dish is </w:t>
       </w:r>
       <w:r>
         <w:rPr>
           <w:b/>
           <w:bCs/>
         </w:rPr>
-        <w:t xml:space="preserve">25–30 min</w:t>
-      </w:r>
-      <w:r>
-        <w:t xml:space="preserve"> of preparation plus </w:t>
+        <w:t xml:space="preserve">running low</w:t>
+      </w:r>
+      <w:r>
+        <w:t xml:space="preserve">. If the kitchen has to make it, the refill arrives </w:t>
       </w:r>
       <w:r>
         <w:rPr>
           <w:b/>
           <w:bCs/>
         </w:rPr>
-        <w:t xml:space="preserve">7–8 min</w:t>
-      </w:r>
-      <w:r>
-        <w:t xml:space="preserve"> of delivery, so top-ups arrive inside the peak.</w:t>
+        <w:t xml:space="preserve">30 min</w:t>
+      </w:r>
+      <w:r>
+        <w:t xml:space="preserve"> after the call (making plus sending). If it is already made, only sending is needed: </w:t>
+      </w:r>
+      <w:r>
+        <w:rPr>
+          <w:b/>
+          <w:bCs/>
+        </w:rPr>
+        <w:t xml:space="preserve">10–14 min</w:t>
+      </w:r>
+      <w:r>
+        <w:t xml:space="preserve">. Either way, top-ups arrive inside the peak.</w:t>
       </w:r>
     </w:p>
     <w:p>
@@ -8800,7 +8810,7 @@
                 <w:sz w:val="19"/>
                 <w:szCs w:val="19"/>
               </w:rPr>
-              <w:t xml:space="preserve"> sets μ to 0 until the refill arrives (25–30 min prep + 7–8 min delivery, about 35 min)</w:t>
+              <w:t xml:space="preserve"> sets μ to 0 until the refill arrives (30 min after the 'running low' call if it has to be made, 10–14 min if already made)</w:t>
             </w:r>
           </w:p>
         </w:tc>
@@ -9601,7 +9611,7 @@
                 <w:sz w:val="19"/>
                 <w:szCs w:val="19"/>
               </w:rPr>
-              <w:t xml:space="preserve">Batches of the main dish (900 at Central, 500 at Munch, assumed); the kitchen starts the next batch at a reorder level and it arrives 35 min later (measured); if stock hits 0, the stations stop</w:t>
+              <w:t xml:space="preserve">Batches of the main dish (900 at Central, 500 at Munch, assumed); when stock falls to a call level (assumed) the mess calls the kitchen; the refill arrives 30 min later if it has to be made, or 10–14 min later if already made (both measured; an assumed 50% chance it is already made); if stock hits 0, the stations stop</w:t>
             </w:r>
           </w:p>
         </w:tc>
@@ -10199,7 +10209,7 @@
         <w:t xml:space="preserve">Simulated, not measured.  </w:t>
       </w:r>
       <w:r>
-        <w:t xml:space="preserve">These results come from 20 simulated lunches per setting with 2,960 students over 11:30–14:30. Measured: students, seats, 2 stations and 1 scanner per mess, the 18-min visit and the 35-min restock. </w:t>
+        <w:t xml:space="preserve">These results come from 20 simulated lunches per setting with 2,960 students over 11:30–14:30. Measured: students, seats, 2 stations and 1 scanner per mess, the 18-min visit and the restock times (30 min, or 10–14 min if already made). </w:t>
       </w:r>
       <w:r>
         <w:rPr>
@@ -10209,7 +10219,7 @@
         <w:t xml:space="preserve">Assumed:</w:t>
       </w:r>
       <w:r>
-        <w:t xml:space="preserve"> the 85/15 habit split, 10 students/min per station, 2 s per scan, food batches and the arrival curve. They show what the method can do; the pilot will show what actually happens.</w:t>
+        <w:t xml:space="preserve"> the 85/15 habit split, 10 students/min per station, 2 s per scan, a 50% chance the next batch is already made, food batches and the arrival curve. They show what the method can do; the pilot will show what actually happens.</w:t>
       </w:r>
     </w:p>
     <w:tbl>
@@ -10516,7 +10526,7 @@
                 <w:sz w:val="19"/>
                 <w:szCs w:val="19"/>
               </w:rPr>
-              <w:t xml:space="preserve">7.0 min</w:t>
+              <w:t xml:space="preserve">7.1 min</w:t>
             </w:r>
           </w:p>
         </w:tc>
@@ -10542,7 +10552,7 @@
                 <w:sz w:val="19"/>
                 <w:szCs w:val="19"/>
               </w:rPr>
-              <w:t xml:space="preserve">17.2 min</w:t>
+              <w:t xml:space="preserve">17.4 min</w:t>
             </w:r>
           </w:p>
         </w:tc>
@@ -10568,7 +10578,7 @@
                 <w:sz w:val="19"/>
                 <w:szCs w:val="19"/>
               </w:rPr>
-              <w:t xml:space="preserve">495</w:t>
+              <w:t xml:space="preserve">406</w:t>
             </w:r>
           </w:p>
         </w:tc>
@@ -10594,7 +10604,7 @@
                 <w:sz w:val="19"/>
                 <w:szCs w:val="19"/>
               </w:rPr>
-              <w:t xml:space="preserve">2.0</w:t>
+              <w:t xml:space="preserve">1.3</w:t>
             </w:r>
           </w:p>
         </w:tc>
@@ -10700,7 +10710,7 @@
                 <w:sz w:val="19"/>
                 <w:szCs w:val="19"/>
               </w:rPr>
-              <w:t xml:space="preserve">1.5 min</w:t>
+              <w:t xml:space="preserve">1.3 min</w:t>
             </w:r>
           </w:p>
         </w:tc>
@@ -10726,7 +10736,7 @@
                 <w:sz w:val="19"/>
                 <w:szCs w:val="19"/>
               </w:rPr>
-              <w:t xml:space="preserve">4.5 min</w:t>
+              <w:t xml:space="preserve">4.0 min</w:t>
             </w:r>
           </w:p>
         </w:tc>
@@ -10752,7 +10762,7 @@
                 <w:sz w:val="19"/>
                 <w:szCs w:val="19"/>
               </w:rPr>
-              <w:t xml:space="preserve">235</w:t>
+              <w:t xml:space="preserve">133</w:t>
             </w:r>
           </w:p>
         </w:tc>
@@ -10778,7 +10788,7 @@
                 <w:sz w:val="19"/>
                 <w:szCs w:val="19"/>
               </w:rPr>
-              <w:t xml:space="preserve">3.0</w:t>
+              <w:t xml:space="preserve">1.9</w:t>
             </w:r>
           </w:p>
         </w:tc>
@@ -10804,7 +10814,7 @@
                 <w:sz w:val="19"/>
                 <w:szCs w:val="19"/>
               </w:rPr>
-              <w:t xml:space="preserve">15%</w:t>
+              <w:t xml:space="preserve">13%</w:t>
             </w:r>
           </w:p>
         </w:tc>
@@ -10884,7 +10894,7 @@
                 <w:sz w:val="19"/>
                 <w:szCs w:val="19"/>
               </w:rPr>
-              <w:t xml:space="preserve">1.1 min</w:t>
+              <w:t xml:space="preserve">0.8 min</w:t>
             </w:r>
           </w:p>
         </w:tc>
@@ -10910,7 +10920,7 @@
                 <w:sz w:val="19"/>
                 <w:szCs w:val="19"/>
               </w:rPr>
-              <w:t xml:space="preserve">3.7 min</w:t>
+              <w:t xml:space="preserve">2.4 min</w:t>
             </w:r>
           </w:p>
         </w:tc>
@@ -10936,7 +10946,7 @@
                 <w:sz w:val="19"/>
                 <w:szCs w:val="19"/>
               </w:rPr>
-              <w:t xml:space="preserve">190</w:t>
+              <w:t xml:space="preserve">97</w:t>
             </w:r>
           </w:p>
         </w:tc>
@@ -10962,7 +10972,7 @@
                 <w:sz w:val="19"/>
                 <w:szCs w:val="19"/>
               </w:rPr>
-              <w:t xml:space="preserve">3.0</w:t>
+              <w:t xml:space="preserve">1.6</w:t>
             </w:r>
           </w:p>
         </w:tc>
@@ -10988,7 +10998,7 @@
                 <w:sz w:val="19"/>
                 <w:szCs w:val="19"/>
               </w:rPr>
-              <w:t xml:space="preserve">20%</w:t>
+              <w:t xml:space="preserve">14%</w:t>
             </w:r>
           </w:p>
         </w:tc>
@@ -11068,7 +11078,7 @@
                 <w:sz w:val="19"/>
                 <w:szCs w:val="19"/>
               </w:rPr>
-              <w:t xml:space="preserve">1.5 min</w:t>
+              <w:t xml:space="preserve">1.1 min</w:t>
             </w:r>
           </w:p>
         </w:tc>
@@ -11094,7 +11104,7 @@
                 <w:sz w:val="19"/>
                 <w:szCs w:val="19"/>
               </w:rPr>
-              <w:t xml:space="preserve">4.5 min</w:t>
+              <w:t xml:space="preserve">3.2 min</w:t>
             </w:r>
           </w:p>
         </w:tc>
@@ -11120,7 +11130,7 @@
                 <w:sz w:val="19"/>
                 <w:szCs w:val="19"/>
               </w:rPr>
-              <w:t xml:space="preserve">187</w:t>
+              <w:t xml:space="preserve">98</w:t>
             </w:r>
           </w:p>
         </w:tc>
@@ -11146,7 +11156,7 @@
                 <w:sz w:val="19"/>
                 <w:szCs w:val="19"/>
               </w:rPr>
-              <w:t xml:space="preserve">3.2</w:t>
+              <w:t xml:space="preserve">1.9</w:t>
             </w:r>
           </w:p>
         </w:tc>
@@ -11172,7 +11182,7 @@
                 <w:sz w:val="19"/>
                 <w:szCs w:val="19"/>
               </w:rPr>
-              <w:t xml:space="preserve">23%</w:t>
+              <w:t xml:space="preserve">18%</w:t>
             </w:r>
           </w:p>
         </w:tc>
@@ -11341,7 +11351,7 @@
                 <w:sz w:val="19"/>
                 <w:szCs w:val="19"/>
               </w:rPr>
-              <w:t xml:space="preserve">≈ 20.0 min</w:t>
+              <w:t xml:space="preserve">≈ 18.3 min</w:t>
             </w:r>
           </w:p>
         </w:tc>
@@ -11367,7 +11377,7 @@
                 <w:sz w:val="19"/>
                 <w:szCs w:val="19"/>
               </w:rPr>
-              <w:t xml:space="preserve">≈ 17.2 min</w:t>
+              <w:t xml:space="preserve">≈ 17.1 min</w:t>
             </w:r>
           </w:p>
         </w:tc>
@@ -11395,7 +11405,7 @@
                 <w:sz w:val="19"/>
                 <w:szCs w:val="19"/>
               </w:rPr>
-              <w:t xml:space="preserve">Peak</w:t>
+              <w:t xml:space="preserve">Peak (±15 min around the busiest moment)</w:t>
             </w:r>
           </w:p>
         </w:tc>
@@ -11421,7 +11431,7 @@
                 <w:sz w:val="19"/>
                 <w:szCs w:val="19"/>
               </w:rPr>
-              <w:t xml:space="preserve">≈ 25.4 min</w:t>
+              <w:t xml:space="preserve">≈ 25.3 min</w:t>
             </w:r>
           </w:p>
         </w:tc>
@@ -11447,7 +11457,591 @@
                 <w:sz w:val="19"/>
                 <w:szCs w:val="19"/>
               </w:rPr>
-              <w:t xml:space="preserve">≈ 19.6 min</w:t>
+              <w:t xml:space="preserve">≈ 18.1 min</w:t>
+            </w:r>
+          </w:p>
+        </w:tc>
+      </w:tr>
+    </w:tbl>
+    <w:p>
+      <w:pPr>
+        <w:spacing w:after="120"/>
+      </w:pPr>
+      <w:r>
+        <w:t xml:space="preserve">The simulated normal-day visit (18.3 min) matches the ~18 min we measured. </w:t>
+      </w:r>
+      <w:r>
+        <w:rPr>
+          <w:b/>
+          <w:bCs/>
+        </w:rPr>
+        <w:t xml:space="preserve">How much the restock time matters</w:t>
+      </w:r>
+      <w:r>
+        <w:t xml:space="preserve"> (equilibrium split, 60% follow):</w:t>
+      </w:r>
+    </w:p>
+    <w:tbl>
+      <w:tblPr>
+        <w:tblW w:type="dxa" w:w="9026"/>
+        <w:tblBorders>
+          <w:top w:val="single" w:color="auto" w:sz="4"/>
+          <w:left w:val="single" w:color="auto" w:sz="4"/>
+          <w:bottom w:val="single" w:color="auto" w:sz="4"/>
+          <w:right w:val="single" w:color="auto" w:sz="4"/>
+          <w:insideH w:val="single" w:color="auto" w:sz="4"/>
+          <w:insideV w:val="single" w:color="auto" w:sz="4"/>
+        </w:tblBorders>
+      </w:tblPr>
+      <w:tblGrid>
+        <w:gridCol w:w="2626"/>
+        <w:gridCol w:w="1600"/>
+        <w:gridCol w:w="1500"/>
+        <w:gridCol w:w="1400"/>
+        <w:gridCol w:w="1900"/>
+      </w:tblGrid>
+      <w:tr>
+        <w:trPr>
+          <w:tblHeader/>
+        </w:trPr>
+        <w:tc>
+          <w:tcPr>
+            <w:tcW w:type="dxa" w:w="2626"/>
+            <w:tcBorders>
+              <w:top w:val="single" w:color="D9D8D3" w:sz="4"/>
+              <w:left w:val="single" w:color="D9D8D3" w:sz="4"/>
+              <w:bottom w:val="single" w:color="D9D8D3" w:sz="4"/>
+              <w:right w:val="single" w:color="D9D8D3" w:sz="4"/>
+            </w:tcBorders>
+            <w:shd w:fill="ECEBE7" w:color="auto" w:val="clear"/>
+            <w:tcMar>
+              <w:top w:type="dxa" w:w="60"/>
+              <w:left w:type="dxa" w:w="100"/>
+              <w:bottom w:type="dxa" w:w="60"/>
+              <w:right w:type="dxa" w:w="100"/>
+            </w:tcMar>
+          </w:tcPr>
+          <w:p>
+            <w:r>
+              <w:rPr>
+                <w:b/>
+                <w:bCs/>
+                <w:sz w:val="19"/>
+                <w:szCs w:val="19"/>
+              </w:rPr>
+              <w:t xml:space="preserve">Next batch already made when the mess calls?</w:t>
+            </w:r>
+          </w:p>
+        </w:tc>
+        <w:tc>
+          <w:tcPr>
+            <w:tcW w:type="dxa" w:w="1600"/>
+            <w:tcBorders>
+              <w:top w:val="single" w:color="D9D8D3" w:sz="4"/>
+              <w:left w:val="single" w:color="D9D8D3" w:sz="4"/>
+              <w:bottom w:val="single" w:color="D9D8D3" w:sz="4"/>
+              <w:right w:val="single" w:color="D9D8D3" w:sz="4"/>
+            </w:tcBorders>
+            <w:shd w:fill="ECEBE7" w:color="auto" w:val="clear"/>
+            <w:tcMar>
+              <w:top w:type="dxa" w:w="60"/>
+              <w:left w:type="dxa" w:w="100"/>
+              <w:bottom w:type="dxa" w:w="60"/>
+              <w:right w:type="dxa" w:w="100"/>
+            </w:tcMar>
+          </w:tcPr>
+          <w:p>
+            <w:r>
+              <w:rPr>
+                <w:b/>
+                <w:bCs/>
+                <w:sz w:val="19"/>
+                <w:szCs w:val="19"/>
+              </w:rPr>
+              <w:t xml:space="preserve">Restock time</w:t>
+            </w:r>
+          </w:p>
+        </w:tc>
+        <w:tc>
+          <w:tcPr>
+            <w:tcW w:type="dxa" w:w="1500"/>
+            <w:tcBorders>
+              <w:top w:val="single" w:color="D9D8D3" w:sz="4"/>
+              <w:left w:val="single" w:color="D9D8D3" w:sz="4"/>
+              <w:bottom w:val="single" w:color="D9D8D3" w:sz="4"/>
+              <w:right w:val="single" w:color="D9D8D3" w:sz="4"/>
+            </w:tcBorders>
+            <w:shd w:fill="ECEBE7" w:color="auto" w:val="clear"/>
+            <w:tcMar>
+              <w:top w:type="dxa" w:w="60"/>
+              <w:left w:type="dxa" w:w="100"/>
+              <w:bottom w:type="dxa" w:w="60"/>
+              <w:right w:type="dxa" w:w="100"/>
+            </w:tcMar>
+          </w:tcPr>
+          <w:p>
+            <w:r>
+              <w:rPr>
+                <w:b/>
+                <w:bCs/>
+                <w:sz w:val="19"/>
+                <w:szCs w:val="19"/>
+              </w:rPr>
+              <w:t xml:space="preserve">Run-outs: no screens</w:t>
+            </w:r>
+          </w:p>
+        </w:tc>
+        <w:tc>
+          <w:tcPr>
+            <w:tcW w:type="dxa" w:w="1400"/>
+            <w:tcBorders>
+              <w:top w:val="single" w:color="D9D8D3" w:sz="4"/>
+              <w:left w:val="single" w:color="D9D8D3" w:sz="4"/>
+              <w:bottom w:val="single" w:color="D9D8D3" w:sz="4"/>
+              <w:right w:val="single" w:color="D9D8D3" w:sz="4"/>
+            </w:tcBorders>
+            <w:shd w:fill="ECEBE7" w:color="auto" w:val="clear"/>
+            <w:tcMar>
+              <w:top w:type="dxa" w:w="60"/>
+              <w:left w:type="dxa" w:w="100"/>
+              <w:bottom w:type="dxa" w:w="60"/>
+              <w:right w:type="dxa" w:w="100"/>
+            </w:tcMar>
+          </w:tcPr>
+          <w:p>
+            <w:r>
+              <w:rPr>
+                <w:b/>
+                <w:bCs/>
+                <w:sz w:val="19"/>
+                <w:szCs w:val="19"/>
+              </w:rPr>
+              <w:t xml:space="preserve">Run-outs: screens</w:t>
+            </w:r>
+          </w:p>
+        </w:tc>
+        <w:tc>
+          <w:tcPr>
+            <w:tcW w:type="dxa" w:w="1900"/>
+            <w:tcBorders>
+              <w:top w:val="single" w:color="D9D8D3" w:sz="4"/>
+              <w:left w:val="single" w:color="D9D8D3" w:sz="4"/>
+              <w:bottom w:val="single" w:color="D9D8D3" w:sz="4"/>
+              <w:right w:val="single" w:color="D9D8D3" w:sz="4"/>
+            </w:tcBorders>
+            <w:shd w:fill="ECEBE7" w:color="auto" w:val="clear"/>
+            <w:tcMar>
+              <w:top w:type="dxa" w:w="60"/>
+              <w:left w:type="dxa" w:w="100"/>
+              <w:bottom w:type="dxa" w:w="60"/>
+              <w:right w:type="dxa" w:w="100"/>
+            </w:tcMar>
+          </w:tcPr>
+          <w:p>
+            <w:r>
+              <w:rPr>
+                <w:b/>
+                <w:bCs/>
+                <w:sz w:val="19"/>
+                <w:szCs w:val="19"/>
+              </w:rPr>
+              <w:t xml:space="preserve">Average wait: no screens → screens</w:t>
+            </w:r>
+          </w:p>
+        </w:tc>
+      </w:tr>
+      <w:tr>
+        <w:tc>
+          <w:tcPr>
+            <w:tcW w:type="dxa" w:w="2626"/>
+            <w:tcBorders>
+              <w:top w:val="single" w:color="D9D8D3" w:sz="4"/>
+              <w:left w:val="single" w:color="D9D8D3" w:sz="4"/>
+              <w:bottom w:val="single" w:color="D9D8D3" w:sz="4"/>
+              <w:right w:val="single" w:color="D9D8D3" w:sz="4"/>
+            </w:tcBorders>
+            <w:tcMar>
+              <w:top w:type="dxa" w:w="60"/>
+              <w:left w:type="dxa" w:w="100"/>
+              <w:bottom w:type="dxa" w:w="60"/>
+              <w:right w:type="dxa" w:w="100"/>
+            </w:tcMar>
+          </w:tcPr>
+          <w:p>
+            <w:r>
+              <w:rPr>
+                <w:sz w:val="19"/>
+                <w:szCs w:val="19"/>
+              </w:rPr>
+              <w:t xml:space="preserve">Never</w:t>
+            </w:r>
+          </w:p>
+        </w:tc>
+        <w:tc>
+          <w:tcPr>
+            <w:tcW w:type="dxa" w:w="1600"/>
+            <w:tcBorders>
+              <w:top w:val="single" w:color="D9D8D3" w:sz="4"/>
+              <w:left w:val="single" w:color="D9D8D3" w:sz="4"/>
+              <w:bottom w:val="single" w:color="D9D8D3" w:sz="4"/>
+              <w:right w:val="single" w:color="D9D8D3" w:sz="4"/>
+            </w:tcBorders>
+            <w:tcMar>
+              <w:top w:type="dxa" w:w="60"/>
+              <w:left w:type="dxa" w:w="100"/>
+              <w:bottom w:type="dxa" w:w="60"/>
+              <w:right w:type="dxa" w:w="100"/>
+            </w:tcMar>
+          </w:tcPr>
+          <w:p>
+            <w:r>
+              <w:rPr>
+                <w:sz w:val="19"/>
+                <w:szCs w:val="19"/>
+              </w:rPr>
+              <w:t xml:space="preserve">30 min</w:t>
+            </w:r>
+          </w:p>
+        </w:tc>
+        <w:tc>
+          <w:tcPr>
+            <w:tcW w:type="dxa" w:w="1500"/>
+            <w:tcBorders>
+              <w:top w:val="single" w:color="D9D8D3" w:sz="4"/>
+              <w:left w:val="single" w:color="D9D8D3" w:sz="4"/>
+              <w:bottom w:val="single" w:color="D9D8D3" w:sz="4"/>
+              <w:right w:val="single" w:color="D9D8D3" w:sz="4"/>
+            </w:tcBorders>
+            <w:tcMar>
+              <w:top w:type="dxa" w:w="60"/>
+              <w:left w:type="dxa" w:w="100"/>
+              <w:bottom w:type="dxa" w:w="60"/>
+              <w:right w:type="dxa" w:w="100"/>
+            </w:tcMar>
+          </w:tcPr>
+          <w:p>
+            <w:r>
+              <w:rPr>
+                <w:sz w:val="19"/>
+                <w:szCs w:val="19"/>
+              </w:rPr>
+              <w:t xml:space="preserve">2.0</w:t>
+            </w:r>
+          </w:p>
+        </w:tc>
+        <w:tc>
+          <w:tcPr>
+            <w:tcW w:type="dxa" w:w="1400"/>
+            <w:tcBorders>
+              <w:top w:val="single" w:color="D9D8D3" w:sz="4"/>
+              <w:left w:val="single" w:color="D9D8D3" w:sz="4"/>
+              <w:bottom w:val="single" w:color="D9D8D3" w:sz="4"/>
+              <w:right w:val="single" w:color="D9D8D3" w:sz="4"/>
+            </w:tcBorders>
+            <w:tcMar>
+              <w:top w:type="dxa" w:w="60"/>
+              <w:left w:type="dxa" w:w="100"/>
+              <w:bottom w:type="dxa" w:w="60"/>
+              <w:right w:type="dxa" w:w="100"/>
+            </w:tcMar>
+          </w:tcPr>
+          <w:p>
+            <w:r>
+              <w:rPr>
+                <w:sz w:val="19"/>
+                <w:szCs w:val="19"/>
+              </w:rPr>
+              <w:t xml:space="preserve">3.0</w:t>
+            </w:r>
+          </w:p>
+        </w:tc>
+        <w:tc>
+          <w:tcPr>
+            <w:tcW w:type="dxa" w:w="1900"/>
+            <w:tcBorders>
+              <w:top w:val="single" w:color="D9D8D3" w:sz="4"/>
+              <w:left w:val="single" w:color="D9D8D3" w:sz="4"/>
+              <w:bottom w:val="single" w:color="D9D8D3" w:sz="4"/>
+              <w:right w:val="single" w:color="D9D8D3" w:sz="4"/>
+            </w:tcBorders>
+            <w:tcMar>
+              <w:top w:type="dxa" w:w="60"/>
+              <w:left w:type="dxa" w:w="100"/>
+              <w:bottom w:type="dxa" w:w="60"/>
+              <w:right w:type="dxa" w:w="100"/>
+            </w:tcMar>
+          </w:tcPr>
+          <w:p>
+            <w:r>
+              <w:rPr>
+                <w:sz w:val="19"/>
+                <w:szCs w:val="19"/>
+              </w:rPr>
+              <w:t xml:space="preserve">7.0 → 0.9 min</w:t>
+            </w:r>
+          </w:p>
+        </w:tc>
+      </w:tr>
+      <w:tr>
+        <w:tc>
+          <w:tcPr>
+            <w:tcW w:type="dxa" w:w="2626"/>
+            <w:tcBorders>
+              <w:top w:val="single" w:color="D9D8D3" w:sz="4"/>
+              <w:left w:val="single" w:color="D9D8D3" w:sz="4"/>
+              <w:bottom w:val="single" w:color="D9D8D3" w:sz="4"/>
+              <w:right w:val="single" w:color="D9D8D3" w:sz="4"/>
+            </w:tcBorders>
+            <w:tcMar>
+              <w:top w:type="dxa" w:w="60"/>
+              <w:left w:type="dxa" w:w="100"/>
+              <w:bottom w:type="dxa" w:w="60"/>
+              <w:right w:type="dxa" w:w="100"/>
+            </w:tcMar>
+          </w:tcPr>
+          <w:p>
+            <w:r>
+              <w:rPr>
+                <w:sz w:val="19"/>
+                <w:szCs w:val="19"/>
+              </w:rPr>
+              <w:t xml:space="preserve">Half the time (default)</w:t>
+            </w:r>
+          </w:p>
+        </w:tc>
+        <w:tc>
+          <w:tcPr>
+            <w:tcW w:type="dxa" w:w="1600"/>
+            <w:tcBorders>
+              <w:top w:val="single" w:color="D9D8D3" w:sz="4"/>
+              <w:left w:val="single" w:color="D9D8D3" w:sz="4"/>
+              <w:bottom w:val="single" w:color="D9D8D3" w:sz="4"/>
+              <w:right w:val="single" w:color="D9D8D3" w:sz="4"/>
+            </w:tcBorders>
+            <w:tcMar>
+              <w:top w:type="dxa" w:w="60"/>
+              <w:left w:type="dxa" w:w="100"/>
+              <w:bottom w:type="dxa" w:w="60"/>
+              <w:right w:type="dxa" w:w="100"/>
+            </w:tcMar>
+          </w:tcPr>
+          <w:p>
+            <w:r>
+              <w:rPr>
+                <w:sz w:val="19"/>
+                <w:szCs w:val="19"/>
+              </w:rPr>
+              <w:t xml:space="preserve">30 or 10–14 min</w:t>
+            </w:r>
+          </w:p>
+        </w:tc>
+        <w:tc>
+          <w:tcPr>
+            <w:tcW w:type="dxa" w:w="1500"/>
+            <w:tcBorders>
+              <w:top w:val="single" w:color="D9D8D3" w:sz="4"/>
+              <w:left w:val="single" w:color="D9D8D3" w:sz="4"/>
+              <w:bottom w:val="single" w:color="D9D8D3" w:sz="4"/>
+              <w:right w:val="single" w:color="D9D8D3" w:sz="4"/>
+            </w:tcBorders>
+            <w:tcMar>
+              <w:top w:type="dxa" w:w="60"/>
+              <w:left w:type="dxa" w:w="100"/>
+              <w:bottom w:type="dxa" w:w="60"/>
+              <w:right w:type="dxa" w:w="100"/>
+            </w:tcMar>
+          </w:tcPr>
+          <w:p>
+            <w:r>
+              <w:rPr>
+                <w:sz w:val="19"/>
+                <w:szCs w:val="19"/>
+              </w:rPr>
+              <w:t xml:space="preserve">1.3</w:t>
+            </w:r>
+          </w:p>
+        </w:tc>
+        <w:tc>
+          <w:tcPr>
+            <w:tcW w:type="dxa" w:w="1400"/>
+            <w:tcBorders>
+              <w:top w:val="single" w:color="D9D8D3" w:sz="4"/>
+              <w:left w:val="single" w:color="D9D8D3" w:sz="4"/>
+              <w:bottom w:val="single" w:color="D9D8D3" w:sz="4"/>
+              <w:right w:val="single" w:color="D9D8D3" w:sz="4"/>
+            </w:tcBorders>
+            <w:tcMar>
+              <w:top w:type="dxa" w:w="60"/>
+              <w:left w:type="dxa" w:w="100"/>
+              <w:bottom w:type="dxa" w:w="60"/>
+              <w:right w:type="dxa" w:w="100"/>
+            </w:tcMar>
+          </w:tcPr>
+          <w:p>
+            <w:r>
+              <w:rPr>
+                <w:sz w:val="19"/>
+                <w:szCs w:val="19"/>
+              </w:rPr>
+              <w:t xml:space="preserve">1.6</w:t>
+            </w:r>
+          </w:p>
+        </w:tc>
+        <w:tc>
+          <w:tcPr>
+            <w:tcW w:type="dxa" w:w="1900"/>
+            <w:tcBorders>
+              <w:top w:val="single" w:color="D9D8D3" w:sz="4"/>
+              <w:left w:val="single" w:color="D9D8D3" w:sz="4"/>
+              <w:bottom w:val="single" w:color="D9D8D3" w:sz="4"/>
+              <w:right w:val="single" w:color="D9D8D3" w:sz="4"/>
+            </w:tcBorders>
+            <w:tcMar>
+              <w:top w:type="dxa" w:w="60"/>
+              <w:left w:type="dxa" w:w="100"/>
+              <w:bottom w:type="dxa" w:w="60"/>
+              <w:right w:type="dxa" w:w="100"/>
+            </w:tcMar>
+          </w:tcPr>
+          <w:p>
+            <w:r>
+              <w:rPr>
+                <w:sz w:val="19"/>
+                <w:szCs w:val="19"/>
+              </w:rPr>
+              <w:t xml:space="preserve">7.1 → 0.8 min</w:t>
+            </w:r>
+          </w:p>
+        </w:tc>
+      </w:tr>
+      <w:tr>
+        <w:tc>
+          <w:tcPr>
+            <w:tcW w:type="dxa" w:w="2626"/>
+            <w:tcBorders>
+              <w:top w:val="single" w:color="D9D8D3" w:sz="4"/>
+              <w:left w:val="single" w:color="D9D8D3" w:sz="4"/>
+              <w:bottom w:val="single" w:color="D9D8D3" w:sz="4"/>
+              <w:right w:val="single" w:color="D9D8D3" w:sz="4"/>
+            </w:tcBorders>
+            <w:tcMar>
+              <w:top w:type="dxa" w:w="60"/>
+              <w:left w:type="dxa" w:w="100"/>
+              <w:bottom w:type="dxa" w:w="60"/>
+              <w:right w:type="dxa" w:w="100"/>
+            </w:tcMar>
+          </w:tcPr>
+          <w:p>
+            <w:r>
+              <w:rPr>
+                <w:sz w:val="19"/>
+                <w:szCs w:val="19"/>
+              </w:rPr>
+              <w:t xml:space="preserve">Always</w:t>
+            </w:r>
+          </w:p>
+        </w:tc>
+        <w:tc>
+          <w:tcPr>
+            <w:tcW w:type="dxa" w:w="1600"/>
+            <w:tcBorders>
+              <w:top w:val="single" w:color="D9D8D3" w:sz="4"/>
+              <w:left w:val="single" w:color="D9D8D3" w:sz="4"/>
+              <w:bottom w:val="single" w:color="D9D8D3" w:sz="4"/>
+              <w:right w:val="single" w:color="D9D8D3" w:sz="4"/>
+            </w:tcBorders>
+            <w:tcMar>
+              <w:top w:type="dxa" w:w="60"/>
+              <w:left w:type="dxa" w:w="100"/>
+              <w:bottom w:type="dxa" w:w="60"/>
+              <w:right w:type="dxa" w:w="100"/>
+            </w:tcMar>
+          </w:tcPr>
+          <w:p>
+            <w:r>
+              <w:rPr>
+                <w:sz w:val="19"/>
+                <w:szCs w:val="19"/>
+              </w:rPr>
+              <w:t xml:space="preserve">10–14 min</w:t>
+            </w:r>
+          </w:p>
+        </w:tc>
+        <w:tc>
+          <w:tcPr>
+            <w:tcW w:type="dxa" w:w="1500"/>
+            <w:tcBorders>
+              <w:top w:val="single" w:color="D9D8D3" w:sz="4"/>
+              <w:left w:val="single" w:color="D9D8D3" w:sz="4"/>
+              <w:bottom w:val="single" w:color="D9D8D3" w:sz="4"/>
+              <w:right w:val="single" w:color="D9D8D3" w:sz="4"/>
+            </w:tcBorders>
+            <w:tcMar>
+              <w:top w:type="dxa" w:w="60"/>
+              <w:left w:type="dxa" w:w="100"/>
+              <w:bottom w:type="dxa" w:w="60"/>
+              <w:right w:type="dxa" w:w="100"/>
+            </w:tcMar>
+          </w:tcPr>
+          <w:p>
+            <w:r>
+              <w:rPr>
+                <w:sz w:val="19"/>
+                <w:szCs w:val="19"/>
+              </w:rPr>
+              <w:t xml:space="preserve">0</w:t>
+            </w:r>
+          </w:p>
+        </w:tc>
+        <w:tc>
+          <w:tcPr>
+            <w:tcW w:type="dxa" w:w="1400"/>
+            <w:tcBorders>
+              <w:top w:val="single" w:color="D9D8D3" w:sz="4"/>
+              <w:left w:val="single" w:color="D9D8D3" w:sz="4"/>
+              <w:bottom w:val="single" w:color="D9D8D3" w:sz="4"/>
+              <w:right w:val="single" w:color="D9D8D3" w:sz="4"/>
+            </w:tcBorders>
+            <w:tcMar>
+              <w:top w:type="dxa" w:w="60"/>
+              <w:left w:type="dxa" w:w="100"/>
+              <w:bottom w:type="dxa" w:w="60"/>
+              <w:right w:type="dxa" w:w="100"/>
+            </w:tcMar>
+          </w:tcPr>
+          <w:p>
+            <w:r>
+              <w:rPr>
+                <w:sz w:val="19"/>
+                <w:szCs w:val="19"/>
+              </w:rPr>
+              <w:t xml:space="preserve">0</w:t>
+            </w:r>
+          </w:p>
+        </w:tc>
+        <w:tc>
+          <w:tcPr>
+            <w:tcW w:type="dxa" w:w="1900"/>
+            <w:tcBorders>
+              <w:top w:val="single" w:color="D9D8D3" w:sz="4"/>
+              <w:left w:val="single" w:color="D9D8D3" w:sz="4"/>
+              <w:bottom w:val="single" w:color="D9D8D3" w:sz="4"/>
+              <w:right w:val="single" w:color="D9D8D3" w:sz="4"/>
+            </w:tcBorders>
+            <w:tcMar>
+              <w:top w:type="dxa" w:w="60"/>
+              <w:left w:type="dxa" w:w="100"/>
+              <w:bottom w:type="dxa" w:w="60"/>
+              <w:right w:type="dxa" w:w="100"/>
+            </w:tcMar>
+          </w:tcPr>
+          <w:p>
+            <w:r>
+              <w:rPr>
+                <w:sz w:val="19"/>
+                <w:szCs w:val="19"/>
+              </w:rPr>
+              <w:t xml:space="preserve">7.2 → 0.9 min</w:t>
             </w:r>
           </w:p>
         </w:tc>
@@ -11495,10 +12089,10 @@
           <w:b/>
           <w:bCs/>
         </w:rPr>
-        <w:t xml:space="preserve">average wait from about 7 to about 1–1.5 minutes</w:t>
-      </w:r>
-      <w:r>
-        <w:t xml:space="preserve"> and long waits (90th percentile) from about 17 to about 4 minutes.</w:t>
+        <w:t xml:space="preserve">average wait from about 7 to about 1 minute</w:t>
+      </w:r>
+      <w:r>
+        <w:t xml:space="preserve"> and long waits (90th percentile) from about 17 to about 2.5–4 minutes.</w:t>
       </w:r>
     </w:p>
     <w:p>
@@ -11518,10 +12112,10 @@
           <w:b/>
           <w:bCs/>
         </w:rPr>
-        <w:t xml:space="preserve">1 in 5 students</w:t>
-      </w:r>
-      <w:r>
-        <w:t xml:space="preserve"> has to walk to the other mess for this (15–23%). Because 85% start at Central, rebalancing needs more movement than a more even habit split would.</w:t>
+        <w:t xml:space="preserve">1 in 7 students</w:t>
+      </w:r>
+      <w:r>
+        <w:t xml:space="preserve"> has to walk to the other mess for this (13–18%). Because 85% start at Central, rebalancing needs more movement than a more even habit split would.</w:t>
       </w:r>
     </w:p>
     <w:p>
@@ -11541,7 +12135,27 @@
         <w:t xml:space="preserve">Moving students moves the run-outs.</w:t>
       </w:r>
       <w:r>
-        <w:t xml:space="preserve"> Food run-outs rise slightly with screens (about 2 → 3 per lunch) because Munch now feeds more students and a restock takes 35 minutes. Student routing and food allocation must be planned together (sections 7.4–7.6).</w:t>
+        <w:t xml:space="preserve"> Food run-outs rise slightly with screens because Munch now feeds more students and a 30-minute call-back restock cannot keep up. Student routing and food allocation must be planned together (sections 7.4–7.6).</w:t>
+      </w:r>
+    </w:p>
+    <w:p>
+      <w:pPr>
+        <w:pStyle w:val="ListParagraph"/>
+        <w:numPr>
+          <w:ilvl w:val="0"/>
+          <w:numId w:val="3"/>
+        </w:numPr>
+        <w:spacing w:after="60"/>
+      </w:pPr>
+      <w:r>
+        <w:rPr>
+          <w:b/>
+          <w:bCs/>
+        </w:rPr>
+        <w:t xml:space="preserve">Run-outs are a kitchen-timing problem.</w:t>
+      </w:r>
+      <w:r>
+        <w:t xml:space="preserve"> If the next batch is always made before the mess calls (10–14 min to send instead of 30), run-outs disappear in the model, while waits barely change: the serving stations, not the food, set the queue. This supports early kitchen alerts from the scan data.</w:t>
       </w:r>
     </w:p>
     <w:p>
@@ -12569,7 +13183,7 @@
         <w:spacing w:after="60"/>
       </w:pPr>
       <w:r>
-        <w:t xml:space="preserve">Why do dishes run out? Because replenishment is triggered after stock is low, and takes 25–30 min plus 7–8 min of delivery.</w:t>
+        <w:t xml:space="preserve">Why do dishes run out? Because replenishment is triggered only when stock is running low, and then takes 30 min if the kitchen has to make it (10–14 min if already made).</w:t>
       </w:r>
     </w:p>
     <w:p>
@@ -13382,17 +13996,17 @@
         <w:t xml:space="preserve">Decision:</w:t>
       </w:r>
       <w:r>
-        <w:t xml:space="preserve"> at 12:30 (before the peak), should the kitchen send an extra batch of the star dish </w:t>
+        <w:t xml:space="preserve"> at 12:30 (before the peak), should the kitchen cook the next batch of the star dish </w:t>
       </w:r>
       <w:r>
         <w:rPr>
           <w:b/>
           <w:bCs/>
         </w:rPr>
-        <w:t xml:space="preserve">pre-emptively</w:t>
-      </w:r>
-      <w:r>
-        <w:t xml:space="preserve">, or </w:t>
+        <w:t xml:space="preserve">ahead</w:t>
+      </w:r>
+      <w:r>
+        <w:t xml:space="preserve"> (so a refill reaches the mess 10–14 min after the call), or </w:t>
       </w:r>
       <w:r>
         <w:rPr>
@@ -13402,7 +14016,7 @@
         <w:t xml:space="preserve">wait and react</w:t>
       </w:r>
       <w:r>
-        <w:t xml:space="preserve"> when it runs low? (All costs and probabilities below are </w:t>
+        <w:t xml:space="preserve"> to the "running low" call (30 min)? (All costs and probabilities below are </w:t>
       </w:r>
       <w:r>
         <w:rPr>
@@ -13749,7 +14363,7 @@
         <w:t xml:space="preserve">Replenishment trips:</w:t>
       </w:r>
       <w:r>
-        <w:t xml:space="preserve"> y_t ∈ {0, 1} = 1 if the vehicle leaves at time t. Each trip carries at most Q portions, must leave 25–30 min after the cook starts, and cumulative deliveries must stay ahead of cumulative forecast demand. Minimise trips plus shortage cost.</w:t>
+        <w:t xml:space="preserve"> y_t ∈ {0, 1} = 1 if the vehicle leaves at time t. Each trip carries at most Q portions, arrives 30 min after a call if it must be made (10–14 min if already made), and cumulative deliveries must stay ahead of cumulative forecast demand. Minimise trips plus shortage cost.</w:t>
       </w:r>
     </w:p>
     <w:p>
@@ -15271,7 +15885,7 @@
                 <w:sz w:val="19"/>
                 <w:szCs w:val="19"/>
               </w:rPr>
-              <w:t xml:space="preserve">25–30 min prep + 7–8 min delivery</w:t>
+              <w:t xml:space="preserve">30 min after the call if it has to be made; 10–14 min if already made</w:t>
             </w:r>
           </w:p>
         </w:tc>
@@ -15325,7 +15939,113 @@
                 <w:sz w:val="19"/>
                 <w:szCs w:val="19"/>
               </w:rPr>
-              <w:t xml:space="preserve">Done (Phase 1)</w:t>
+              <w:t xml:space="preserve">Done</w:t>
+            </w:r>
+          </w:p>
+        </w:tc>
+      </w:tr>
+      <w:tr>
+        <w:tc>
+          <w:tcPr>
+            <w:tcW w:type="dxa" w:w="2400"/>
+            <w:tcBorders>
+              <w:top w:val="single" w:color="D9D8D3" w:sz="4"/>
+              <w:left w:val="single" w:color="D9D8D3" w:sz="4"/>
+              <w:bottom w:val="single" w:color="D9D8D3" w:sz="4"/>
+              <w:right w:val="single" w:color="D9D8D3" w:sz="4"/>
+            </w:tcBorders>
+            <w:tcMar>
+              <w:top w:type="dxa" w:w="60"/>
+              <w:left w:type="dxa" w:w="100"/>
+              <w:bottom w:type="dxa" w:w="60"/>
+              <w:right w:type="dxa" w:w="100"/>
+            </w:tcMar>
+          </w:tcPr>
+          <w:p>
+            <w:r>
+              <w:rPr>
+                <w:sz w:val="19"/>
+                <w:szCs w:val="19"/>
+              </w:rPr>
+              <w:t xml:space="preserve">Chance the next batch is already made</w:t>
+            </w:r>
+          </w:p>
+        </w:tc>
+        <w:tc>
+          <w:tcPr>
+            <w:tcW w:type="dxa" w:w="2400"/>
+            <w:tcBorders>
+              <w:top w:val="single" w:color="D9D8D3" w:sz="4"/>
+              <w:left w:val="single" w:color="D9D8D3" w:sz="4"/>
+              <w:bottom w:val="single" w:color="D9D8D3" w:sz="4"/>
+              <w:right w:val="single" w:color="D9D8D3" w:sz="4"/>
+            </w:tcBorders>
+            <w:tcMar>
+              <w:top w:type="dxa" w:w="60"/>
+              <w:left w:type="dxa" w:w="100"/>
+              <w:bottom w:type="dxa" w:w="60"/>
+              <w:right w:type="dxa" w:w="100"/>
+            </w:tcMar>
+          </w:tcPr>
+          <w:p>
+            <w:r>
+              <w:rPr>
+                <w:sz w:val="19"/>
+                <w:szCs w:val="19"/>
+              </w:rPr>
+              <w:t xml:space="preserve">50%</w:t>
+            </w:r>
+          </w:p>
+        </w:tc>
+        <w:tc>
+          <w:tcPr>
+            <w:tcW w:type="dxa" w:w="1700"/>
+            <w:tcBorders>
+              <w:top w:val="single" w:color="D9D8D3" w:sz="4"/>
+              <w:left w:val="single" w:color="D9D8D3" w:sz="4"/>
+              <w:bottom w:val="single" w:color="D9D8D3" w:sz="4"/>
+              <w:right w:val="single" w:color="D9D8D3" w:sz="4"/>
+            </w:tcBorders>
+            <w:tcMar>
+              <w:top w:type="dxa" w:w="60"/>
+              <w:left w:type="dxa" w:w="100"/>
+              <w:bottom w:type="dxa" w:w="60"/>
+              <w:right w:type="dxa" w:w="100"/>
+            </w:tcMar>
+          </w:tcPr>
+          <w:p>
+            <w:r>
+              <w:rPr>
+                <w:sz w:val="19"/>
+                <w:szCs w:val="19"/>
+              </w:rPr>
+              <w:t xml:space="preserve">Assumed</w:t>
+            </w:r>
+          </w:p>
+        </w:tc>
+        <w:tc>
+          <w:tcPr>
+            <w:tcW w:type="dxa" w:w="2526"/>
+            <w:tcBorders>
+              <w:top w:val="single" w:color="D9D8D3" w:sz="4"/>
+              <w:left w:val="single" w:color="D9D8D3" w:sz="4"/>
+              <w:bottom w:val="single" w:color="D9D8D3" w:sz="4"/>
+              <w:right w:val="single" w:color="D9D8D3" w:sz="4"/>
+            </w:tcBorders>
+            <w:tcMar>
+              <w:top w:type="dxa" w:w="60"/>
+              <w:left w:type="dxa" w:w="100"/>
+              <w:bottom w:type="dxa" w:w="60"/>
+              <w:right w:type="dxa" w:w="100"/>
+            </w:tcMar>
+          </w:tcPr>
+          <w:p>
+            <w:r>
+              <w:rPr>
+                <w:sz w:val="19"/>
+                <w:szCs w:val="19"/>
+              </w:rPr>
+              <w:t xml:space="preserve">Ask the CT kitchen</w:t>
             </w:r>
           </w:p>
         </w:tc>

</xml_diff>

<commit_message>
Food already made ~70% of the time when the mess calls (group estimate); rerun results
Co-Authored-By: Claude Opus 5.5 <noreply@anthropic.com>
Claude-Session: https://claude.ai/code/session_013JwSYm4UV7vKHqaUukbU1G
</commit_message>
<xml_diff>
--- a/docs/MDS_Queuing_Theory_and_Simulation.docx
+++ b/docs/MDS_Queuing_Theory_and_Simulation.docx
@@ -9611,7 +9611,7 @@
                 <w:sz w:val="19"/>
                 <w:szCs w:val="19"/>
               </w:rPr>
-              <w:t xml:space="preserve">Batches of the main dish (900 at Central, 500 at Munch, assumed); when stock falls to a call level (assumed) the mess calls the kitchen; the refill arrives 30 min later if it has to be made, or 10–14 min later if already made (both measured; an assumed 50% chance it is already made); if stock hits 0, the stations stop</w:t>
+              <w:t xml:space="preserve">Batches of the main dish (900 at Central, 500 at Munch, assumed); when stock falls to a call level (assumed) the mess calls the kitchen; the refill arrives 30 min later if it has to be made, or 10–14 min later if already made (both measured; the group estimates it is already made about 70% of the time); if stock hits 0, the stations stop</w:t>
             </w:r>
           </w:p>
         </w:tc>
@@ -10219,7 +10219,17 @@
         <w:t xml:space="preserve">Assumed:</w:t>
       </w:r>
       <w:r>
-        <w:t xml:space="preserve"> the 85/15 habit split, 10 students/min per station, 2 s per scan, a 50% chance the next batch is already made, food batches and the arrival curve. They show what the method can do; the pilot will show what actually happens.</w:t>
+        <w:t xml:space="preserve"> the 85/15 habit split, 10 students/min per station, 2 s per scan, food batches and the arrival curve. </w:t>
+      </w:r>
+      <w:r>
+        <w:rPr>
+          <w:b/>
+          <w:bCs/>
+        </w:rPr>
+        <w:t xml:space="preserve">Group estimate:</w:t>
+      </w:r>
+      <w:r>
+        <w:t xml:space="preserve"> the next batch is already made about 70% of the time. They show what the method can do; the pilot will show what actually happens.</w:t>
       </w:r>
     </w:p>
     <w:tbl>
@@ -10526,7 +10536,7 @@
                 <w:sz w:val="19"/>
                 <w:szCs w:val="19"/>
               </w:rPr>
-              <w:t xml:space="preserve">7.1 min</w:t>
+              <w:t xml:space="preserve">7.2 min</w:t>
             </w:r>
           </w:p>
         </w:tc>
@@ -10552,7 +10562,7 @@
                 <w:sz w:val="19"/>
                 <w:szCs w:val="19"/>
               </w:rPr>
-              <w:t xml:space="preserve">17.4 min</w:t>
+              <w:t xml:space="preserve">17.6 min</w:t>
             </w:r>
           </w:p>
         </w:tc>
@@ -10578,7 +10588,7 @@
                 <w:sz w:val="19"/>
                 <w:szCs w:val="19"/>
               </w:rPr>
-              <w:t xml:space="preserve">406</w:t>
+              <w:t xml:space="preserve">405</w:t>
             </w:r>
           </w:p>
         </w:tc>
@@ -10604,7 +10614,7 @@
                 <w:sz w:val="19"/>
                 <w:szCs w:val="19"/>
               </w:rPr>
-              <w:t xml:space="preserve">1.3</w:t>
+              <w:t xml:space="preserve">0.8</w:t>
             </w:r>
           </w:p>
         </w:tc>
@@ -10710,7 +10720,7 @@
                 <w:sz w:val="19"/>
                 <w:szCs w:val="19"/>
               </w:rPr>
-              <w:t xml:space="preserve">1.3 min</w:t>
+              <w:t xml:space="preserve">1.4 min</w:t>
             </w:r>
           </w:p>
         </w:tc>
@@ -10736,7 +10746,7 @@
                 <w:sz w:val="19"/>
                 <w:szCs w:val="19"/>
               </w:rPr>
-              <w:t xml:space="preserve">4.0 min</w:t>
+              <w:t xml:space="preserve">4.3 min</w:t>
             </w:r>
           </w:p>
         </w:tc>
@@ -10762,7 +10772,7 @@
                 <w:sz w:val="19"/>
                 <w:szCs w:val="19"/>
               </w:rPr>
-              <w:t xml:space="preserve">133</w:t>
+              <w:t xml:space="preserve">119</w:t>
             </w:r>
           </w:p>
         </w:tc>
@@ -10788,7 +10798,7 @@
                 <w:sz w:val="19"/>
                 <w:szCs w:val="19"/>
               </w:rPr>
-              <w:t xml:space="preserve">1.9</w:t>
+              <w:t xml:space="preserve">1.1</w:t>
             </w:r>
           </w:p>
         </w:tc>
@@ -10814,7 +10824,7 @@
                 <w:sz w:val="19"/>
                 <w:szCs w:val="19"/>
               </w:rPr>
-              <w:t xml:space="preserve">13%</w:t>
+              <w:t xml:space="preserve">12%</w:t>
             </w:r>
           </w:p>
         </w:tc>
@@ -10920,7 +10930,7 @@
                 <w:sz w:val="19"/>
                 <w:szCs w:val="19"/>
               </w:rPr>
-              <w:t xml:space="preserve">2.4 min</w:t>
+              <w:t xml:space="preserve">2.5 min</w:t>
             </w:r>
           </w:p>
         </w:tc>
@@ -10946,7 +10956,7 @@
                 <w:sz w:val="19"/>
                 <w:szCs w:val="19"/>
               </w:rPr>
-              <w:t xml:space="preserve">97</w:t>
+              <w:t xml:space="preserve">84</w:t>
             </w:r>
           </w:p>
         </w:tc>
@@ -10972,7 +10982,7 @@
                 <w:sz w:val="19"/>
                 <w:szCs w:val="19"/>
               </w:rPr>
-              <w:t xml:space="preserve">1.6</w:t>
+              <w:t xml:space="preserve">0.9</w:t>
             </w:r>
           </w:p>
         </w:tc>
@@ -10998,7 +11008,7 @@
                 <w:sz w:val="19"/>
                 <w:szCs w:val="19"/>
               </w:rPr>
-              <w:t xml:space="preserve">14%</w:t>
+              <w:t xml:space="preserve">13%</w:t>
             </w:r>
           </w:p>
         </w:tc>
@@ -11078,7 +11088,7 @@
                 <w:sz w:val="19"/>
                 <w:szCs w:val="19"/>
               </w:rPr>
-              <w:t xml:space="preserve">1.1 min</w:t>
+              <w:t xml:space="preserve">0.9 min</w:t>
             </w:r>
           </w:p>
         </w:tc>
@@ -11104,7 +11114,7 @@
                 <w:sz w:val="19"/>
                 <w:szCs w:val="19"/>
               </w:rPr>
-              <w:t xml:space="preserve">3.2 min</w:t>
+              <w:t xml:space="preserve">2.7 min</w:t>
             </w:r>
           </w:p>
         </w:tc>
@@ -11130,7 +11140,7 @@
                 <w:sz w:val="19"/>
                 <w:szCs w:val="19"/>
               </w:rPr>
-              <w:t xml:space="preserve">98</w:t>
+              <w:t xml:space="preserve">80</w:t>
             </w:r>
           </w:p>
         </w:tc>
@@ -11156,7 +11166,7 @@
                 <w:sz w:val="19"/>
                 <w:szCs w:val="19"/>
               </w:rPr>
-              <w:t xml:space="preserve">1.9</w:t>
+              <w:t xml:space="preserve">0.9</w:t>
             </w:r>
           </w:p>
         </w:tc>
@@ -11182,7 +11192,7 @@
                 <w:sz w:val="19"/>
                 <w:szCs w:val="19"/>
               </w:rPr>
-              <w:t xml:space="preserve">18%</w:t>
+              <w:t xml:space="preserve">16%</w:t>
             </w:r>
           </w:p>
         </w:tc>
@@ -11351,7 +11361,7 @@
                 <w:sz w:val="19"/>
                 <w:szCs w:val="19"/>
               </w:rPr>
-              <w:t xml:space="preserve">≈ 18.3 min</w:t>
+              <w:t xml:space="preserve">≈ 18.4 min</w:t>
             </w:r>
           </w:p>
         </w:tc>
@@ -11377,7 +11387,7 @@
                 <w:sz w:val="19"/>
                 <w:szCs w:val="19"/>
               </w:rPr>
-              <w:t xml:space="preserve">≈ 17.1 min</w:t>
+              <w:t xml:space="preserve">≈ 17.3 min</w:t>
             </w:r>
           </w:p>
         </w:tc>
@@ -11431,7 +11441,7 @@
                 <w:sz w:val="19"/>
                 <w:szCs w:val="19"/>
               </w:rPr>
-              <w:t xml:space="preserve">≈ 25.3 min</w:t>
+              <w:t xml:space="preserve">≈ 25.2 min</w:t>
             </w:r>
           </w:p>
         </w:tc>
@@ -11468,7 +11478,7 @@
         <w:spacing w:after="120"/>
       </w:pPr>
       <w:r>
-        <w:t xml:space="preserve">The simulated normal-day visit (18.3 min) matches the ~18 min we measured. </w:t>
+        <w:t xml:space="preserve">The simulated normal-day visit (18.4 min) matches the ~18 min we measured. </w:t>
       </w:r>
       <w:r>
         <w:rPr>
@@ -11805,7 +11815,7 @@
                 <w:sz w:val="19"/>
                 <w:szCs w:val="19"/>
               </w:rPr>
-              <w:t xml:space="preserve">Half the time (default)</w:t>
+              <w:t xml:space="preserve">Half the time</w:t>
             </w:r>
           </w:p>
         </w:tc>
@@ -11910,6 +11920,138 @@
                 <w:szCs w:val="19"/>
               </w:rPr>
               <w:t xml:space="preserve">7.1 → 0.8 min</w:t>
+            </w:r>
+          </w:p>
+        </w:tc>
+      </w:tr>
+      <w:tr>
+        <w:tc>
+          <w:tcPr>
+            <w:tcW w:type="dxa" w:w="2626"/>
+            <w:tcBorders>
+              <w:top w:val="single" w:color="D9D8D3" w:sz="4"/>
+              <w:left w:val="single" w:color="D9D8D3" w:sz="4"/>
+              <w:bottom w:val="single" w:color="D9D8D3" w:sz="4"/>
+              <w:right w:val="single" w:color="D9D8D3" w:sz="4"/>
+            </w:tcBorders>
+            <w:tcMar>
+              <w:top w:type="dxa" w:w="60"/>
+              <w:left w:type="dxa" w:w="100"/>
+              <w:bottom w:type="dxa" w:w="60"/>
+              <w:right w:type="dxa" w:w="100"/>
+            </w:tcMar>
+          </w:tcPr>
+          <w:p>
+            <w:r>
+              <w:rPr>
+                <w:sz w:val="19"/>
+                <w:szCs w:val="19"/>
+              </w:rPr>
+              <w:t xml:space="preserve">70% of the time (group estimate, default)</w:t>
+            </w:r>
+          </w:p>
+        </w:tc>
+        <w:tc>
+          <w:tcPr>
+            <w:tcW w:type="dxa" w:w="1600"/>
+            <w:tcBorders>
+              <w:top w:val="single" w:color="D9D8D3" w:sz="4"/>
+              <w:left w:val="single" w:color="D9D8D3" w:sz="4"/>
+              <w:bottom w:val="single" w:color="D9D8D3" w:sz="4"/>
+              <w:right w:val="single" w:color="D9D8D3" w:sz="4"/>
+            </w:tcBorders>
+            <w:tcMar>
+              <w:top w:type="dxa" w:w="60"/>
+              <w:left w:type="dxa" w:w="100"/>
+              <w:bottom w:type="dxa" w:w="60"/>
+              <w:right w:type="dxa" w:w="100"/>
+            </w:tcMar>
+          </w:tcPr>
+          <w:p>
+            <w:r>
+              <w:rPr>
+                <w:sz w:val="19"/>
+                <w:szCs w:val="19"/>
+              </w:rPr>
+              <w:t xml:space="preserve">30 or 10–14 min</w:t>
+            </w:r>
+          </w:p>
+        </w:tc>
+        <w:tc>
+          <w:tcPr>
+            <w:tcW w:type="dxa" w:w="1500"/>
+            <w:tcBorders>
+              <w:top w:val="single" w:color="D9D8D3" w:sz="4"/>
+              <w:left w:val="single" w:color="D9D8D3" w:sz="4"/>
+              <w:bottom w:val="single" w:color="D9D8D3" w:sz="4"/>
+              <w:right w:val="single" w:color="D9D8D3" w:sz="4"/>
+            </w:tcBorders>
+            <w:tcMar>
+              <w:top w:type="dxa" w:w="60"/>
+              <w:left w:type="dxa" w:w="100"/>
+              <w:bottom w:type="dxa" w:w="60"/>
+              <w:right w:type="dxa" w:w="100"/>
+            </w:tcMar>
+          </w:tcPr>
+          <w:p>
+            <w:r>
+              <w:rPr>
+                <w:sz w:val="19"/>
+                <w:szCs w:val="19"/>
+              </w:rPr>
+              <w:t xml:space="preserve">0.8</w:t>
+            </w:r>
+          </w:p>
+        </w:tc>
+        <w:tc>
+          <w:tcPr>
+            <w:tcW w:type="dxa" w:w="1400"/>
+            <w:tcBorders>
+              <w:top w:val="single" w:color="D9D8D3" w:sz="4"/>
+              <w:left w:val="single" w:color="D9D8D3" w:sz="4"/>
+              <w:bottom w:val="single" w:color="D9D8D3" w:sz="4"/>
+              <w:right w:val="single" w:color="D9D8D3" w:sz="4"/>
+            </w:tcBorders>
+            <w:tcMar>
+              <w:top w:type="dxa" w:w="60"/>
+              <w:left w:type="dxa" w:w="100"/>
+              <w:bottom w:type="dxa" w:w="60"/>
+              <w:right w:type="dxa" w:w="100"/>
+            </w:tcMar>
+          </w:tcPr>
+          <w:p>
+            <w:r>
+              <w:rPr>
+                <w:sz w:val="19"/>
+                <w:szCs w:val="19"/>
+              </w:rPr>
+              <w:t xml:space="preserve">0.9</w:t>
+            </w:r>
+          </w:p>
+        </w:tc>
+        <w:tc>
+          <w:tcPr>
+            <w:tcW w:type="dxa" w:w="1900"/>
+            <w:tcBorders>
+              <w:top w:val="single" w:color="D9D8D3" w:sz="4"/>
+              <w:left w:val="single" w:color="D9D8D3" w:sz="4"/>
+              <w:bottom w:val="single" w:color="D9D8D3" w:sz="4"/>
+              <w:right w:val="single" w:color="D9D8D3" w:sz="4"/>
+            </w:tcBorders>
+            <w:tcMar>
+              <w:top w:type="dxa" w:w="60"/>
+              <w:left w:type="dxa" w:w="100"/>
+              <w:bottom w:type="dxa" w:w="60"/>
+              <w:right w:type="dxa" w:w="100"/>
+            </w:tcMar>
+          </w:tcPr>
+          <w:p>
+            <w:r>
+              <w:rPr>
+                <w:sz w:val="19"/>
+                <w:szCs w:val="19"/>
+              </w:rPr>
+              <w:t xml:space="preserve">7.2 → 0.8 min</w:t>
             </w:r>
           </w:p>
         </w:tc>
@@ -12092,7 +12234,7 @@
         <w:t xml:space="preserve">average wait from about 7 to about 1 minute</w:t>
       </w:r>
       <w:r>
-        <w:t xml:space="preserve"> and long waits (90th percentile) from about 17 to about 2.5–4 minutes.</w:t>
+        <w:t xml:space="preserve"> and long waits (90th percentile) from about 18 to about 2.5–4 minutes.</w:t>
       </w:r>
     </w:p>
     <w:p>
@@ -12112,10 +12254,10 @@
           <w:b/>
           <w:bCs/>
         </w:rPr>
-        <w:t xml:space="preserve">1 in 7 students</w:t>
-      </w:r>
-      <w:r>
-        <w:t xml:space="preserve"> has to walk to the other mess for this (13–18%). Because 85% start at Central, rebalancing needs more movement than a more even habit split would.</w:t>
+        <w:t xml:space="preserve">1 in 8 students</w:t>
+      </w:r>
+      <w:r>
+        <w:t xml:space="preserve"> has to walk to the other mess for this (12–16%). Because 85% start at Central, rebalancing needs more movement than a more even habit split would.</w:t>
       </w:r>
     </w:p>
     <w:p>
@@ -15993,7 +16135,7 @@
                 <w:sz w:val="19"/>
                 <w:szCs w:val="19"/>
               </w:rPr>
-              <w:t xml:space="preserve">50%</w:t>
+              <w:t xml:space="preserve">≈ 70%</w:t>
             </w:r>
           </w:p>
         </w:tc>
@@ -16016,10 +16158,12 @@
           <w:p>
             <w:r>
               <w:rPr>
-                <w:sz w:val="19"/>
-                <w:szCs w:val="19"/>
-              </w:rPr>
-              <w:t xml:space="preserve">Assumed</w:t>
+                <w:b/>
+                <w:bCs/>
+                <w:sz w:val="19"/>
+                <w:szCs w:val="19"/>
+              </w:rPr>
+              <w:t xml:space="preserve">Group estimate</w:t>
             </w:r>
           </w:p>
         </w:tc>
@@ -16045,7 +16189,7 @@
                 <w:sz w:val="19"/>
                 <w:szCs w:val="19"/>
               </w:rPr>
-              <w:t xml:space="preserve">Ask the CT kitchen</w:t>
+              <w:t xml:space="preserve">Confirm with the CT kitchen</w:t>
             </w:r>
           </w:p>
         </w:tc>

</xml_diff>

<commit_message>
Doc: where the problem sits in Operations Management (checked against our numbers); matrix counts from the dataset; tray weights; refreshed results
Co-Authored-By: Claude Opus 5.5 <noreply@anthropic.com>
Claude-Session: https://claude.ai/code/session_013JwSYm4UV7vKHqaUukbU1G
</commit_message>
<xml_diff>
--- a/docs/MDS_Queuing_Theory_and_Simulation.docx
+++ b/docs/MDS_Queuing_Theory_and_Simulation.docx
@@ -176,7 +176,7 @@
         <w:spacing w:after="60"/>
       </w:pPr>
       <w:r>
-        <w:t xml:space="preserve">The problem in brief</w:t>
+        <w:t xml:space="preserve">The problem in brief (and where it sits in Operations Management)</w:t>
       </w:r>
     </w:p>
     <w:p>
@@ -602,6 +602,871 @@
       </w:r>
       <w:r>
         <w:t xml:space="preserve"> (where food and students should go). Queuing theory explains the first part; section 7 shows how the other course topics handle the second.</w:t>
+      </w:r>
+    </w:p>
+    <w:p>
+      <w:pPr>
+        <w:pStyle w:val="Heading2"/>
+      </w:pPr>
+      <w:r>
+        <w:t xml:space="preserve">1.1 Where the problem sits in Operations Management</w:t>
+      </w:r>
+    </w:p>
+    <w:p>
+      <w:pPr>
+        <w:spacing w:after="120"/>
+      </w:pPr>
+      <w:r>
+        <w:t xml:space="preserve">The problem falls mainly under </w:t>
+      </w:r>
+      <w:r>
+        <w:rPr>
+          <w:b/>
+          <w:bCs/>
+        </w:rPr>
+        <w:t xml:space="preserve">capacity management</w:t>
+      </w:r>
+      <w:r>
+        <w:t xml:space="preserve"> and </w:t>
+      </w:r>
+      <w:r>
+        <w:rPr>
+          <w:b/>
+          <w:bCs/>
+        </w:rPr>
+        <w:t xml:space="preserve">queuing theory</w:t>
+      </w:r>
+      <w:r>
+        <w:t xml:space="preserve">, two core parts of Operations Management (OM). Because students choose where to eat, it also falls under </w:t>
+      </w:r>
+      <w:r>
+        <w:rPr>
+          <w:b/>
+          <w:bCs/>
+        </w:rPr>
+        <w:t xml:space="preserve">behavioural operations</w:t>
+      </w:r>
+      <w:r>
+        <w:t xml:space="preserve"> and </w:t>
+      </w:r>
+      <w:r>
+        <w:rPr>
+          <w:b/>
+          <w:bCs/>
+        </w:rPr>
+        <w:t xml:space="preserve">service operations</w:t>
+      </w:r>
+      <w:r>
+        <w:t xml:space="preserve">. We checked each area against our own numbers before using it:</w:t>
+      </w:r>
+    </w:p>
+    <w:tbl>
+      <w:tblPr>
+        <w:tblW w:type="dxa" w:w="9026"/>
+        <w:tblBorders>
+          <w:top w:val="single" w:color="auto" w:sz="4"/>
+          <w:left w:val="single" w:color="auto" w:sz="4"/>
+          <w:bottom w:val="single" w:color="auto" w:sz="4"/>
+          <w:right w:val="single" w:color="auto" w:sz="4"/>
+          <w:insideH w:val="single" w:color="auto" w:sz="4"/>
+          <w:insideV w:val="single" w:color="auto" w:sz="4"/>
+        </w:tblBorders>
+      </w:tblPr>
+      <w:tblGrid>
+        <w:gridCol w:w="1700"/>
+        <w:gridCol w:w="1800"/>
+        <w:gridCol w:w="3626"/>
+        <w:gridCol w:w="1900"/>
+      </w:tblGrid>
+      <w:tr>
+        <w:trPr>
+          <w:tblHeader/>
+        </w:trPr>
+        <w:tc>
+          <w:tcPr>
+            <w:tcW w:type="dxa" w:w="1700"/>
+            <w:tcBorders>
+              <w:top w:val="single" w:color="D9D8D3" w:sz="4"/>
+              <w:left w:val="single" w:color="D9D8D3" w:sz="4"/>
+              <w:bottom w:val="single" w:color="D9D8D3" w:sz="4"/>
+              <w:right w:val="single" w:color="D9D8D3" w:sz="4"/>
+            </w:tcBorders>
+            <w:shd w:fill="ECEBE7" w:color="auto" w:val="clear"/>
+            <w:tcMar>
+              <w:top w:type="dxa" w:w="60"/>
+              <w:left w:type="dxa" w:w="100"/>
+              <w:bottom w:type="dxa" w:w="60"/>
+              <w:right w:type="dxa" w:w="100"/>
+            </w:tcMar>
+          </w:tcPr>
+          <w:p>
+            <w:r>
+              <w:rPr>
+                <w:b/>
+                <w:bCs/>
+                <w:sz w:val="19"/>
+                <w:szCs w:val="19"/>
+              </w:rPr>
+              <w:t xml:space="preserve">Area of OM</w:t>
+            </w:r>
+          </w:p>
+        </w:tc>
+        <w:tc>
+          <w:tcPr>
+            <w:tcW w:type="dxa" w:w="1800"/>
+            <w:tcBorders>
+              <w:top w:val="single" w:color="D9D8D3" w:sz="4"/>
+              <w:left w:val="single" w:color="D9D8D3" w:sz="4"/>
+              <w:bottom w:val="single" w:color="D9D8D3" w:sz="4"/>
+              <w:right w:val="single" w:color="D9D8D3" w:sz="4"/>
+            </w:tcBorders>
+            <w:shd w:fill="ECEBE7" w:color="auto" w:val="clear"/>
+            <w:tcMar>
+              <w:top w:type="dxa" w:w="60"/>
+              <w:left w:type="dxa" w:w="100"/>
+              <w:bottom w:type="dxa" w:w="60"/>
+              <w:right w:type="dxa" w:w="100"/>
+            </w:tcMar>
+          </w:tcPr>
+          <w:p>
+            <w:r>
+              <w:rPr>
+                <w:b/>
+                <w:bCs/>
+                <w:sz w:val="19"/>
+                <w:szCs w:val="19"/>
+              </w:rPr>
+              <w:t xml:space="preserve">What it means</w:t>
+            </w:r>
+          </w:p>
+        </w:tc>
+        <w:tc>
+          <w:tcPr>
+            <w:tcW w:type="dxa" w:w="3626"/>
+            <w:tcBorders>
+              <w:top w:val="single" w:color="D9D8D3" w:sz="4"/>
+              <w:left w:val="single" w:color="D9D8D3" w:sz="4"/>
+              <w:bottom w:val="single" w:color="D9D8D3" w:sz="4"/>
+              <w:right w:val="single" w:color="D9D8D3" w:sz="4"/>
+            </w:tcBorders>
+            <w:shd w:fill="ECEBE7" w:color="auto" w:val="clear"/>
+            <w:tcMar>
+              <w:top w:type="dxa" w:w="60"/>
+              <w:left w:type="dxa" w:w="100"/>
+              <w:bottom w:type="dxa" w:w="60"/>
+              <w:right w:type="dxa" w:w="100"/>
+            </w:tcMar>
+          </w:tcPr>
+          <w:p>
+            <w:r>
+              <w:rPr>
+                <w:b/>
+                <w:bCs/>
+                <w:sz w:val="19"/>
+                <w:szCs w:val="19"/>
+              </w:rPr>
+              <w:t xml:space="preserve">How it applies here, with our numbers</w:t>
+            </w:r>
+          </w:p>
+        </w:tc>
+        <w:tc>
+          <w:tcPr>
+            <w:tcW w:type="dxa" w:w="1900"/>
+            <w:tcBorders>
+              <w:top w:val="single" w:color="D9D8D3" w:sz="4"/>
+              <w:left w:val="single" w:color="D9D8D3" w:sz="4"/>
+              <w:bottom w:val="single" w:color="D9D8D3" w:sz="4"/>
+              <w:right w:val="single" w:color="D9D8D3" w:sz="4"/>
+            </w:tcBorders>
+            <w:shd w:fill="ECEBE7" w:color="auto" w:val="clear"/>
+            <w:tcMar>
+              <w:top w:type="dxa" w:w="60"/>
+              <w:left w:type="dxa" w:w="100"/>
+              <w:bottom w:type="dxa" w:w="60"/>
+              <w:right w:type="dxa" w:w="100"/>
+            </w:tcMar>
+          </w:tcPr>
+          <w:p>
+            <w:r>
+              <w:rPr>
+                <w:b/>
+                <w:bCs/>
+                <w:sz w:val="19"/>
+                <w:szCs w:val="19"/>
+              </w:rPr>
+              <w:t xml:space="preserve">Where we use it</w:t>
+            </w:r>
+          </w:p>
+        </w:tc>
+      </w:tr>
+      <w:tr>
+        <w:tc>
+          <w:tcPr>
+            <w:tcW w:type="dxa" w:w="1700"/>
+            <w:tcBorders>
+              <w:top w:val="single" w:color="D9D8D3" w:sz="4"/>
+              <w:left w:val="single" w:color="D9D8D3" w:sz="4"/>
+              <w:bottom w:val="single" w:color="D9D8D3" w:sz="4"/>
+              <w:right w:val="single" w:color="D9D8D3" w:sz="4"/>
+            </w:tcBorders>
+            <w:tcMar>
+              <w:top w:type="dxa" w:w="60"/>
+              <w:left w:type="dxa" w:w="100"/>
+              <w:bottom w:type="dxa" w:w="60"/>
+              <w:right w:type="dxa" w:w="100"/>
+            </w:tcMar>
+          </w:tcPr>
+          <w:p>
+            <w:r>
+              <w:rPr>
+                <w:sz w:val="19"/>
+                <w:szCs w:val="19"/>
+              </w:rPr>
+              <w:t xml:space="preserve">1. Capacity management and load balancing</w:t>
+            </w:r>
+          </w:p>
+        </w:tc>
+        <w:tc>
+          <w:tcPr>
+            <w:tcW w:type="dxa" w:w="1800"/>
+            <w:tcBorders>
+              <w:top w:val="single" w:color="D9D8D3" w:sz="4"/>
+              <w:left w:val="single" w:color="D9D8D3" w:sz="4"/>
+              <w:bottom w:val="single" w:color="D9D8D3" w:sz="4"/>
+              <w:right w:val="single" w:color="D9D8D3" w:sz="4"/>
+            </w:tcBorders>
+            <w:tcMar>
+              <w:top w:type="dxa" w:w="60"/>
+              <w:left w:type="dxa" w:w="100"/>
+              <w:bottom w:type="dxa" w:w="60"/>
+              <w:right w:type="dxa" w:w="100"/>
+            </w:tcMar>
+          </w:tcPr>
+          <w:p>
+            <w:r>
+              <w:rPr>
+                <w:sz w:val="19"/>
+                <w:szCs w:val="19"/>
+              </w:rPr>
+              <w:t xml:space="preserve">Matching resources (seats, food, staff) to demand</w:t>
+            </w:r>
+          </w:p>
+        </w:tc>
+        <w:tc>
+          <w:tcPr>
+            <w:tcW w:type="dxa" w:w="3626"/>
+            <w:tcBorders>
+              <w:top w:val="single" w:color="D9D8D3" w:sz="4"/>
+              <w:left w:val="single" w:color="D9D8D3" w:sz="4"/>
+              <w:bottom w:val="single" w:color="D9D8D3" w:sz="4"/>
+              <w:right w:val="single" w:color="D9D8D3" w:sz="4"/>
+            </w:tcBorders>
+            <w:tcMar>
+              <w:top w:type="dxa" w:w="60"/>
+              <w:left w:type="dxa" w:w="100"/>
+              <w:bottom w:type="dxa" w:w="60"/>
+              <w:right w:type="dxa" w:w="100"/>
+            </w:tcMar>
+          </w:tcPr>
+          <w:p>
+            <w:r>
+              <w:rPr>
+                <w:sz w:val="19"/>
+                <w:szCs w:val="19"/>
+              </w:rPr>
+              <w:t xml:space="preserve">Total capacity is enough, but the load is uneven. At the simulated peak about </w:t>
+            </w:r>
+            <w:r>
+              <w:rPr>
+                <w:b/>
+                <w:bCs/>
+                <w:sz w:val="19"/>
+                <w:szCs w:val="19"/>
+              </w:rPr>
+              <w:t xml:space="preserve">34 students/min</w:t>
+            </w:r>
+            <w:r>
+              <w:rPr>
+                <w:sz w:val="19"/>
+                <w:szCs w:val="19"/>
+              </w:rPr>
+              <w:t xml:space="preserve"> arrive in all, against </w:t>
+            </w:r>
+            <w:r>
+              <w:rPr>
+                <w:b/>
+                <w:bCs/>
+                <w:sz w:val="19"/>
+                <w:szCs w:val="19"/>
+              </w:rPr>
+              <w:t xml:space="preserve">40/min</w:t>
+            </w:r>
+            <w:r>
+              <w:rPr>
+                <w:sz w:val="19"/>
+                <w:szCs w:val="19"/>
+              </w:rPr>
+              <w:t xml:space="preserve"> of serving capacity (2 stations × 2 messes × 10/min, μ assumed), so ρ ≈ 0.84 overall. With 85% going to Central by habit (assumed), Central gets ≈ </w:t>
+            </w:r>
+            <w:r>
+              <w:rPr>
+                <w:b/>
+                <w:bCs/>
+                <w:sz w:val="19"/>
+                <w:szCs w:val="19"/>
+              </w:rPr>
+              <w:t xml:space="preserve">29/min against 20/min</w:t>
+            </w:r>
+            <w:r>
+              <w:rPr>
+                <w:sz w:val="19"/>
+                <w:szCs w:val="19"/>
+              </w:rPr>
+              <w:t xml:space="preserve"> (ρ ≈ 1.4, saturated) while Munch gets ≈ </w:t>
+            </w:r>
+            <w:r>
+              <w:rPr>
+                <w:b/>
+                <w:bCs/>
+                <w:sz w:val="19"/>
+                <w:szCs w:val="19"/>
+              </w:rPr>
+              <w:t xml:space="preserve">5/min against 20/min</w:t>
+            </w:r>
+            <w:r>
+              <w:rPr>
+                <w:sz w:val="19"/>
+                <w:szCs w:val="19"/>
+              </w:rPr>
+              <w:t xml:space="preserve"> (ρ ≈ 0.26). Seats are not the constraint: 1,400 seats, ~725 people inside Central at peak (section 3.2)</w:t>
+            </w:r>
+          </w:p>
+        </w:tc>
+        <w:tc>
+          <w:tcPr>
+            <w:tcW w:type="dxa" w:w="1900"/>
+            <w:tcBorders>
+              <w:top w:val="single" w:color="D9D8D3" w:sz="4"/>
+              <w:left w:val="single" w:color="D9D8D3" w:sz="4"/>
+              <w:bottom w:val="single" w:color="D9D8D3" w:sz="4"/>
+              <w:right w:val="single" w:color="D9D8D3" w:sz="4"/>
+            </w:tcBorders>
+            <w:tcMar>
+              <w:top w:type="dxa" w:w="60"/>
+              <w:left w:type="dxa" w:w="100"/>
+              <w:bottom w:type="dxa" w:w="60"/>
+              <w:right w:type="dxa" w:w="100"/>
+            </w:tcMar>
+          </w:tcPr>
+          <w:p>
+            <w:r>
+              <w:rPr>
+                <w:sz w:val="19"/>
+                <w:szCs w:val="19"/>
+              </w:rPr>
+              <w:t xml:space="preserve">Equilibrium split and door screens (5.3); integer staffing per slot (7.7); LP allocation of food between messes (7.6)</w:t>
+            </w:r>
+          </w:p>
+        </w:tc>
+      </w:tr>
+      <w:tr>
+        <w:tc>
+          <w:tcPr>
+            <w:tcW w:type="dxa" w:w="1700"/>
+            <w:tcBorders>
+              <w:top w:val="single" w:color="D9D8D3" w:sz="4"/>
+              <w:left w:val="single" w:color="D9D8D3" w:sz="4"/>
+              <w:bottom w:val="single" w:color="D9D8D3" w:sz="4"/>
+              <w:right w:val="single" w:color="D9D8D3" w:sz="4"/>
+            </w:tcBorders>
+            <w:tcMar>
+              <w:top w:type="dxa" w:w="60"/>
+              <w:left w:type="dxa" w:w="100"/>
+              <w:bottom w:type="dxa" w:w="60"/>
+              <w:right w:type="dxa" w:w="100"/>
+            </w:tcMar>
+          </w:tcPr>
+          <w:p>
+            <w:r>
+              <w:rPr>
+                <w:sz w:val="19"/>
+                <w:szCs w:val="19"/>
+              </w:rPr>
+              <w:t xml:space="preserve">2. Queuing theory (wait-time management)</w:t>
+            </w:r>
+          </w:p>
+        </w:tc>
+        <w:tc>
+          <w:tcPr>
+            <w:tcW w:type="dxa" w:w="1800"/>
+            <w:tcBorders>
+              <w:top w:val="single" w:color="D9D8D3" w:sz="4"/>
+              <w:left w:val="single" w:color="D9D8D3" w:sz="4"/>
+              <w:bottom w:val="single" w:color="D9D8D3" w:sz="4"/>
+              <w:right w:val="single" w:color="D9D8D3" w:sz="4"/>
+            </w:tcBorders>
+            <w:tcMar>
+              <w:top w:type="dxa" w:w="60"/>
+              <w:left w:type="dxa" w:w="100"/>
+              <w:bottom w:type="dxa" w:w="60"/>
+              <w:right w:type="dxa" w:w="100"/>
+            </w:tcMar>
+          </w:tcPr>
+          <w:p>
+            <w:r>
+              <w:rPr>
+                <w:sz w:val="19"/>
+                <w:szCs w:val="19"/>
+              </w:rPr>
+              <w:t xml:space="preserve">Why lines form: arrival rate, number of servers, service rate</w:t>
+            </w:r>
+          </w:p>
+        </w:tc>
+        <w:tc>
+          <w:tcPr>
+            <w:tcW w:type="dxa" w:w="3626"/>
+            <w:tcBorders>
+              <w:top w:val="single" w:color="D9D8D3" w:sz="4"/>
+              <w:left w:val="single" w:color="D9D8D3" w:sz="4"/>
+              <w:bottom w:val="single" w:color="D9D8D3" w:sz="4"/>
+              <w:right w:val="single" w:color="D9D8D3" w:sz="4"/>
+            </w:tcBorders>
+            <w:tcMar>
+              <w:top w:type="dxa" w:w="60"/>
+              <w:left w:type="dxa" w:w="100"/>
+              <w:bottom w:type="dxa" w:w="60"/>
+              <w:right w:type="dxa" w:w="100"/>
+            </w:tcMar>
+          </w:tcPr>
+          <w:p>
+            <w:r>
+              <w:rPr>
+                <w:sz w:val="19"/>
+                <w:szCs w:val="19"/>
+              </w:rPr>
+              <w:t xml:space="preserve">The servers are the 2 serving stations per mess, with the single face scanner as a first phase. At saturation, </w:t>
+            </w:r>
+            <w:r>
+              <w:rPr>
+                <w:b/>
+                <w:bCs/>
+                <w:sz w:val="19"/>
+                <w:szCs w:val="19"/>
+              </w:rPr>
+              <w:t xml:space="preserve">throughput is capped</w:t>
+            </w:r>
+            <w:r>
+              <w:rPr>
+                <w:sz w:val="19"/>
+                <w:szCs w:val="19"/>
+              </w:rPr>
+              <w:t xml:space="preserve"> at cμ = 20/min and the queue grows by λ − cμ each minute. Throughput actually </w:t>
+            </w:r>
+            <w:r>
+              <w:rPr>
+                <w:b/>
+                <w:bCs/>
+                <w:sz w:val="19"/>
+                <w:szCs w:val="19"/>
+              </w:rPr>
+              <w:t xml:space="preserve">drops</w:t>
+            </w:r>
+            <w:r>
+              <w:rPr>
+                <w:sz w:val="19"/>
+                <w:szCs w:val="19"/>
+              </w:rPr>
+              <w:t xml:space="preserve"> during stock-outs and while staff refill wells over the counter (field note O4)</w:t>
+            </w:r>
+          </w:p>
+        </w:tc>
+        <w:tc>
+          <w:tcPr>
+            <w:tcW w:type="dxa" w:w="1900"/>
+            <w:tcBorders>
+              <w:top w:val="single" w:color="D9D8D3" w:sz="4"/>
+              <w:left w:val="single" w:color="D9D8D3" w:sz="4"/>
+              <w:bottom w:val="single" w:color="D9D8D3" w:sz="4"/>
+              <w:right w:val="single" w:color="D9D8D3" w:sz="4"/>
+            </w:tcBorders>
+            <w:tcMar>
+              <w:top w:type="dxa" w:w="60"/>
+              <w:left w:type="dxa" w:w="100"/>
+              <w:bottom w:type="dxa" w:w="60"/>
+              <w:right w:type="dxa" w:w="100"/>
+            </w:tcMar>
+          </w:tcPr>
+          <w:p>
+            <w:r>
+              <w:rPr>
+                <w:sz w:val="19"/>
+                <w:szCs w:val="19"/>
+              </w:rPr>
+              <w:t xml:space="preserve">Sections 2–6</w:t>
+            </w:r>
+          </w:p>
+        </w:tc>
+      </w:tr>
+      <w:tr>
+        <w:tc>
+          <w:tcPr>
+            <w:tcW w:type="dxa" w:w="1700"/>
+            <w:tcBorders>
+              <w:top w:val="single" w:color="D9D8D3" w:sz="4"/>
+              <w:left w:val="single" w:color="D9D8D3" w:sz="4"/>
+              <w:bottom w:val="single" w:color="D9D8D3" w:sz="4"/>
+              <w:right w:val="single" w:color="D9D8D3" w:sz="4"/>
+            </w:tcBorders>
+            <w:tcMar>
+              <w:top w:type="dxa" w:w="60"/>
+              <w:left w:type="dxa" w:w="100"/>
+              <w:bottom w:type="dxa" w:w="60"/>
+              <w:right w:type="dxa" w:w="100"/>
+            </w:tcMar>
+          </w:tcPr>
+          <w:p>
+            <w:r>
+              <w:rPr>
+                <w:sz w:val="19"/>
+                <w:szCs w:val="19"/>
+              </w:rPr>
+              <w:t xml:space="preserve">3. Behavioural operations</w:t>
+            </w:r>
+          </w:p>
+        </w:tc>
+        <w:tc>
+          <w:tcPr>
+            <w:tcW w:type="dxa" w:w="1800"/>
+            <w:tcBorders>
+              <w:top w:val="single" w:color="D9D8D3" w:sz="4"/>
+              <w:left w:val="single" w:color="D9D8D3" w:sz="4"/>
+              <w:bottom w:val="single" w:color="D9D8D3" w:sz="4"/>
+              <w:right w:val="single" w:color="D9D8D3" w:sz="4"/>
+            </w:tcBorders>
+            <w:tcMar>
+              <w:top w:type="dxa" w:w="60"/>
+              <w:left w:type="dxa" w:w="100"/>
+              <w:bottom w:type="dxa" w:w="60"/>
+              <w:right w:type="dxa" w:w="100"/>
+            </w:tcMar>
+          </w:tcPr>
+          <w:p>
+            <w:r>
+              <w:rPr>
+                <w:sz w:val="19"/>
+                <w:szCs w:val="19"/>
+              </w:rPr>
+              <w:t xml:space="preserve">How human behaviour shapes an operational system</w:t>
+            </w:r>
+          </w:p>
+        </w:tc>
+        <w:tc>
+          <w:tcPr>
+            <w:tcW w:type="dxa" w:w="3626"/>
+            <w:tcBorders>
+              <w:top w:val="single" w:color="D9D8D3" w:sz="4"/>
+              <w:left w:val="single" w:color="D9D8D3" w:sz="4"/>
+              <w:bottom w:val="single" w:color="D9D8D3" w:sz="4"/>
+              <w:right w:val="single" w:color="D9D8D3" w:sz="4"/>
+            </w:tcBorders>
+            <w:tcMar>
+              <w:top w:type="dxa" w:w="60"/>
+              <w:left w:type="dxa" w:w="100"/>
+              <w:bottom w:type="dxa" w:w="60"/>
+              <w:right w:type="dxa" w:w="100"/>
+            </w:tcMar>
+          </w:tcPr>
+          <w:p>
+            <w:r>
+              <w:rPr>
+                <w:sz w:val="19"/>
+                <w:szCs w:val="19"/>
+              </w:rPr>
+              <w:t xml:space="preserve">Habit (85/15, assumed), herding if every screen says 'go to the emptier mess', partial compliance (κ = 60%, assumed), and the star dish that students come for. The </w:t>
+            </w:r>
+            <w:r>
+              <w:rPr>
+                <w:b/>
+                <w:bCs/>
+                <w:sz w:val="19"/>
+                <w:szCs w:val="19"/>
+              </w:rPr>
+              <w:t xml:space="preserve">reasons</w:t>
+            </w:r>
+            <w:r>
+              <w:rPr>
+                <w:sz w:val="19"/>
+                <w:szCs w:val="19"/>
+              </w:rPr>
+              <w:t xml:space="preserve"> for the habit (food, distance from hostels, friends) are not measured yet: our survey and the biometric logs will show them</w:t>
+            </w:r>
+          </w:p>
+        </w:tc>
+        <w:tc>
+          <w:tcPr>
+            <w:tcW w:type="dxa" w:w="1900"/>
+            <w:tcBorders>
+              <w:top w:val="single" w:color="D9D8D3" w:sz="4"/>
+              <w:left w:val="single" w:color="D9D8D3" w:sz="4"/>
+              <w:bottom w:val="single" w:color="D9D8D3" w:sz="4"/>
+              <w:right w:val="single" w:color="D9D8D3" w:sz="4"/>
+            </w:tcBorders>
+            <w:tcMar>
+              <w:top w:type="dxa" w:w="60"/>
+              <w:left w:type="dxa" w:w="100"/>
+              <w:bottom w:type="dxa" w:w="60"/>
+              <w:right w:type="dxa" w:w="100"/>
+            </w:tcMar>
+          </w:tcPr>
+          <w:p>
+            <w:r>
+              <w:rPr>
+                <w:sz w:val="19"/>
+                <w:szCs w:val="19"/>
+              </w:rPr>
+              <w:t xml:space="preserve">Compliance κ and anti-herding split (5.3); biases (7.3); student-screen design (see docs/student-screen-psychology.md)</w:t>
+            </w:r>
+          </w:p>
+        </w:tc>
+      </w:tr>
+      <w:tr>
+        <w:tc>
+          <w:tcPr>
+            <w:tcW w:type="dxa" w:w="1700"/>
+            <w:tcBorders>
+              <w:top w:val="single" w:color="D9D8D3" w:sz="4"/>
+              <w:left w:val="single" w:color="D9D8D3" w:sz="4"/>
+              <w:bottom w:val="single" w:color="D9D8D3" w:sz="4"/>
+              <w:right w:val="single" w:color="D9D8D3" w:sz="4"/>
+            </w:tcBorders>
+            <w:tcMar>
+              <w:top w:type="dxa" w:w="60"/>
+              <w:left w:type="dxa" w:w="100"/>
+              <w:bottom w:type="dxa" w:w="60"/>
+              <w:right w:type="dxa" w:w="100"/>
+            </w:tcMar>
+          </w:tcPr>
+          <w:p>
+            <w:r>
+              <w:rPr>
+                <w:sz w:val="19"/>
+                <w:szCs w:val="19"/>
+              </w:rPr>
+              <w:t xml:space="preserve">4. Demand shaping</w:t>
+            </w:r>
+          </w:p>
+        </w:tc>
+        <w:tc>
+          <w:tcPr>
+            <w:tcW w:type="dxa" w:w="1800"/>
+            <w:tcBorders>
+              <w:top w:val="single" w:color="D9D8D3" w:sz="4"/>
+              <w:left w:val="single" w:color="D9D8D3" w:sz="4"/>
+              <w:bottom w:val="single" w:color="D9D8D3" w:sz="4"/>
+              <w:right w:val="single" w:color="D9D8D3" w:sz="4"/>
+            </w:tcBorders>
+            <w:tcMar>
+              <w:top w:type="dxa" w:w="60"/>
+              <w:left w:type="dxa" w:w="100"/>
+              <w:bottom w:type="dxa" w:w="60"/>
+              <w:right w:type="dxa" w:w="100"/>
+            </w:tcMar>
+          </w:tcPr>
+          <w:p>
+            <w:r>
+              <w:rPr>
+                <w:sz w:val="19"/>
+                <w:szCs w:val="19"/>
+              </w:rPr>
+              <w:t xml:space="preserve">Influencing </w:t>
+            </w:r>
+            <w:r>
+              <w:rPr>
+                <w:b/>
+                <w:bCs/>
+                <w:sz w:val="19"/>
+                <w:szCs w:val="19"/>
+              </w:rPr>
+              <w:t xml:space="preserve">where</w:t>
+            </w:r>
+            <w:r>
+              <w:rPr>
+                <w:sz w:val="19"/>
+                <w:szCs w:val="19"/>
+              </w:rPr>
+              <w:t xml:space="preserve"> and </w:t>
+            </w:r>
+            <w:r>
+              <w:rPr>
+                <w:b/>
+                <w:bCs/>
+                <w:sz w:val="19"/>
+                <w:szCs w:val="19"/>
+              </w:rPr>
+              <w:t xml:space="preserve">when</w:t>
+            </w:r>
+            <w:r>
+              <w:rPr>
+                <w:sz w:val="19"/>
+                <w:szCs w:val="19"/>
+              </w:rPr>
+              <w:t xml:space="preserve"> demand arrives instead of adding capacity</w:t>
+            </w:r>
+          </w:p>
+        </w:tc>
+        <w:tc>
+          <w:tcPr>
+            <w:tcW w:type="dxa" w:w="3626"/>
+            <w:tcBorders>
+              <w:top w:val="single" w:color="D9D8D3" w:sz="4"/>
+              <w:left w:val="single" w:color="D9D8D3" w:sz="4"/>
+              <w:bottom w:val="single" w:color="D9D8D3" w:sz="4"/>
+              <w:right w:val="single" w:color="D9D8D3" w:sz="4"/>
+            </w:tcBorders>
+            <w:tcMar>
+              <w:top w:type="dxa" w:w="60"/>
+              <w:left w:type="dxa" w:w="100"/>
+              <w:bottom w:type="dxa" w:w="60"/>
+              <w:right w:type="dxa" w:w="100"/>
+            </w:tcMar>
+          </w:tcPr>
+          <w:p>
+            <w:r>
+              <w:rPr>
+                <w:sz w:val="19"/>
+                <w:szCs w:val="19"/>
+              </w:rPr>
+              <w:t xml:space="preserve">Our lever is </w:t>
+            </w:r>
+            <w:r>
+              <w:rPr>
+                <w:b/>
+                <w:bCs/>
+                <w:sz w:val="19"/>
+                <w:szCs w:val="19"/>
+              </w:rPr>
+              <w:t xml:space="preserve">information</w:t>
+            </w:r>
+            <w:r>
+              <w:rPr>
+                <w:sz w:val="19"/>
+                <w:szCs w:val="19"/>
+              </w:rPr>
+              <w:t xml:space="preserve">: live waits on screens outside each mess and on phones, plus a 'fresh batch just out' cue. Shaping </w:t>
+            </w:r>
+            <w:r>
+              <w:rPr>
+                <w:b/>
+                <w:bCs/>
+                <w:sz w:val="19"/>
+                <w:szCs w:val="19"/>
+              </w:rPr>
+              <w:t xml:space="preserve">when</w:t>
+            </w:r>
+            <w:r>
+              <w:rPr>
+                <w:sz w:val="19"/>
+                <w:szCs w:val="19"/>
+              </w:rPr>
+              <w:t xml:space="preserve"> students arrive (staggered class end times) is alternative A5 in the AHP. Other nudges (a dish only at Munch, loyalty points, grab-and-go) are possible future options; we have not built or tested them</w:t>
+            </w:r>
+          </w:p>
+        </w:tc>
+        <w:tc>
+          <w:tcPr>
+            <w:tcW w:type="dxa" w:w="1900"/>
+            <w:tcBorders>
+              <w:top w:val="single" w:color="D9D8D3" w:sz="4"/>
+              <w:left w:val="single" w:color="D9D8D3" w:sz="4"/>
+              <w:bottom w:val="single" w:color="D9D8D3" w:sz="4"/>
+              <w:right w:val="single" w:color="D9D8D3" w:sz="4"/>
+            </w:tcBorders>
+            <w:tcMar>
+              <w:top w:type="dxa" w:w="60"/>
+              <w:left w:type="dxa" w:w="100"/>
+              <w:bottom w:type="dxa" w:w="60"/>
+              <w:right w:type="dxa" w:w="100"/>
+            </w:tcMar>
+          </w:tcPr>
+          <w:p>
+            <w:r>
+              <w:rPr>
+                <w:sz w:val="19"/>
+                <w:szCs w:val="19"/>
+              </w:rPr>
+              <w:t xml:space="preserve">Door screens and phone page; AHP alternatives (7.8)</w:t>
+            </w:r>
+          </w:p>
+        </w:tc>
+      </w:tr>
+    </w:tbl>
+    <w:p>
+      <w:pPr>
+        <w:pBdr>
+          <w:left w:val="single" w:color="EDA100" w:sz="18" w:space="8"/>
+        </w:pBdr>
+        <w:shd w:fill="FFF6E0" w:color="auto" w:val="clear"/>
+        <w:spacing w:after="160" w:before="120"/>
+      </w:pPr>
+      <w:r>
+        <w:rPr>
+          <w:b/>
+          <w:bCs/>
+        </w:rPr>
+        <w:t xml:space="preserve">What we changed from the general framing.  </w:t>
+      </w:r>
+      <w:r>
+        <w:t xml:space="preserve">(1) We call area 4 </w:t>
+      </w:r>
+      <w:r>
+        <w:rPr>
+          <w:b/>
+          <w:bCs/>
+        </w:rPr>
+        <w:t xml:space="preserve">demand shaping</w:t>
+      </w:r>
+      <w:r>
+        <w:t xml:space="preserve">, not yield management: yield (revenue) management sets </w:t>
+      </w:r>
+      <w:r>
+        <w:rPr>
+          <w:b/>
+          <w:bCs/>
+        </w:rPr>
+        <w:t xml:space="preserve">prices</w:t>
+      </w:r>
+      <w:r>
+        <w:t xml:space="preserve"> for perishable capacity, and a prepaid mess has no price lever. (2) 'Cashiers' become </w:t>
+      </w:r>
+      <w:r>
+        <w:rPr>
+          <w:b/>
+          <w:bCs/>
+        </w:rPr>
+        <w:t xml:space="preserve">serving stations</w:t>
+      </w:r>
+      <w:r>
+        <w:t xml:space="preserve"> and the </w:t>
+      </w:r>
+      <w:r>
+        <w:rPr>
+          <w:b/>
+          <w:bCs/>
+        </w:rPr>
+        <w:t xml:space="preserve">face scanner</w:t>
+      </w:r>
+      <w:r>
+        <w:t xml:space="preserve">. (3) 'Throughput slows at saturation' is sharpened: throughput is capped at capacity, and it falls during stock-outs. (4) The reasons students prefer Central are </w:t>
+      </w:r>
+      <w:r>
+        <w:rPr>
+          <w:b/>
+          <w:bCs/>
+        </w:rPr>
+        <w:t xml:space="preserve">hypotheses</w:t>
+      </w:r>
+      <w:r>
+        <w:t xml:space="preserve">, not findings, until the survey and logs are in.</w:t>
       </w:r>
     </w:p>
     <w:p>
@@ -8836,7 +9701,7 @@
                 <w:sz w:val="19"/>
                 <w:szCs w:val="19"/>
               </w:rPr>
-              <w:t xml:space="preserve">Kitchen taps 'out'; the model sets capacity to 0 and adds the remaining refill time</w:t>
+              <w:t xml:space="preserve">The manager taps 'out' on a star dish; the model sets capacity to 0, adds the remaining refill time and sends students to the other mess</w:t>
             </w:r>
           </w:p>
         </w:tc>
@@ -9104,7 +9969,7 @@
         <w:t xml:space="preserve">only</w:t>
       </w:r>
       <w:r>
-        <w:t xml:space="preserve"> what the real deployment would see, namely biometric entry scans and kitchen taps ('tray low', 'out', 'refilled'). Keeping them separate means the simulation tests whether the estimates are any good, not just whether the formulas are.</w:t>
+        <w:t xml:space="preserve"> what the real deployment would see, namely biometric entry scans and the mess manager's food-status taps ('running low', 'out', 'refilled'). Keeping them separate means the simulation tests whether the estimates are any good, not just whether the formulas are.</w:t>
       </w:r>
     </w:p>
     <w:p>
@@ -9918,7 +10783,7 @@
         <w:t xml:space="preserve">Step 2: the queue.</w:t>
       </w:r>
       <w:r>
-        <w:t xml:space="preserve"> The backlog B(t) follows the fluid-queue formula from section 4.1, with capacity cμ (0 if the kitchen has reported the main dish 'out').</w:t>
+        <w:t xml:space="preserve"> The backlog B(t) follows the fluid-queue formula from section 4.1, with capacity cμ (0 if the manager has reported a star dish 'out').</w:t>
       </w:r>
     </w:p>
     <w:p>
@@ -10078,7 +10943,17 @@
         <w:t xml:space="preserve">Food delay</w:t>
       </w:r>
       <w:r>
-        <w:t xml:space="preserve"> = remaining refill time if the kitchen reported 'out'; a small penalty if 'tray low'. Kitchen taps expire if staff forget to tap 'refilled'.</w:t>
+        <w:t xml:space="preserve">, weighted by the priority matrix (section 7.4). A </w:t>
+      </w:r>
+      <w:r>
+        <w:rPr>
+          <w:b/>
+          <w:bCs/>
+        </w:rPr>
+        <w:t xml:space="preserve">star dish</w:t>
+      </w:r>
+      <w:r>
+        <w:t xml:space="preserve"> out (any star dish) closes that mess for routing until it is refilled. Any other tray out adds w × E[refill]; any tray running low adds w × 0.25 × E[refill] (0.25 assumed: the chance it empties before a student arriving now is served). E[refill] = 0.7 × 12 + 0.3 × 30 ≈ 17 min. Weights w: star dishes 1.0, roti 0.5, dessert and curd/raita 0.3, base food (rice, dal, dry sabji, sambar/rasam) 0.1; table items are not tracked. Taps expire if the manager forgets 'refilled'.</w:t>
       </w:r>
     </w:p>
     <w:p>
@@ -10720,7 +11595,7 @@
                 <w:sz w:val="19"/>
                 <w:szCs w:val="19"/>
               </w:rPr>
-              <w:t xml:space="preserve">1.4 min</w:t>
+              <w:t xml:space="preserve">1.6 min</w:t>
             </w:r>
           </w:p>
         </w:tc>
@@ -10746,7 +11621,7 @@
                 <w:sz w:val="19"/>
                 <w:szCs w:val="19"/>
               </w:rPr>
-              <w:t xml:space="preserve">4.3 min</w:t>
+              <w:t xml:space="preserve">4.8 min</w:t>
             </w:r>
           </w:p>
         </w:tc>
@@ -10772,7 +11647,7 @@
                 <w:sz w:val="19"/>
                 <w:szCs w:val="19"/>
               </w:rPr>
-              <w:t xml:space="preserve">119</w:t>
+              <w:t xml:space="preserve">122</w:t>
             </w:r>
           </w:p>
         </w:tc>
@@ -10798,7 +11673,7 @@
                 <w:sz w:val="19"/>
                 <w:szCs w:val="19"/>
               </w:rPr>
-              <w:t xml:space="preserve">1.1</w:t>
+              <w:t xml:space="preserve">0.8</w:t>
             </w:r>
           </w:p>
         </w:tc>
@@ -10824,7 +11699,7 @@
                 <w:sz w:val="19"/>
                 <w:szCs w:val="19"/>
               </w:rPr>
-              <w:t xml:space="preserve">12%</w:t>
+              <w:t xml:space="preserve">13%</w:t>
             </w:r>
           </w:p>
         </w:tc>
@@ -10904,7 +11779,7 @@
                 <w:sz w:val="19"/>
                 <w:szCs w:val="19"/>
               </w:rPr>
-              <w:t xml:space="preserve">0.8 min</w:t>
+              <w:t xml:space="preserve">1.1 min</w:t>
             </w:r>
           </w:p>
         </w:tc>
@@ -10930,7 +11805,7 @@
                 <w:sz w:val="19"/>
                 <w:szCs w:val="19"/>
               </w:rPr>
-              <w:t xml:space="preserve">2.5 min</w:t>
+              <w:t xml:space="preserve">3.1 min</w:t>
             </w:r>
           </w:p>
         </w:tc>
@@ -10956,7 +11831,7 @@
                 <w:sz w:val="19"/>
                 <w:szCs w:val="19"/>
               </w:rPr>
-              <w:t xml:space="preserve">84</w:t>
+              <w:t xml:space="preserve">94</w:t>
             </w:r>
           </w:p>
         </w:tc>
@@ -10982,7 +11857,7 @@
                 <w:sz w:val="19"/>
                 <w:szCs w:val="19"/>
               </w:rPr>
-              <w:t xml:space="preserve">0.9</w:t>
+              <w:t xml:space="preserve">0.5</w:t>
             </w:r>
           </w:p>
         </w:tc>
@@ -11008,7 +11883,7 @@
                 <w:sz w:val="19"/>
                 <w:szCs w:val="19"/>
               </w:rPr>
-              <w:t xml:space="preserve">13%</w:t>
+              <w:t xml:space="preserve">15%</w:t>
             </w:r>
           </w:p>
         </w:tc>
@@ -11088,7 +11963,7 @@
                 <w:sz w:val="19"/>
                 <w:szCs w:val="19"/>
               </w:rPr>
-              <w:t xml:space="preserve">0.9 min</w:t>
+              <w:t xml:space="preserve">1.0 min</w:t>
             </w:r>
           </w:p>
         </w:tc>
@@ -11114,7 +11989,7 @@
                 <w:sz w:val="19"/>
                 <w:szCs w:val="19"/>
               </w:rPr>
-              <w:t xml:space="preserve">2.7 min</w:t>
+              <w:t xml:space="preserve">2.6 min</w:t>
             </w:r>
           </w:p>
         </w:tc>
@@ -11140,7 +12015,7 @@
                 <w:sz w:val="19"/>
                 <w:szCs w:val="19"/>
               </w:rPr>
-              <w:t xml:space="preserve">80</w:t>
+              <w:t xml:space="preserve">82</w:t>
             </w:r>
           </w:p>
         </w:tc>
@@ -11166,7 +12041,7 @@
                 <w:sz w:val="19"/>
                 <w:szCs w:val="19"/>
               </w:rPr>
-              <w:t xml:space="preserve">0.9</w:t>
+              <w:t xml:space="preserve">0.5</w:t>
             </w:r>
           </w:p>
         </w:tc>
@@ -11192,7 +12067,7 @@
                 <w:sz w:val="19"/>
                 <w:szCs w:val="19"/>
               </w:rPr>
-              <w:t xml:space="preserve">16%</w:t>
+              <w:t xml:space="preserve">17%</w:t>
             </w:r>
           </w:p>
         </w:tc>
@@ -11761,7 +12636,7 @@
                 <w:sz w:val="19"/>
                 <w:szCs w:val="19"/>
               </w:rPr>
-              <w:t xml:space="preserve">3.0</w:t>
+              <w:t xml:space="preserve">2.1</w:t>
             </w:r>
           </w:p>
         </w:tc>
@@ -11787,7 +12662,7 @@
                 <w:sz w:val="19"/>
                 <w:szCs w:val="19"/>
               </w:rPr>
-              <w:t xml:space="preserve">7.0 → 0.9 min</w:t>
+              <w:t xml:space="preserve">7.0 → 1.1 min</w:t>
             </w:r>
           </w:p>
         </w:tc>
@@ -11893,7 +12768,7 @@
                 <w:sz w:val="19"/>
                 <w:szCs w:val="19"/>
               </w:rPr>
-              <w:t xml:space="preserve">1.6</w:t>
+              <w:t xml:space="preserve">1.1</w:t>
             </w:r>
           </w:p>
         </w:tc>
@@ -11919,7 +12794,7 @@
                 <w:sz w:val="19"/>
                 <w:szCs w:val="19"/>
               </w:rPr>
-              <w:t xml:space="preserve">7.1 → 0.8 min</w:t>
+              <w:t xml:space="preserve">7.1 → 1.0 min</w:t>
             </w:r>
           </w:p>
         </w:tc>
@@ -12025,7 +12900,7 @@
                 <w:sz w:val="19"/>
                 <w:szCs w:val="19"/>
               </w:rPr>
-              <w:t xml:space="preserve">0.9</w:t>
+              <w:t xml:space="preserve">0.5</w:t>
             </w:r>
           </w:p>
         </w:tc>
@@ -12051,7 +12926,7 @@
                 <w:sz w:val="19"/>
                 <w:szCs w:val="19"/>
               </w:rPr>
-              <w:t xml:space="preserve">7.2 → 0.8 min</w:t>
+              <w:t xml:space="preserve">7.2 → 1.1 min</w:t>
             </w:r>
           </w:p>
         </w:tc>
@@ -12234,7 +13109,7 @@
         <w:t xml:space="preserve">average wait from about 7 to about 1 minute</w:t>
       </w:r>
       <w:r>
-        <w:t xml:space="preserve"> and long waits (90th percentile) from about 18 to about 2.5–4 minutes.</w:t>
+        <w:t xml:space="preserve"> and long waits (90th percentile) from about 18 to about 2.5–5 minutes.</w:t>
       </w:r>
     </w:p>
     <w:p>
@@ -12254,10 +13129,10 @@
           <w:b/>
           <w:bCs/>
         </w:rPr>
-        <w:t xml:space="preserve">1 in 8 students</w:t>
-      </w:r>
-      <w:r>
-        <w:t xml:space="preserve"> has to walk to the other mess for this (12–16%). Because 85% start at Central, rebalancing needs more movement than a more even habit split would.</w:t>
+        <w:t xml:space="preserve">1 in 7 students</w:t>
+      </w:r>
+      <w:r>
+        <w:t xml:space="preserve"> has to walk to the other mess for this (13–17%). Because 85% start at Central, rebalancing needs more movement than a more even habit split would.</w:t>
       </w:r>
     </w:p>
     <w:p>
@@ -12274,10 +13149,20 @@
           <w:b/>
           <w:bCs/>
         </w:rPr>
-        <w:t xml:space="preserve">Moving students moves the run-outs.</w:t>
-      </w:r>
-      <w:r>
-        <w:t xml:space="preserve"> Food run-outs rise slightly with screens because Munch now feeds more students and a 30-minute call-back restock cannot keep up. Student routing and food allocation must be planned together (sections 7.4–7.6).</w:t>
+        <w:t xml:space="preserve">Routing and food interact.</w:t>
+      </w:r>
+      <w:r>
+        <w:t xml:space="preserve"> When the next batch is rarely ready, run-outs stay about the same with screens (2.0 → 2.1): Munch now feeds more students and a 30-minute call-back cannot keep up. When food is usually ready (70%), screens </w:t>
+      </w:r>
+      <w:r>
+        <w:rPr>
+          <w:b/>
+          <w:bCs/>
+        </w:rPr>
+        <w:t xml:space="preserve">cut</w:t>
+      </w:r>
+      <w:r>
+        <w:t xml:space="preserve"> run-outs (0.8 → 0.5), because a star dish marked 'out' sends students to the other mess at once. Student routing and food allocation must be planned together (sections 7.4–7.6).</w:t>
       </w:r>
     </w:p>
     <w:p>
@@ -13750,7 +14635,7 @@
                 <w:sz w:val="19"/>
                 <w:szCs w:val="19"/>
               </w:rPr>
-              <w:t xml:space="preserve">20</w:t>
+              <w:t xml:space="preserve">28</w:t>
             </w:r>
           </w:p>
         </w:tc>
@@ -13776,7 +14661,7 @@
                 <w:sz w:val="19"/>
                 <w:szCs w:val="19"/>
               </w:rPr>
-              <w:t xml:space="preserve">Measure and model: chapattis, star dishes</w:t>
+              <w:t xml:space="preserve">Measure and model: star dishes, chapattis, curd and raitha</w:t>
             </w:r>
           </w:p>
         </w:tc>
@@ -13856,7 +14741,7 @@
                 <w:sz w:val="19"/>
                 <w:szCs w:val="19"/>
               </w:rPr>
-              <w:t xml:space="preserve">16</w:t>
+              <w:t xml:space="preserve">9</w:t>
             </w:r>
           </w:p>
         </w:tc>
@@ -13882,7 +14767,7 @@
                 <w:sz w:val="19"/>
                 <w:szCs w:val="19"/>
               </w:rPr>
-              <w:t xml:space="preserve">Derive from plate count: curd, raitha, one-per-plate sweets</w:t>
+              <w:t xml:space="preserve">Derive from plate count: one-per-plate sweets (and Sunday's portioned chicken)</w:t>
             </w:r>
           </w:p>
         </w:tc>
@@ -13988,7 +14873,7 @@
                 <w:sz w:val="19"/>
                 <w:szCs w:val="19"/>
               </w:rPr>
-              <w:t xml:space="preserve">Issue with a safety margin: rice, dal, sambar, rasam</w:t>
+              <w:t xml:space="preserve">Issue with a safety margin: rice, dal, sambar, rasam, dry veg</w:t>
             </w:r>
           </w:p>
         </w:tc>
@@ -14068,7 +14953,7 @@
                 <w:sz w:val="19"/>
                 <w:szCs w:val="19"/>
               </w:rPr>
-              <w:t xml:space="preserve">27</w:t>
+              <w:t xml:space="preserve">26</w:t>
             </w:r>
           </w:p>
         </w:tc>
@@ -14094,7 +14979,7 @@
                 <w:sz w:val="19"/>
                 <w:szCs w:val="19"/>
               </w:rPr>
-              <w:t xml:space="preserve">Issue without control: pickle, salt, sugar</w:t>
+              <w:t xml:space="preserve">Issue without control: pickle, salt, sugar, fryums</w:t>
             </w:r>
           </w:p>
         </w:tc>
@@ -14105,7 +14990,7 @@
         <w:spacing w:after="120"/>
       </w:pPr>
       <w:r>
-        <w:t xml:space="preserve">The matrix decides where the queuing and optimisation effort goes: the </w:t>
+        <w:t xml:space="preserve">Counts are menu entries for the week (MDS_dataset.xlsx, Priority Matrix sheet). The matrix decides where the queuing and optimisation effort goes: the </w:t>
       </w:r>
       <w:r>
         <w:rPr>
@@ -14115,7 +15000,992 @@
         <w:t xml:space="preserve">AZ items</w:t>
       </w:r>
       <w:r>
-        <w:t xml:space="preserve">. The field visit confirmed the order: AZ star dishes ran out first (13:20–13:23), the AX curd later (13:39).</w:t>
+        <w:t xml:space="preserve">. The field visit confirmed the order: star dishes ran out first (13:20–13:23), the curd later (13:39). (The dataset's field notes label the curd AX, while its menu ratings give it AZ; we follow the ratings.)</w:t>
+      </w:r>
+    </w:p>
+    <w:p>
+      <w:pPr>
+        <w:spacing w:after="120"/>
+      </w:pPr>
+      <w:r>
+        <w:rPr>
+          <w:b/>
+          <w:bCs/>
+        </w:rPr>
+        <w:t xml:space="preserve">The matrix also sets how much each tray matters to the live system.</w:t>
+      </w:r>
+      <w:r>
+        <w:t xml:space="preserve"> The mess manager marks trays running low, out or refilled, and each tray's weight decides how strongly that moves students:</w:t>
+      </w:r>
+    </w:p>
+    <w:tbl>
+      <w:tblPr>
+        <w:tblW w:type="dxa" w:w="9026"/>
+        <w:tblBorders>
+          <w:top w:val="single" w:color="auto" w:sz="4"/>
+          <w:left w:val="single" w:color="auto" w:sz="4"/>
+          <w:bottom w:val="single" w:color="auto" w:sz="4"/>
+          <w:right w:val="single" w:color="auto" w:sz="4"/>
+          <w:insideH w:val="single" w:color="auto" w:sz="4"/>
+          <w:insideV w:val="single" w:color="auto" w:sz="4"/>
+        </w:tblBorders>
+      </w:tblPr>
+      <w:tblGrid>
+        <w:gridCol w:w="2400"/>
+        <w:gridCol w:w="1700"/>
+        <w:gridCol w:w="800"/>
+        <w:gridCol w:w="900"/>
+        <w:gridCol w:w="3226"/>
+      </w:tblGrid>
+      <w:tr>
+        <w:trPr>
+          <w:tblHeader/>
+        </w:trPr>
+        <w:tc>
+          <w:tcPr>
+            <w:tcW w:type="dxa" w:w="2400"/>
+            <w:tcBorders>
+              <w:top w:val="single" w:color="D9D8D3" w:sz="4"/>
+              <w:left w:val="single" w:color="D9D8D3" w:sz="4"/>
+              <w:bottom w:val="single" w:color="D9D8D3" w:sz="4"/>
+              <w:right w:val="single" w:color="D9D8D3" w:sz="4"/>
+            </w:tcBorders>
+            <w:shd w:fill="ECEBE7" w:color="auto" w:val="clear"/>
+            <w:tcMar>
+              <w:top w:type="dxa" w:w="60"/>
+              <w:left w:type="dxa" w:w="100"/>
+              <w:bottom w:type="dxa" w:w="60"/>
+              <w:right w:type="dxa" w:w="100"/>
+            </w:tcMar>
+          </w:tcPr>
+          <w:p>
+            <w:r>
+              <w:rPr>
+                <w:b/>
+                <w:bCs/>
+                <w:sz w:val="19"/>
+                <w:szCs w:val="19"/>
+              </w:rPr>
+              <w:t xml:space="preserve">Tray</w:t>
+            </w:r>
+          </w:p>
+        </w:tc>
+        <w:tc>
+          <w:tcPr>
+            <w:tcW w:type="dxa" w:w="1700"/>
+            <w:tcBorders>
+              <w:top w:val="single" w:color="D9D8D3" w:sz="4"/>
+              <w:left w:val="single" w:color="D9D8D3" w:sz="4"/>
+              <w:bottom w:val="single" w:color="D9D8D3" w:sz="4"/>
+              <w:right w:val="single" w:color="D9D8D3" w:sz="4"/>
+            </w:tcBorders>
+            <w:shd w:fill="ECEBE7" w:color="auto" w:val="clear"/>
+            <w:tcMar>
+              <w:top w:type="dxa" w:w="60"/>
+              <w:left w:type="dxa" w:w="100"/>
+              <w:bottom w:type="dxa" w:w="60"/>
+              <w:right w:type="dxa" w:w="100"/>
+            </w:tcMar>
+          </w:tcPr>
+          <w:p>
+            <w:r>
+              <w:rPr>
+                <w:b/>
+                <w:bCs/>
+                <w:sz w:val="19"/>
+                <w:szCs w:val="19"/>
+              </w:rPr>
+              <w:t xml:space="preserve">Item type</w:t>
+            </w:r>
+          </w:p>
+        </w:tc>
+        <w:tc>
+          <w:tcPr>
+            <w:tcW w:type="dxa" w:w="800"/>
+            <w:tcBorders>
+              <w:top w:val="single" w:color="D9D8D3" w:sz="4"/>
+              <w:left w:val="single" w:color="D9D8D3" w:sz="4"/>
+              <w:bottom w:val="single" w:color="D9D8D3" w:sz="4"/>
+              <w:right w:val="single" w:color="D9D8D3" w:sz="4"/>
+            </w:tcBorders>
+            <w:shd w:fill="ECEBE7" w:color="auto" w:val="clear"/>
+            <w:tcMar>
+              <w:top w:type="dxa" w:w="60"/>
+              <w:left w:type="dxa" w:w="100"/>
+              <w:bottom w:type="dxa" w:w="60"/>
+              <w:right w:type="dxa" w:w="100"/>
+            </w:tcMar>
+          </w:tcPr>
+          <w:p>
+            <w:r>
+              <w:rPr>
+                <w:b/>
+                <w:bCs/>
+                <w:sz w:val="19"/>
+                <w:szCs w:val="19"/>
+              </w:rPr>
+              <w:t xml:space="preserve">Class</w:t>
+            </w:r>
+          </w:p>
+        </w:tc>
+        <w:tc>
+          <w:tcPr>
+            <w:tcW w:type="dxa" w:w="900"/>
+            <w:tcBorders>
+              <w:top w:val="single" w:color="D9D8D3" w:sz="4"/>
+              <w:left w:val="single" w:color="D9D8D3" w:sz="4"/>
+              <w:bottom w:val="single" w:color="D9D8D3" w:sz="4"/>
+              <w:right w:val="single" w:color="D9D8D3" w:sz="4"/>
+            </w:tcBorders>
+            <w:shd w:fill="ECEBE7" w:color="auto" w:val="clear"/>
+            <w:tcMar>
+              <w:top w:type="dxa" w:w="60"/>
+              <w:left w:type="dxa" w:w="100"/>
+              <w:bottom w:type="dxa" w:w="60"/>
+              <w:right w:type="dxa" w:w="100"/>
+            </w:tcMar>
+          </w:tcPr>
+          <w:p>
+            <w:r>
+              <w:rPr>
+                <w:b/>
+                <w:bCs/>
+                <w:sz w:val="19"/>
+                <w:szCs w:val="19"/>
+              </w:rPr>
+              <w:t xml:space="preserve">Weight</w:t>
+            </w:r>
+          </w:p>
+        </w:tc>
+        <w:tc>
+          <w:tcPr>
+            <w:tcW w:type="dxa" w:w="3226"/>
+            <w:tcBorders>
+              <w:top w:val="single" w:color="D9D8D3" w:sz="4"/>
+              <w:left w:val="single" w:color="D9D8D3" w:sz="4"/>
+              <w:bottom w:val="single" w:color="D9D8D3" w:sz="4"/>
+              <w:right w:val="single" w:color="D9D8D3" w:sz="4"/>
+            </w:tcBorders>
+            <w:shd w:fill="ECEBE7" w:color="auto" w:val="clear"/>
+            <w:tcMar>
+              <w:top w:type="dxa" w:w="60"/>
+              <w:left w:type="dxa" w:w="100"/>
+              <w:bottom w:type="dxa" w:w="60"/>
+              <w:right w:type="dxa" w:w="100"/>
+            </w:tcMar>
+          </w:tcPr>
+          <w:p>
+            <w:r>
+              <w:rPr>
+                <w:b/>
+                <w:bCs/>
+                <w:sz w:val="19"/>
+                <w:szCs w:val="19"/>
+              </w:rPr>
+              <w:t xml:space="preserve">Effect when OUT</w:t>
+            </w:r>
+          </w:p>
+        </w:tc>
+      </w:tr>
+      <w:tr>
+        <w:tc>
+          <w:tcPr>
+            <w:tcW w:type="dxa" w:w="2400"/>
+            <w:tcBorders>
+              <w:top w:val="single" w:color="D9D8D3" w:sz="4"/>
+              <w:left w:val="single" w:color="D9D8D3" w:sz="4"/>
+              <w:bottom w:val="single" w:color="D9D8D3" w:sz="4"/>
+              <w:right w:val="single" w:color="D9D8D3" w:sz="4"/>
+            </w:tcBorders>
+            <w:tcMar>
+              <w:top w:type="dxa" w:w="60"/>
+              <w:left w:type="dxa" w:w="100"/>
+              <w:bottom w:type="dxa" w:w="60"/>
+              <w:right w:type="dxa" w:w="100"/>
+            </w:tcMar>
+          </w:tcPr>
+          <w:p>
+            <w:r>
+              <w:rPr>
+                <w:sz w:val="19"/>
+                <w:szCs w:val="19"/>
+              </w:rPr>
+              <w:t xml:space="preserve">Gravy sabji, special rice</w:t>
+            </w:r>
+          </w:p>
+        </w:tc>
+        <w:tc>
+          <w:tcPr>
+            <w:tcW w:type="dxa" w:w="1700"/>
+            <w:tcBorders>
+              <w:top w:val="single" w:color="D9D8D3" w:sz="4"/>
+              <w:left w:val="single" w:color="D9D8D3" w:sz="4"/>
+              <w:bottom w:val="single" w:color="D9D8D3" w:sz="4"/>
+              <w:right w:val="single" w:color="D9D8D3" w:sz="4"/>
+            </w:tcBorders>
+            <w:tcMar>
+              <w:top w:type="dxa" w:w="60"/>
+              <w:left w:type="dxa" w:w="100"/>
+              <w:bottom w:type="dxa" w:w="60"/>
+              <w:right w:type="dxa" w:w="100"/>
+            </w:tcMar>
+          </w:tcPr>
+          <w:p>
+            <w:r>
+              <w:rPr>
+                <w:sz w:val="19"/>
+                <w:szCs w:val="19"/>
+              </w:rPr>
+              <w:t xml:space="preserve">Star dish</w:t>
+            </w:r>
+          </w:p>
+        </w:tc>
+        <w:tc>
+          <w:tcPr>
+            <w:tcW w:type="dxa" w:w="800"/>
+            <w:tcBorders>
+              <w:top w:val="single" w:color="D9D8D3" w:sz="4"/>
+              <w:left w:val="single" w:color="D9D8D3" w:sz="4"/>
+              <w:bottom w:val="single" w:color="D9D8D3" w:sz="4"/>
+              <w:right w:val="single" w:color="D9D8D3" w:sz="4"/>
+            </w:tcBorders>
+            <w:tcMar>
+              <w:top w:type="dxa" w:w="60"/>
+              <w:left w:type="dxa" w:w="100"/>
+              <w:bottom w:type="dxa" w:w="60"/>
+              <w:right w:type="dxa" w:w="100"/>
+            </w:tcMar>
+          </w:tcPr>
+          <w:p>
+            <w:r>
+              <w:rPr>
+                <w:sz w:val="19"/>
+                <w:szCs w:val="19"/>
+              </w:rPr>
+              <w:t xml:space="preserve">AZ</w:t>
+            </w:r>
+          </w:p>
+        </w:tc>
+        <w:tc>
+          <w:tcPr>
+            <w:tcW w:type="dxa" w:w="900"/>
+            <w:tcBorders>
+              <w:top w:val="single" w:color="D9D8D3" w:sz="4"/>
+              <w:left w:val="single" w:color="D9D8D3" w:sz="4"/>
+              <w:bottom w:val="single" w:color="D9D8D3" w:sz="4"/>
+              <w:right w:val="single" w:color="D9D8D3" w:sz="4"/>
+            </w:tcBorders>
+            <w:tcMar>
+              <w:top w:type="dxa" w:w="60"/>
+              <w:left w:type="dxa" w:w="100"/>
+              <w:bottom w:type="dxa" w:w="60"/>
+              <w:right w:type="dxa" w:w="100"/>
+            </w:tcMar>
+          </w:tcPr>
+          <w:p>
+            <w:r>
+              <w:rPr>
+                <w:sz w:val="19"/>
+                <w:szCs w:val="19"/>
+              </w:rPr>
+              <w:t xml:space="preserve">1.0</w:t>
+            </w:r>
+          </w:p>
+        </w:tc>
+        <w:tc>
+          <w:tcPr>
+            <w:tcW w:type="dxa" w:w="3226"/>
+            <w:tcBorders>
+              <w:top w:val="single" w:color="D9D8D3" w:sz="4"/>
+              <w:left w:val="single" w:color="D9D8D3" w:sz="4"/>
+              <w:bottom w:val="single" w:color="D9D8D3" w:sz="4"/>
+              <w:right w:val="single" w:color="D9D8D3" w:sz="4"/>
+            </w:tcBorders>
+            <w:tcMar>
+              <w:top w:type="dxa" w:w="60"/>
+              <w:left w:type="dxa" w:w="100"/>
+              <w:bottom w:type="dxa" w:w="60"/>
+              <w:right w:type="dxa" w:w="100"/>
+            </w:tcMar>
+          </w:tcPr>
+          <w:p>
+            <w:r>
+              <w:rPr>
+                <w:sz w:val="19"/>
+                <w:szCs w:val="19"/>
+              </w:rPr>
+              <w:t xml:space="preserve">That mess is closed for routing: students are sent to the other mess</w:t>
+            </w:r>
+          </w:p>
+        </w:tc>
+      </w:tr>
+      <w:tr>
+        <w:tc>
+          <w:tcPr>
+            <w:tcW w:type="dxa" w:w="2400"/>
+            <w:tcBorders>
+              <w:top w:val="single" w:color="D9D8D3" w:sz="4"/>
+              <w:left w:val="single" w:color="D9D8D3" w:sz="4"/>
+              <w:bottom w:val="single" w:color="D9D8D3" w:sz="4"/>
+              <w:right w:val="single" w:color="D9D8D3" w:sz="4"/>
+            </w:tcBorders>
+            <w:tcMar>
+              <w:top w:type="dxa" w:w="60"/>
+              <w:left w:type="dxa" w:w="100"/>
+              <w:bottom w:type="dxa" w:w="60"/>
+              <w:right w:type="dxa" w:w="100"/>
+            </w:tcMar>
+          </w:tcPr>
+          <w:p>
+            <w:r>
+              <w:rPr>
+                <w:sz w:val="19"/>
+                <w:szCs w:val="19"/>
+              </w:rPr>
+              <w:t xml:space="preserve">Roti</w:t>
+            </w:r>
+          </w:p>
+        </w:tc>
+        <w:tc>
+          <w:tcPr>
+            <w:tcW w:type="dxa" w:w="1700"/>
+            <w:tcBorders>
+              <w:top w:val="single" w:color="D9D8D3" w:sz="4"/>
+              <w:left w:val="single" w:color="D9D8D3" w:sz="4"/>
+              <w:bottom w:val="single" w:color="D9D8D3" w:sz="4"/>
+              <w:right w:val="single" w:color="D9D8D3" w:sz="4"/>
+            </w:tcBorders>
+            <w:tcMar>
+              <w:top w:type="dxa" w:w="60"/>
+              <w:left w:type="dxa" w:w="100"/>
+              <w:bottom w:type="dxa" w:w="60"/>
+              <w:right w:type="dxa" w:w="100"/>
+            </w:tcMar>
+          </w:tcPr>
+          <w:p>
+            <w:r>
+              <w:rPr>
+                <w:sz w:val="19"/>
+                <w:szCs w:val="19"/>
+              </w:rPr>
+              <w:t xml:space="preserve">Made fresh in batches</w:t>
+            </w:r>
+          </w:p>
+        </w:tc>
+        <w:tc>
+          <w:tcPr>
+            <w:tcW w:type="dxa" w:w="800"/>
+            <w:tcBorders>
+              <w:top w:val="single" w:color="D9D8D3" w:sz="4"/>
+              <w:left w:val="single" w:color="D9D8D3" w:sz="4"/>
+              <w:bottom w:val="single" w:color="D9D8D3" w:sz="4"/>
+              <w:right w:val="single" w:color="D9D8D3" w:sz="4"/>
+            </w:tcBorders>
+            <w:tcMar>
+              <w:top w:type="dxa" w:w="60"/>
+              <w:left w:type="dxa" w:w="100"/>
+              <w:bottom w:type="dxa" w:w="60"/>
+              <w:right w:type="dxa" w:w="100"/>
+            </w:tcMar>
+          </w:tcPr>
+          <w:p>
+            <w:r>
+              <w:rPr>
+                <w:sz w:val="19"/>
+                <w:szCs w:val="19"/>
+              </w:rPr>
+              <w:t xml:space="preserve">AZ</w:t>
+            </w:r>
+          </w:p>
+        </w:tc>
+        <w:tc>
+          <w:tcPr>
+            <w:tcW w:type="dxa" w:w="900"/>
+            <w:tcBorders>
+              <w:top w:val="single" w:color="D9D8D3" w:sz="4"/>
+              <w:left w:val="single" w:color="D9D8D3" w:sz="4"/>
+              <w:bottom w:val="single" w:color="D9D8D3" w:sz="4"/>
+              <w:right w:val="single" w:color="D9D8D3" w:sz="4"/>
+            </w:tcBorders>
+            <w:tcMar>
+              <w:top w:type="dxa" w:w="60"/>
+              <w:left w:type="dxa" w:w="100"/>
+              <w:bottom w:type="dxa" w:w="60"/>
+              <w:right w:type="dxa" w:w="100"/>
+            </w:tcMar>
+          </w:tcPr>
+          <w:p>
+            <w:r>
+              <w:rPr>
+                <w:sz w:val="19"/>
+                <w:szCs w:val="19"/>
+              </w:rPr>
+              <w:t xml:space="preserve">0.5</w:t>
+            </w:r>
+          </w:p>
+        </w:tc>
+        <w:tc>
+          <w:tcPr>
+            <w:tcW w:type="dxa" w:w="3226"/>
+            <w:tcBorders>
+              <w:top w:val="single" w:color="D9D8D3" w:sz="4"/>
+              <w:left w:val="single" w:color="D9D8D3" w:sz="4"/>
+              <w:bottom w:val="single" w:color="D9D8D3" w:sz="4"/>
+              <w:right w:val="single" w:color="D9D8D3" w:sz="4"/>
+            </w:tcBorders>
+            <w:tcMar>
+              <w:top w:type="dxa" w:w="60"/>
+              <w:left w:type="dxa" w:w="100"/>
+              <w:bottom w:type="dxa" w:w="60"/>
+              <w:right w:type="dxa" w:w="100"/>
+            </w:tcMar>
+          </w:tcPr>
+          <w:p>
+            <w:r>
+              <w:rPr>
+                <w:sz w:val="19"/>
+                <w:szCs w:val="19"/>
+              </w:rPr>
+              <w:t xml:space="preserve">Adds 0.5 × E[refill] ≈ 9 min to that mess's wait</w:t>
+            </w:r>
+          </w:p>
+        </w:tc>
+      </w:tr>
+      <w:tr>
+        <w:tc>
+          <w:tcPr>
+            <w:tcW w:type="dxa" w:w="2400"/>
+            <w:tcBorders>
+              <w:top w:val="single" w:color="D9D8D3" w:sz="4"/>
+              <w:left w:val="single" w:color="D9D8D3" w:sz="4"/>
+              <w:bottom w:val="single" w:color="D9D8D3" w:sz="4"/>
+              <w:right w:val="single" w:color="D9D8D3" w:sz="4"/>
+            </w:tcBorders>
+            <w:tcMar>
+              <w:top w:type="dxa" w:w="60"/>
+              <w:left w:type="dxa" w:w="100"/>
+              <w:bottom w:type="dxa" w:w="60"/>
+              <w:right w:type="dxa" w:w="100"/>
+            </w:tcMar>
+          </w:tcPr>
+          <w:p>
+            <w:r>
+              <w:rPr>
+                <w:sz w:val="19"/>
+                <w:szCs w:val="19"/>
+              </w:rPr>
+              <w:t xml:space="preserve">Dessert</w:t>
+            </w:r>
+          </w:p>
+        </w:tc>
+        <w:tc>
+          <w:tcPr>
+            <w:tcW w:type="dxa" w:w="1700"/>
+            <w:tcBorders>
+              <w:top w:val="single" w:color="D9D8D3" w:sz="4"/>
+              <w:left w:val="single" w:color="D9D8D3" w:sz="4"/>
+              <w:bottom w:val="single" w:color="D9D8D3" w:sz="4"/>
+              <w:right w:val="single" w:color="D9D8D3" w:sz="4"/>
+            </w:tcBorders>
+            <w:tcMar>
+              <w:top w:type="dxa" w:w="60"/>
+              <w:left w:type="dxa" w:w="100"/>
+              <w:bottom w:type="dxa" w:w="60"/>
+              <w:right w:type="dxa" w:w="100"/>
+            </w:tcMar>
+          </w:tcPr>
+          <w:p>
+            <w:r>
+              <w:rPr>
+                <w:sz w:val="19"/>
+                <w:szCs w:val="19"/>
+              </w:rPr>
+              <w:t xml:space="preserve">One per plate</w:t>
+            </w:r>
+          </w:p>
+        </w:tc>
+        <w:tc>
+          <w:tcPr>
+            <w:tcW w:type="dxa" w:w="800"/>
+            <w:tcBorders>
+              <w:top w:val="single" w:color="D9D8D3" w:sz="4"/>
+              <w:left w:val="single" w:color="D9D8D3" w:sz="4"/>
+              <w:bottom w:val="single" w:color="D9D8D3" w:sz="4"/>
+              <w:right w:val="single" w:color="D9D8D3" w:sz="4"/>
+            </w:tcBorders>
+            <w:tcMar>
+              <w:top w:type="dxa" w:w="60"/>
+              <w:left w:type="dxa" w:w="100"/>
+              <w:bottom w:type="dxa" w:w="60"/>
+              <w:right w:type="dxa" w:w="100"/>
+            </w:tcMar>
+          </w:tcPr>
+          <w:p>
+            <w:r>
+              <w:rPr>
+                <w:sz w:val="19"/>
+                <w:szCs w:val="19"/>
+              </w:rPr>
+              <w:t xml:space="preserve">AX</w:t>
+            </w:r>
+          </w:p>
+        </w:tc>
+        <w:tc>
+          <w:tcPr>
+            <w:tcW w:type="dxa" w:w="900"/>
+            <w:tcBorders>
+              <w:top w:val="single" w:color="D9D8D3" w:sz="4"/>
+              <w:left w:val="single" w:color="D9D8D3" w:sz="4"/>
+              <w:bottom w:val="single" w:color="D9D8D3" w:sz="4"/>
+              <w:right w:val="single" w:color="D9D8D3" w:sz="4"/>
+            </w:tcBorders>
+            <w:tcMar>
+              <w:top w:type="dxa" w:w="60"/>
+              <w:left w:type="dxa" w:w="100"/>
+              <w:bottom w:type="dxa" w:w="60"/>
+              <w:right w:type="dxa" w:w="100"/>
+            </w:tcMar>
+          </w:tcPr>
+          <w:p>
+            <w:r>
+              <w:rPr>
+                <w:sz w:val="19"/>
+                <w:szCs w:val="19"/>
+              </w:rPr>
+              <w:t xml:space="preserve">0.3</w:t>
+            </w:r>
+          </w:p>
+        </w:tc>
+        <w:tc>
+          <w:tcPr>
+            <w:tcW w:type="dxa" w:w="3226"/>
+            <w:tcBorders>
+              <w:top w:val="single" w:color="D9D8D3" w:sz="4"/>
+              <w:left w:val="single" w:color="D9D8D3" w:sz="4"/>
+              <w:bottom w:val="single" w:color="D9D8D3" w:sz="4"/>
+              <w:right w:val="single" w:color="D9D8D3" w:sz="4"/>
+            </w:tcBorders>
+            <w:tcMar>
+              <w:top w:type="dxa" w:w="60"/>
+              <w:left w:type="dxa" w:w="100"/>
+              <w:bottom w:type="dxa" w:w="60"/>
+              <w:right w:type="dxa" w:w="100"/>
+            </w:tcMar>
+          </w:tcPr>
+          <w:p>
+            <w:r>
+              <w:rPr>
+                <w:sz w:val="19"/>
+                <w:szCs w:val="19"/>
+              </w:rPr>
+              <w:t xml:space="preserve">Adds ≈ 5 min</w:t>
+            </w:r>
+          </w:p>
+        </w:tc>
+      </w:tr>
+      <w:tr>
+        <w:tc>
+          <w:tcPr>
+            <w:tcW w:type="dxa" w:w="2400"/>
+            <w:tcBorders>
+              <w:top w:val="single" w:color="D9D8D3" w:sz="4"/>
+              <w:left w:val="single" w:color="D9D8D3" w:sz="4"/>
+              <w:bottom w:val="single" w:color="D9D8D3" w:sz="4"/>
+              <w:right w:val="single" w:color="D9D8D3" w:sz="4"/>
+            </w:tcBorders>
+            <w:tcMar>
+              <w:top w:type="dxa" w:w="60"/>
+              <w:left w:type="dxa" w:w="100"/>
+              <w:bottom w:type="dxa" w:w="60"/>
+              <w:right w:type="dxa" w:w="100"/>
+            </w:tcMar>
+          </w:tcPr>
+          <w:p>
+            <w:r>
+              <w:rPr>
+                <w:sz w:val="19"/>
+                <w:szCs w:val="19"/>
+              </w:rPr>
+              <w:t xml:space="preserve">Curd / raita</w:t>
+            </w:r>
+          </w:p>
+        </w:tc>
+        <w:tc>
+          <w:tcPr>
+            <w:tcW w:type="dxa" w:w="1700"/>
+            <w:tcBorders>
+              <w:top w:val="single" w:color="D9D8D3" w:sz="4"/>
+              <w:left w:val="single" w:color="D9D8D3" w:sz="4"/>
+              <w:bottom w:val="single" w:color="D9D8D3" w:sz="4"/>
+              <w:right w:val="single" w:color="D9D8D3" w:sz="4"/>
+            </w:tcBorders>
+            <w:tcMar>
+              <w:top w:type="dxa" w:w="60"/>
+              <w:left w:type="dxa" w:w="100"/>
+              <w:bottom w:type="dxa" w:w="60"/>
+              <w:right w:type="dxa" w:w="100"/>
+            </w:tcMar>
+          </w:tcPr>
+          <w:p>
+            <w:r>
+              <w:rPr>
+                <w:sz w:val="19"/>
+                <w:szCs w:val="19"/>
+              </w:rPr>
+              <w:t xml:space="preserve">Fresh side</w:t>
+            </w:r>
+          </w:p>
+        </w:tc>
+        <w:tc>
+          <w:tcPr>
+            <w:tcW w:type="dxa" w:w="800"/>
+            <w:tcBorders>
+              <w:top w:val="single" w:color="D9D8D3" w:sz="4"/>
+              <w:left w:val="single" w:color="D9D8D3" w:sz="4"/>
+              <w:bottom w:val="single" w:color="D9D8D3" w:sz="4"/>
+              <w:right w:val="single" w:color="D9D8D3" w:sz="4"/>
+            </w:tcBorders>
+            <w:tcMar>
+              <w:top w:type="dxa" w:w="60"/>
+              <w:left w:type="dxa" w:w="100"/>
+              <w:bottom w:type="dxa" w:w="60"/>
+              <w:right w:type="dxa" w:w="100"/>
+            </w:tcMar>
+          </w:tcPr>
+          <w:p>
+            <w:r>
+              <w:rPr>
+                <w:sz w:val="19"/>
+                <w:szCs w:val="19"/>
+              </w:rPr>
+              <w:t xml:space="preserve">AZ</w:t>
+            </w:r>
+          </w:p>
+        </w:tc>
+        <w:tc>
+          <w:tcPr>
+            <w:tcW w:type="dxa" w:w="900"/>
+            <w:tcBorders>
+              <w:top w:val="single" w:color="D9D8D3" w:sz="4"/>
+              <w:left w:val="single" w:color="D9D8D3" w:sz="4"/>
+              <w:bottom w:val="single" w:color="D9D8D3" w:sz="4"/>
+              <w:right w:val="single" w:color="D9D8D3" w:sz="4"/>
+            </w:tcBorders>
+            <w:tcMar>
+              <w:top w:type="dxa" w:w="60"/>
+              <w:left w:type="dxa" w:w="100"/>
+              <w:bottom w:type="dxa" w:w="60"/>
+              <w:right w:type="dxa" w:w="100"/>
+            </w:tcMar>
+          </w:tcPr>
+          <w:p>
+            <w:r>
+              <w:rPr>
+                <w:sz w:val="19"/>
+                <w:szCs w:val="19"/>
+              </w:rPr>
+              <w:t xml:space="preserve">0.3</w:t>
+            </w:r>
+          </w:p>
+        </w:tc>
+        <w:tc>
+          <w:tcPr>
+            <w:tcW w:type="dxa" w:w="3226"/>
+            <w:tcBorders>
+              <w:top w:val="single" w:color="D9D8D3" w:sz="4"/>
+              <w:left w:val="single" w:color="D9D8D3" w:sz="4"/>
+              <w:bottom w:val="single" w:color="D9D8D3" w:sz="4"/>
+              <w:right w:val="single" w:color="D9D8D3" w:sz="4"/>
+            </w:tcBorders>
+            <w:tcMar>
+              <w:top w:type="dxa" w:w="60"/>
+              <w:left w:type="dxa" w:w="100"/>
+              <w:bottom w:type="dxa" w:w="60"/>
+              <w:right w:type="dxa" w:w="100"/>
+            </w:tcMar>
+          </w:tcPr>
+          <w:p>
+            <w:r>
+              <w:rPr>
+                <w:sz w:val="19"/>
+                <w:szCs w:val="19"/>
+              </w:rPr>
+              <w:t xml:space="preserve">Adds ≈ 5 min</w:t>
+            </w:r>
+          </w:p>
+        </w:tc>
+      </w:tr>
+      <w:tr>
+        <w:tc>
+          <w:tcPr>
+            <w:tcW w:type="dxa" w:w="2400"/>
+            <w:tcBorders>
+              <w:top w:val="single" w:color="D9D8D3" w:sz="4"/>
+              <w:left w:val="single" w:color="D9D8D3" w:sz="4"/>
+              <w:bottom w:val="single" w:color="D9D8D3" w:sz="4"/>
+              <w:right w:val="single" w:color="D9D8D3" w:sz="4"/>
+            </w:tcBorders>
+            <w:tcMar>
+              <w:top w:type="dxa" w:w="60"/>
+              <w:left w:type="dxa" w:w="100"/>
+              <w:bottom w:type="dxa" w:w="60"/>
+              <w:right w:type="dxa" w:w="100"/>
+            </w:tcMar>
+          </w:tcPr>
+          <w:p>
+            <w:r>
+              <w:rPr>
+                <w:sz w:val="19"/>
+                <w:szCs w:val="19"/>
+              </w:rPr>
+              <w:t xml:space="preserve">Rice, dal, dry sabji, sambar / rasam</w:t>
+            </w:r>
+          </w:p>
+        </w:tc>
+        <w:tc>
+          <w:tcPr>
+            <w:tcW w:type="dxa" w:w="1700"/>
+            <w:tcBorders>
+              <w:top w:val="single" w:color="D9D8D3" w:sz="4"/>
+              <w:left w:val="single" w:color="D9D8D3" w:sz="4"/>
+              <w:bottom w:val="single" w:color="D9D8D3" w:sz="4"/>
+              <w:right w:val="single" w:color="D9D8D3" w:sz="4"/>
+            </w:tcBorders>
+            <w:tcMar>
+              <w:top w:type="dxa" w:w="60"/>
+              <w:left w:type="dxa" w:w="100"/>
+              <w:bottom w:type="dxa" w:w="60"/>
+              <w:right w:type="dxa" w:w="100"/>
+            </w:tcMar>
+          </w:tcPr>
+          <w:p>
+            <w:r>
+              <w:rPr>
+                <w:sz w:val="19"/>
+                <w:szCs w:val="19"/>
+              </w:rPr>
+              <w:t xml:space="preserve">Base food</w:t>
+            </w:r>
+          </w:p>
+        </w:tc>
+        <w:tc>
+          <w:tcPr>
+            <w:tcW w:type="dxa" w:w="800"/>
+            <w:tcBorders>
+              <w:top w:val="single" w:color="D9D8D3" w:sz="4"/>
+              <w:left w:val="single" w:color="D9D8D3" w:sz="4"/>
+              <w:bottom w:val="single" w:color="D9D8D3" w:sz="4"/>
+              <w:right w:val="single" w:color="D9D8D3" w:sz="4"/>
+            </w:tcBorders>
+            <w:tcMar>
+              <w:top w:type="dxa" w:w="60"/>
+              <w:left w:type="dxa" w:w="100"/>
+              <w:bottom w:type="dxa" w:w="60"/>
+              <w:right w:type="dxa" w:w="100"/>
+            </w:tcMar>
+          </w:tcPr>
+          <w:p>
+            <w:r>
+              <w:rPr>
+                <w:sz w:val="19"/>
+                <w:szCs w:val="19"/>
+              </w:rPr>
+              <w:t xml:space="preserve">CZ</w:t>
+            </w:r>
+          </w:p>
+        </w:tc>
+        <w:tc>
+          <w:tcPr>
+            <w:tcW w:type="dxa" w:w="900"/>
+            <w:tcBorders>
+              <w:top w:val="single" w:color="D9D8D3" w:sz="4"/>
+              <w:left w:val="single" w:color="D9D8D3" w:sz="4"/>
+              <w:bottom w:val="single" w:color="D9D8D3" w:sz="4"/>
+              <w:right w:val="single" w:color="D9D8D3" w:sz="4"/>
+            </w:tcBorders>
+            <w:tcMar>
+              <w:top w:type="dxa" w:w="60"/>
+              <w:left w:type="dxa" w:w="100"/>
+              <w:bottom w:type="dxa" w:w="60"/>
+              <w:right w:type="dxa" w:w="100"/>
+            </w:tcMar>
+          </w:tcPr>
+          <w:p>
+            <w:r>
+              <w:rPr>
+                <w:sz w:val="19"/>
+                <w:szCs w:val="19"/>
+              </w:rPr>
+              <w:t xml:space="preserve">0.1</w:t>
+            </w:r>
+          </w:p>
+        </w:tc>
+        <w:tc>
+          <w:tcPr>
+            <w:tcW w:type="dxa" w:w="3226"/>
+            <w:tcBorders>
+              <w:top w:val="single" w:color="D9D8D3" w:sz="4"/>
+              <w:left w:val="single" w:color="D9D8D3" w:sz="4"/>
+              <w:bottom w:val="single" w:color="D9D8D3" w:sz="4"/>
+              <w:right w:val="single" w:color="D9D8D3" w:sz="4"/>
+            </w:tcBorders>
+            <w:tcMar>
+              <w:top w:type="dxa" w:w="60"/>
+              <w:left w:type="dxa" w:w="100"/>
+              <w:bottom w:type="dxa" w:w="60"/>
+              <w:right w:type="dxa" w:w="100"/>
+            </w:tcMar>
+          </w:tcPr>
+          <w:p>
+            <w:r>
+              <w:rPr>
+                <w:sz w:val="19"/>
+                <w:szCs w:val="19"/>
+              </w:rPr>
+              <w:t xml:space="preserve">Adds ≈ 2 min (interchangeable; 'quietly absorbed')</w:t>
+            </w:r>
+          </w:p>
+        </w:tc>
+      </w:tr>
+      <w:tr>
+        <w:tc>
+          <w:tcPr>
+            <w:tcW w:type="dxa" w:w="2400"/>
+            <w:tcBorders>
+              <w:top w:val="single" w:color="D9D8D3" w:sz="4"/>
+              <w:left w:val="single" w:color="D9D8D3" w:sz="4"/>
+              <w:bottom w:val="single" w:color="D9D8D3" w:sz="4"/>
+              <w:right w:val="single" w:color="D9D8D3" w:sz="4"/>
+            </w:tcBorders>
+            <w:tcMar>
+              <w:top w:type="dxa" w:w="60"/>
+              <w:left w:type="dxa" w:w="100"/>
+              <w:bottom w:type="dxa" w:w="60"/>
+              <w:right w:type="dxa" w:w="100"/>
+            </w:tcMar>
+          </w:tcPr>
+          <w:p>
+            <w:r>
+              <w:rPr>
+                <w:sz w:val="19"/>
+                <w:szCs w:val="19"/>
+              </w:rPr>
+              <w:t xml:space="preserve">Salt, pickle, fryums</w:t>
+            </w:r>
+          </w:p>
+        </w:tc>
+        <w:tc>
+          <w:tcPr>
+            <w:tcW w:type="dxa" w:w="1700"/>
+            <w:tcBorders>
+              <w:top w:val="single" w:color="D9D8D3" w:sz="4"/>
+              <w:left w:val="single" w:color="D9D8D3" w:sz="4"/>
+              <w:bottom w:val="single" w:color="D9D8D3" w:sz="4"/>
+              <w:right w:val="single" w:color="D9D8D3" w:sz="4"/>
+            </w:tcBorders>
+            <w:tcMar>
+              <w:top w:type="dxa" w:w="60"/>
+              <w:left w:type="dxa" w:w="100"/>
+              <w:bottom w:type="dxa" w:w="60"/>
+              <w:right w:type="dxa" w:w="100"/>
+            </w:tcMar>
+          </w:tcPr>
+          <w:p>
+            <w:r>
+              <w:rPr>
+                <w:sz w:val="19"/>
+                <w:szCs w:val="19"/>
+              </w:rPr>
+              <w:t xml:space="preserve">Table item</w:t>
+            </w:r>
+          </w:p>
+        </w:tc>
+        <w:tc>
+          <w:tcPr>
+            <w:tcW w:type="dxa" w:w="800"/>
+            <w:tcBorders>
+              <w:top w:val="single" w:color="D9D8D3" w:sz="4"/>
+              <w:left w:val="single" w:color="D9D8D3" w:sz="4"/>
+              <w:bottom w:val="single" w:color="D9D8D3" w:sz="4"/>
+              <w:right w:val="single" w:color="D9D8D3" w:sz="4"/>
+            </w:tcBorders>
+            <w:tcMar>
+              <w:top w:type="dxa" w:w="60"/>
+              <w:left w:type="dxa" w:w="100"/>
+              <w:bottom w:type="dxa" w:w="60"/>
+              <w:right w:type="dxa" w:w="100"/>
+            </w:tcMar>
+          </w:tcPr>
+          <w:p>
+            <w:r>
+              <w:rPr>
+                <w:sz w:val="19"/>
+                <w:szCs w:val="19"/>
+              </w:rPr>
+              <w:t xml:space="preserve">CX</w:t>
+            </w:r>
+          </w:p>
+        </w:tc>
+        <w:tc>
+          <w:tcPr>
+            <w:tcW w:type="dxa" w:w="900"/>
+            <w:tcBorders>
+              <w:top w:val="single" w:color="D9D8D3" w:sz="4"/>
+              <w:left w:val="single" w:color="D9D8D3" w:sz="4"/>
+              <w:bottom w:val="single" w:color="D9D8D3" w:sz="4"/>
+              <w:right w:val="single" w:color="D9D8D3" w:sz="4"/>
+            </w:tcBorders>
+            <w:tcMar>
+              <w:top w:type="dxa" w:w="60"/>
+              <w:left w:type="dxa" w:w="100"/>
+              <w:bottom w:type="dxa" w:w="60"/>
+              <w:right w:type="dxa" w:w="100"/>
+            </w:tcMar>
+          </w:tcPr>
+          <w:p>
+            <w:r>
+              <w:rPr>
+                <w:sz w:val="19"/>
+                <w:szCs w:val="19"/>
+              </w:rPr>
+              <w:t xml:space="preserve">0</w:t>
+            </w:r>
+          </w:p>
+        </w:tc>
+        <w:tc>
+          <w:tcPr>
+            <w:tcW w:type="dxa" w:w="3226"/>
+            <w:tcBorders>
+              <w:top w:val="single" w:color="D9D8D3" w:sz="4"/>
+              <w:left w:val="single" w:color="D9D8D3" w:sz="4"/>
+              <w:bottom w:val="single" w:color="D9D8D3" w:sz="4"/>
+              <w:right w:val="single" w:color="D9D8D3" w:sz="4"/>
+            </w:tcBorders>
+            <w:tcMar>
+              <w:top w:type="dxa" w:w="60"/>
+              <w:left w:type="dxa" w:w="100"/>
+              <w:bottom w:type="dxa" w:w="60"/>
+              <w:right w:type="dxa" w:w="100"/>
+            </w:tcMar>
+          </w:tcPr>
+          <w:p>
+            <w:r>
+              <w:rPr>
+                <w:sz w:val="19"/>
+                <w:szCs w:val="19"/>
+              </w:rPr>
+              <w:t xml:space="preserve">Not tracked</w:t>
+            </w:r>
+          </w:p>
+        </w:tc>
+      </w:tr>
+    </w:tbl>
+    <w:p>
+      <w:pPr>
+        <w:spacing w:after="120"/>
+      </w:pPr>
+      <w:r>
+        <w:t xml:space="preserve">'Running low' adds a quarter of the 'out' effect (assumed), e.g. a star dish running low adds ≈ 4 min. The weights are the group's reading of the matrix: class A above class C; within A, the dish students come for above items made continuously (chapati), one-per-plate sweets and fresh sides. They should be confirmed with the CT manager.</w:t>
       </w:r>
     </w:p>
     <w:p>
@@ -17386,6 +19256,218 @@
           </w:p>
         </w:tc>
       </w:tr>
+      <w:tr>
+        <w:tc>
+          <w:tcPr>
+            <w:tcW w:type="dxa" w:w="2400"/>
+            <w:tcBorders>
+              <w:top w:val="single" w:color="D9D8D3" w:sz="4"/>
+              <w:left w:val="single" w:color="D9D8D3" w:sz="4"/>
+              <w:bottom w:val="single" w:color="D9D8D3" w:sz="4"/>
+              <w:right w:val="single" w:color="D9D8D3" w:sz="4"/>
+            </w:tcBorders>
+            <w:tcMar>
+              <w:top w:type="dxa" w:w="60"/>
+              <w:left w:type="dxa" w:w="100"/>
+              <w:bottom w:type="dxa" w:w="60"/>
+              <w:right w:type="dxa" w:w="100"/>
+            </w:tcMar>
+          </w:tcPr>
+          <w:p>
+            <w:r>
+              <w:rPr>
+                <w:sz w:val="19"/>
+                <w:szCs w:val="19"/>
+              </w:rPr>
+              <w:t xml:space="preserve">Tray weights</w:t>
+            </w:r>
+          </w:p>
+        </w:tc>
+        <w:tc>
+          <w:tcPr>
+            <w:tcW w:type="dxa" w:w="2400"/>
+            <w:tcBorders>
+              <w:top w:val="single" w:color="D9D8D3" w:sz="4"/>
+              <w:left w:val="single" w:color="D9D8D3" w:sz="4"/>
+              <w:bottom w:val="single" w:color="D9D8D3" w:sz="4"/>
+              <w:right w:val="single" w:color="D9D8D3" w:sz="4"/>
+            </w:tcBorders>
+            <w:tcMar>
+              <w:top w:type="dxa" w:w="60"/>
+              <w:left w:type="dxa" w:w="100"/>
+              <w:bottom w:type="dxa" w:w="60"/>
+              <w:right w:type="dxa" w:w="100"/>
+            </w:tcMar>
+          </w:tcPr>
+          <w:p>
+            <w:r>
+              <w:rPr>
+                <w:sz w:val="19"/>
+                <w:szCs w:val="19"/>
+              </w:rPr>
+              <w:t xml:space="preserve">Star 1.0, roti 0.5, dessert / curd 0.3, base food 0.1</w:t>
+            </w:r>
+          </w:p>
+        </w:tc>
+        <w:tc>
+          <w:tcPr>
+            <w:tcW w:type="dxa" w:w="1700"/>
+            <w:tcBorders>
+              <w:top w:val="single" w:color="D9D8D3" w:sz="4"/>
+              <w:left w:val="single" w:color="D9D8D3" w:sz="4"/>
+              <w:bottom w:val="single" w:color="D9D8D3" w:sz="4"/>
+              <w:right w:val="single" w:color="D9D8D3" w:sz="4"/>
+            </w:tcBorders>
+            <w:tcMar>
+              <w:top w:type="dxa" w:w="60"/>
+              <w:left w:type="dxa" w:w="100"/>
+              <w:bottom w:type="dxa" w:w="60"/>
+              <w:right w:type="dxa" w:w="100"/>
+            </w:tcMar>
+          </w:tcPr>
+          <w:p>
+            <w:r>
+              <w:rPr>
+                <w:sz w:val="19"/>
+                <w:szCs w:val="19"/>
+              </w:rPr>
+              <w:t xml:space="preserve">Group judgement from the ABC/XYZ matrix</w:t>
+            </w:r>
+          </w:p>
+        </w:tc>
+        <w:tc>
+          <w:tcPr>
+            <w:tcW w:type="dxa" w:w="2526"/>
+            <w:tcBorders>
+              <w:top w:val="single" w:color="D9D8D3" w:sz="4"/>
+              <w:left w:val="single" w:color="D9D8D3" w:sz="4"/>
+              <w:bottom w:val="single" w:color="D9D8D3" w:sz="4"/>
+              <w:right w:val="single" w:color="D9D8D3" w:sz="4"/>
+            </w:tcBorders>
+            <w:tcMar>
+              <w:top w:type="dxa" w:w="60"/>
+              <w:left w:type="dxa" w:w="100"/>
+              <w:bottom w:type="dxa" w:w="60"/>
+              <w:right w:type="dxa" w:w="100"/>
+            </w:tcMar>
+          </w:tcPr>
+          <w:p>
+            <w:r>
+              <w:rPr>
+                <w:sz w:val="19"/>
+                <w:szCs w:val="19"/>
+              </w:rPr>
+              <w:t xml:space="preserve">Confirm with the CT manager</w:t>
+            </w:r>
+          </w:p>
+        </w:tc>
+      </w:tr>
+      <w:tr>
+        <w:tc>
+          <w:tcPr>
+            <w:tcW w:type="dxa" w:w="2400"/>
+            <w:tcBorders>
+              <w:top w:val="single" w:color="D9D8D3" w:sz="4"/>
+              <w:left w:val="single" w:color="D9D8D3" w:sz="4"/>
+              <w:bottom w:val="single" w:color="D9D8D3" w:sz="4"/>
+              <w:right w:val="single" w:color="D9D8D3" w:sz="4"/>
+            </w:tcBorders>
+            <w:tcMar>
+              <w:top w:type="dxa" w:w="60"/>
+              <w:left w:type="dxa" w:w="100"/>
+              <w:bottom w:type="dxa" w:w="60"/>
+              <w:right w:type="dxa" w:w="100"/>
+            </w:tcMar>
+          </w:tcPr>
+          <w:p>
+            <w:r>
+              <w:rPr>
+                <w:sz w:val="19"/>
+                <w:szCs w:val="19"/>
+              </w:rPr>
+              <w:t xml:space="preserve">'Running low' share</w:t>
+            </w:r>
+          </w:p>
+        </w:tc>
+        <w:tc>
+          <w:tcPr>
+            <w:tcW w:type="dxa" w:w="2400"/>
+            <w:tcBorders>
+              <w:top w:val="single" w:color="D9D8D3" w:sz="4"/>
+              <w:left w:val="single" w:color="D9D8D3" w:sz="4"/>
+              <w:bottom w:val="single" w:color="D9D8D3" w:sz="4"/>
+              <w:right w:val="single" w:color="D9D8D3" w:sz="4"/>
+            </w:tcBorders>
+            <w:tcMar>
+              <w:top w:type="dxa" w:w="60"/>
+              <w:left w:type="dxa" w:w="100"/>
+              <w:bottom w:type="dxa" w:w="60"/>
+              <w:right w:type="dxa" w:w="100"/>
+            </w:tcMar>
+          </w:tcPr>
+          <w:p>
+            <w:r>
+              <w:rPr>
+                <w:sz w:val="19"/>
+                <w:szCs w:val="19"/>
+              </w:rPr>
+              <w:t xml:space="preserve">0.25 of a run-out</w:t>
+            </w:r>
+          </w:p>
+        </w:tc>
+        <w:tc>
+          <w:tcPr>
+            <w:tcW w:type="dxa" w:w="1700"/>
+            <w:tcBorders>
+              <w:top w:val="single" w:color="D9D8D3" w:sz="4"/>
+              <w:left w:val="single" w:color="D9D8D3" w:sz="4"/>
+              <w:bottom w:val="single" w:color="D9D8D3" w:sz="4"/>
+              <w:right w:val="single" w:color="D9D8D3" w:sz="4"/>
+            </w:tcBorders>
+            <w:tcMar>
+              <w:top w:type="dxa" w:w="60"/>
+              <w:left w:type="dxa" w:w="100"/>
+              <w:bottom w:type="dxa" w:w="60"/>
+              <w:right w:type="dxa" w:w="100"/>
+            </w:tcMar>
+          </w:tcPr>
+          <w:p>
+            <w:r>
+              <w:rPr>
+                <w:sz w:val="19"/>
+                <w:szCs w:val="19"/>
+              </w:rPr>
+              <w:t xml:space="preserve">Assumed</w:t>
+            </w:r>
+          </w:p>
+        </w:tc>
+        <w:tc>
+          <w:tcPr>
+            <w:tcW w:type="dxa" w:w="2526"/>
+            <w:tcBorders>
+              <w:top w:val="single" w:color="D9D8D3" w:sz="4"/>
+              <w:left w:val="single" w:color="D9D8D3" w:sz="4"/>
+              <w:bottom w:val="single" w:color="D9D8D3" w:sz="4"/>
+              <w:right w:val="single" w:color="D9D8D3" w:sz="4"/>
+            </w:tcBorders>
+            <w:tcMar>
+              <w:top w:type="dxa" w:w="60"/>
+              <w:left w:type="dxa" w:w="100"/>
+              <w:bottom w:type="dxa" w:w="60"/>
+              <w:right w:type="dxa" w:w="100"/>
+            </w:tcMar>
+          </w:tcPr>
+          <w:p>
+            <w:r>
+              <w:rPr>
+                <w:sz w:val="19"/>
+                <w:szCs w:val="19"/>
+              </w:rPr>
+              <w:t xml:space="preserve">Logs of how long trays last after 'running low'</w:t>
+            </w:r>
+          </w:p>
+        </w:tc>
+      </w:tr>
     </w:tbl>
     <w:p>
       <w:pPr>
@@ -19167,7 +21249,95 @@
                 <w:sz w:val="19"/>
                 <w:szCs w:val="19"/>
               </w:rPr>
-              <w:t xml:space="preserve">Combines scans, kitchen taps, estimates and routing</w:t>
+              <w:t xml:space="preserve">Combines scans, the manager's food-status taps (weighted), estimates and routing</w:t>
+            </w:r>
+          </w:p>
+        </w:tc>
+      </w:tr>
+      <w:tr>
+        <w:tc>
+          <w:tcPr>
+            <w:tcW w:type="dxa" w:w="3000"/>
+            <w:tcBorders>
+              <w:top w:val="single" w:color="D9D8D3" w:sz="4"/>
+              <w:left w:val="single" w:color="D9D8D3" w:sz="4"/>
+              <w:bottom w:val="single" w:color="D9D8D3" w:sz="4"/>
+              <w:right w:val="single" w:color="D9D8D3" w:sz="4"/>
+            </w:tcBorders>
+            <w:tcMar>
+              <w:top w:type="dxa" w:w="60"/>
+              <w:left w:type="dxa" w:w="100"/>
+              <w:bottom w:type="dxa" w:w="60"/>
+              <w:right w:type="dxa" w:w="100"/>
+            </w:tcMar>
+          </w:tcPr>
+          <w:p>
+            <w:r>
+              <w:rPr>
+                <w:sz w:val="19"/>
+                <w:szCs w:val="19"/>
+              </w:rPr>
+              <w:t xml:space="preserve">Tray weights</w:t>
+            </w:r>
+          </w:p>
+        </w:tc>
+        <w:tc>
+          <w:tcPr>
+            <w:tcW w:type="dxa" w:w="2600"/>
+            <w:tcBorders>
+              <w:top w:val="single" w:color="D9D8D3" w:sz="4"/>
+              <w:left w:val="single" w:color="D9D8D3" w:sz="4"/>
+              <w:bottom w:val="single" w:color="D9D8D3" w:sz="4"/>
+              <w:right w:val="single" w:color="D9D8D3" w:sz="4"/>
+            </w:tcBorders>
+            <w:tcMar>
+              <w:top w:type="dxa" w:w="60"/>
+              <w:left w:type="dxa" w:w="100"/>
+              <w:bottom w:type="dxa" w:w="60"/>
+              <w:right w:type="dxa" w:w="100"/>
+            </w:tcMar>
+          </w:tcPr>
+          <w:p>
+            <w:r>
+              <w:rPr>
+                <w:rFonts w:ascii="Consolas" w:cs="Consolas" w:eastAsia="Consolas" w:hAnsi="Consolas"/>
+                <w:sz w:val="19"/>
+                <w:szCs w:val="19"/>
+              </w:rPr>
+              <w:t xml:space="preserve">config/default.toml</w:t>
+            </w:r>
+            <w:r>
+              <w:rPr>
+                <w:sz w:val="19"/>
+                <w:szCs w:val="19"/>
+              </w:rPr>
+              <w:t xml:space="preserve"> [[tray]]</w:t>
+            </w:r>
+          </w:p>
+        </w:tc>
+        <w:tc>
+          <w:tcPr>
+            <w:tcW w:type="dxa" w:w="3426"/>
+            <w:tcBorders>
+              <w:top w:val="single" w:color="D9D8D3" w:sz="4"/>
+              <w:left w:val="single" w:color="D9D8D3" w:sz="4"/>
+              <w:bottom w:val="single" w:color="D9D8D3" w:sz="4"/>
+              <w:right w:val="single" w:color="D9D8D3" w:sz="4"/>
+            </w:tcBorders>
+            <w:tcMar>
+              <w:top w:type="dxa" w:w="60"/>
+              <w:left w:type="dxa" w:w="100"/>
+              <w:bottom w:type="dxa" w:w="60"/>
+              <w:right w:type="dxa" w:w="100"/>
+            </w:tcMar>
+          </w:tcPr>
+          <w:p>
+            <w:r>
+              <w:rPr>
+                <w:sz w:val="19"/>
+                <w:szCs w:val="19"/>
+              </w:rPr>
+              <w:t xml:space="preserve">Item type, ABC/XYZ class and weight for each tray</w:t>
             </w:r>
           </w:p>
         </w:tc>

</xml_diff>

<commit_message>
New project title (Beyond the Bottleneck) and revised problem statement; Phase 1 to Phase 2 bridge
Co-Authored-By: Claude Opus 5.5 <noreply@anthropic.com>
Claude-Session: https://claude.ai/code/session_013JwSYm4UV7vKHqaUukbU1G
</commit_message>
<xml_diff>
--- a/docs/MDS_Queuing_Theory_and_Simulation.docx
+++ b/docs/MDS_Queuing_Theory_and_Simulation.docx
@@ -53,6 +53,21 @@
           <w:bCs/>
         </w:rPr>
         <w:t xml:space="preserve">Project:</w:t>
+      </w:r>
+      <w:r>
+        <w:t xml:space="preserve"> Beyond the Bottleneck: Enabling Smarter Lunch Flow by Optimising Queue Management and Capacity Utilisation Across Chefs Touch Centres</w:t>
+      </w:r>
+    </w:p>
+    <w:p>
+      <w:pPr>
+        <w:spacing w:after="120"/>
+      </w:pPr>
+      <w:r>
+        <w:rPr>
+          <w:b/>
+          <w:bCs/>
+        </w:rPr>
+        <w:t xml:space="preserve">Phase 1 title:</w:t>
       </w:r>
       <w:r>
         <w:t xml:space="preserve"> The Two-Hour Bottleneck: Optimising Critical Commodity Allocation Across CT's Centres During Peak Lunch Hours</w:t>
@@ -311,6 +326,594 @@
       </w:pPr>
       <w:r>
         <w:t xml:space="preserve">Chefs Touch (CT) cooks lunch in a central kitchen and supplies five centres: Central CT, AB2, AB3, AB4 and New Mess. Lunch (11:30–14:30) is the busiest three hours on campus. Demand is concentrated into a short window while kitchen, delivery and serving capacity are fixed, so small mismatches turn into queues, run-outs and waste.</w:t>
+      </w:r>
+    </w:p>
+    <w:p>
+      <w:pPr>
+        <w:pStyle w:val="Heading2"/>
+      </w:pPr>
+      <w:r>
+        <w:t xml:space="preserve">1.0 From Phase 1 to Phase 2: the revised problem</w:t>
+      </w:r>
+    </w:p>
+    <w:p>
+      <w:pPr>
+        <w:spacing w:after="120"/>
+      </w:pPr>
+      <w:r>
+        <w:rPr>
+          <w:b/>
+          <w:bCs/>
+        </w:rPr>
+        <w:t xml:space="preserve">Phase 1</w:t>
+      </w:r>
+      <w:r>
+        <w:t xml:space="preserve"> (*The Two-Hour Bottleneck*) asked whether CT's </w:t>
+      </w:r>
+      <w:r>
+        <w:rPr>
+          <w:b/>
+          <w:bCs/>
+        </w:rPr>
+        <w:t xml:space="preserve">food</w:t>
+      </w:r>
+      <w:r>
+        <w:t xml:space="preserve"> was reaching the right centre, in the right quantity, at the right time. The field visit answered part of that, and it showed that food is only half the problem. Students also wait because of </w:t>
+      </w:r>
+      <w:r>
+        <w:rPr>
+          <w:b/>
+          <w:bCs/>
+        </w:rPr>
+        <w:t xml:space="preserve">how they and the serving capacity are matched</w:t>
+      </w:r>
+      <w:r>
+        <w:t xml:space="preserve">: most go to Central CT by habit and overload its two serving stations, while Munch Mess, serving the same menu, runs well below capacity. When a star dish runs out at the busy mess, its queue gets longer still.</w:t>
+      </w:r>
+    </w:p>
+    <w:p>
+      <w:pPr>
+        <w:spacing w:after="120"/>
+      </w:pPr>
+      <w:r>
+        <w:rPr>
+          <w:b/>
+          <w:bCs/>
+        </w:rPr>
+        <w:t xml:space="preserve">Revised problem statement (Phase 2).</w:t>
+      </w:r>
+      <w:r>
+        <w:t xml:space="preserve"> During the 11:30–14:30 lunch window, Chefs Touch serves about 2,960 students. Total serving capacity is enough on average, but it is used unevenly: one centre is saturated while another has spare capacity, so students wait (about 15 minutes observed) even though the system as a whole could serve them faster. Food run-outs at the busy centre make this worse. </w:t>
+      </w:r>
+      <w:r>
+        <w:rPr>
+          <w:b/>
+          <w:bCs/>
+        </w:rPr>
+        <w:t xml:space="preserve">The project uses biometric entry scans, queuing theory and live screens to balance student flow across centres and to give the mess manager earlier signals about food, so the same capacity serves the same students with less waiting.</w:t>
+      </w:r>
+    </w:p>
+    <w:p>
+      <w:pPr>
+        <w:spacing w:after="120"/>
+      </w:pPr>
+      <w:r>
+        <w:rPr>
+          <w:b/>
+          <w:bCs/>
+        </w:rPr>
+        <w:t xml:space="preserve">Decision question:</w:t>
+      </w:r>
+      <w:r>
+        <w:t xml:space="preserve"> how should student flow and serving capacity be balanced across CT's centres, minute by minute, so that waiting falls without adding staff or space?</w:t>
+      </w:r>
+    </w:p>
+    <w:tbl>
+      <w:tblPr>
+        <w:tblW w:type="dxa" w:w="9026"/>
+        <w:tblBorders>
+          <w:top w:val="single" w:color="auto" w:sz="4"/>
+          <w:left w:val="single" w:color="auto" w:sz="4"/>
+          <w:bottom w:val="single" w:color="auto" w:sz="4"/>
+          <w:right w:val="single" w:color="auto" w:sz="4"/>
+          <w:insideH w:val="single" w:color="auto" w:sz="4"/>
+          <w:insideV w:val="single" w:color="auto" w:sz="4"/>
+        </w:tblBorders>
+      </w:tblPr>
+      <w:tblGrid>
+        <w:gridCol w:w="1400"/>
+        <w:gridCol w:w="3800"/>
+        <w:gridCol w:w="3826"/>
+      </w:tblGrid>
+      <w:tr>
+        <w:trPr>
+          <w:tblHeader/>
+        </w:trPr>
+        <w:tc>
+          <w:tcPr>
+            <w:tcW w:type="dxa" w:w="1400"/>
+            <w:tcBorders>
+              <w:top w:val="single" w:color="D9D8D3" w:sz="4"/>
+              <w:left w:val="single" w:color="D9D8D3" w:sz="4"/>
+              <w:bottom w:val="single" w:color="D9D8D3" w:sz="4"/>
+              <w:right w:val="single" w:color="D9D8D3" w:sz="4"/>
+            </w:tcBorders>
+            <w:shd w:fill="ECEBE7" w:color="auto" w:val="clear"/>
+            <w:tcMar>
+              <w:top w:type="dxa" w:w="60"/>
+              <w:left w:type="dxa" w:w="100"/>
+              <w:bottom w:type="dxa" w:w="60"/>
+              <w:right w:type="dxa" w:w="100"/>
+            </w:tcMar>
+          </w:tcPr>
+          <w:p/>
+        </w:tc>
+        <w:tc>
+          <w:tcPr>
+            <w:tcW w:type="dxa" w:w="3800"/>
+            <w:tcBorders>
+              <w:top w:val="single" w:color="D9D8D3" w:sz="4"/>
+              <w:left w:val="single" w:color="D9D8D3" w:sz="4"/>
+              <w:bottom w:val="single" w:color="D9D8D3" w:sz="4"/>
+              <w:right w:val="single" w:color="D9D8D3" w:sz="4"/>
+            </w:tcBorders>
+            <w:shd w:fill="ECEBE7" w:color="auto" w:val="clear"/>
+            <w:tcMar>
+              <w:top w:type="dxa" w:w="60"/>
+              <w:left w:type="dxa" w:w="100"/>
+              <w:bottom w:type="dxa" w:w="60"/>
+              <w:right w:type="dxa" w:w="100"/>
+            </w:tcMar>
+          </w:tcPr>
+          <w:p>
+            <w:r>
+              <w:rPr>
+                <w:b/>
+                <w:bCs/>
+                <w:sz w:val="19"/>
+                <w:szCs w:val="19"/>
+              </w:rPr>
+              <w:t xml:space="preserve">Phase 1: The Two-Hour Bottleneck</w:t>
+            </w:r>
+          </w:p>
+        </w:tc>
+        <w:tc>
+          <w:tcPr>
+            <w:tcW w:type="dxa" w:w="3826"/>
+            <w:tcBorders>
+              <w:top w:val="single" w:color="D9D8D3" w:sz="4"/>
+              <w:left w:val="single" w:color="D9D8D3" w:sz="4"/>
+              <w:bottom w:val="single" w:color="D9D8D3" w:sz="4"/>
+              <w:right w:val="single" w:color="D9D8D3" w:sz="4"/>
+            </w:tcBorders>
+            <w:shd w:fill="ECEBE7" w:color="auto" w:val="clear"/>
+            <w:tcMar>
+              <w:top w:type="dxa" w:w="60"/>
+              <w:left w:type="dxa" w:w="100"/>
+              <w:bottom w:type="dxa" w:w="60"/>
+              <w:right w:type="dxa" w:w="100"/>
+            </w:tcMar>
+          </w:tcPr>
+          <w:p>
+            <w:r>
+              <w:rPr>
+                <w:b/>
+                <w:bCs/>
+                <w:sz w:val="19"/>
+                <w:szCs w:val="19"/>
+              </w:rPr>
+              <w:t xml:space="preserve">Phase 2: Beyond the Bottleneck</w:t>
+            </w:r>
+          </w:p>
+        </w:tc>
+      </w:tr>
+      <w:tr>
+        <w:tc>
+          <w:tcPr>
+            <w:tcW w:type="dxa" w:w="1400"/>
+            <w:tcBorders>
+              <w:top w:val="single" w:color="D9D8D3" w:sz="4"/>
+              <w:left w:val="single" w:color="D9D8D3" w:sz="4"/>
+              <w:bottom w:val="single" w:color="D9D8D3" w:sz="4"/>
+              <w:right w:val="single" w:color="D9D8D3" w:sz="4"/>
+            </w:tcBorders>
+            <w:tcMar>
+              <w:top w:type="dxa" w:w="60"/>
+              <w:left w:type="dxa" w:w="100"/>
+              <w:bottom w:type="dxa" w:w="60"/>
+              <w:right w:type="dxa" w:w="100"/>
+            </w:tcMar>
+          </w:tcPr>
+          <w:p>
+            <w:r>
+              <w:rPr>
+                <w:sz w:val="19"/>
+                <w:szCs w:val="19"/>
+              </w:rPr>
+              <w:t xml:space="preserve">Focus</w:t>
+            </w:r>
+          </w:p>
+        </w:tc>
+        <w:tc>
+          <w:tcPr>
+            <w:tcW w:type="dxa" w:w="3800"/>
+            <w:tcBorders>
+              <w:top w:val="single" w:color="D9D8D3" w:sz="4"/>
+              <w:left w:val="single" w:color="D9D8D3" w:sz="4"/>
+              <w:bottom w:val="single" w:color="D9D8D3" w:sz="4"/>
+              <w:right w:val="single" w:color="D9D8D3" w:sz="4"/>
+            </w:tcBorders>
+            <w:tcMar>
+              <w:top w:type="dxa" w:w="60"/>
+              <w:left w:type="dxa" w:w="100"/>
+              <w:bottom w:type="dxa" w:w="60"/>
+              <w:right w:type="dxa" w:w="100"/>
+            </w:tcMar>
+          </w:tcPr>
+          <w:p>
+            <w:r>
+              <w:rPr>
+                <w:sz w:val="19"/>
+                <w:szCs w:val="19"/>
+              </w:rPr>
+              <w:t xml:space="preserve">Allocating critical food items across five centres</w:t>
+            </w:r>
+          </w:p>
+        </w:tc>
+        <w:tc>
+          <w:tcPr>
+            <w:tcW w:type="dxa" w:w="3826"/>
+            <w:tcBorders>
+              <w:top w:val="single" w:color="D9D8D3" w:sz="4"/>
+              <w:left w:val="single" w:color="D9D8D3" w:sz="4"/>
+              <w:bottom w:val="single" w:color="D9D8D3" w:sz="4"/>
+              <w:right w:val="single" w:color="D9D8D3" w:sz="4"/>
+            </w:tcBorders>
+            <w:tcMar>
+              <w:top w:type="dxa" w:w="60"/>
+              <w:left w:type="dxa" w:w="100"/>
+              <w:bottom w:type="dxa" w:w="60"/>
+              <w:right w:type="dxa" w:w="100"/>
+            </w:tcMar>
+          </w:tcPr>
+          <w:p>
+            <w:r>
+              <w:rPr>
+                <w:sz w:val="19"/>
+                <w:szCs w:val="19"/>
+              </w:rPr>
+              <w:t xml:space="preserve">Managing queues and using capacity evenly, with food as an input</w:t>
+            </w:r>
+          </w:p>
+        </w:tc>
+      </w:tr>
+      <w:tr>
+        <w:tc>
+          <w:tcPr>
+            <w:tcW w:type="dxa" w:w="1400"/>
+            <w:tcBorders>
+              <w:top w:val="single" w:color="D9D8D3" w:sz="4"/>
+              <w:left w:val="single" w:color="D9D8D3" w:sz="4"/>
+              <w:bottom w:val="single" w:color="D9D8D3" w:sz="4"/>
+              <w:right w:val="single" w:color="D9D8D3" w:sz="4"/>
+            </w:tcBorders>
+            <w:tcMar>
+              <w:top w:type="dxa" w:w="60"/>
+              <w:left w:type="dxa" w:w="100"/>
+              <w:bottom w:type="dxa" w:w="60"/>
+              <w:right w:type="dxa" w:w="100"/>
+            </w:tcMar>
+          </w:tcPr>
+          <w:p>
+            <w:r>
+              <w:rPr>
+                <w:sz w:val="19"/>
+                <w:szCs w:val="19"/>
+              </w:rPr>
+              <w:t xml:space="preserve">Main lever</w:t>
+            </w:r>
+          </w:p>
+        </w:tc>
+        <w:tc>
+          <w:tcPr>
+            <w:tcW w:type="dxa" w:w="3800"/>
+            <w:tcBorders>
+              <w:top w:val="single" w:color="D9D8D3" w:sz="4"/>
+              <w:left w:val="single" w:color="D9D8D3" w:sz="4"/>
+              <w:bottom w:val="single" w:color="D9D8D3" w:sz="4"/>
+              <w:right w:val="single" w:color="D9D8D3" w:sz="4"/>
+            </w:tcBorders>
+            <w:tcMar>
+              <w:top w:type="dxa" w:w="60"/>
+              <w:left w:type="dxa" w:w="100"/>
+              <w:bottom w:type="dxa" w:w="60"/>
+              <w:right w:type="dxa" w:w="100"/>
+            </w:tcMar>
+          </w:tcPr>
+          <w:p>
+            <w:r>
+              <w:rPr>
+                <w:sz w:val="19"/>
+                <w:szCs w:val="19"/>
+              </w:rPr>
+              <w:t xml:space="preserve">How much food goes where, and when</w:t>
+            </w:r>
+          </w:p>
+        </w:tc>
+        <w:tc>
+          <w:tcPr>
+            <w:tcW w:type="dxa" w:w="3826"/>
+            <w:tcBorders>
+              <w:top w:val="single" w:color="D9D8D3" w:sz="4"/>
+              <w:left w:val="single" w:color="D9D8D3" w:sz="4"/>
+              <w:bottom w:val="single" w:color="D9D8D3" w:sz="4"/>
+              <w:right w:val="single" w:color="D9D8D3" w:sz="4"/>
+            </w:tcBorders>
+            <w:tcMar>
+              <w:top w:type="dxa" w:w="60"/>
+              <w:left w:type="dxa" w:w="100"/>
+              <w:bottom w:type="dxa" w:w="60"/>
+              <w:right w:type="dxa" w:w="100"/>
+            </w:tcMar>
+          </w:tcPr>
+          <w:p>
+            <w:r>
+              <w:rPr>
+                <w:sz w:val="19"/>
+                <w:szCs w:val="19"/>
+              </w:rPr>
+              <w:t xml:space="preserve">Where students eat (live screens), plus earlier food signals from the manager</w:t>
+            </w:r>
+          </w:p>
+        </w:tc>
+      </w:tr>
+      <w:tr>
+        <w:tc>
+          <w:tcPr>
+            <w:tcW w:type="dxa" w:w="1400"/>
+            <w:tcBorders>
+              <w:top w:val="single" w:color="D9D8D3" w:sz="4"/>
+              <w:left w:val="single" w:color="D9D8D3" w:sz="4"/>
+              <w:bottom w:val="single" w:color="D9D8D3" w:sz="4"/>
+              <w:right w:val="single" w:color="D9D8D3" w:sz="4"/>
+            </w:tcBorders>
+            <w:tcMar>
+              <w:top w:type="dxa" w:w="60"/>
+              <w:left w:type="dxa" w:w="100"/>
+              <w:bottom w:type="dxa" w:w="60"/>
+              <w:right w:type="dxa" w:w="100"/>
+            </w:tcMar>
+          </w:tcPr>
+          <w:p>
+            <w:r>
+              <w:rPr>
+                <w:sz w:val="19"/>
+                <w:szCs w:val="19"/>
+              </w:rPr>
+              <w:t xml:space="preserve">Evidence</w:t>
+            </w:r>
+          </w:p>
+        </w:tc>
+        <w:tc>
+          <w:tcPr>
+            <w:tcW w:type="dxa" w:w="3800"/>
+            <w:tcBorders>
+              <w:top w:val="single" w:color="D9D8D3" w:sz="4"/>
+              <w:left w:val="single" w:color="D9D8D3" w:sz="4"/>
+              <w:bottom w:val="single" w:color="D9D8D3" w:sz="4"/>
+              <w:right w:val="single" w:color="D9D8D3" w:sz="4"/>
+            </w:tcBorders>
+            <w:tcMar>
+              <w:top w:type="dxa" w:w="60"/>
+              <w:left w:type="dxa" w:w="100"/>
+              <w:bottom w:type="dxa" w:w="60"/>
+              <w:right w:type="dxa" w:w="100"/>
+            </w:tcMar>
+          </w:tcPr>
+          <w:p>
+            <w:r>
+              <w:rPr>
+                <w:sz w:val="19"/>
+                <w:szCs w:val="19"/>
+              </w:rPr>
+              <w:t xml:space="preserve">Field visit at New Mess, CT interviews, item-wise risk (ABC/XYZ)</w:t>
+            </w:r>
+          </w:p>
+        </w:tc>
+        <w:tc>
+          <w:tcPr>
+            <w:tcW w:type="dxa" w:w="3826"/>
+            <w:tcBorders>
+              <w:top w:val="single" w:color="D9D8D3" w:sz="4"/>
+              <w:left w:val="single" w:color="D9D8D3" w:sz="4"/>
+              <w:bottom w:val="single" w:color="D9D8D3" w:sz="4"/>
+              <w:right w:val="single" w:color="D9D8D3" w:sz="4"/>
+            </w:tcBorders>
+            <w:tcMar>
+              <w:top w:type="dxa" w:w="60"/>
+              <w:left w:type="dxa" w:w="100"/>
+              <w:bottom w:type="dxa" w:w="60"/>
+              <w:right w:type="dxa" w:w="100"/>
+            </w:tcMar>
+          </w:tcPr>
+          <w:p>
+            <w:r>
+              <w:rPr>
+                <w:sz w:val="19"/>
+                <w:szCs w:val="19"/>
+              </w:rPr>
+              <w:t xml:space="preserve">The same, plus biometric entry scans (requested) and a working prototype on simulated data</w:t>
+            </w:r>
+          </w:p>
+        </w:tc>
+      </w:tr>
+      <w:tr>
+        <w:tc>
+          <w:tcPr>
+            <w:tcW w:type="dxa" w:w="1400"/>
+            <w:tcBorders>
+              <w:top w:val="single" w:color="D9D8D3" w:sz="4"/>
+              <w:left w:val="single" w:color="D9D8D3" w:sz="4"/>
+              <w:bottom w:val="single" w:color="D9D8D3" w:sz="4"/>
+              <w:right w:val="single" w:color="D9D8D3" w:sz="4"/>
+            </w:tcBorders>
+            <w:tcMar>
+              <w:top w:type="dxa" w:w="60"/>
+              <w:left w:type="dxa" w:w="100"/>
+              <w:bottom w:type="dxa" w:w="60"/>
+              <w:right w:type="dxa" w:w="100"/>
+            </w:tcMar>
+          </w:tcPr>
+          <w:p>
+            <w:r>
+              <w:rPr>
+                <w:sz w:val="19"/>
+                <w:szCs w:val="19"/>
+              </w:rPr>
+              <w:t xml:space="preserve">Scope now</w:t>
+            </w:r>
+          </w:p>
+        </w:tc>
+        <w:tc>
+          <w:tcPr>
+            <w:tcW w:type="dxa" w:w="3800"/>
+            <w:tcBorders>
+              <w:top w:val="single" w:color="D9D8D3" w:sz="4"/>
+              <w:left w:val="single" w:color="D9D8D3" w:sz="4"/>
+              <w:bottom w:val="single" w:color="D9D8D3" w:sz="4"/>
+              <w:right w:val="single" w:color="D9D8D3" w:sz="4"/>
+            </w:tcBorders>
+            <w:tcMar>
+              <w:top w:type="dxa" w:w="60"/>
+              <w:left w:type="dxa" w:w="100"/>
+              <w:bottom w:type="dxa" w:w="60"/>
+              <w:right w:type="dxa" w:w="100"/>
+            </w:tcMar>
+          </w:tcPr>
+          <w:p>
+            <w:r>
+              <w:rPr>
+                <w:sz w:val="19"/>
+                <w:szCs w:val="19"/>
+              </w:rPr>
+              <w:t xml:space="preserve">Five centres</w:t>
+            </w:r>
+          </w:p>
+        </w:tc>
+        <w:tc>
+          <w:tcPr>
+            <w:tcW w:type="dxa" w:w="3826"/>
+            <w:tcBorders>
+              <w:top w:val="single" w:color="D9D8D3" w:sz="4"/>
+              <w:left w:val="single" w:color="D9D8D3" w:sz="4"/>
+              <w:bottom w:val="single" w:color="D9D8D3" w:sz="4"/>
+              <w:right w:val="single" w:color="D9D8D3" w:sz="4"/>
+            </w:tcBorders>
+            <w:tcMar>
+              <w:top w:type="dxa" w:w="60"/>
+              <w:left w:type="dxa" w:w="100"/>
+              <w:bottom w:type="dxa" w:w="60"/>
+              <w:right w:type="dxa" w:w="100"/>
+            </w:tcMar>
+          </w:tcPr>
+          <w:p>
+            <w:r>
+              <w:rPr>
+                <w:sz w:val="19"/>
+                <w:szCs w:val="19"/>
+              </w:rPr>
+              <w:t xml:space="preserve">Central CT and Munch Mess (they serve the same menu side by side); the method extends to all five</w:t>
+            </w:r>
+          </w:p>
+        </w:tc>
+      </w:tr>
+      <w:tr>
+        <w:tc>
+          <w:tcPr>
+            <w:tcW w:type="dxa" w:w="1400"/>
+            <w:tcBorders>
+              <w:top w:val="single" w:color="D9D8D3" w:sz="4"/>
+              <w:left w:val="single" w:color="D9D8D3" w:sz="4"/>
+              <w:bottom w:val="single" w:color="D9D8D3" w:sz="4"/>
+              <w:right w:val="single" w:color="D9D8D3" w:sz="4"/>
+            </w:tcBorders>
+            <w:tcMar>
+              <w:top w:type="dxa" w:w="60"/>
+              <w:left w:type="dxa" w:w="100"/>
+              <w:bottom w:type="dxa" w:w="60"/>
+              <w:right w:type="dxa" w:w="100"/>
+            </w:tcMar>
+          </w:tcPr>
+          <w:p>
+            <w:r>
+              <w:rPr>
+                <w:sz w:val="19"/>
+                <w:szCs w:val="19"/>
+              </w:rPr>
+              <w:t xml:space="preserve">Methods</w:t>
+            </w:r>
+          </w:p>
+        </w:tc>
+        <w:tc>
+          <w:tcPr>
+            <w:tcW w:type="dxa" w:w="3800"/>
+            <w:tcBorders>
+              <w:top w:val="single" w:color="D9D8D3" w:sz="4"/>
+              <w:left w:val="single" w:color="D9D8D3" w:sz="4"/>
+              <w:bottom w:val="single" w:color="D9D8D3" w:sz="4"/>
+              <w:right w:val="single" w:color="D9D8D3" w:sz="4"/>
+            </w:tcBorders>
+            <w:tcMar>
+              <w:top w:type="dxa" w:w="60"/>
+              <w:left w:type="dxa" w:w="100"/>
+              <w:bottom w:type="dxa" w:w="60"/>
+              <w:right w:type="dxa" w:w="100"/>
+            </w:tcMar>
+          </w:tcPr>
+          <w:p>
+            <w:r>
+              <w:rPr>
+                <w:sz w:val="19"/>
+                <w:szCs w:val="19"/>
+              </w:rPr>
+              <w:t xml:space="preserve">Forecasting, weighted decision table</w:t>
+            </w:r>
+          </w:p>
+        </w:tc>
+        <w:tc>
+          <w:tcPr>
+            <w:tcW w:type="dxa" w:w="3826"/>
+            <w:tcBorders>
+              <w:top w:val="single" w:color="D9D8D3" w:sz="4"/>
+              <w:left w:val="single" w:color="D9D8D3" w:sz="4"/>
+              <w:bottom w:val="single" w:color="D9D8D3" w:sz="4"/>
+              <w:right w:val="single" w:color="D9D8D3" w:sz="4"/>
+            </w:tcBorders>
+            <w:tcMar>
+              <w:top w:type="dxa" w:w="60"/>
+              <w:left w:type="dxa" w:w="100"/>
+              <w:bottom w:type="dxa" w:w="60"/>
+              <w:right w:type="dxa" w:w="100"/>
+            </w:tcMar>
+          </w:tcPr>
+          <w:p>
+            <w:r>
+              <w:rPr>
+                <w:sz w:val="19"/>
+                <w:szCs w:val="19"/>
+              </w:rPr>
+              <w:t xml:space="preserve">Queuing theory, simulation, routing, LP/IP, decision analysis, MCDM</w:t>
+            </w:r>
+          </w:p>
+        </w:tc>
+      </w:tr>
+    </w:tbl>
+    <w:p>
+      <w:pPr>
+        <w:spacing w:after="120"/>
+      </w:pPr>
+      <w:r>
+        <w:t xml:space="preserve">Food allocation stays in the project: the priority matrix sets how much each tray matters to the live advice (section 7.4), and the LP allocation and decision tree (sections 7.5–7.6) still decide how much food to send and when.</w:t>
       </w:r>
     </w:p>
     <w:p>
@@ -6983,7 +7586,7 @@
         <w:t xml:space="preserve">temporarily unstable</w:t>
       </w:r>
       <w:r>
-        <w:t xml:space="preserve">. For part of the peak, arrivals can exceed serving capacity, and the queue then grows by roughly (λ − cμ) students every minute. Our observations (long queue, run-outs around 13:20) suggest this happens; the biometric logs will show when it starts and how long it lasts. When demand repeatedly exceeds capacity, waiting becomes a structural problem rather than a temporary inconvenience. That is the 'Two-Hour Bottleneck'.</w:t>
+        <w:t xml:space="preserve">. For part of the peak, arrivals can exceed serving capacity, and the queue then grows by roughly (λ − cμ) students every minute. Our observations (long queue, run-outs around 13:20) suggest this happens; the biometric logs will show when it starts and how long it lasts. When demand repeatedly exceeds capacity, waiting becomes a structural problem rather than a temporary inconvenience. That is what Phase 1 called the 'Two-Hour Bottleneck'.</w:t>
       </w:r>
     </w:p>
     <w:p>

</xml_diff>

<commit_message>
Department-based lunch arrivals: timetable surge, stagger tests, Arrival Curve tab
Arrival rate is now the department lunch breaks added up (MIT, TAPMI,
DOC/MICFE, SMI, DLHS/MILHS, MLS, MIRM; MIT lab days 13:00-14:00), sizes
scaled to the 2,960 plates, with a calibrated lag after each break.
Peak lands at 13:17, matching the full hall seen at 13:18. Adds stress
tests for lab days, the bell rush and 15-min staggers; reruns all
scenarios, payoff and reconciliation; workbook gets department inputs
and an Arrival Curve tab (0 formula errors, all checks OK).

Co-Authored-By: Claude Opus 5.5 <noreply@anthropic.com>
Claude-Session: https://claude.ai/code/session_013JwSYm4UV7vKHqaUukbU1G
</commit_message>
<xml_diff>
--- a/docs/MDS_Queuing_Theory_and_Simulation.docx
+++ b/docs/MDS_Queuing_Theory_and_Simulation.docx
@@ -1477,7 +1477,7 @@
                 <w:sz w:val="19"/>
                 <w:szCs w:val="19"/>
               </w:rPr>
-              <w:t xml:space="preserve">Total capacity is enough, but the load is uneven. At the simulated peak about </w:t>
+              <w:t xml:space="preserve">Total capacity is enough, but the load is uneven. In the busiest 10 minutes (13:10, when several departments' lunch breaks overlap) about </w:t>
             </w:r>
             <w:r>
               <w:rPr>
@@ -1486,7 +1486,7 @@
                 <w:sz w:val="19"/>
                 <w:szCs w:val="19"/>
               </w:rPr>
-              <w:t xml:space="preserve">34 students/min</w:t>
+              <w:t xml:space="preserve">37 students/min</w:t>
             </w:r>
             <w:r>
               <w:rPr>
@@ -1509,7 +1509,7 @@
                 <w:sz w:val="19"/>
                 <w:szCs w:val="19"/>
               </w:rPr>
-              <w:t xml:space="preserve"> of serving capacity (2 stations × 2 messes × 10/min, μ assumed), so ρ ≈ 0.84 overall. With 85% going to Central by habit (assumed), Central gets ≈ </w:t>
+              <w:t xml:space="preserve"> of serving capacity (2 stations × 2 messes × 10/min, μ assumed), so ρ ≈ 0.94 overall. With 85% going to Central by habit (assumed), Central gets ≈ </w:t>
             </w:r>
             <w:r>
               <w:rPr>
@@ -1518,14 +1518,14 @@
                 <w:sz w:val="19"/>
                 <w:szCs w:val="19"/>
               </w:rPr>
-              <w:t xml:space="preserve">29/min against 20/min</w:t>
-            </w:r>
-            <w:r>
-              <w:rPr>
-                <w:sz w:val="19"/>
-                <w:szCs w:val="19"/>
-              </w:rPr>
-              <w:t xml:space="preserve"> (ρ ≈ 1.4, saturated) while Munch gets ≈ </w:t>
+              <w:t xml:space="preserve">32/min against 20/min</w:t>
+            </w:r>
+            <w:r>
+              <w:rPr>
+                <w:sz w:val="19"/>
+                <w:szCs w:val="19"/>
+              </w:rPr>
+              <w:t xml:space="preserve"> (ρ ≈ 1.6, saturated, and above its single scanner's ~30/min) while Munch gets ≈ </w:t>
             </w:r>
             <w:r>
               <w:rPr>
@@ -1534,14 +1534,14 @@
                 <w:sz w:val="19"/>
                 <w:szCs w:val="19"/>
               </w:rPr>
-              <w:t xml:space="preserve">5/min against 20/min</w:t>
-            </w:r>
-            <w:r>
-              <w:rPr>
-                <w:sz w:val="19"/>
-                <w:szCs w:val="19"/>
-              </w:rPr>
-              <w:t xml:space="preserve"> (ρ ≈ 0.26). Seats are not the constraint: 1,400 seats, ~725 people inside Central at peak (section 3.2)</w:t>
+              <w:t xml:space="preserve">6/min against 20/min</w:t>
+            </w:r>
+            <w:r>
+              <w:rPr>
+                <w:sz w:val="19"/>
+                <w:szCs w:val="19"/>
+              </w:rPr>
+              <w:t xml:space="preserve"> (ρ ≈ 0.28). Seats are close to full but not the first constraint (section 3.2)</w:t>
             </w:r>
           </w:p>
         </w:tc>
@@ -2479,7 +2479,7 @@
                 <w:sz w:val="19"/>
                 <w:szCs w:val="19"/>
               </w:rPr>
-              <w:t xml:space="preserve">About 2,960 plates are served within the 11:30–14:30 window (measured). Our field visit saw a full hall and a long queue around 13:18–13:23 (observed). How arrivals spread across the three hours is not yet measured: that is what the biometric logs will show</w:t>
+              <w:t xml:space="preserve">About 2,960 plates are served within the 11:30–14:30 window (measured). Our field visit saw a full hall and a long queue around 13:18–13:23 (observed). Department lunch breaks overlap (group's timetable): MIT and SMI break at 12:00, DOC/MICFE at 12:30, DLHS/MILHS at 12:40, MLS at 12:50, MIT's lab-day batch at 13:00 and TAPMI at 13:05, so the heaviest overlap is 13:05–13:30 (section 5.1). The biometric logs will confirm the real curve</w:t>
             </w:r>
           </w:p>
         </w:tc>
@@ -8140,17 +8140,17 @@
         <w:spacing w:after="120"/>
       </w:pPr>
       <w:r>
-        <w:t xml:space="preserve">In a surge, W grows because of queueing. If about 29 students/min arrive at Central CT at peak (our simulated peak, close to the single scanner's ~30/min) and the visit stretches to 25 minutes, L ≈ 29 × 25 ≈ </w:t>
+        <w:t xml:space="preserve">In a surge, W grows because of queueing. If about 32 students/min arrive at Central CT at the 13:10 peak (85% of ~37/min; above the single scanner's ~30/min) and the visit stretches to about 27 minutes (simulated), L ≈ 32 × 27 ≈ </w:t>
       </w:r>
       <w:r>
         <w:rPr>
           <w:b/>
           <w:bCs/>
         </w:rPr>
-        <w:t xml:space="preserve">725</w:t>
-      </w:r>
-      <w:r>
-        <w:t xml:space="preserve"> people inside: below 900 seats. So with these inputs Central's bottleneck is the serving stations and the scanner, not the seats. If the visit stretched past 31 minutes, L would exceed 900 and the hall would fill (as in photo O1 at 13:18).</w:t>
+        <w:t xml:space="preserve">860</w:t>
+      </w:r>
+      <w:r>
+        <w:t xml:space="preserve"> people inside: just below 900 seats. So with these inputs Central's bottleneck is the serving stations and the scanner, with the seats close behind. If the visit stretched past 28 minutes, L would exceed 900 and the hall would fill (as in photo O1 at 13:18).</w:t>
       </w:r>
     </w:p>
     <w:p>
@@ -10745,7 +10745,7 @@
                 <w:sz w:val="19"/>
                 <w:szCs w:val="19"/>
               </w:rPr>
-              <w:t xml:space="preserve">Random arrivals whose average rate follows the lunch peak (a bell-shaped curve over the slot); each student starts at their habitual mess (h_i)</w:t>
+              <w:t xml:space="preserve">Random arrivals whose average rate is the department lunch breaks added up (section 5.1, Arrival curve); each student starts at their habitual mess (h_i)</w:t>
             </w:r>
           </w:p>
         </w:tc>
@@ -11305,7 +11305,7 @@
                 <w:sz w:val="19"/>
                 <w:szCs w:val="19"/>
               </w:rPr>
-              <w:t xml:space="preserve">Queue wait = time queueing for the scanner, a station and a seat. Throughput = door to leaving (group: 17–25 min). Simulated: ~16.6 min in the quiet first 30 minutes, ~25.6 min at today's peak</w:t>
+              <w:t xml:space="preserve">Queue wait = time queueing for the scanner, a station and a seat. Throughput = door to leaving (group: 17–25 min). Simulated: ~16.7 min for students who meet no queue, ~26.7 min around today's 13:17 peak</w:t>
             </w:r>
           </w:p>
         </w:tc>
@@ -11417,6 +11417,993 @@
         </w:tc>
       </w:tr>
     </w:tbl>
+    <w:p>
+      <w:pPr>
+        <w:pStyle w:val="Heading3"/>
+      </w:pPr>
+      <w:r>
+        <w:t xml:space="preserve">Arrival curve: department lunch breaks added up</w:t>
+      </w:r>
+    </w:p>
+    <w:p>
+      <w:pPr>
+        <w:spacing w:after="120"/>
+      </w:pPr>
+      <w:r>
+        <w:t xml:space="preserve">Students do not arrive on one smooth curve: each department breaks for lunch at its own time. We build the arrival rate λ(t) from the timetable the group collected. Department sizes are rough counts that add up to 3,150, more than the 2,960 plates, so they are used as </w:t>
+      </w:r>
+      <w:r>
+        <w:rPr>
+          <w:b/>
+          <w:bCs/>
+        </w:rPr>
+        <w:t xml:space="preserve">shares</w:t>
+      </w:r>
+      <w:r>
+        <w:t xml:space="preserve"> and scaled to 2,960.</w:t>
+      </w:r>
+    </w:p>
+    <w:tbl>
+      <w:tblPr>
+        <w:tblW w:type="dxa" w:w="9026"/>
+        <w:tblBorders>
+          <w:top w:val="single" w:color="auto" w:sz="4"/>
+          <w:left w:val="single" w:color="auto" w:sz="4"/>
+          <w:bottom w:val="single" w:color="auto" w:sz="4"/>
+          <w:right w:val="single" w:color="auto" w:sz="4"/>
+          <w:insideH w:val="single" w:color="auto" w:sz="4"/>
+          <w:insideV w:val="single" w:color="auto" w:sz="4"/>
+        </w:tblBorders>
+      </w:tblPr>
+      <w:tblGrid>
+        <w:gridCol w:w="1500"/>
+        <w:gridCol w:w="2700"/>
+        <w:gridCol w:w="1300"/>
+        <w:gridCol w:w="3526"/>
+      </w:tblGrid>
+      <w:tr>
+        <w:trPr>
+          <w:tblHeader/>
+        </w:trPr>
+        <w:tc>
+          <w:tcPr>
+            <w:tcW w:type="dxa" w:w="1500"/>
+            <w:tcBorders>
+              <w:top w:val="single" w:color="D9D8D3" w:sz="4"/>
+              <w:left w:val="single" w:color="D9D8D3" w:sz="4"/>
+              <w:bottom w:val="single" w:color="D9D8D3" w:sz="4"/>
+              <w:right w:val="single" w:color="D9D8D3" w:sz="4"/>
+            </w:tcBorders>
+            <w:shd w:fill="ECEBE7" w:color="auto" w:val="clear"/>
+            <w:tcMar>
+              <w:top w:type="dxa" w:w="60"/>
+              <w:left w:type="dxa" w:w="100"/>
+              <w:bottom w:type="dxa" w:w="60"/>
+              <w:right w:type="dxa" w:w="100"/>
+            </w:tcMar>
+          </w:tcPr>
+          <w:p>
+            <w:r>
+              <w:rPr>
+                <w:b/>
+                <w:bCs/>
+                <w:sz w:val="19"/>
+                <w:szCs w:val="19"/>
+              </w:rPr>
+              <w:t xml:space="preserve">Department</w:t>
+            </w:r>
+          </w:p>
+        </w:tc>
+        <w:tc>
+          <w:tcPr>
+            <w:tcW w:type="dxa" w:w="2700"/>
+            <w:tcBorders>
+              <w:top w:val="single" w:color="D9D8D3" w:sz="4"/>
+              <w:left w:val="single" w:color="D9D8D3" w:sz="4"/>
+              <w:bottom w:val="single" w:color="D9D8D3" w:sz="4"/>
+              <w:right w:val="single" w:color="D9D8D3" w:sz="4"/>
+            </w:tcBorders>
+            <w:shd w:fill="ECEBE7" w:color="auto" w:val="clear"/>
+            <w:tcMar>
+              <w:top w:type="dxa" w:w="60"/>
+              <w:left w:type="dxa" w:w="100"/>
+              <w:bottom w:type="dxa" w:w="60"/>
+              <w:right w:type="dxa" w:w="100"/>
+            </w:tcMar>
+          </w:tcPr>
+          <w:p>
+            <w:r>
+              <w:rPr>
+                <w:b/>
+                <w:bCs/>
+                <w:sz w:val="19"/>
+                <w:szCs w:val="19"/>
+              </w:rPr>
+              <w:t xml:space="preserve">Lunch break</w:t>
+            </w:r>
+          </w:p>
+        </w:tc>
+        <w:tc>
+          <w:tcPr>
+            <w:tcW w:type="dxa" w:w="1300"/>
+            <w:tcBorders>
+              <w:top w:val="single" w:color="D9D8D3" w:sz="4"/>
+              <w:left w:val="single" w:color="D9D8D3" w:sz="4"/>
+              <w:bottom w:val="single" w:color="D9D8D3" w:sz="4"/>
+              <w:right w:val="single" w:color="D9D8D3" w:sz="4"/>
+            </w:tcBorders>
+            <w:shd w:fill="ECEBE7" w:color="auto" w:val="clear"/>
+            <w:tcMar>
+              <w:top w:type="dxa" w:w="60"/>
+              <w:left w:type="dxa" w:w="100"/>
+              <w:bottom w:type="dxa" w:w="60"/>
+              <w:right w:type="dxa" w:w="100"/>
+            </w:tcMar>
+          </w:tcPr>
+          <w:p>
+            <w:r>
+              <w:rPr>
+                <w:b/>
+                <w:bCs/>
+                <w:sz w:val="19"/>
+                <w:szCs w:val="19"/>
+              </w:rPr>
+              <w:t xml:space="preserve">Students (rough)</w:t>
+            </w:r>
+          </w:p>
+        </w:tc>
+        <w:tc>
+          <w:tcPr>
+            <w:tcW w:type="dxa" w:w="3526"/>
+            <w:tcBorders>
+              <w:top w:val="single" w:color="D9D8D3" w:sz="4"/>
+              <w:left w:val="single" w:color="D9D8D3" w:sz="4"/>
+              <w:bottom w:val="single" w:color="D9D8D3" w:sz="4"/>
+              <w:right w:val="single" w:color="D9D8D3" w:sz="4"/>
+            </w:tcBorders>
+            <w:shd w:fill="ECEBE7" w:color="auto" w:val="clear"/>
+            <w:tcMar>
+              <w:top w:type="dxa" w:w="60"/>
+              <w:left w:type="dxa" w:w="100"/>
+              <w:bottom w:type="dxa" w:w="60"/>
+              <w:right w:type="dxa" w:w="100"/>
+            </w:tcMar>
+          </w:tcPr>
+          <w:p>
+            <w:r>
+              <w:rPr>
+                <w:b/>
+                <w:bCs/>
+                <w:sz w:val="19"/>
+                <w:szCs w:val="19"/>
+              </w:rPr>
+              <w:t xml:space="preserve">Status</w:t>
+            </w:r>
+          </w:p>
+        </w:tc>
+      </w:tr>
+      <w:tr>
+        <w:tc>
+          <w:tcPr>
+            <w:tcW w:type="dxa" w:w="1500"/>
+            <w:tcBorders>
+              <w:top w:val="single" w:color="D9D8D3" w:sz="4"/>
+              <w:left w:val="single" w:color="D9D8D3" w:sz="4"/>
+              <w:bottom w:val="single" w:color="D9D8D3" w:sz="4"/>
+              <w:right w:val="single" w:color="D9D8D3" w:sz="4"/>
+            </w:tcBorders>
+            <w:tcMar>
+              <w:top w:type="dxa" w:w="60"/>
+              <w:left w:type="dxa" w:w="100"/>
+              <w:bottom w:type="dxa" w:w="60"/>
+              <w:right w:type="dxa" w:w="100"/>
+            </w:tcMar>
+          </w:tcPr>
+          <w:p>
+            <w:r>
+              <w:rPr>
+                <w:sz w:val="19"/>
+                <w:szCs w:val="19"/>
+              </w:rPr>
+              <w:t xml:space="preserve">MIT</w:t>
+            </w:r>
+          </w:p>
+        </w:tc>
+        <w:tc>
+          <w:tcPr>
+            <w:tcW w:type="dxa" w:w="2700"/>
+            <w:tcBorders>
+              <w:top w:val="single" w:color="D9D8D3" w:sz="4"/>
+              <w:left w:val="single" w:color="D9D8D3" w:sz="4"/>
+              <w:bottom w:val="single" w:color="D9D8D3" w:sz="4"/>
+              <w:right w:val="single" w:color="D9D8D3" w:sz="4"/>
+            </w:tcBorders>
+            <w:tcMar>
+              <w:top w:type="dxa" w:w="60"/>
+              <w:left w:type="dxa" w:w="100"/>
+              <w:bottom w:type="dxa" w:w="60"/>
+              <w:right w:type="dxa" w:w="100"/>
+            </w:tcMar>
+          </w:tcPr>
+          <w:p>
+            <w:r>
+              <w:rPr>
+                <w:sz w:val="19"/>
+                <w:szCs w:val="19"/>
+              </w:rPr>
+              <w:t xml:space="preserve">12:00–13:00, or 13:00–14:00 on a lab day</w:t>
+            </w:r>
+          </w:p>
+        </w:tc>
+        <w:tc>
+          <w:tcPr>
+            <w:tcW w:type="dxa" w:w="1300"/>
+            <w:tcBorders>
+              <w:top w:val="single" w:color="D9D8D3" w:sz="4"/>
+              <w:left w:val="single" w:color="D9D8D3" w:sz="4"/>
+              <w:bottom w:val="single" w:color="D9D8D3" w:sz="4"/>
+              <w:right w:val="single" w:color="D9D8D3" w:sz="4"/>
+            </w:tcBorders>
+            <w:tcMar>
+              <w:top w:type="dxa" w:w="60"/>
+              <w:left w:type="dxa" w:w="100"/>
+              <w:bottom w:type="dxa" w:w="60"/>
+              <w:right w:type="dxa" w:w="100"/>
+            </w:tcMar>
+          </w:tcPr>
+          <w:p>
+            <w:r>
+              <w:rPr>
+                <w:sz w:val="19"/>
+                <w:szCs w:val="19"/>
+              </w:rPr>
+              <w:t xml:space="preserve">1,100</w:t>
+            </w:r>
+          </w:p>
+        </w:tc>
+        <w:tc>
+          <w:tcPr>
+            <w:tcW w:type="dxa" w:w="3526"/>
+            <w:tcBorders>
+              <w:top w:val="single" w:color="D9D8D3" w:sz="4"/>
+              <w:left w:val="single" w:color="D9D8D3" w:sz="4"/>
+              <w:bottom w:val="single" w:color="D9D8D3" w:sz="4"/>
+              <w:right w:val="single" w:color="D9D8D3" w:sz="4"/>
+            </w:tcBorders>
+            <w:tcMar>
+              <w:top w:type="dxa" w:w="60"/>
+              <w:left w:type="dxa" w:w="100"/>
+              <w:bottom w:type="dxa" w:w="60"/>
+              <w:right w:type="dxa" w:w="100"/>
+            </w:tcMar>
+          </w:tcPr>
+          <w:p>
+            <w:r>
+              <w:rPr>
+                <w:sz w:val="19"/>
+                <w:szCs w:val="19"/>
+              </w:rPr>
+              <w:t xml:space="preserve">Timetable and size from the group; lab-day share 45% assumed (labs 3 days/week for electrical, 2 for others)</w:t>
+            </w:r>
+          </w:p>
+        </w:tc>
+      </w:tr>
+      <w:tr>
+        <w:tc>
+          <w:tcPr>
+            <w:tcW w:type="dxa" w:w="1500"/>
+            <w:tcBorders>
+              <w:top w:val="single" w:color="D9D8D3" w:sz="4"/>
+              <w:left w:val="single" w:color="D9D8D3" w:sz="4"/>
+              <w:bottom w:val="single" w:color="D9D8D3" w:sz="4"/>
+              <w:right w:val="single" w:color="D9D8D3" w:sz="4"/>
+            </w:tcBorders>
+            <w:tcMar>
+              <w:top w:type="dxa" w:w="60"/>
+              <w:left w:type="dxa" w:w="100"/>
+              <w:bottom w:type="dxa" w:w="60"/>
+              <w:right w:type="dxa" w:w="100"/>
+            </w:tcMar>
+          </w:tcPr>
+          <w:p>
+            <w:r>
+              <w:rPr>
+                <w:sz w:val="19"/>
+                <w:szCs w:val="19"/>
+              </w:rPr>
+              <w:t xml:space="preserve">TAPMI</w:t>
+            </w:r>
+          </w:p>
+        </w:tc>
+        <w:tc>
+          <w:tcPr>
+            <w:tcW w:type="dxa" w:w="2700"/>
+            <w:tcBorders>
+              <w:top w:val="single" w:color="D9D8D3" w:sz="4"/>
+              <w:left w:val="single" w:color="D9D8D3" w:sz="4"/>
+              <w:bottom w:val="single" w:color="D9D8D3" w:sz="4"/>
+              <w:right w:val="single" w:color="D9D8D3" w:sz="4"/>
+            </w:tcBorders>
+            <w:tcMar>
+              <w:top w:type="dxa" w:w="60"/>
+              <w:left w:type="dxa" w:w="100"/>
+              <w:bottom w:type="dxa" w:w="60"/>
+              <w:right w:type="dxa" w:w="100"/>
+            </w:tcMar>
+          </w:tcPr>
+          <w:p>
+            <w:r>
+              <w:rPr>
+                <w:sz w:val="19"/>
+                <w:szCs w:val="19"/>
+              </w:rPr>
+              <w:t xml:space="preserve">13:05–14:00</w:t>
+            </w:r>
+          </w:p>
+        </w:tc>
+        <w:tc>
+          <w:tcPr>
+            <w:tcW w:type="dxa" w:w="1300"/>
+            <w:tcBorders>
+              <w:top w:val="single" w:color="D9D8D3" w:sz="4"/>
+              <w:left w:val="single" w:color="D9D8D3" w:sz="4"/>
+              <w:bottom w:val="single" w:color="D9D8D3" w:sz="4"/>
+              <w:right w:val="single" w:color="D9D8D3" w:sz="4"/>
+            </w:tcBorders>
+            <w:tcMar>
+              <w:top w:type="dxa" w:w="60"/>
+              <w:left w:type="dxa" w:w="100"/>
+              <w:bottom w:type="dxa" w:w="60"/>
+              <w:right w:type="dxa" w:w="100"/>
+            </w:tcMar>
+          </w:tcPr>
+          <w:p>
+            <w:r>
+              <w:rPr>
+                <w:sz w:val="19"/>
+                <w:szCs w:val="19"/>
+              </w:rPr>
+              <w:t xml:space="preserve">850</w:t>
+            </w:r>
+          </w:p>
+        </w:tc>
+        <w:tc>
+          <w:tcPr>
+            <w:tcW w:type="dxa" w:w="3526"/>
+            <w:tcBorders>
+              <w:top w:val="single" w:color="D9D8D3" w:sz="4"/>
+              <w:left w:val="single" w:color="D9D8D3" w:sz="4"/>
+              <w:bottom w:val="single" w:color="D9D8D3" w:sz="4"/>
+              <w:right w:val="single" w:color="D9D8D3" w:sz="4"/>
+            </w:tcBorders>
+            <w:tcMar>
+              <w:top w:type="dxa" w:w="60"/>
+              <w:left w:type="dxa" w:w="100"/>
+              <w:bottom w:type="dxa" w:w="60"/>
+              <w:right w:type="dxa" w:w="100"/>
+            </w:tcMar>
+          </w:tcPr>
+          <w:p>
+            <w:r>
+              <w:rPr>
+                <w:sz w:val="19"/>
+                <w:szCs w:val="19"/>
+              </w:rPr>
+              <w:t xml:space="preserve">Group</w:t>
+            </w:r>
+          </w:p>
+        </w:tc>
+      </w:tr>
+      <w:tr>
+        <w:tc>
+          <w:tcPr>
+            <w:tcW w:type="dxa" w:w="1500"/>
+            <w:tcBorders>
+              <w:top w:val="single" w:color="D9D8D3" w:sz="4"/>
+              <w:left w:val="single" w:color="D9D8D3" w:sz="4"/>
+              <w:bottom w:val="single" w:color="D9D8D3" w:sz="4"/>
+              <w:right w:val="single" w:color="D9D8D3" w:sz="4"/>
+            </w:tcBorders>
+            <w:tcMar>
+              <w:top w:type="dxa" w:w="60"/>
+              <w:left w:type="dxa" w:w="100"/>
+              <w:bottom w:type="dxa" w:w="60"/>
+              <w:right w:type="dxa" w:w="100"/>
+            </w:tcMar>
+          </w:tcPr>
+          <w:p>
+            <w:r>
+              <w:rPr>
+                <w:sz w:val="19"/>
+                <w:szCs w:val="19"/>
+              </w:rPr>
+              <w:t xml:space="preserve">DOC/MICFE</w:t>
+            </w:r>
+          </w:p>
+        </w:tc>
+        <w:tc>
+          <w:tcPr>
+            <w:tcW w:type="dxa" w:w="2700"/>
+            <w:tcBorders>
+              <w:top w:val="single" w:color="D9D8D3" w:sz="4"/>
+              <w:left w:val="single" w:color="D9D8D3" w:sz="4"/>
+              <w:bottom w:val="single" w:color="D9D8D3" w:sz="4"/>
+              <w:right w:val="single" w:color="D9D8D3" w:sz="4"/>
+            </w:tcBorders>
+            <w:tcMar>
+              <w:top w:type="dxa" w:w="60"/>
+              <w:left w:type="dxa" w:w="100"/>
+              <w:bottom w:type="dxa" w:w="60"/>
+              <w:right w:type="dxa" w:w="100"/>
+            </w:tcMar>
+          </w:tcPr>
+          <w:p>
+            <w:r>
+              <w:rPr>
+                <w:sz w:val="19"/>
+                <w:szCs w:val="19"/>
+              </w:rPr>
+              <w:t xml:space="preserve">12:30–13:30</w:t>
+            </w:r>
+          </w:p>
+        </w:tc>
+        <w:tc>
+          <w:tcPr>
+            <w:tcW w:type="dxa" w:w="1300"/>
+            <w:tcBorders>
+              <w:top w:val="single" w:color="D9D8D3" w:sz="4"/>
+              <w:left w:val="single" w:color="D9D8D3" w:sz="4"/>
+              <w:bottom w:val="single" w:color="D9D8D3" w:sz="4"/>
+              <w:right w:val="single" w:color="D9D8D3" w:sz="4"/>
+            </w:tcBorders>
+            <w:tcMar>
+              <w:top w:type="dxa" w:w="60"/>
+              <w:left w:type="dxa" w:w="100"/>
+              <w:bottom w:type="dxa" w:w="60"/>
+              <w:right w:type="dxa" w:w="100"/>
+            </w:tcMar>
+          </w:tcPr>
+          <w:p>
+            <w:r>
+              <w:rPr>
+                <w:sz w:val="19"/>
+                <w:szCs w:val="19"/>
+              </w:rPr>
+              <w:t xml:space="preserve">550</w:t>
+            </w:r>
+          </w:p>
+        </w:tc>
+        <w:tc>
+          <w:tcPr>
+            <w:tcW w:type="dxa" w:w="3526"/>
+            <w:tcBorders>
+              <w:top w:val="single" w:color="D9D8D3" w:sz="4"/>
+              <w:left w:val="single" w:color="D9D8D3" w:sz="4"/>
+              <w:bottom w:val="single" w:color="D9D8D3" w:sz="4"/>
+              <w:right w:val="single" w:color="D9D8D3" w:sz="4"/>
+            </w:tcBorders>
+            <w:tcMar>
+              <w:top w:type="dxa" w:w="60"/>
+              <w:left w:type="dxa" w:w="100"/>
+              <w:bottom w:type="dxa" w:w="60"/>
+              <w:right w:type="dxa" w:w="100"/>
+            </w:tcMar>
+          </w:tcPr>
+          <w:p>
+            <w:r>
+              <w:rPr>
+                <w:sz w:val="19"/>
+                <w:szCs w:val="19"/>
+              </w:rPr>
+              <w:t xml:space="preserve">Group</w:t>
+            </w:r>
+          </w:p>
+        </w:tc>
+      </w:tr>
+      <w:tr>
+        <w:tc>
+          <w:tcPr>
+            <w:tcW w:type="dxa" w:w="1500"/>
+            <w:tcBorders>
+              <w:top w:val="single" w:color="D9D8D3" w:sz="4"/>
+              <w:left w:val="single" w:color="D9D8D3" w:sz="4"/>
+              <w:bottom w:val="single" w:color="D9D8D3" w:sz="4"/>
+              <w:right w:val="single" w:color="D9D8D3" w:sz="4"/>
+            </w:tcBorders>
+            <w:tcMar>
+              <w:top w:type="dxa" w:w="60"/>
+              <w:left w:type="dxa" w:w="100"/>
+              <w:bottom w:type="dxa" w:w="60"/>
+              <w:right w:type="dxa" w:w="100"/>
+            </w:tcMar>
+          </w:tcPr>
+          <w:p>
+            <w:r>
+              <w:rPr>
+                <w:sz w:val="19"/>
+                <w:szCs w:val="19"/>
+              </w:rPr>
+              <w:t xml:space="preserve">SMI</w:t>
+            </w:r>
+          </w:p>
+        </w:tc>
+        <w:tc>
+          <w:tcPr>
+            <w:tcW w:type="dxa" w:w="2700"/>
+            <w:tcBorders>
+              <w:top w:val="single" w:color="D9D8D3" w:sz="4"/>
+              <w:left w:val="single" w:color="D9D8D3" w:sz="4"/>
+              <w:bottom w:val="single" w:color="D9D8D3" w:sz="4"/>
+              <w:right w:val="single" w:color="D9D8D3" w:sz="4"/>
+            </w:tcBorders>
+            <w:tcMar>
+              <w:top w:type="dxa" w:w="60"/>
+              <w:left w:type="dxa" w:w="100"/>
+              <w:bottom w:type="dxa" w:w="60"/>
+              <w:right w:type="dxa" w:w="100"/>
+            </w:tcMar>
+          </w:tcPr>
+          <w:p>
+            <w:r>
+              <w:rPr>
+                <w:sz w:val="19"/>
+                <w:szCs w:val="19"/>
+              </w:rPr>
+              <w:t xml:space="preserve">12:00–13:00</w:t>
+            </w:r>
+          </w:p>
+        </w:tc>
+        <w:tc>
+          <w:tcPr>
+            <w:tcW w:type="dxa" w:w="1300"/>
+            <w:tcBorders>
+              <w:top w:val="single" w:color="D9D8D3" w:sz="4"/>
+              <w:left w:val="single" w:color="D9D8D3" w:sz="4"/>
+              <w:bottom w:val="single" w:color="D9D8D3" w:sz="4"/>
+              <w:right w:val="single" w:color="D9D8D3" w:sz="4"/>
+            </w:tcBorders>
+            <w:tcMar>
+              <w:top w:type="dxa" w:w="60"/>
+              <w:left w:type="dxa" w:w="100"/>
+              <w:bottom w:type="dxa" w:w="60"/>
+              <w:right w:type="dxa" w:w="100"/>
+            </w:tcMar>
+          </w:tcPr>
+          <w:p>
+            <w:r>
+              <w:rPr>
+                <w:sz w:val="19"/>
+                <w:szCs w:val="19"/>
+              </w:rPr>
+              <w:t xml:space="preserve">450</w:t>
+            </w:r>
+          </w:p>
+        </w:tc>
+        <w:tc>
+          <w:tcPr>
+            <w:tcW w:type="dxa" w:w="3526"/>
+            <w:tcBorders>
+              <w:top w:val="single" w:color="D9D8D3" w:sz="4"/>
+              <w:left w:val="single" w:color="D9D8D3" w:sz="4"/>
+              <w:bottom w:val="single" w:color="D9D8D3" w:sz="4"/>
+              <w:right w:val="single" w:color="D9D8D3" w:sz="4"/>
+            </w:tcBorders>
+            <w:tcMar>
+              <w:top w:type="dxa" w:w="60"/>
+              <w:left w:type="dxa" w:w="100"/>
+              <w:bottom w:type="dxa" w:w="60"/>
+              <w:right w:type="dxa" w:w="100"/>
+            </w:tcMar>
+          </w:tcPr>
+          <w:p>
+            <w:r>
+              <w:rPr>
+                <w:sz w:val="19"/>
+                <w:szCs w:val="19"/>
+              </w:rPr>
+              <w:t xml:space="preserve">Group</w:t>
+            </w:r>
+          </w:p>
+        </w:tc>
+      </w:tr>
+      <w:tr>
+        <w:tc>
+          <w:tcPr>
+            <w:tcW w:type="dxa" w:w="1500"/>
+            <w:tcBorders>
+              <w:top w:val="single" w:color="D9D8D3" w:sz="4"/>
+              <w:left w:val="single" w:color="D9D8D3" w:sz="4"/>
+              <w:bottom w:val="single" w:color="D9D8D3" w:sz="4"/>
+              <w:right w:val="single" w:color="D9D8D3" w:sz="4"/>
+            </w:tcBorders>
+            <w:tcMar>
+              <w:top w:type="dxa" w:w="60"/>
+              <w:left w:type="dxa" w:w="100"/>
+              <w:bottom w:type="dxa" w:w="60"/>
+              <w:right w:type="dxa" w:w="100"/>
+            </w:tcMar>
+          </w:tcPr>
+          <w:p>
+            <w:r>
+              <w:rPr>
+                <w:sz w:val="19"/>
+                <w:szCs w:val="19"/>
+              </w:rPr>
+              <w:t xml:space="preserve">DLHS/MILHS</w:t>
+            </w:r>
+          </w:p>
+        </w:tc>
+        <w:tc>
+          <w:tcPr>
+            <w:tcW w:type="dxa" w:w="2700"/>
+            <w:tcBorders>
+              <w:top w:val="single" w:color="D9D8D3" w:sz="4"/>
+              <w:left w:val="single" w:color="D9D8D3" w:sz="4"/>
+              <w:bottom w:val="single" w:color="D9D8D3" w:sz="4"/>
+              <w:right w:val="single" w:color="D9D8D3" w:sz="4"/>
+            </w:tcBorders>
+            <w:tcMar>
+              <w:top w:type="dxa" w:w="60"/>
+              <w:left w:type="dxa" w:w="100"/>
+              <w:bottom w:type="dxa" w:w="60"/>
+              <w:right w:type="dxa" w:w="100"/>
+            </w:tcMar>
+          </w:tcPr>
+          <w:p>
+            <w:r>
+              <w:rPr>
+                <w:sz w:val="19"/>
+                <w:szCs w:val="19"/>
+              </w:rPr>
+              <w:t xml:space="preserve">12:40–13:40</w:t>
+            </w:r>
+          </w:p>
+        </w:tc>
+        <w:tc>
+          <w:tcPr>
+            <w:tcW w:type="dxa" w:w="1300"/>
+            <w:tcBorders>
+              <w:top w:val="single" w:color="D9D8D3" w:sz="4"/>
+              <w:left w:val="single" w:color="D9D8D3" w:sz="4"/>
+              <w:bottom w:val="single" w:color="D9D8D3" w:sz="4"/>
+              <w:right w:val="single" w:color="D9D8D3" w:sz="4"/>
+            </w:tcBorders>
+            <w:tcMar>
+              <w:top w:type="dxa" w:w="60"/>
+              <w:left w:type="dxa" w:w="100"/>
+              <w:bottom w:type="dxa" w:w="60"/>
+              <w:right w:type="dxa" w:w="100"/>
+            </w:tcMar>
+          </w:tcPr>
+          <w:p>
+            <w:r>
+              <w:rPr>
+                <w:sz w:val="19"/>
+                <w:szCs w:val="19"/>
+              </w:rPr>
+              <w:t xml:space="preserve">~100</w:t>
+            </w:r>
+          </w:p>
+        </w:tc>
+        <w:tc>
+          <w:tcPr>
+            <w:tcW w:type="dxa" w:w="3526"/>
+            <w:tcBorders>
+              <w:top w:val="single" w:color="D9D8D3" w:sz="4"/>
+              <w:left w:val="single" w:color="D9D8D3" w:sz="4"/>
+              <w:bottom w:val="single" w:color="D9D8D3" w:sz="4"/>
+              <w:right w:val="single" w:color="D9D8D3" w:sz="4"/>
+            </w:tcBorders>
+            <w:tcMar>
+              <w:top w:type="dxa" w:w="60"/>
+              <w:left w:type="dxa" w:w="100"/>
+              <w:bottom w:type="dxa" w:w="60"/>
+              <w:right w:type="dxa" w:w="100"/>
+            </w:tcMar>
+          </w:tcPr>
+          <w:p>
+            <w:r>
+              <w:rPr>
+                <w:sz w:val="19"/>
+                <w:szCs w:val="19"/>
+              </w:rPr>
+              <w:t xml:space="preserve">Timing from the group; size assumed</w:t>
+            </w:r>
+          </w:p>
+        </w:tc>
+      </w:tr>
+      <w:tr>
+        <w:tc>
+          <w:tcPr>
+            <w:tcW w:type="dxa" w:w="1500"/>
+            <w:tcBorders>
+              <w:top w:val="single" w:color="D9D8D3" w:sz="4"/>
+              <w:left w:val="single" w:color="D9D8D3" w:sz="4"/>
+              <w:bottom w:val="single" w:color="D9D8D3" w:sz="4"/>
+              <w:right w:val="single" w:color="D9D8D3" w:sz="4"/>
+            </w:tcBorders>
+            <w:tcMar>
+              <w:top w:type="dxa" w:w="60"/>
+              <w:left w:type="dxa" w:w="100"/>
+              <w:bottom w:type="dxa" w:w="60"/>
+              <w:right w:type="dxa" w:w="100"/>
+            </w:tcMar>
+          </w:tcPr>
+          <w:p>
+            <w:r>
+              <w:rPr>
+                <w:sz w:val="19"/>
+                <w:szCs w:val="19"/>
+              </w:rPr>
+              <w:t xml:space="preserve">MLS</w:t>
+            </w:r>
+          </w:p>
+        </w:tc>
+        <w:tc>
+          <w:tcPr>
+            <w:tcW w:type="dxa" w:w="2700"/>
+            <w:tcBorders>
+              <w:top w:val="single" w:color="D9D8D3" w:sz="4"/>
+              <w:left w:val="single" w:color="D9D8D3" w:sz="4"/>
+              <w:bottom w:val="single" w:color="D9D8D3" w:sz="4"/>
+              <w:right w:val="single" w:color="D9D8D3" w:sz="4"/>
+            </w:tcBorders>
+            <w:tcMar>
+              <w:top w:type="dxa" w:w="60"/>
+              <w:left w:type="dxa" w:w="100"/>
+              <w:bottom w:type="dxa" w:w="60"/>
+              <w:right w:type="dxa" w:w="100"/>
+            </w:tcMar>
+          </w:tcPr>
+          <w:p>
+            <w:r>
+              <w:rPr>
+                <w:sz w:val="19"/>
+                <w:szCs w:val="19"/>
+              </w:rPr>
+              <w:t xml:space="preserve">12:50–13:50</w:t>
+            </w:r>
+          </w:p>
+        </w:tc>
+        <w:tc>
+          <w:tcPr>
+            <w:tcW w:type="dxa" w:w="1300"/>
+            <w:tcBorders>
+              <w:top w:val="single" w:color="D9D8D3" w:sz="4"/>
+              <w:left w:val="single" w:color="D9D8D3" w:sz="4"/>
+              <w:bottom w:val="single" w:color="D9D8D3" w:sz="4"/>
+              <w:right w:val="single" w:color="D9D8D3" w:sz="4"/>
+            </w:tcBorders>
+            <w:tcMar>
+              <w:top w:type="dxa" w:w="60"/>
+              <w:left w:type="dxa" w:w="100"/>
+              <w:bottom w:type="dxa" w:w="60"/>
+              <w:right w:type="dxa" w:w="100"/>
+            </w:tcMar>
+          </w:tcPr>
+          <w:p>
+            <w:r>
+              <w:rPr>
+                <w:sz w:val="19"/>
+                <w:szCs w:val="19"/>
+              </w:rPr>
+              <w:t xml:space="preserve">~50</w:t>
+            </w:r>
+          </w:p>
+        </w:tc>
+        <w:tc>
+          <w:tcPr>
+            <w:tcW w:type="dxa" w:w="3526"/>
+            <w:tcBorders>
+              <w:top w:val="single" w:color="D9D8D3" w:sz="4"/>
+              <w:left w:val="single" w:color="D9D8D3" w:sz="4"/>
+              <w:bottom w:val="single" w:color="D9D8D3" w:sz="4"/>
+              <w:right w:val="single" w:color="D9D8D3" w:sz="4"/>
+            </w:tcBorders>
+            <w:tcMar>
+              <w:top w:type="dxa" w:w="60"/>
+              <w:left w:type="dxa" w:w="100"/>
+              <w:bottom w:type="dxa" w:w="60"/>
+              <w:right w:type="dxa" w:w="100"/>
+            </w:tcMar>
+          </w:tcPr>
+          <w:p>
+            <w:r>
+              <w:rPr>
+                <w:sz w:val="19"/>
+                <w:szCs w:val="19"/>
+              </w:rPr>
+              <w:t xml:space="preserve">MLS + MIRM ~100 (group); half each assumed</w:t>
+            </w:r>
+          </w:p>
+        </w:tc>
+      </w:tr>
+      <w:tr>
+        <w:tc>
+          <w:tcPr>
+            <w:tcW w:type="dxa" w:w="1500"/>
+            <w:tcBorders>
+              <w:top w:val="single" w:color="D9D8D3" w:sz="4"/>
+              <w:left w:val="single" w:color="D9D8D3" w:sz="4"/>
+              <w:bottom w:val="single" w:color="D9D8D3" w:sz="4"/>
+              <w:right w:val="single" w:color="D9D8D3" w:sz="4"/>
+            </w:tcBorders>
+            <w:tcMar>
+              <w:top w:type="dxa" w:w="60"/>
+              <w:left w:type="dxa" w:w="100"/>
+              <w:bottom w:type="dxa" w:w="60"/>
+              <w:right w:type="dxa" w:w="100"/>
+            </w:tcMar>
+          </w:tcPr>
+          <w:p>
+            <w:r>
+              <w:rPr>
+                <w:sz w:val="19"/>
+                <w:szCs w:val="19"/>
+              </w:rPr>
+              <w:t xml:space="preserve">MIRM</w:t>
+            </w:r>
+          </w:p>
+        </w:tc>
+        <w:tc>
+          <w:tcPr>
+            <w:tcW w:type="dxa" w:w="2700"/>
+            <w:tcBorders>
+              <w:top w:val="single" w:color="D9D8D3" w:sz="4"/>
+              <w:left w:val="single" w:color="D9D8D3" w:sz="4"/>
+              <w:bottom w:val="single" w:color="D9D8D3" w:sz="4"/>
+              <w:right w:val="single" w:color="D9D8D3" w:sz="4"/>
+            </w:tcBorders>
+            <w:tcMar>
+              <w:top w:type="dxa" w:w="60"/>
+              <w:left w:type="dxa" w:w="100"/>
+              <w:bottom w:type="dxa" w:w="60"/>
+              <w:right w:type="dxa" w:w="100"/>
+            </w:tcMar>
+          </w:tcPr>
+          <w:p>
+            <w:r>
+              <w:rPr>
+                <w:sz w:val="19"/>
+                <w:szCs w:val="19"/>
+              </w:rPr>
+              <w:t xml:space="preserve">not known (12:30–13:30 assumed)</w:t>
+            </w:r>
+          </w:p>
+        </w:tc>
+        <w:tc>
+          <w:tcPr>
+            <w:tcW w:type="dxa" w:w="1300"/>
+            <w:tcBorders>
+              <w:top w:val="single" w:color="D9D8D3" w:sz="4"/>
+              <w:left w:val="single" w:color="D9D8D3" w:sz="4"/>
+              <w:bottom w:val="single" w:color="D9D8D3" w:sz="4"/>
+              <w:right w:val="single" w:color="D9D8D3" w:sz="4"/>
+            </w:tcBorders>
+            <w:tcMar>
+              <w:top w:type="dxa" w:w="60"/>
+              <w:left w:type="dxa" w:w="100"/>
+              <w:bottom w:type="dxa" w:w="60"/>
+              <w:right w:type="dxa" w:w="100"/>
+            </w:tcMar>
+          </w:tcPr>
+          <w:p>
+            <w:r>
+              <w:rPr>
+                <w:sz w:val="19"/>
+                <w:szCs w:val="19"/>
+              </w:rPr>
+              <w:t xml:space="preserve">~50</w:t>
+            </w:r>
+          </w:p>
+        </w:tc>
+        <w:tc>
+          <w:tcPr>
+            <w:tcW w:type="dxa" w:w="3526"/>
+            <w:tcBorders>
+              <w:top w:val="single" w:color="D9D8D3" w:sz="4"/>
+              <w:left w:val="single" w:color="D9D8D3" w:sz="4"/>
+              <w:bottom w:val="single" w:color="D9D8D3" w:sz="4"/>
+              <w:right w:val="single" w:color="D9D8D3" w:sz="4"/>
+            </w:tcBorders>
+            <w:tcMar>
+              <w:top w:type="dxa" w:w="60"/>
+              <w:left w:type="dxa" w:w="100"/>
+              <w:bottom w:type="dxa" w:w="60"/>
+              <w:right w:type="dxa" w:w="100"/>
+            </w:tcMar>
+          </w:tcPr>
+          <w:p>
+            <w:r>
+              <w:rPr>
+                <w:sz w:val="19"/>
+                <w:szCs w:val="19"/>
+              </w:rPr>
+              <w:t xml:space="preserve">Assumed</w:t>
+            </w:r>
+          </w:p>
+        </w:tc>
+      </w:tr>
+    </w:tbl>
+    <w:p>
+      <w:pPr>
+        <w:pBdr>
+          <w:left w:val="single" w:color="2A78D6" w:sz="12" w:space="8"/>
+        </w:pBdr>
+        <w:shd w:fill="F7F7F5" w:color="auto" w:val="clear"/>
+        <w:spacing w:after="160" w:before="120"/>
+        <w:jc w:val="center"/>
+      </w:pPr>
+      <w:r>
+        <w:rPr>
+          <w:rFonts w:ascii="Cambria Math" w:cs="Cambria Math" w:eastAsia="Cambria Math" w:hAnsi="Cambria Math"/>
+          <w:sz w:val="24"/>
+          <w:szCs w:val="24"/>
+        </w:rPr>
+        <w:t xml:space="preserve">λ(t) = Σ_d n_d · f_d(t),   f_d = Normal(start_d + 20, 20) cut off to [start_d, end_d]</w:t>
+      </w:r>
+      <w:r>
+        <w:rPr>
+          <w:color w:val="52514E"/>
+          <w:sz w:val="18"/>
+          <w:szCs w:val="18"/>
+        </w:rPr>
+        <w:t xml:space="preserve">    (arrival rate)</w:t>
+      </w:r>
+    </w:p>
+    <w:p>
+      <w:pPr>
+        <w:spacing w:after="120"/>
+      </w:pPr>
+      <w:r>
+        <w:t xml:space="preserve">Each department starts arriving when its break starts; a student's lag after the bell is Normal(20, 20) minutes, cut off at the end of the break. The lag is </w:t>
+      </w:r>
+      <w:r>
+        <w:rPr>
+          <w:b/>
+          <w:bCs/>
+        </w:rPr>
+        <w:t xml:space="preserve">calibrated, not measured</w:t>
+      </w:r>
+      <w:r>
+        <w:t xml:space="preserve">: with it, the no-screen simulation gives a 17–27 minute visit and a ~20 minute 90th-percentile wait, close to what the group and Phase 1 observed; a tighter lag (15 ± 10, everyone rushing at the bell) gives 36-minute peak visits, above anything observed. The curve has two surges: about </w:t>
+      </w:r>
+      <w:r>
+        <w:rPr>
+          <w:b/>
+          <w:bCs/>
+        </w:rPr>
+        <w:t xml:space="preserve">12:10</w:t>
+      </w:r>
+      <w:r>
+        <w:t xml:space="preserve"> (MIT and SMI) and a larger one at </w:t>
+      </w:r>
+      <w:r>
+        <w:rPr>
+          <w:b/>
+          <w:bCs/>
+        </w:rPr>
+        <w:t xml:space="preserve">13:10–13:30</w:t>
+      </w:r>
+      <w:r>
+        <w:t xml:space="preserve"> (MIT's lab-day batch, TAPMI, DOC/MICFE, DLHS/MILHS and MLS overlap). The busiest 10 minutes start at 13:10, matching the full hall photographed at 13:18.</w:t>
+      </w:r>
+    </w:p>
+    <w:p>
+      <w:pPr>
+        <w:spacing w:after="120"/>
+      </w:pPr>
+      <w:r>
+        <w:rPr>
+          <w:b/>
+          <w:bCs/>
+        </w:rPr>
+        <w:t xml:space="preserve">What this adds to the decision:</w:t>
+      </w:r>
+      <w:r>
+        <w:t xml:space="preserve"> staggering one department's break by 15 minutes cuts today's average wait from 7.3 to 4.3 minutes (SMI to 11:45) or 3.9 minutes (TAPMI to 13:20) with no screens at all. That makes alternative A7 (stagger class end times) concrete, though it needs academic administration; the screens get further (1.0 minutes) without changing any timetable.</w:t>
+      </w:r>
+    </w:p>
     <w:p>
       <w:pPr>
         <w:pStyle w:val="Heading2"/>
@@ -11793,7 +12780,17 @@
         <w:t xml:space="preserve">Assumed:</w:t>
       </w:r>
       <w:r>
-        <w:t xml:space="preserve"> the 85/15 habit split, 10 students/min per station, scan and plate times, the arrival curve. Every number is reproduced by </w:t>
+        <w:t xml:space="preserve"> the 85/15 habit split, 10 students/min per station, scan and plate times, department sizes (rough). </w:t>
+      </w:r>
+      <w:r>
+        <w:rPr>
+          <w:b/>
+          <w:bCs/>
+        </w:rPr>
+        <w:t xml:space="preserve">Calibrated:</w:t>
+      </w:r>
+      <w:r>
+        <w:t xml:space="preserve"> the arrival lag after each lunch break. Every number is reproduced by </w:t>
       </w:r>
       <w:r>
         <w:rPr>
@@ -12123,7 +13120,7 @@
                 <w:sz w:val="19"/>
                 <w:szCs w:val="19"/>
               </w:rPr>
-              <w:t xml:space="preserve">8.02 ± 0.63</w:t>
+              <w:t xml:space="preserve">7.34 ± 0.68</w:t>
             </w:r>
           </w:p>
         </w:tc>
@@ -12149,7 +13146,7 @@
                 <w:sz w:val="19"/>
                 <w:szCs w:val="19"/>
               </w:rPr>
-              <w:t xml:space="preserve">20.0</w:t>
+              <w:t xml:space="preserve">20.5</w:t>
             </w:r>
           </w:p>
         </w:tc>
@@ -12175,7 +13172,7 @@
                 <w:sz w:val="19"/>
                 <w:szCs w:val="19"/>
               </w:rPr>
-              <w:t xml:space="preserve">24.6</w:t>
+              <w:t xml:space="preserve">23.9</w:t>
             </w:r>
           </w:p>
         </w:tc>
@@ -12227,7 +13224,7 @@
                 <w:sz w:val="19"/>
                 <w:szCs w:val="19"/>
               </w:rPr>
-              <w:t xml:space="preserve">0.6</w:t>
+              <w:t xml:space="preserve">0.8</w:t>
             </w:r>
           </w:p>
         </w:tc>
@@ -12333,7 +13330,7 @@
                 <w:sz w:val="19"/>
                 <w:szCs w:val="19"/>
               </w:rPr>
-              <w:t xml:space="preserve">1.37 ± 0.36</w:t>
+              <w:t xml:space="preserve">1.93 ± 0.43</w:t>
             </w:r>
           </w:p>
         </w:tc>
@@ -12359,7 +13356,7 @@
                 <w:sz w:val="19"/>
                 <w:szCs w:val="19"/>
               </w:rPr>
-              <w:t xml:space="preserve">3.5</w:t>
+              <w:t xml:space="preserve">5.2</w:t>
             </w:r>
           </w:p>
         </w:tc>
@@ -12385,7 +13382,7 @@
                 <w:sz w:val="19"/>
                 <w:szCs w:val="19"/>
               </w:rPr>
-              <w:t xml:space="preserve">17.9</w:t>
+              <w:t xml:space="preserve">18.5</w:t>
             </w:r>
           </w:p>
         </w:tc>
@@ -12411,7 +13408,7 @@
                 <w:sz w:val="19"/>
                 <w:szCs w:val="19"/>
               </w:rPr>
-              <w:t xml:space="preserve">60% / 22%</w:t>
+              <w:t xml:space="preserve">61% / 22%</w:t>
             </w:r>
           </w:p>
         </w:tc>
@@ -12437,7 +13434,7 @@
                 <w:sz w:val="19"/>
                 <w:szCs w:val="19"/>
               </w:rPr>
-              <w:t xml:space="preserve">0.9</w:t>
+              <w:t xml:space="preserve">1.0</w:t>
             </w:r>
           </w:p>
         </w:tc>
@@ -12463,7 +13460,7 @@
                 <w:sz w:val="19"/>
                 <w:szCs w:val="19"/>
               </w:rPr>
-              <w:t xml:space="preserve">334</w:t>
+              <w:t xml:space="preserve">336</w:t>
             </w:r>
           </w:p>
         </w:tc>
@@ -12489,7 +13486,7 @@
                 <w:sz w:val="19"/>
                 <w:szCs w:val="19"/>
               </w:rPr>
-              <w:t xml:space="preserve">6%</w:t>
+              <w:t xml:space="preserve">0%</w:t>
             </w:r>
           </w:p>
         </w:tc>
@@ -12543,7 +13540,7 @@
                 <w:sz w:val="19"/>
                 <w:szCs w:val="19"/>
               </w:rPr>
-              <w:t xml:space="preserve">0.81 ± 0.11</w:t>
+              <w:t xml:space="preserve">0.98 ± 0.12</w:t>
             </w:r>
           </w:p>
         </w:tc>
@@ -12569,7 +13566,7 @@
                 <w:sz w:val="19"/>
                 <w:szCs w:val="19"/>
               </w:rPr>
-              <w:t xml:space="preserve">2.2</w:t>
+              <w:t xml:space="preserve">2.4</w:t>
             </w:r>
           </w:p>
         </w:tc>
@@ -12595,7 +13592,7 @@
                 <w:sz w:val="19"/>
                 <w:szCs w:val="19"/>
               </w:rPr>
-              <w:t xml:space="preserve">17.4</w:t>
+              <w:t xml:space="preserve">17.5</w:t>
             </w:r>
           </w:p>
         </w:tc>
@@ -12647,7 +13644,7 @@
                 <w:sz w:val="19"/>
                 <w:szCs w:val="19"/>
               </w:rPr>
-              <w:t xml:space="preserve">0.7</w:t>
+              <w:t xml:space="preserve">0.6</w:t>
             </w:r>
           </w:p>
         </w:tc>
@@ -12673,7 +13670,7 @@
                 <w:sz w:val="19"/>
                 <w:szCs w:val="19"/>
               </w:rPr>
-              <w:t xml:space="preserve">380</w:t>
+              <w:t xml:space="preserve">385</w:t>
             </w:r>
           </w:p>
         </w:tc>
@@ -12699,7 +13696,7 @@
                 <w:sz w:val="19"/>
                 <w:szCs w:val="19"/>
               </w:rPr>
-              <w:t xml:space="preserve">8%</w:t>
+              <w:t xml:space="preserve">3%</w:t>
             </w:r>
           </w:p>
         </w:tc>
@@ -12753,7 +13750,7 @@
                 <w:sz w:val="19"/>
                 <w:szCs w:val="19"/>
               </w:rPr>
-              <w:t xml:space="preserve">0.99 ± 0.16</w:t>
+              <w:t xml:space="preserve">0.97 ± 0.13</w:t>
             </w:r>
           </w:p>
         </w:tc>
@@ -12779,7 +13776,7 @@
                 <w:sz w:val="19"/>
                 <w:szCs w:val="19"/>
               </w:rPr>
-              <w:t xml:space="preserve">2.8</w:t>
+              <w:t xml:space="preserve">2.2</w:t>
             </w:r>
           </w:p>
         </w:tc>
@@ -12831,7 +13828,7 @@
                 <w:sz w:val="19"/>
                 <w:szCs w:val="19"/>
               </w:rPr>
-              <w:t xml:space="preserve">60% / 22%</w:t>
+              <w:t xml:space="preserve">59% / 22%</w:t>
             </w:r>
           </w:p>
         </w:tc>
@@ -12857,7 +13854,7 @@
                 <w:sz w:val="19"/>
                 <w:szCs w:val="19"/>
               </w:rPr>
-              <w:t xml:space="preserve">0.8</w:t>
+              <w:t xml:space="preserve">0.5</w:t>
             </w:r>
           </w:p>
         </w:tc>
@@ -12883,7 +13880,7 @@
                 <w:sz w:val="19"/>
                 <w:szCs w:val="19"/>
               </w:rPr>
-              <w:t xml:space="preserve">375</w:t>
+              <w:t xml:space="preserve">377</w:t>
             </w:r>
           </w:p>
         </w:tc>
@@ -12909,7 +13906,7 @@
                 <w:sz w:val="19"/>
                 <w:szCs w:val="19"/>
               </w:rPr>
-              <w:t xml:space="preserve">6%</w:t>
+              <w:t xml:space="preserve">2%</w:t>
             </w:r>
           </w:p>
         </w:tc>
@@ -12950,7 +13947,7 @@
           <w:b/>
           <w:bCs/>
         </w:rPr>
-        <w:t xml:space="preserve">8.0 to 0.8 minutes</w:t>
+        <w:t xml:space="preserve">7.3 to 1.0 minutes</w:t>
       </w:r>
       <w:r>
         <w:t xml:space="preserve"> and the 90th percentile from </w:t>
@@ -12960,10 +13957,10 @@
           <w:b/>
           <w:bCs/>
         </w:rPr>
-        <w:t xml:space="preserve">20 to 2.2 minutes</w:t>
-      </w:r>
-      <w:r>
-        <w:t xml:space="preserve">; throughput falls from 24.6 to 17.4 minutes.</w:t>
+        <w:t xml:space="preserve">20 to 2.4 minutes</w:t>
+      </w:r>
+      <w:r>
+        <w:t xml:space="preserve">; throughput falls from 23.9 to 17.5 minutes.</w:t>
       </w:r>
     </w:p>
     <w:p>
@@ -12983,7 +13980,7 @@
         <w:t xml:space="preserve">Food status helps</w:t>
       </w:r>
       <w:r>
-        <w:t xml:space="preserve">: queue information alone gives 1.4 minutes; adding the manager's food status gives 0.8.</w:t>
+        <w:t xml:space="preserve">: queue information alone gives 1.9 minutes; adding the manager's food status gives 1.0. The 13:10 surge drains the trays just when the queue is longest, so knowing about a run-out matters.</w:t>
       </w:r>
     </w:p>
     <w:p>
@@ -13006,7 +14003,7 @@
         <w:t xml:space="preserve">1 in 8 students</w:t>
       </w:r>
       <w:r>
-        <w:t xml:space="preserve"> walks to the other mess (380 of ~2,960). The LP optimum (section 7.6) moves 337, so the live system is close to the theoretical split.</w:t>
+        <w:t xml:space="preserve"> walks to the other mess (385 of ~2,960). The LP optimum (section 7.6) moves 358, so the live system is close to the theoretical split.</w:t>
       </w:r>
     </w:p>
     <w:p>
@@ -13019,7 +14016,7 @@
         <w:spacing w:after="60"/>
       </w:pPr>
       <w:r>
-        <w:t xml:space="preserve">Without screens the simulated 90th-percentile wait (~20 min) is close to the ~15 min observed in Phase 1, and the simulated throughput (~16.6 min quiet, ~25.6 min at the peak) sits in the group's 17–25 min range: the assumed inputs are in the right range.</w:t>
+        <w:t xml:space="preserve">Without screens the simulated 90th-percentile wait (~20 min) is close to the ~15 min observed in Phase 1, and the simulated throughput (~16.7 min with no queue, ~26.7 min at the peak) sits in or just above the group's 17–25 min range. This is partly by construction: the arrival lag was calibrated to it.</w:t>
       </w:r>
     </w:p>
     <w:p>
@@ -13218,7 +14215,7 @@
                 <w:sz w:val="19"/>
                 <w:szCs w:val="19"/>
               </w:rPr>
-              <w:t xml:space="preserve">15.71</w:t>
+              <w:t xml:space="preserve">16.14</w:t>
             </w:r>
           </w:p>
         </w:tc>
@@ -13244,7 +14241,7 @@
                 <w:sz w:val="19"/>
                 <w:szCs w:val="19"/>
               </w:rPr>
-              <w:t xml:space="preserve">2.67</w:t>
+              <w:t xml:space="preserve">2.79</w:t>
             </w:r>
           </w:p>
         </w:tc>
@@ -13270,7 +14267,7 @@
                 <w:sz w:val="19"/>
                 <w:szCs w:val="19"/>
               </w:rPr>
-              <w:t xml:space="preserve">2.73</w:t>
+              <w:t xml:space="preserve">2.22</w:t>
             </w:r>
           </w:p>
         </w:tc>
@@ -13298,7 +14295,7 @@
                 <w:sz w:val="19"/>
                 <w:szCs w:val="19"/>
               </w:rPr>
-              <w:t xml:space="preserve">Sharper peak (spread 25 min, not 35)</w:t>
+              <w:t xml:space="preserve">Students rush at the bell (lag 15 +/- 10 min, not 20 +/- 20)</w:t>
             </w:r>
           </w:p>
         </w:tc>
@@ -13324,7 +14321,7 @@
                 <w:sz w:val="19"/>
                 <w:szCs w:val="19"/>
               </w:rPr>
-              <w:t xml:space="preserve">16.88</w:t>
+              <w:t xml:space="preserve">12.21</w:t>
             </w:r>
           </w:p>
         </w:tc>
@@ -13350,7 +14347,7 @@
                 <w:sz w:val="19"/>
                 <w:szCs w:val="19"/>
               </w:rPr>
-              <w:t xml:space="preserve">4.16</w:t>
+              <w:t xml:space="preserve">2.12</w:t>
             </w:r>
           </w:p>
         </w:tc>
@@ -13376,7 +14373,7 @@
                 <w:sz w:val="19"/>
                 <w:szCs w:val="19"/>
               </w:rPr>
-              <w:t xml:space="preserve">3.45</w:t>
+              <w:t xml:space="preserve">1.88</w:t>
             </w:r>
           </w:p>
         </w:tc>
@@ -13404,7 +14401,7 @@
                 <w:sz w:val="19"/>
                 <w:szCs w:val="19"/>
               </w:rPr>
-              <w:t xml:space="preserve">Only 30% follow the screens</w:t>
+              <w:t xml:space="preserve">Heavy lab day: 70% of MIT eat 13:00-14:00</w:t>
             </w:r>
           </w:p>
         </w:tc>
@@ -13430,7 +14427,7 @@
                 <w:sz w:val="19"/>
                 <w:szCs w:val="19"/>
               </w:rPr>
-              <w:t xml:space="preserve">8.02</w:t>
+              <w:t xml:space="preserve">7.55</w:t>
             </w:r>
           </w:p>
         </w:tc>
@@ -13456,7 +14453,7 @@
                 <w:sz w:val="19"/>
                 <w:szCs w:val="19"/>
               </w:rPr>
-              <w:t xml:space="preserve">1.70</w:t>
+              <w:t xml:space="preserve">1.74</w:t>
             </w:r>
           </w:p>
         </w:tc>
@@ -13482,7 +14479,7 @@
                 <w:sz w:val="19"/>
                 <w:szCs w:val="19"/>
               </w:rPr>
-              <w:t xml:space="preserve">1.51</w:t>
+              <w:t xml:space="preserve">1.48</w:t>
             </w:r>
           </w:p>
         </w:tc>
@@ -13510,7 +14507,7 @@
                 <w:sz w:val="19"/>
                 <w:szCs w:val="19"/>
               </w:rPr>
-              <w:t xml:space="preserve">Everyone follows the screens</w:t>
+              <w:t xml:space="preserve">No MIT labs: all MIT eat 12:00-13:00</w:t>
             </w:r>
           </w:p>
         </w:tc>
@@ -13536,7 +14533,7 @@
                 <w:sz w:val="19"/>
                 <w:szCs w:val="19"/>
               </w:rPr>
-              <w:t xml:space="preserve">8.02</w:t>
+              <w:t xml:space="preserve">12.52</w:t>
             </w:r>
           </w:p>
         </w:tc>
@@ -13562,7 +14559,7 @@
                 <w:sz w:val="19"/>
                 <w:szCs w:val="19"/>
               </w:rPr>
-              <w:t xml:space="preserve">1.26</w:t>
+              <w:t xml:space="preserve">1.30</w:t>
             </w:r>
           </w:p>
         </w:tc>
@@ -13588,7 +14585,7 @@
                 <w:sz w:val="19"/>
                 <w:szCs w:val="19"/>
               </w:rPr>
-              <w:t xml:space="preserve">0.92</w:t>
+              <w:t xml:space="preserve">1.12</w:t>
             </w:r>
           </w:p>
         </w:tc>
@@ -13616,7 +14613,7 @@
                 <w:sz w:val="19"/>
                 <w:szCs w:val="19"/>
               </w:rPr>
-              <w:t xml:space="preserve">Slower serving: 8 students/min per station</w:t>
+              <w:t xml:space="preserve">Stagger: SMI lunch 15 min earlier (11:45-12:45)</w:t>
             </w:r>
           </w:p>
         </w:tc>
@@ -13642,7 +14639,7 @@
                 <w:sz w:val="19"/>
                 <w:szCs w:val="19"/>
               </w:rPr>
-              <w:t xml:space="preserve">16.09</w:t>
+              <w:t xml:space="preserve">4.25</w:t>
             </w:r>
           </w:p>
         </w:tc>
@@ -13668,7 +14665,7 @@
                 <w:sz w:val="19"/>
                 <w:szCs w:val="19"/>
               </w:rPr>
-              <w:t xml:space="preserve">1.76</w:t>
+              <w:t xml:space="preserve">1.01</w:t>
             </w:r>
           </w:p>
         </w:tc>
@@ -13694,7 +14691,7 @@
                 <w:sz w:val="19"/>
                 <w:szCs w:val="19"/>
               </w:rPr>
-              <w:t xml:space="preserve">1.66</w:t>
+              <w:t xml:space="preserve">0.80</w:t>
             </w:r>
           </w:p>
         </w:tc>
@@ -13722,7 +14719,7 @@
                 <w:sz w:val="19"/>
                 <w:szCs w:val="19"/>
               </w:rPr>
-              <w:t xml:space="preserve">Faster serving: 12 students/min per station</w:t>
+              <w:t xml:space="preserve">Stagger: TAPMI lunch 15 min later (13:20-14:15)</w:t>
             </w:r>
           </w:p>
         </w:tc>
@@ -13748,7 +14745,7 @@
                 <w:sz w:val="19"/>
                 <w:szCs w:val="19"/>
               </w:rPr>
-              <w:t xml:space="preserve">4.05</w:t>
+              <w:t xml:space="preserve">3.91</w:t>
             </w:r>
           </w:p>
         </w:tc>
@@ -13774,7 +14771,7 @@
                 <w:sz w:val="19"/>
                 <w:szCs w:val="19"/>
               </w:rPr>
-              <w:t xml:space="preserve">2.17</w:t>
+              <w:t xml:space="preserve">1.46</w:t>
             </w:r>
           </w:p>
         </w:tc>
@@ -13800,7 +14797,7 @@
                 <w:sz w:val="19"/>
                 <w:szCs w:val="19"/>
               </w:rPr>
-              <w:t xml:space="preserve">0.78</w:t>
+              <w:t xml:space="preserve">0.79</w:t>
             </w:r>
           </w:p>
         </w:tc>
@@ -13828,7 +14825,7 @@
                 <w:sz w:val="19"/>
                 <w:szCs w:val="19"/>
               </w:rPr>
-              <w:t xml:space="preserve">More stock-outs: next batch never ready</w:t>
+              <w:t xml:space="preserve">One bell curve (old assumption: peak 13:05, spread 35)</w:t>
             </w:r>
           </w:p>
         </w:tc>
@@ -13854,7 +14851,7 @@
                 <w:sz w:val="19"/>
                 <w:szCs w:val="19"/>
               </w:rPr>
-              <w:t xml:space="preserve">10.41</w:t>
+              <w:t xml:space="preserve">8.02</w:t>
             </w:r>
           </w:p>
         </w:tc>
@@ -13880,7 +14877,7 @@
                 <w:sz w:val="19"/>
                 <w:szCs w:val="19"/>
               </w:rPr>
-              <w:t xml:space="preserve">3.07</w:t>
+              <w:t xml:space="preserve">1.37</w:t>
             </w:r>
           </w:p>
         </w:tc>
@@ -13906,7 +14903,7 @@
                 <w:sz w:val="19"/>
                 <w:szCs w:val="19"/>
               </w:rPr>
-              <w:t xml:space="preserve">1.91</w:t>
+              <w:t xml:space="preserve">0.81</w:t>
             </w:r>
           </w:p>
         </w:tc>
@@ -13934,7 +14931,7 @@
                 <w:sz w:val="19"/>
                 <w:szCs w:val="19"/>
               </w:rPr>
-              <w:t xml:space="preserve">No stock-outs: next batch always ready</w:t>
+              <w:t xml:space="preserve">Only 30% follow the screens</w:t>
             </w:r>
           </w:p>
         </w:tc>
@@ -13960,7 +14957,7 @@
                 <w:sz w:val="19"/>
                 <w:szCs w:val="19"/>
               </w:rPr>
-              <w:t xml:space="preserve">6.90</w:t>
+              <w:t xml:space="preserve">7.34</w:t>
             </w:r>
           </w:p>
         </w:tc>
@@ -13986,7 +14983,7 @@
                 <w:sz w:val="19"/>
                 <w:szCs w:val="19"/>
               </w:rPr>
-              <w:t xml:space="preserve">0.71</w:t>
+              <w:t xml:space="preserve">2.01</w:t>
             </w:r>
           </w:p>
         </w:tc>
@@ -14012,7 +15009,7 @@
                 <w:sz w:val="19"/>
                 <w:szCs w:val="19"/>
               </w:rPr>
-              <w:t xml:space="preserve">0.70</w:t>
+              <w:t xml:space="preserve">1.59</w:t>
             </w:r>
           </w:p>
         </w:tc>
@@ -14040,6 +15037,536 @@
                 <w:sz w:val="19"/>
                 <w:szCs w:val="19"/>
               </w:rPr>
+              <w:t xml:space="preserve">Everyone follows the screens</w:t>
+            </w:r>
+          </w:p>
+        </w:tc>
+        <w:tc>
+          <w:tcPr>
+            <w:tcW w:type="dxa" w:w="1400"/>
+            <w:tcBorders>
+              <w:top w:val="single" w:color="D9D8D3" w:sz="4"/>
+              <w:left w:val="single" w:color="D9D8D3" w:sz="4"/>
+              <w:bottom w:val="single" w:color="D9D8D3" w:sz="4"/>
+              <w:right w:val="single" w:color="D9D8D3" w:sz="4"/>
+            </w:tcBorders>
+            <w:tcMar>
+              <w:top w:type="dxa" w:w="60"/>
+              <w:left w:type="dxa" w:w="100"/>
+              <w:bottom w:type="dxa" w:w="60"/>
+              <w:right w:type="dxa" w:w="100"/>
+            </w:tcMar>
+          </w:tcPr>
+          <w:p>
+            <w:r>
+              <w:rPr>
+                <w:sz w:val="19"/>
+                <w:szCs w:val="19"/>
+              </w:rPr>
+              <w:t xml:space="preserve">7.34</w:t>
+            </w:r>
+          </w:p>
+        </w:tc>
+        <w:tc>
+          <w:tcPr>
+            <w:tcW w:type="dxa" w:w="1400"/>
+            <w:tcBorders>
+              <w:top w:val="single" w:color="D9D8D3" w:sz="4"/>
+              <w:left w:val="single" w:color="D9D8D3" w:sz="4"/>
+              <w:bottom w:val="single" w:color="D9D8D3" w:sz="4"/>
+              <w:right w:val="single" w:color="D9D8D3" w:sz="4"/>
+            </w:tcBorders>
+            <w:tcMar>
+              <w:top w:type="dxa" w:w="60"/>
+              <w:left w:type="dxa" w:w="100"/>
+              <w:bottom w:type="dxa" w:w="60"/>
+              <w:right w:type="dxa" w:w="100"/>
+            </w:tcMar>
+          </w:tcPr>
+          <w:p>
+            <w:r>
+              <w:rPr>
+                <w:sz w:val="19"/>
+                <w:szCs w:val="19"/>
+              </w:rPr>
+              <w:t xml:space="preserve">1.71</w:t>
+            </w:r>
+          </w:p>
+        </w:tc>
+        <w:tc>
+          <w:tcPr>
+            <w:tcW w:type="dxa" w:w="1400"/>
+            <w:tcBorders>
+              <w:top w:val="single" w:color="D9D8D3" w:sz="4"/>
+              <w:left w:val="single" w:color="D9D8D3" w:sz="4"/>
+              <w:bottom w:val="single" w:color="D9D8D3" w:sz="4"/>
+              <w:right w:val="single" w:color="D9D8D3" w:sz="4"/>
+            </w:tcBorders>
+            <w:tcMar>
+              <w:top w:type="dxa" w:w="60"/>
+              <w:left w:type="dxa" w:w="100"/>
+              <w:bottom w:type="dxa" w:w="60"/>
+              <w:right w:type="dxa" w:w="100"/>
+            </w:tcMar>
+          </w:tcPr>
+          <w:p>
+            <w:r>
+              <w:rPr>
+                <w:sz w:val="19"/>
+                <w:szCs w:val="19"/>
+              </w:rPr>
+              <w:t xml:space="preserve">1.11</w:t>
+            </w:r>
+          </w:p>
+        </w:tc>
+      </w:tr>
+      <w:tr>
+        <w:tc>
+          <w:tcPr>
+            <w:tcW w:type="dxa" w:w="4826"/>
+            <w:tcBorders>
+              <w:top w:val="single" w:color="D9D8D3" w:sz="4"/>
+              <w:left w:val="single" w:color="D9D8D3" w:sz="4"/>
+              <w:bottom w:val="single" w:color="D9D8D3" w:sz="4"/>
+              <w:right w:val="single" w:color="D9D8D3" w:sz="4"/>
+            </w:tcBorders>
+            <w:tcMar>
+              <w:top w:type="dxa" w:w="60"/>
+              <w:left w:type="dxa" w:w="100"/>
+              <w:bottom w:type="dxa" w:w="60"/>
+              <w:right w:type="dxa" w:w="100"/>
+            </w:tcMar>
+          </w:tcPr>
+          <w:p>
+            <w:r>
+              <w:rPr>
+                <w:sz w:val="19"/>
+                <w:szCs w:val="19"/>
+              </w:rPr>
+              <w:t xml:space="preserve">Slower serving: 8 students/min per station</w:t>
+            </w:r>
+          </w:p>
+        </w:tc>
+        <w:tc>
+          <w:tcPr>
+            <w:tcW w:type="dxa" w:w="1400"/>
+            <w:tcBorders>
+              <w:top w:val="single" w:color="D9D8D3" w:sz="4"/>
+              <w:left w:val="single" w:color="D9D8D3" w:sz="4"/>
+              <w:bottom w:val="single" w:color="D9D8D3" w:sz="4"/>
+              <w:right w:val="single" w:color="D9D8D3" w:sz="4"/>
+            </w:tcBorders>
+            <w:tcMar>
+              <w:top w:type="dxa" w:w="60"/>
+              <w:left w:type="dxa" w:w="100"/>
+              <w:bottom w:type="dxa" w:w="60"/>
+              <w:right w:type="dxa" w:w="100"/>
+            </w:tcMar>
+          </w:tcPr>
+          <w:p>
+            <w:r>
+              <w:rPr>
+                <w:sz w:val="19"/>
+                <w:szCs w:val="19"/>
+              </w:rPr>
+              <w:t xml:space="preserve">17.78</w:t>
+            </w:r>
+          </w:p>
+        </w:tc>
+        <w:tc>
+          <w:tcPr>
+            <w:tcW w:type="dxa" w:w="1400"/>
+            <w:tcBorders>
+              <w:top w:val="single" w:color="D9D8D3" w:sz="4"/>
+              <w:left w:val="single" w:color="D9D8D3" w:sz="4"/>
+              <w:bottom w:val="single" w:color="D9D8D3" w:sz="4"/>
+              <w:right w:val="single" w:color="D9D8D3" w:sz="4"/>
+            </w:tcBorders>
+            <w:tcMar>
+              <w:top w:type="dxa" w:w="60"/>
+              <w:left w:type="dxa" w:w="100"/>
+              <w:bottom w:type="dxa" w:w="60"/>
+              <w:right w:type="dxa" w:w="100"/>
+            </w:tcMar>
+          </w:tcPr>
+          <w:p>
+            <w:r>
+              <w:rPr>
+                <w:sz w:val="19"/>
+                <w:szCs w:val="19"/>
+              </w:rPr>
+              <w:t xml:space="preserve">1.90</w:t>
+            </w:r>
+          </w:p>
+        </w:tc>
+        <w:tc>
+          <w:tcPr>
+            <w:tcW w:type="dxa" w:w="1400"/>
+            <w:tcBorders>
+              <w:top w:val="single" w:color="D9D8D3" w:sz="4"/>
+              <w:left w:val="single" w:color="D9D8D3" w:sz="4"/>
+              <w:bottom w:val="single" w:color="D9D8D3" w:sz="4"/>
+              <w:right w:val="single" w:color="D9D8D3" w:sz="4"/>
+            </w:tcBorders>
+            <w:tcMar>
+              <w:top w:type="dxa" w:w="60"/>
+              <w:left w:type="dxa" w:w="100"/>
+              <w:bottom w:type="dxa" w:w="60"/>
+              <w:right w:type="dxa" w:w="100"/>
+            </w:tcMar>
+          </w:tcPr>
+          <w:p>
+            <w:r>
+              <w:rPr>
+                <w:sz w:val="19"/>
+                <w:szCs w:val="19"/>
+              </w:rPr>
+              <w:t xml:space="preserve">1.92</w:t>
+            </w:r>
+          </w:p>
+        </w:tc>
+      </w:tr>
+      <w:tr>
+        <w:tc>
+          <w:tcPr>
+            <w:tcW w:type="dxa" w:w="4826"/>
+            <w:tcBorders>
+              <w:top w:val="single" w:color="D9D8D3" w:sz="4"/>
+              <w:left w:val="single" w:color="D9D8D3" w:sz="4"/>
+              <w:bottom w:val="single" w:color="D9D8D3" w:sz="4"/>
+              <w:right w:val="single" w:color="D9D8D3" w:sz="4"/>
+            </w:tcBorders>
+            <w:tcMar>
+              <w:top w:type="dxa" w:w="60"/>
+              <w:left w:type="dxa" w:w="100"/>
+              <w:bottom w:type="dxa" w:w="60"/>
+              <w:right w:type="dxa" w:w="100"/>
+            </w:tcMar>
+          </w:tcPr>
+          <w:p>
+            <w:r>
+              <w:rPr>
+                <w:sz w:val="19"/>
+                <w:szCs w:val="19"/>
+              </w:rPr>
+              <w:t xml:space="preserve">Faster serving: 12 students/min per station</w:t>
+            </w:r>
+          </w:p>
+        </w:tc>
+        <w:tc>
+          <w:tcPr>
+            <w:tcW w:type="dxa" w:w="1400"/>
+            <w:tcBorders>
+              <w:top w:val="single" w:color="D9D8D3" w:sz="4"/>
+              <w:left w:val="single" w:color="D9D8D3" w:sz="4"/>
+              <w:bottom w:val="single" w:color="D9D8D3" w:sz="4"/>
+              <w:right w:val="single" w:color="D9D8D3" w:sz="4"/>
+            </w:tcBorders>
+            <w:tcMar>
+              <w:top w:type="dxa" w:w="60"/>
+              <w:left w:type="dxa" w:w="100"/>
+              <w:bottom w:type="dxa" w:w="60"/>
+              <w:right w:type="dxa" w:w="100"/>
+            </w:tcMar>
+          </w:tcPr>
+          <w:p>
+            <w:r>
+              <w:rPr>
+                <w:sz w:val="19"/>
+                <w:szCs w:val="19"/>
+              </w:rPr>
+              <w:t xml:space="preserve">3.96</w:t>
+            </w:r>
+          </w:p>
+        </w:tc>
+        <w:tc>
+          <w:tcPr>
+            <w:tcW w:type="dxa" w:w="1400"/>
+            <w:tcBorders>
+              <w:top w:val="single" w:color="D9D8D3" w:sz="4"/>
+              <w:left w:val="single" w:color="D9D8D3" w:sz="4"/>
+              <w:bottom w:val="single" w:color="D9D8D3" w:sz="4"/>
+              <w:right w:val="single" w:color="D9D8D3" w:sz="4"/>
+            </w:tcBorders>
+            <w:tcMar>
+              <w:top w:type="dxa" w:w="60"/>
+              <w:left w:type="dxa" w:w="100"/>
+              <w:bottom w:type="dxa" w:w="60"/>
+              <w:right w:type="dxa" w:w="100"/>
+            </w:tcMar>
+          </w:tcPr>
+          <w:p>
+            <w:r>
+              <w:rPr>
+                <w:sz w:val="19"/>
+                <w:szCs w:val="19"/>
+              </w:rPr>
+              <w:t xml:space="preserve">1.97</w:t>
+            </w:r>
+          </w:p>
+        </w:tc>
+        <w:tc>
+          <w:tcPr>
+            <w:tcW w:type="dxa" w:w="1400"/>
+            <w:tcBorders>
+              <w:top w:val="single" w:color="D9D8D3" w:sz="4"/>
+              <w:left w:val="single" w:color="D9D8D3" w:sz="4"/>
+              <w:bottom w:val="single" w:color="D9D8D3" w:sz="4"/>
+              <w:right w:val="single" w:color="D9D8D3" w:sz="4"/>
+            </w:tcBorders>
+            <w:tcMar>
+              <w:top w:type="dxa" w:w="60"/>
+              <w:left w:type="dxa" w:w="100"/>
+              <w:bottom w:type="dxa" w:w="60"/>
+              <w:right w:type="dxa" w:w="100"/>
+            </w:tcMar>
+          </w:tcPr>
+          <w:p>
+            <w:r>
+              <w:rPr>
+                <w:sz w:val="19"/>
+                <w:szCs w:val="19"/>
+              </w:rPr>
+              <w:t xml:space="preserve">0.80</w:t>
+            </w:r>
+          </w:p>
+        </w:tc>
+      </w:tr>
+      <w:tr>
+        <w:tc>
+          <w:tcPr>
+            <w:tcW w:type="dxa" w:w="4826"/>
+            <w:tcBorders>
+              <w:top w:val="single" w:color="D9D8D3" w:sz="4"/>
+              <w:left w:val="single" w:color="D9D8D3" w:sz="4"/>
+              <w:bottom w:val="single" w:color="D9D8D3" w:sz="4"/>
+              <w:right w:val="single" w:color="D9D8D3" w:sz="4"/>
+            </w:tcBorders>
+            <w:tcMar>
+              <w:top w:type="dxa" w:w="60"/>
+              <w:left w:type="dxa" w:w="100"/>
+              <w:bottom w:type="dxa" w:w="60"/>
+              <w:right w:type="dxa" w:w="100"/>
+            </w:tcMar>
+          </w:tcPr>
+          <w:p>
+            <w:r>
+              <w:rPr>
+                <w:sz w:val="19"/>
+                <w:szCs w:val="19"/>
+              </w:rPr>
+              <w:t xml:space="preserve">More stock-outs: next batch never ready</w:t>
+            </w:r>
+          </w:p>
+        </w:tc>
+        <w:tc>
+          <w:tcPr>
+            <w:tcW w:type="dxa" w:w="1400"/>
+            <w:tcBorders>
+              <w:top w:val="single" w:color="D9D8D3" w:sz="4"/>
+              <w:left w:val="single" w:color="D9D8D3" w:sz="4"/>
+              <w:bottom w:val="single" w:color="D9D8D3" w:sz="4"/>
+              <w:right w:val="single" w:color="D9D8D3" w:sz="4"/>
+            </w:tcBorders>
+            <w:tcMar>
+              <w:top w:type="dxa" w:w="60"/>
+              <w:left w:type="dxa" w:w="100"/>
+              <w:bottom w:type="dxa" w:w="60"/>
+              <w:right w:type="dxa" w:w="100"/>
+            </w:tcMar>
+          </w:tcPr>
+          <w:p>
+            <w:r>
+              <w:rPr>
+                <w:sz w:val="19"/>
+                <w:szCs w:val="19"/>
+              </w:rPr>
+              <w:t xml:space="preserve">9.77</w:t>
+            </w:r>
+          </w:p>
+        </w:tc>
+        <w:tc>
+          <w:tcPr>
+            <w:tcW w:type="dxa" w:w="1400"/>
+            <w:tcBorders>
+              <w:top w:val="single" w:color="D9D8D3" w:sz="4"/>
+              <w:left w:val="single" w:color="D9D8D3" w:sz="4"/>
+              <w:bottom w:val="single" w:color="D9D8D3" w:sz="4"/>
+              <w:right w:val="single" w:color="D9D8D3" w:sz="4"/>
+            </w:tcBorders>
+            <w:tcMar>
+              <w:top w:type="dxa" w:w="60"/>
+              <w:left w:type="dxa" w:w="100"/>
+              <w:bottom w:type="dxa" w:w="60"/>
+              <w:right w:type="dxa" w:w="100"/>
+            </w:tcMar>
+          </w:tcPr>
+          <w:p>
+            <w:r>
+              <w:rPr>
+                <w:sz w:val="19"/>
+                <w:szCs w:val="19"/>
+              </w:rPr>
+              <w:t xml:space="preserve">3.41</w:t>
+            </w:r>
+          </w:p>
+        </w:tc>
+        <w:tc>
+          <w:tcPr>
+            <w:tcW w:type="dxa" w:w="1400"/>
+            <w:tcBorders>
+              <w:top w:val="single" w:color="D9D8D3" w:sz="4"/>
+              <w:left w:val="single" w:color="D9D8D3" w:sz="4"/>
+              <w:bottom w:val="single" w:color="D9D8D3" w:sz="4"/>
+              <w:right w:val="single" w:color="D9D8D3" w:sz="4"/>
+            </w:tcBorders>
+            <w:tcMar>
+              <w:top w:type="dxa" w:w="60"/>
+              <w:left w:type="dxa" w:w="100"/>
+              <w:bottom w:type="dxa" w:w="60"/>
+              <w:right w:type="dxa" w:w="100"/>
+            </w:tcMar>
+          </w:tcPr>
+          <w:p>
+            <w:r>
+              <w:rPr>
+                <w:sz w:val="19"/>
+                <w:szCs w:val="19"/>
+              </w:rPr>
+              <w:t xml:space="preserve">1.28</w:t>
+            </w:r>
+          </w:p>
+        </w:tc>
+      </w:tr>
+      <w:tr>
+        <w:tc>
+          <w:tcPr>
+            <w:tcW w:type="dxa" w:w="4826"/>
+            <w:tcBorders>
+              <w:top w:val="single" w:color="D9D8D3" w:sz="4"/>
+              <w:left w:val="single" w:color="D9D8D3" w:sz="4"/>
+              <w:bottom w:val="single" w:color="D9D8D3" w:sz="4"/>
+              <w:right w:val="single" w:color="D9D8D3" w:sz="4"/>
+            </w:tcBorders>
+            <w:tcMar>
+              <w:top w:type="dxa" w:w="60"/>
+              <w:left w:type="dxa" w:w="100"/>
+              <w:bottom w:type="dxa" w:w="60"/>
+              <w:right w:type="dxa" w:w="100"/>
+            </w:tcMar>
+          </w:tcPr>
+          <w:p>
+            <w:r>
+              <w:rPr>
+                <w:sz w:val="19"/>
+                <w:szCs w:val="19"/>
+              </w:rPr>
+              <w:t xml:space="preserve">No stock-outs: next batch always ready</w:t>
+            </w:r>
+          </w:p>
+        </w:tc>
+        <w:tc>
+          <w:tcPr>
+            <w:tcW w:type="dxa" w:w="1400"/>
+            <w:tcBorders>
+              <w:top w:val="single" w:color="D9D8D3" w:sz="4"/>
+              <w:left w:val="single" w:color="D9D8D3" w:sz="4"/>
+              <w:bottom w:val="single" w:color="D9D8D3" w:sz="4"/>
+              <w:right w:val="single" w:color="D9D8D3" w:sz="4"/>
+            </w:tcBorders>
+            <w:tcMar>
+              <w:top w:type="dxa" w:w="60"/>
+              <w:left w:type="dxa" w:w="100"/>
+              <w:bottom w:type="dxa" w:w="60"/>
+              <w:right w:type="dxa" w:w="100"/>
+            </w:tcMar>
+          </w:tcPr>
+          <w:p>
+            <w:r>
+              <w:rPr>
+                <w:sz w:val="19"/>
+                <w:szCs w:val="19"/>
+              </w:rPr>
+              <w:t xml:space="preserve">5.78</w:t>
+            </w:r>
+          </w:p>
+        </w:tc>
+        <w:tc>
+          <w:tcPr>
+            <w:tcW w:type="dxa" w:w="1400"/>
+            <w:tcBorders>
+              <w:top w:val="single" w:color="D9D8D3" w:sz="4"/>
+              <w:left w:val="single" w:color="D9D8D3" w:sz="4"/>
+              <w:bottom w:val="single" w:color="D9D8D3" w:sz="4"/>
+              <w:right w:val="single" w:color="D9D8D3" w:sz="4"/>
+            </w:tcBorders>
+            <w:tcMar>
+              <w:top w:type="dxa" w:w="60"/>
+              <w:left w:type="dxa" w:w="100"/>
+              <w:bottom w:type="dxa" w:w="60"/>
+              <w:right w:type="dxa" w:w="100"/>
+            </w:tcMar>
+          </w:tcPr>
+          <w:p>
+            <w:r>
+              <w:rPr>
+                <w:sz w:val="19"/>
+                <w:szCs w:val="19"/>
+              </w:rPr>
+              <w:t xml:space="preserve">0.95</w:t>
+            </w:r>
+          </w:p>
+        </w:tc>
+        <w:tc>
+          <w:tcPr>
+            <w:tcW w:type="dxa" w:w="1400"/>
+            <w:tcBorders>
+              <w:top w:val="single" w:color="D9D8D3" w:sz="4"/>
+              <w:left w:val="single" w:color="D9D8D3" w:sz="4"/>
+              <w:bottom w:val="single" w:color="D9D8D3" w:sz="4"/>
+              <w:right w:val="single" w:color="D9D8D3" w:sz="4"/>
+            </w:tcBorders>
+            <w:tcMar>
+              <w:top w:type="dxa" w:w="60"/>
+              <w:left w:type="dxa" w:w="100"/>
+              <w:bottom w:type="dxa" w:w="60"/>
+              <w:right w:type="dxa" w:w="100"/>
+            </w:tcMar>
+          </w:tcPr>
+          <w:p>
+            <w:r>
+              <w:rPr>
+                <w:sz w:val="19"/>
+                <w:szCs w:val="19"/>
+              </w:rPr>
+              <w:t xml:space="preserve">0.99</w:t>
+            </w:r>
+          </w:p>
+        </w:tc>
+      </w:tr>
+      <w:tr>
+        <w:tc>
+          <w:tcPr>
+            <w:tcW w:type="dxa" w:w="4826"/>
+            <w:tcBorders>
+              <w:top w:val="single" w:color="D9D8D3" w:sz="4"/>
+              <w:left w:val="single" w:color="D9D8D3" w:sz="4"/>
+              <w:bottom w:val="single" w:color="D9D8D3" w:sz="4"/>
+              <w:right w:val="single" w:color="D9D8D3" w:sz="4"/>
+            </w:tcBorders>
+            <w:tcMar>
+              <w:top w:type="dxa" w:w="60"/>
+              <w:left w:type="dxa" w:w="100"/>
+              <w:bottom w:type="dxa" w:w="60"/>
+              <w:right w:type="dxa" w:w="100"/>
+            </w:tcMar>
+          </w:tcPr>
+          <w:p>
+            <w:r>
+              <w:rPr>
+                <w:sz w:val="19"/>
+                <w:szCs w:val="19"/>
+              </w:rPr>
               <w:t xml:space="preserve">Slower eating: 15-18 min</w:t>
             </w:r>
           </w:p>
@@ -14066,7 +15593,7 @@
                 <w:sz w:val="19"/>
                 <w:szCs w:val="19"/>
               </w:rPr>
-              <w:t xml:space="preserve">8.02</w:t>
+              <w:t xml:space="preserve">7.34</w:t>
             </w:r>
           </w:p>
         </w:tc>
@@ -14092,7 +15619,7 @@
                 <w:sz w:val="19"/>
                 <w:szCs w:val="19"/>
               </w:rPr>
-              <w:t xml:space="preserve">1.37</w:t>
+              <w:t xml:space="preserve">1.93</w:t>
             </w:r>
           </w:p>
         </w:tc>
@@ -14118,7 +15645,7 @@
                 <w:sz w:val="19"/>
                 <w:szCs w:val="19"/>
               </w:rPr>
-              <w:t xml:space="preserve">0.81</w:t>
+              <w:t xml:space="preserve">0.98</w:t>
             </w:r>
           </w:p>
         </w:tc>
@@ -14129,7 +15656,7 @@
         <w:spacing w:after="120"/>
       </w:pPr>
       <w:r>
-        <w:t xml:space="preserve">The proposal cuts the wait in every stress test (by at least ~80%). It beats queue information only in most of them; on a sharp demand surge the two tie, because Munch then fills whichever signal is used. With no stock-outs the food signal adds nothing (2 and 3 converge); with more stock-outs it matters most.</w:t>
+        <w:t xml:space="preserve">The proposal cuts the wait in every stress test (by about 80–90%) and beats or ties queue information only in every one. With no stock-outs the food signal adds nothing (2 and 3 converge); with more stock-outs it matters most. The department tests show the timetable matters as much as any operational input: a day without MIT labs, when MIT and SMI break together at 12:00, is almost twice as bad as an average day; staggering one department by 15 minutes roughly halves the wait; the old single bell curve gave similar averages but hid the two surges.</w:t>
       </w:r>
     </w:p>
     <w:p>
@@ -14145,7 +15672,7 @@
         <w:spacing w:after="120"/>
       </w:pPr>
       <w:r>
-        <w:t xml:space="preserve">The workbook's S15 tab (M/M/c + fluid queue) gives 6.87 → 0.42 minutes. We started the simulator with the spreadsheet's simplifications and added one real-world feature at a time:</w:t>
+        <w:t xml:space="preserve">The workbook's S15 tab (M/M/c + fluid queue) gives 6.43 → 0.66 minutes. We started the simulator with the spreadsheet's simplifications and added one real-world feature at a time:</w:t>
       </w:r>
     </w:p>
     <w:tbl>
@@ -14306,7 +15833,7 @@
                 <w:sz w:val="19"/>
                 <w:szCs w:val="19"/>
               </w:rPr>
-              <w:t xml:space="preserve">6.80</w:t>
+              <w:t xml:space="preserve">5.76</w:t>
             </w:r>
           </w:p>
         </w:tc>
@@ -14332,7 +15859,7 @@
                 <w:sz w:val="19"/>
                 <w:szCs w:val="19"/>
               </w:rPr>
-              <w:t xml:space="preserve">0.94</w:t>
+              <w:t xml:space="preserve">1.15</w:t>
             </w:r>
           </w:p>
         </w:tc>
@@ -14386,7 +15913,7 @@
                 <w:sz w:val="19"/>
                 <w:szCs w:val="19"/>
               </w:rPr>
-              <w:t xml:space="preserve">6.87</w:t>
+              <w:t xml:space="preserve">5.91</w:t>
             </w:r>
           </w:p>
         </w:tc>
@@ -14412,7 +15939,7 @@
                 <w:sz w:val="19"/>
                 <w:szCs w:val="19"/>
               </w:rPr>
-              <w:t xml:space="preserve">0.74</w:t>
+              <w:t xml:space="preserve">0.80</w:t>
             </w:r>
           </w:p>
         </w:tc>
@@ -14466,7 +15993,7 @@
                 <w:sz w:val="19"/>
                 <w:szCs w:val="19"/>
               </w:rPr>
-              <w:t xml:space="preserve">6.84</w:t>
+              <w:t xml:space="preserve">5.96</w:t>
             </w:r>
           </w:p>
         </w:tc>
@@ -14492,7 +16019,7 @@
                 <w:sz w:val="19"/>
                 <w:szCs w:val="19"/>
               </w:rPr>
-              <w:t xml:space="preserve">0.71</w:t>
+              <w:t xml:space="preserve">0.91</w:t>
             </w:r>
           </w:p>
         </w:tc>
@@ -14546,7 +16073,7 @@
                 <w:sz w:val="19"/>
                 <w:szCs w:val="19"/>
               </w:rPr>
-              <w:t xml:space="preserve">6.84</w:t>
+              <w:t xml:space="preserve">5.96</w:t>
             </w:r>
           </w:p>
         </w:tc>
@@ -14572,7 +16099,7 @@
                 <w:sz w:val="19"/>
                 <w:szCs w:val="19"/>
               </w:rPr>
-              <w:t xml:space="preserve">0.71</w:t>
+              <w:t xml:space="preserve">0.91</w:t>
             </w:r>
           </w:p>
         </w:tc>
@@ -14626,7 +16153,7 @@
                 <w:sz w:val="19"/>
                 <w:szCs w:val="19"/>
               </w:rPr>
-              <w:t xml:space="preserve">8.02</w:t>
+              <w:t xml:space="preserve">7.34</w:t>
             </w:r>
           </w:p>
         </w:tc>
@@ -14652,7 +16179,7 @@
                 <w:sz w:val="19"/>
                 <w:szCs w:val="19"/>
               </w:rPr>
-              <w:t xml:space="preserve">0.81</w:t>
+              <w:t xml:space="preserve">0.98</w:t>
             </w:r>
           </w:p>
         </w:tc>
@@ -14663,7 +16190,7 @@
         <w:spacing w:after="120"/>
       </w:pPr>
       <w:r>
-        <w:t xml:space="preserve">Under the same assumptions the two models agree without screens (6.87 vs 6.80). With screens the spreadsheet is optimistic because it routes with perfect knowledge every 10 minutes; the simulator routes on live estimates with a delay and the 2-minute rule. The headline numbers come from the full simulator because it includes randomness, live estimation, the scanner, seats and run-outs.</w:t>
+        <w:t xml:space="preserve">Under the same assumptions the two models agree without screens within 15% (6.43 vs 5.76). The spreadsheet is a little higher because it adds the steady-state M/M/c wait in every 10-minute slot, and near 100% busy a slot is too short for the queue to reach steady state; the department surge passes through several such slots. With screens the spreadsheet is optimistic because it routes with perfect knowledge every 10 minutes; the simulator routes on live estimates with a delay and the 2-minute rule. The headline numbers come from the full simulator because it includes randomness, live estimation, the scanner, seats and run-outs.</w:t>
       </w:r>
     </w:p>
     <w:p>
@@ -14731,7 +16258,7 @@
         <w:t xml:space="preserve">Limits</w:t>
       </w:r>
       <w:r>
-        <w:t xml:space="preserve">: the habit split, the service rate and the arrival curve are assumed; the bias explanations are hypotheses; the quiet-time throughput (16.6 min) is slightly below the measured 17–18, so the stage times may be a little short. The biometric logs and a few stopwatch timings settle these (workbook: Data Collection).</w:t>
+        <w:t xml:space="preserve">: the habit split and the service rate are assumed; department sizes are rough and the arrival lag is calibrated, not measured; the bias explanations are hypotheses; the no-queue throughput (16.7 min) is slightly below the measured 17–18, so the stage times may be a little short. The biometric logs and a few stopwatch timings settle these (workbook: Data Collection).</w:t>
       </w:r>
     </w:p>
     <w:p>
@@ -17830,7 +19357,7 @@
           <w:b/>
           <w:bCs/>
         </w:rPr>
-        <w:t xml:space="preserve">today 18,861 student-minutes (6.4 min per student) → 168 (0.06 min)</w:t>
+        <w:t xml:space="preserve">today 15,676 student-minutes (5.3 min per student) → 179 (0.06 min)</w:t>
       </w:r>
       <w:r>
         <w:t xml:space="preserve">, by redirecting </w:t>
@@ -17840,10 +19367,10 @@
           <w:b/>
           <w:bCs/>
         </w:rPr>
-        <w:t xml:space="preserve">337 students (11%)</w:t>
-      </w:r>
-      <w:r>
-        <w:t xml:space="preserve"> at the peak. The simulator's proposal redirects about 380, close to this optimum. The LP is a lower bound: it has no randomness and perfect foresight.</w:t>
+        <w:t xml:space="preserve">358 students (12%)</w:t>
+      </w:r>
+      <w:r>
+        <w:t xml:space="preserve"> at the peaks. The simulator's proposal redirects about 385, close to this optimum. The LP is a lower bound: it has no randomness and perfect foresight.</w:t>
       </w:r>
     </w:p>
     <w:p>
@@ -17858,7 +19385,7 @@
         <w:t xml:space="preserve">Shadow price of food.</w:t>
       </w:r>
       <w:r>
-        <w:t xml:space="preserve"> Munch needs about 780 star-dish portions to carry the optimal flow. Below that, the food constraint binds: with 700 portions each extra portion saves about 40 student-minutes, with 600 about 60. Routing students and allocating food are one decision, not two.</w:t>
+        <w:t xml:space="preserve"> Munch needs about 800 star-dish portions to carry the optimal flow. Below that, the food constraint binds: with 700 portions each extra portion saves about 30 student-minutes, with 600 about 50. Routing students and allocating food are one decision, not two.</w:t>
       </w:r>
     </w:p>
     <w:p>
@@ -19677,7 +21204,7 @@
                 <w:sz w:val="19"/>
                 <w:szCs w:val="19"/>
               </w:rPr>
-              <w:t xml:space="preserve">Simulated bell curve</w:t>
+              <w:t xml:space="preserve">Department lunch breaks (timetable, group); sizes rough; lag after the bell calibrated</w:t>
             </w:r>
           </w:p>
         </w:tc>
@@ -19703,7 +21230,7 @@
                 <w:sz w:val="19"/>
                 <w:szCs w:val="19"/>
               </w:rPr>
-              <w:t xml:space="preserve">Assumed</w:t>
+              <w:t xml:space="preserve">Timetable measured; rest assumed</w:t>
             </w:r>
           </w:p>
         </w:tc>

</xml_diff>

<commit_message>
Doc: department arrival curve and demo panel; add PDF copy
Co-Authored-By: Claude Opus 5.5 <noreply@anthropic.com>
Claude-Session: https://claude.ai/code/session_013JwSYm4UV7vKHqaUukbU1G
</commit_message>
<xml_diff>
--- a/docs/MDS_Queuing_Theory_and_Simulation.docx
+++ b/docs/MDS_Queuing_Theory_and_Simulation.docx
@@ -12654,7 +12654,7 @@
         <w:t xml:space="preserve">Step 5: expected time inside</w:t>
       </w:r>
       <w:r>
-        <w:t xml:space="preserve"> for someone arriving now = scan and plate + queue wait + serving + food line + eating + disposal. It is about 17–18 minutes on a quiet day and rises during surges. The manager dashboard shows it.</w:t>
+        <w:t xml:space="preserve"> for someone arriving now = scan and plate + queue wait + serving + food line + eating + disposal. It is about 17–18 minutes on a quiet day and rises during surges. The manager dashboard shows it, next to a 'When students arrive' panel: the arrival curve from the department lunch breaks, the arrivals so far, the 40/min serving capacity of both messes, and which departments are on their break now.</w:t>
       </w:r>
     </w:p>
     <w:p>
@@ -25476,6 +25476,183 @@
                 <w:szCs w:val="19"/>
               </w:rPr>
               <w:t xml:space="preserve">Runs many lunches; prints the tables in section 6</w:t>
+            </w:r>
+          </w:p>
+        </w:tc>
+      </w:tr>
+      <w:tr>
+        <w:tc>
+          <w:tcPr>
+            <w:tcW w:type="dxa" w:w="3000"/>
+            <w:tcBorders>
+              <w:top w:val="single" w:color="D9D8D3" w:sz="4"/>
+              <w:left w:val="single" w:color="D9D8D3" w:sz="4"/>
+              <w:bottom w:val="single" w:color="D9D8D3" w:sz="4"/>
+              <w:right w:val="single" w:color="D9D8D3" w:sz="4"/>
+            </w:tcBorders>
+            <w:tcMar>
+              <w:top w:type="dxa" w:w="60"/>
+              <w:left w:type="dxa" w:w="100"/>
+              <w:bottom w:type="dxa" w:w="60"/>
+              <w:right w:type="dxa" w:w="100"/>
+            </w:tcMar>
+          </w:tcPr>
+          <w:p>
+            <w:r>
+              <w:rPr>
+                <w:sz w:val="19"/>
+                <w:szCs w:val="19"/>
+              </w:rPr>
+              <w:t xml:space="preserve">Department arrival curve</w:t>
+            </w:r>
+          </w:p>
+        </w:tc>
+        <w:tc>
+          <w:tcPr>
+            <w:tcW w:type="dxa" w:w="2600"/>
+            <w:tcBorders>
+              <w:top w:val="single" w:color="D9D8D3" w:sz="4"/>
+              <w:left w:val="single" w:color="D9D8D3" w:sz="4"/>
+              <w:bottom w:val="single" w:color="D9D8D3" w:sz="4"/>
+              <w:right w:val="single" w:color="D9D8D3" w:sz="4"/>
+            </w:tcBorders>
+            <w:tcMar>
+              <w:top w:type="dxa" w:w="60"/>
+              <w:left w:type="dxa" w:w="100"/>
+              <w:bottom w:type="dxa" w:w="60"/>
+              <w:right w:type="dxa" w:w="100"/>
+            </w:tcMar>
+          </w:tcPr>
+          <w:p>
+            <w:r>
+              <w:rPr>
+                <w:rFonts w:ascii="Consolas" w:cs="Consolas" w:eastAsia="Consolas" w:hAnsi="Consolas"/>
+                <w:sz w:val="19"/>
+                <w:szCs w:val="19"/>
+              </w:rPr>
+              <w:t xml:space="preserve">config/default.toml</w:t>
+            </w:r>
+            <w:r>
+              <w:rPr>
+                <w:sz w:val="19"/>
+                <w:szCs w:val="19"/>
+              </w:rPr>
+              <w:t xml:space="preserve"> [[simulation.slot.group]]; </w:t>
+            </w:r>
+            <w:r>
+              <w:rPr>
+                <w:rFonts w:ascii="Consolas" w:cs="Consolas" w:eastAsia="Consolas" w:hAnsi="Consolas"/>
+                <w:sz w:val="19"/>
+                <w:szCs w:val="19"/>
+              </w:rPr>
+              <w:t xml:space="preserve">messq/config.py</w:t>
+            </w:r>
+          </w:p>
+        </w:tc>
+        <w:tc>
+          <w:tcPr>
+            <w:tcW w:type="dxa" w:w="3426"/>
+            <w:tcBorders>
+              <w:top w:val="single" w:color="D9D8D3" w:sz="4"/>
+              <w:left w:val="single" w:color="D9D8D3" w:sz="4"/>
+              <w:bottom w:val="single" w:color="D9D8D3" w:sz="4"/>
+              <w:right w:val="single" w:color="D9D8D3" w:sz="4"/>
+            </w:tcBorders>
+            <w:tcMar>
+              <w:top w:type="dxa" w:w="60"/>
+              <w:left w:type="dxa" w:w="100"/>
+              <w:bottom w:type="dxa" w:w="60"/>
+              <w:right w:type="dxa" w:w="100"/>
+            </w:tcMar>
+          </w:tcPr>
+          <w:p>
+            <w:r>
+              <w:rPr>
+                <w:sz w:val="19"/>
+                <w:szCs w:val="19"/>
+              </w:rPr>
+              <w:t xml:space="preserve">Lunch break, rough size and lab-day share per department; λ(t) = the breaks added up</w:t>
+            </w:r>
+          </w:p>
+        </w:tc>
+      </w:tr>
+      <w:tr>
+        <w:tc>
+          <w:tcPr>
+            <w:tcW w:type="dxa" w:w="3000"/>
+            <w:tcBorders>
+              <w:top w:val="single" w:color="D9D8D3" w:sz="4"/>
+              <w:left w:val="single" w:color="D9D8D3" w:sz="4"/>
+              <w:bottom w:val="single" w:color="D9D8D3" w:sz="4"/>
+              <w:right w:val="single" w:color="D9D8D3" w:sz="4"/>
+            </w:tcBorders>
+            <w:tcMar>
+              <w:top w:type="dxa" w:w="60"/>
+              <w:left w:type="dxa" w:w="100"/>
+              <w:bottom w:type="dxa" w:w="60"/>
+              <w:right w:type="dxa" w:w="100"/>
+            </w:tcMar>
+          </w:tcPr>
+          <w:p>
+            <w:r>
+              <w:rPr>
+                <w:sz w:val="19"/>
+                <w:szCs w:val="19"/>
+              </w:rPr>
+              <w:t xml:space="preserve">Live demo dashboard</w:t>
+            </w:r>
+          </w:p>
+        </w:tc>
+        <w:tc>
+          <w:tcPr>
+            <w:tcW w:type="dxa" w:w="2600"/>
+            <w:tcBorders>
+              <w:top w:val="single" w:color="D9D8D3" w:sz="4"/>
+              <w:left w:val="single" w:color="D9D8D3" w:sz="4"/>
+              <w:bottom w:val="single" w:color="D9D8D3" w:sz="4"/>
+              <w:right w:val="single" w:color="D9D8D3" w:sz="4"/>
+            </w:tcBorders>
+            <w:tcMar>
+              <w:top w:type="dxa" w:w="60"/>
+              <w:left w:type="dxa" w:w="100"/>
+              <w:bottom w:type="dxa" w:w="60"/>
+              <w:right w:type="dxa" w:w="100"/>
+            </w:tcMar>
+          </w:tcPr>
+          <w:p>
+            <w:r>
+              <w:rPr>
+                <w:rFonts w:ascii="Consolas" w:cs="Consolas" w:eastAsia="Consolas" w:hAnsi="Consolas"/>
+                <w:sz w:val="19"/>
+                <w:szCs w:val="19"/>
+              </w:rPr>
+              <w:t xml:space="preserve">messq/demo/</w:t>
+            </w:r>
+          </w:p>
+        </w:tc>
+        <w:tc>
+          <w:tcPr>
+            <w:tcW w:type="dxa" w:w="3426"/>
+            <w:tcBorders>
+              <w:top w:val="single" w:color="D9D8D3" w:sz="4"/>
+              <w:left w:val="single" w:color="D9D8D3" w:sz="4"/>
+              <w:bottom w:val="single" w:color="D9D8D3" w:sz="4"/>
+              <w:right w:val="single" w:color="D9D8D3" w:sz="4"/>
+            </w:tcBorders>
+            <w:tcMar>
+              <w:top w:type="dxa" w:w="60"/>
+              <w:left w:type="dxa" w:w="100"/>
+              <w:bottom w:type="dxa" w:w="60"/>
+              <w:right w:type="dxa" w:w="100"/>
+            </w:tcMar>
+          </w:tcPr>
+          <w:p>
+            <w:r>
+              <w:rPr>
+                <w:sz w:val="19"/>
+                <w:szCs w:val="19"/>
+              </w:rPr>
+              <w:t xml:space="preserve">Same lunch twice (without / with screens); 'When students arrive' panel shows the timetable curve, arrivals so far, capacity and who is on break</w:t>
             </w:r>
           </w:p>
         </w:tc>

</xml_diff>

<commit_message>
Use the measured 80/20 habit split; clarify queue and arrival labels on the dashboard
Habit share is now ~2,360 Central / ~600 Munch (group's count) instead of
the assumed 85/15, in the simulator, engine and workbook. All scenarios,
payoff and reconciliation rerun; README, doc and workbook updated. The
dashboard says what 'queueing' counts (outside the scanner vs scanned in
and waiting for food) and shows each mess's habit count next to the
screens-run count, so the split visibly follows compliance.

Co-Authored-By: Claude Opus 5.5 <noreply@anthropic.com>
Claude-Session: https://claude.ai/code/session_013JwSYm4UV7vKHqaUukbU1G
</commit_message>
<xml_diff>
--- a/docs/MDS_Queuing_Theory_and_Simulation.docx
+++ b/docs/MDS_Queuing_Theory_and_Simulation.docx
@@ -1156,27 +1156,17 @@
         <w:t xml:space="preserve">2,960 students</w:t>
       </w:r>
       <w:r>
-        <w:t xml:space="preserve"> (one plate each) eat at Central CT or Munch Mess. How they split by habit is </w:t>
+        <w:t xml:space="preserve"> (one plate each) eat at Central CT or Munch Mess. By habit about </w:t>
       </w:r>
       <w:r>
         <w:rPr>
           <w:b/>
           <w:bCs/>
         </w:rPr>
-        <w:t xml:space="preserve">not measured</w:t>
-      </w:r>
-      <w:r>
-        <w:t xml:space="preserve">; we assume </w:t>
-      </w:r>
-      <w:r>
-        <w:rPr>
-          <w:b/>
-          <w:bCs/>
-        </w:rPr>
-        <w:t xml:space="preserve">85% go to Central</w:t>
-      </w:r>
-      <w:r>
-        <w:t xml:space="preserve">.</w:t>
+        <w:t xml:space="preserve">2,360 eat at Central and ~600 at Munch</w:t>
+      </w:r>
+      <w:r>
+        <w:t xml:space="preserve"> (80/20, the group's count).</w:t>
       </w:r>
     </w:p>
     <w:p>
@@ -1509,7 +1499,7 @@
                 <w:sz w:val="19"/>
                 <w:szCs w:val="19"/>
               </w:rPr>
-              <w:t xml:space="preserve"> of serving capacity (2 stations × 2 messes × 10/min, μ assumed), so ρ ≈ 0.94 overall. With 85% going to Central by habit (assumed), Central gets ≈ </w:t>
+              <w:t xml:space="preserve"> of serving capacity (2 stations × 2 messes × 10/min, μ assumed), so ρ ≈ 0.94 overall. With 80% going to Central by habit (measured: ~2,360 of ~2,960), Central gets ≈ </w:t>
             </w:r>
             <w:r>
               <w:rPr>
@@ -1518,14 +1508,14 @@
                 <w:sz w:val="19"/>
                 <w:szCs w:val="19"/>
               </w:rPr>
-              <w:t xml:space="preserve">32/min against 20/min</w:t>
-            </w:r>
-            <w:r>
-              <w:rPr>
-                <w:sz w:val="19"/>
-                <w:szCs w:val="19"/>
-              </w:rPr>
-              <w:t xml:space="preserve"> (ρ ≈ 1.6, saturated, and above its single scanner's ~30/min) while Munch gets ≈ </w:t>
+              <w:t xml:space="preserve">30/min against 20/min</w:t>
+            </w:r>
+            <w:r>
+              <w:rPr>
+                <w:sz w:val="19"/>
+                <w:szCs w:val="19"/>
+              </w:rPr>
+              <w:t xml:space="preserve"> (ρ ≈ 1.5, saturated, and at its single scanner's ~30/min limit) while Munch gets ≈ </w:t>
             </w:r>
             <w:r>
               <w:rPr>
@@ -1534,14 +1524,14 @@
                 <w:sz w:val="19"/>
                 <w:szCs w:val="19"/>
               </w:rPr>
-              <w:t xml:space="preserve">6/min against 20/min</w:t>
-            </w:r>
-            <w:r>
-              <w:rPr>
-                <w:sz w:val="19"/>
-                <w:szCs w:val="19"/>
-              </w:rPr>
-              <w:t xml:space="preserve"> (ρ ≈ 0.28). Seats are close to full but not the first constraint (section 3.2)</w:t>
+              <w:t xml:space="preserve">8/min against 20/min</w:t>
+            </w:r>
+            <w:r>
+              <w:rPr>
+                <w:sz w:val="19"/>
+                <w:szCs w:val="19"/>
+              </w:rPr>
+              <w:t xml:space="preserve"> (ρ ≈ 0.38). Seats are close to full but not the first constraint (section 3.2)</w:t>
             </w:r>
           </w:p>
         </w:tc>
@@ -1785,7 +1775,7 @@
                 <w:sz w:val="19"/>
                 <w:szCs w:val="19"/>
               </w:rPr>
-              <w:t xml:space="preserve">Habit (85/15, assumed), herding if every screen says 'go to the emptier mess', partial compliance (κ = 60%, assumed), and the star dish that students come for. The </w:t>
+              <w:t xml:space="preserve">Habit (80/20, measured by the group), herding if every screen says 'go to the emptier mess', partial compliance (κ = 60%, assumed), and the star dish that students come for. The </w:t>
             </w:r>
             <w:r>
               <w:rPr>
@@ -6994,7 +6984,7 @@
                 <w:sz w:val="19"/>
                 <w:szCs w:val="19"/>
               </w:rPr>
-              <w:t xml:space="preserve">85% Central / 15% Munch, </w:t>
+              <w:t xml:space="preserve">80% Central / 20% Munch (~2,360 / ~600), </w:t>
             </w:r>
             <w:r>
               <w:rPr>
@@ -7003,14 +6993,14 @@
                 <w:sz w:val="19"/>
                 <w:szCs w:val="19"/>
               </w:rPr>
-              <w:t xml:space="preserve">assumed</w:t>
-            </w:r>
-            <w:r>
-              <w:rPr>
-                <w:sz w:val="19"/>
-                <w:szCs w:val="19"/>
-              </w:rPr>
-              <w:t xml:space="preserve"> (not measured)</w:t>
+              <w:t xml:space="preserve">measured</w:t>
+            </w:r>
+            <w:r>
+              <w:rPr>
+                <w:sz w:val="19"/>
+                <w:szCs w:val="19"/>
+              </w:rPr>
+              <w:t xml:space="preserve"> by the group</w:t>
             </w:r>
           </w:p>
         </w:tc>
@@ -8140,17 +8130,17 @@
         <w:spacing w:after="120"/>
       </w:pPr>
       <w:r>
-        <w:t xml:space="preserve">In a surge, W grows because of queueing. If about 32 students/min arrive at Central CT at the 13:10 peak (85% of ~37/min; above the single scanner's ~30/min) and the visit stretches to about 27 minutes (simulated), L ≈ 32 × 27 ≈ </w:t>
+        <w:t xml:space="preserve">In a surge, W grows because of queueing. If about 30 students/min arrive at Central CT at the 13:10 peak (80% of ~37/min; the single scanner's limit) and the visit stretches to about 23 minutes (simulated), L ≈ 30 × 23 ≈ </w:t>
       </w:r>
       <w:r>
         <w:rPr>
           <w:b/>
           <w:bCs/>
         </w:rPr>
-        <w:t xml:space="preserve">860</w:t>
-      </w:r>
-      <w:r>
-        <w:t xml:space="preserve"> people inside: just below 900 seats. So with these inputs Central's bottleneck is the serving stations and the scanner, with the seats close behind. If the visit stretched past 28 minutes, L would exceed 900 and the hall would fill (as in photo O1 at 13:18).</w:t>
+        <w:t xml:space="preserve">690</w:t>
+      </w:r>
+      <w:r>
+        <w:t xml:space="preserve"> people inside: below 900 seats. So with these inputs Central's bottleneck is the serving stations and the scanner, not the seats. If the visit stretched past 30 minutes, L would exceed 900 and the hall would fill (as in photo O1 at 13:18).</w:t>
       </w:r>
     </w:p>
     <w:p>
@@ -9694,7 +9684,7 @@
         <w:spacing w:after="120"/>
       </w:pPr>
       <w:r>
-        <w:t xml:space="preserve">Two stations pooled into one queue wait much less than two separate M/M/1 lines at the same utilisation. That is the case for one shared queue feeding both serving stations. Why μ = 10/min: with only 2 stations, Central must serve about 2,500 students (85% of 2,960) in three hours, which is impossible at slower speeds; it must be about this fast. A stopwatch check is the most valuable next measurement.</w:t>
+        <w:t xml:space="preserve">Two stations pooled into one queue wait much less than two separate M/M/1 lines at the same utilisation. That is the case for one shared queue feeding both serving stations. Why μ = 10/min: with only 2 stations, Central must serve about 2,360 students (80% of 2,960), mostly within two hours of breaks, which is impossible at slower speeds; it must be about this fast. A stopwatch check is the most valuable next measurement.</w:t>
       </w:r>
     </w:p>
     <w:p>
@@ -12366,7 +12356,7 @@
         <w:t xml:space="preserve">calibrated, not measured</w:t>
       </w:r>
       <w:r>
-        <w:t xml:space="preserve">: with it, the no-screen simulation gives a 17–27 minute visit and a ~20 minute 90th-percentile wait, close to what the group and Phase 1 observed; a tighter lag (15 ± 10, everyone rushing at the bell) gives 36-minute peak visits, above anything observed. The curve has two surges: about </w:t>
+        <w:t xml:space="preserve">: with it, the no-screen simulation gives a 17–23 minute visit and a ~13 minute 90th-percentile wait, close to the group's 17–25 minutes and the ~15 minutes seen in Phase 1; a tighter lag (15 ± 10, everyone rushing at the bell) gives ~30-minute peak visits and a 23-minute 90th percentile, above what was observed. The curve has two surges: about </w:t>
       </w:r>
       <w:r>
         <w:rPr>
@@ -12401,7 +12391,7 @@
         <w:t xml:space="preserve">What this adds to the decision:</w:t>
       </w:r>
       <w:r>
-        <w:t xml:space="preserve"> staggering one department's break by 15 minutes cuts today's average wait from 7.3 to 4.3 minutes (SMI to 11:45) or 3.9 minutes (TAPMI to 13:20) with no screens at all. That makes alternative A7 (stagger class end times) concrete, though it needs academic administration; the screens get further (1.0 minutes) without changing any timetable.</w:t>
+        <w:t xml:space="preserve"> staggering one department's break by 15 minutes cuts today's average wait from 4.4 to 3.2 minutes (SMI to 11:45) or 1.9 minutes (TAPMI to 13:20) with no screens at all. That makes alternative A7 (stagger class end times) concrete, though it needs academic administration; the screens get further (0.8 minutes) without changing any timetable.</w:t>
       </w:r>
     </w:p>
     <w:p>
@@ -12770,7 +12760,7 @@
         <w:t xml:space="preserve">Simulated, not measured.  </w:t>
       </w:r>
       <w:r>
-        <w:t xml:space="preserve">20 simulated lunches per row, the same students in every scenario (paired comparison); ± is a 95% confidence interval across lunches. Measured: 2,960 students, seats, 2 stations and 1 scanner per mess, refill times. Group estimates: eating 12–15 min, disposal ≤ 2 min, food ready 70% of the time. </w:t>
+        <w:t xml:space="preserve">20 simulated lunches per row, the same students in every scenario (paired comparison); ± is a 95% confidence interval across lunches. Measured: 2,960 students, the 80/20 habit split, seats, 2 stations and 1 scanner per mess, refill times. Group estimates: eating 12–15 min, disposal ≤ 2 min, food ready 70% of the time. </w:t>
       </w:r>
       <w:r>
         <w:rPr>
@@ -12780,7 +12770,7 @@
         <w:t xml:space="preserve">Assumed:</w:t>
       </w:r>
       <w:r>
-        <w:t xml:space="preserve"> the 85/15 habit split, 10 students/min per station, scan and plate times, department sizes (rough). </w:t>
+        <w:t xml:space="preserve"> 10 students/min per station, scan and plate times, department sizes (rough). </w:t>
       </w:r>
       <w:r>
         <w:rPr>
@@ -13120,7 +13110,7 @@
                 <w:sz w:val="19"/>
                 <w:szCs w:val="19"/>
               </w:rPr>
-              <w:t xml:space="preserve">7.34 ± 0.68</w:t>
+              <w:t xml:space="preserve">4.38 ± 0.53</w:t>
             </w:r>
           </w:p>
         </w:tc>
@@ -13146,7 +13136,7 @@
                 <w:sz w:val="19"/>
                 <w:szCs w:val="19"/>
               </w:rPr>
-              <w:t xml:space="preserve">20.5</w:t>
+              <w:t xml:space="preserve">13.5</w:t>
             </w:r>
           </w:p>
         </w:tc>
@@ -13172,7 +13162,7 @@
                 <w:sz w:val="19"/>
                 <w:szCs w:val="19"/>
               </w:rPr>
-              <w:t xml:space="preserve">23.9</w:t>
+              <w:t xml:space="preserve">20.9</w:t>
             </w:r>
           </w:p>
         </w:tc>
@@ -13198,7 +13188,7 @@
                 <w:sz w:val="19"/>
                 <w:szCs w:val="19"/>
               </w:rPr>
-              <w:t xml:space="preserve">70% / 12%</w:t>
+              <w:t xml:space="preserve">65% / 17%</w:t>
             </w:r>
           </w:p>
         </w:tc>
@@ -13224,7 +13214,7 @@
                 <w:sz w:val="19"/>
                 <w:szCs w:val="19"/>
               </w:rPr>
-              <w:t xml:space="preserve">0.8</w:t>
+              <w:t xml:space="preserve">0.5</w:t>
             </w:r>
           </w:p>
         </w:tc>
@@ -13330,7 +13320,7 @@
                 <w:sz w:val="19"/>
                 <w:szCs w:val="19"/>
               </w:rPr>
-              <w:t xml:space="preserve">1.93 ± 0.43</w:t>
+              <w:t xml:space="preserve">1.30 ± 0.33</w:t>
             </w:r>
           </w:p>
         </w:tc>
@@ -13356,7 +13346,7 @@
                 <w:sz w:val="19"/>
                 <w:szCs w:val="19"/>
               </w:rPr>
-              <w:t xml:space="preserve">5.2</w:t>
+              <w:t xml:space="preserve">3.4</w:t>
             </w:r>
           </w:p>
         </w:tc>
@@ -13382,7 +13372,7 @@
                 <w:sz w:val="19"/>
                 <w:szCs w:val="19"/>
               </w:rPr>
-              <w:t xml:space="preserve">18.5</w:t>
+              <w:t xml:space="preserve">17.9</w:t>
             </w:r>
           </w:p>
         </w:tc>
@@ -13408,7 +13398,7 @@
                 <w:sz w:val="19"/>
                 <w:szCs w:val="19"/>
               </w:rPr>
-              <w:t xml:space="preserve">61% / 22%</w:t>
+              <w:t xml:space="preserve">59% / 23%</w:t>
             </w:r>
           </w:p>
         </w:tc>
@@ -13434,7 +13424,7 @@
                 <w:sz w:val="19"/>
                 <w:szCs w:val="19"/>
               </w:rPr>
-              <w:t xml:space="preserve">1.0</w:t>
+              <w:t xml:space="preserve">0.6</w:t>
             </w:r>
           </w:p>
         </w:tc>
@@ -13460,7 +13450,7 @@
                 <w:sz w:val="19"/>
                 <w:szCs w:val="19"/>
               </w:rPr>
-              <w:t xml:space="preserve">336</w:t>
+              <w:t xml:space="preserve">240</w:t>
             </w:r>
           </w:p>
         </w:tc>
@@ -13486,7 +13476,7 @@
                 <w:sz w:val="19"/>
                 <w:szCs w:val="19"/>
               </w:rPr>
-              <w:t xml:space="preserve">0%</w:t>
+              <w:t xml:space="preserve">1%</w:t>
             </w:r>
           </w:p>
         </w:tc>
@@ -13540,7 +13530,7 @@
                 <w:sz w:val="19"/>
                 <w:szCs w:val="19"/>
               </w:rPr>
-              <w:t xml:space="preserve">0.98 ± 0.12</w:t>
+              <w:t xml:space="preserve">0.81 ± 0.09</w:t>
             </w:r>
           </w:p>
         </w:tc>
@@ -13566,7 +13556,7 @@
                 <w:sz w:val="19"/>
                 <w:szCs w:val="19"/>
               </w:rPr>
-              <w:t xml:space="preserve">2.4</w:t>
+              <w:t xml:space="preserve">2.2</w:t>
             </w:r>
           </w:p>
         </w:tc>
@@ -13592,7 +13582,7 @@
                 <w:sz w:val="19"/>
                 <w:szCs w:val="19"/>
               </w:rPr>
-              <w:t xml:space="preserve">17.5</w:t>
+              <w:t xml:space="preserve">17.4</w:t>
             </w:r>
           </w:p>
         </w:tc>
@@ -13618,7 +13608,7 @@
                 <w:sz w:val="19"/>
                 <w:szCs w:val="19"/>
               </w:rPr>
-              <w:t xml:space="preserve">59% / 23%</w:t>
+              <w:t xml:space="preserve">58% / 24%</w:t>
             </w:r>
           </w:p>
         </w:tc>
@@ -13644,7 +13634,7 @@
                 <w:sz w:val="19"/>
                 <w:szCs w:val="19"/>
               </w:rPr>
-              <w:t xml:space="preserve">0.6</w:t>
+              <w:t xml:space="preserve">0.7</w:t>
             </w:r>
           </w:p>
         </w:tc>
@@ -13670,7 +13660,7 @@
                 <w:sz w:val="19"/>
                 <w:szCs w:val="19"/>
               </w:rPr>
-              <w:t xml:space="preserve">385</w:t>
+              <w:t xml:space="preserve">286</w:t>
             </w:r>
           </w:p>
         </w:tc>
@@ -13750,7 +13740,7 @@
                 <w:sz w:val="19"/>
                 <w:szCs w:val="19"/>
               </w:rPr>
-              <w:t xml:space="preserve">0.97 ± 0.13</w:t>
+              <w:t xml:space="preserve">0.74 ± 0.07</w:t>
             </w:r>
           </w:p>
         </w:tc>
@@ -13776,7 +13766,7 @@
                 <w:sz w:val="19"/>
                 <w:szCs w:val="19"/>
               </w:rPr>
-              <w:t xml:space="preserve">2.2</w:t>
+              <w:t xml:space="preserve">2.0</w:t>
             </w:r>
           </w:p>
         </w:tc>
@@ -13802,7 +13792,7 @@
                 <w:sz w:val="19"/>
                 <w:szCs w:val="19"/>
               </w:rPr>
-              <w:t xml:space="preserve">17.5</w:t>
+              <w:t xml:space="preserve">17.3</w:t>
             </w:r>
           </w:p>
         </w:tc>
@@ -13828,7 +13818,7 @@
                 <w:sz w:val="19"/>
                 <w:szCs w:val="19"/>
               </w:rPr>
-              <w:t xml:space="preserve">59% / 22%</w:t>
+              <w:t xml:space="preserve">58% / 24%</w:t>
             </w:r>
           </w:p>
         </w:tc>
@@ -13880,7 +13870,7 @@
                 <w:sz w:val="19"/>
                 <w:szCs w:val="19"/>
               </w:rPr>
-              <w:t xml:space="preserve">377</w:t>
+              <w:t xml:space="preserve">277</w:t>
             </w:r>
           </w:p>
         </w:tc>
@@ -13906,7 +13896,7 @@
                 <w:sz w:val="19"/>
                 <w:szCs w:val="19"/>
               </w:rPr>
-              <w:t xml:space="preserve">2%</w:t>
+              <w:t xml:space="preserve">4%</w:t>
             </w:r>
           </w:p>
         </w:tc>
@@ -13947,7 +13937,7 @@
           <w:b/>
           <w:bCs/>
         </w:rPr>
-        <w:t xml:space="preserve">7.3 to 1.0 minutes</w:t>
+        <w:t xml:space="preserve">4.4 to 0.8 minutes</w:t>
       </w:r>
       <w:r>
         <w:t xml:space="preserve"> and the 90th percentile from </w:t>
@@ -13957,10 +13947,10 @@
           <w:b/>
           <w:bCs/>
         </w:rPr>
-        <w:t xml:space="preserve">20 to 2.4 minutes</w:t>
-      </w:r>
-      <w:r>
-        <w:t xml:space="preserve">; throughput falls from 23.9 to 17.5 minutes.</w:t>
+        <w:t xml:space="preserve">13.5 to 2.2 minutes</w:t>
+      </w:r>
+      <w:r>
+        <w:t xml:space="preserve">; throughput falls from 20.9 to 17.4 minutes.</w:t>
       </w:r>
     </w:p>
     <w:p>
@@ -13980,7 +13970,7 @@
         <w:t xml:space="preserve">Food status helps</w:t>
       </w:r>
       <w:r>
-        <w:t xml:space="preserve">: queue information alone gives 1.9 minutes; adding the manager's food status gives 1.0. The 13:10 surge drains the trays just when the queue is longest, so knowing about a run-out matters.</w:t>
+        <w:t xml:space="preserve">: queue information alone gives 1.3 minutes; adding the manager's food status gives 0.8. The 13:10 surge drains the trays just when the queue is longest, so knowing about a run-out matters.</w:t>
       </w:r>
     </w:p>
     <w:p>
@@ -14000,10 +13990,10 @@
           <w:b/>
           <w:bCs/>
         </w:rPr>
-        <w:t xml:space="preserve">1 in 8 students</w:t>
-      </w:r>
-      <w:r>
-        <w:t xml:space="preserve"> walks to the other mess (385 of ~2,960). The LP optimum (section 7.6) moves 358, so the live system is close to the theoretical split.</w:t>
+        <w:t xml:space="preserve">1 in 10 students</w:t>
+      </w:r>
+      <w:r>
+        <w:t xml:space="preserve"> walks to the other mess (286 of ~2,960). The LP optimum (section 7.6) moves 261, so the live system is close to the theoretical split.</w:t>
       </w:r>
     </w:p>
     <w:p>
@@ -14016,7 +14006,7 @@
         <w:spacing w:after="60"/>
       </w:pPr>
       <w:r>
-        <w:t xml:space="preserve">Without screens the simulated 90th-percentile wait (~20 min) is close to the ~15 min observed in Phase 1, and the simulated throughput (~16.7 min with no queue, ~26.7 min at the peak) sits in or just above the group's 17–25 min range. This is partly by construction: the arrival lag was calibrated to it.</w:t>
+        <w:t xml:space="preserve">Without screens the simulated 90th-percentile wait (~13 min) is close to the ~15 min observed in Phase 1, and the simulated throughput (~16.7 min with no queue, ~22.7 min at the peak) sits in the group's 17–25 min range. This is partly by construction: the arrival lag was calibrated to it.</w:t>
       </w:r>
     </w:p>
     <w:p>
@@ -14215,7 +14205,7 @@
                 <w:sz w:val="19"/>
                 <w:szCs w:val="19"/>
               </w:rPr>
-              <w:t xml:space="preserve">16.14</w:t>
+              <w:t xml:space="preserve">11.41</w:t>
             </w:r>
           </w:p>
         </w:tc>
@@ -14241,7 +14231,7 @@
                 <w:sz w:val="19"/>
                 <w:szCs w:val="19"/>
               </w:rPr>
-              <w:t xml:space="preserve">2.79</w:t>
+              <w:t xml:space="preserve">2.81</w:t>
             </w:r>
           </w:p>
         </w:tc>
@@ -14267,7 +14257,7 @@
                 <w:sz w:val="19"/>
                 <w:szCs w:val="19"/>
               </w:rPr>
-              <w:t xml:space="preserve">2.22</w:t>
+              <w:t xml:space="preserve">2.04</w:t>
             </w:r>
           </w:p>
         </w:tc>
@@ -14321,7 +14311,7 @@
                 <w:sz w:val="19"/>
                 <w:szCs w:val="19"/>
               </w:rPr>
-              <w:t xml:space="preserve">12.21</w:t>
+              <w:t xml:space="preserve">8.86</w:t>
             </w:r>
           </w:p>
         </w:tc>
@@ -14347,7 +14337,7 @@
                 <w:sz w:val="19"/>
                 <w:szCs w:val="19"/>
               </w:rPr>
-              <w:t xml:space="preserve">2.12</w:t>
+              <w:t xml:space="preserve">1.93</w:t>
             </w:r>
           </w:p>
         </w:tc>
@@ -14373,7 +14363,7 @@
                 <w:sz w:val="19"/>
                 <w:szCs w:val="19"/>
               </w:rPr>
-              <w:t xml:space="preserve">1.88</w:t>
+              <w:t xml:space="preserve">1.78</w:t>
             </w:r>
           </w:p>
         </w:tc>
@@ -14427,7 +14417,7 @@
                 <w:sz w:val="19"/>
                 <w:szCs w:val="19"/>
               </w:rPr>
-              <w:t xml:space="preserve">7.55</w:t>
+              <w:t xml:space="preserve">6.00</w:t>
             </w:r>
           </w:p>
         </w:tc>
@@ -14453,7 +14443,7 @@
                 <w:sz w:val="19"/>
                 <w:szCs w:val="19"/>
               </w:rPr>
-              <w:t xml:space="preserve">1.74</w:t>
+              <w:t xml:space="preserve">1.40</w:t>
             </w:r>
           </w:p>
         </w:tc>
@@ -14479,7 +14469,7 @@
                 <w:sz w:val="19"/>
                 <w:szCs w:val="19"/>
               </w:rPr>
-              <w:t xml:space="preserve">1.48</w:t>
+              <w:t xml:space="preserve">1.13</w:t>
             </w:r>
           </w:p>
         </w:tc>
@@ -14533,7 +14523,7 @@
                 <w:sz w:val="19"/>
                 <w:szCs w:val="19"/>
               </w:rPr>
-              <w:t xml:space="preserve">12.52</w:t>
+              <w:t xml:space="preserve">8.86</w:t>
             </w:r>
           </w:p>
         </w:tc>
@@ -14559,7 +14549,7 @@
                 <w:sz w:val="19"/>
                 <w:szCs w:val="19"/>
               </w:rPr>
-              <w:t xml:space="preserve">1.30</w:t>
+              <w:t xml:space="preserve">1.27</w:t>
             </w:r>
           </w:p>
         </w:tc>
@@ -14585,7 +14575,7 @@
                 <w:sz w:val="19"/>
                 <w:szCs w:val="19"/>
               </w:rPr>
-              <w:t xml:space="preserve">1.12</w:t>
+              <w:t xml:space="preserve">1.29</w:t>
             </w:r>
           </w:p>
         </w:tc>
@@ -14639,7 +14629,7 @@
                 <w:sz w:val="19"/>
                 <w:szCs w:val="19"/>
               </w:rPr>
-              <w:t xml:space="preserve">4.25</w:t>
+              <w:t xml:space="preserve">3.16</w:t>
             </w:r>
           </w:p>
         </w:tc>
@@ -14665,7 +14655,7 @@
                 <w:sz w:val="19"/>
                 <w:szCs w:val="19"/>
               </w:rPr>
-              <w:t xml:space="preserve">1.01</w:t>
+              <w:t xml:space="preserve">0.65</w:t>
             </w:r>
           </w:p>
         </w:tc>
@@ -14691,7 +14681,7 @@
                 <w:sz w:val="19"/>
                 <w:szCs w:val="19"/>
               </w:rPr>
-              <w:t xml:space="preserve">0.80</w:t>
+              <w:t xml:space="preserve">0.62</w:t>
             </w:r>
           </w:p>
         </w:tc>
@@ -14745,7 +14735,7 @@
                 <w:sz w:val="19"/>
                 <w:szCs w:val="19"/>
               </w:rPr>
-              <w:t xml:space="preserve">3.91</w:t>
+              <w:t xml:space="preserve">1.90</w:t>
             </w:r>
           </w:p>
         </w:tc>
@@ -14771,7 +14761,7 @@
                 <w:sz w:val="19"/>
                 <w:szCs w:val="19"/>
               </w:rPr>
-              <w:t xml:space="preserve">1.46</w:t>
+              <w:t xml:space="preserve">0.90</w:t>
             </w:r>
           </w:p>
         </w:tc>
@@ -14797,7 +14787,7 @@
                 <w:sz w:val="19"/>
                 <w:szCs w:val="19"/>
               </w:rPr>
-              <w:t xml:space="preserve">0.79</w:t>
+              <w:t xml:space="preserve">0.56</w:t>
             </w:r>
           </w:p>
         </w:tc>
@@ -14851,7 +14841,7 @@
                 <w:sz w:val="19"/>
                 <w:szCs w:val="19"/>
               </w:rPr>
-              <w:t xml:space="preserve">8.02</w:t>
+              <w:t xml:space="preserve">5.19</w:t>
             </w:r>
           </w:p>
         </w:tc>
@@ -14877,7 +14867,7 @@
                 <w:sz w:val="19"/>
                 <w:szCs w:val="19"/>
               </w:rPr>
-              <w:t xml:space="preserve">1.37</w:t>
+              <w:t xml:space="preserve">1.03</w:t>
             </w:r>
           </w:p>
         </w:tc>
@@ -14903,7 +14893,7 @@
                 <w:sz w:val="19"/>
                 <w:szCs w:val="19"/>
               </w:rPr>
-              <w:t xml:space="preserve">0.81</w:t>
+              <w:t xml:space="preserve">0.86</w:t>
             </w:r>
           </w:p>
         </w:tc>
@@ -14957,7 +14947,7 @@
                 <w:sz w:val="19"/>
                 <w:szCs w:val="19"/>
               </w:rPr>
-              <w:t xml:space="preserve">7.34</w:t>
+              <w:t xml:space="preserve">4.38</w:t>
             </w:r>
           </w:p>
         </w:tc>
@@ -14983,7 +14973,7 @@
                 <w:sz w:val="19"/>
                 <w:szCs w:val="19"/>
               </w:rPr>
-              <w:t xml:space="preserve">2.01</w:t>
+              <w:t xml:space="preserve">1.49</w:t>
             </w:r>
           </w:p>
         </w:tc>
@@ -15009,7 +14999,7 @@
                 <w:sz w:val="19"/>
                 <w:szCs w:val="19"/>
               </w:rPr>
-              <w:t xml:space="preserve">1.59</w:t>
+              <w:t xml:space="preserve">1.00</w:t>
             </w:r>
           </w:p>
         </w:tc>
@@ -15063,7 +15053,7 @@
                 <w:sz w:val="19"/>
                 <w:szCs w:val="19"/>
               </w:rPr>
-              <w:t xml:space="preserve">7.34</w:t>
+              <w:t xml:space="preserve">4.38</w:t>
             </w:r>
           </w:p>
         </w:tc>
@@ -15089,7 +15079,7 @@
                 <w:sz w:val="19"/>
                 <w:szCs w:val="19"/>
               </w:rPr>
-              <w:t xml:space="preserve">1.71</w:t>
+              <w:t xml:space="preserve">1.12</w:t>
             </w:r>
           </w:p>
         </w:tc>
@@ -15115,7 +15105,7 @@
                 <w:sz w:val="19"/>
                 <w:szCs w:val="19"/>
               </w:rPr>
-              <w:t xml:space="preserve">1.11</w:t>
+              <w:t xml:space="preserve">0.70</w:t>
             </w:r>
           </w:p>
         </w:tc>
@@ -15169,7 +15159,7 @@
                 <w:sz w:val="19"/>
                 <w:szCs w:val="19"/>
               </w:rPr>
-              <w:t xml:space="preserve">17.78</w:t>
+              <w:t xml:space="preserve">12.88</w:t>
             </w:r>
           </w:p>
         </w:tc>
@@ -15195,7 +15185,7 @@
                 <w:sz w:val="19"/>
                 <w:szCs w:val="19"/>
               </w:rPr>
-              <w:t xml:space="preserve">1.90</w:t>
+              <w:t xml:space="preserve">1.96</w:t>
             </w:r>
           </w:p>
         </w:tc>
@@ -15221,7 +15211,7 @@
                 <w:sz w:val="19"/>
                 <w:szCs w:val="19"/>
               </w:rPr>
-              <w:t xml:space="preserve">1.92</w:t>
+              <w:t xml:space="preserve">1.78</w:t>
             </w:r>
           </w:p>
         </w:tc>
@@ -15275,7 +15265,7 @@
                 <w:sz w:val="19"/>
                 <w:szCs w:val="19"/>
               </w:rPr>
-              <w:t xml:space="preserve">3.96</w:t>
+              <w:t xml:space="preserve">2.11</w:t>
             </w:r>
           </w:p>
         </w:tc>
@@ -15301,7 +15291,7 @@
                 <w:sz w:val="19"/>
                 <w:szCs w:val="19"/>
               </w:rPr>
-              <w:t xml:space="preserve">1.97</w:t>
+              <w:t xml:space="preserve">1.18</w:t>
             </w:r>
           </w:p>
         </w:tc>
@@ -15327,7 +15317,7 @@
                 <w:sz w:val="19"/>
                 <w:szCs w:val="19"/>
               </w:rPr>
-              <w:t xml:space="preserve">0.80</w:t>
+              <w:t xml:space="preserve">0.69</w:t>
             </w:r>
           </w:p>
         </w:tc>
@@ -15381,7 +15371,7 @@
                 <w:sz w:val="19"/>
                 <w:szCs w:val="19"/>
               </w:rPr>
-              <w:t xml:space="preserve">9.77</w:t>
+              <w:t xml:space="preserve">6.40</w:t>
             </w:r>
           </w:p>
         </w:tc>
@@ -15407,7 +15397,7 @@
                 <w:sz w:val="19"/>
                 <w:szCs w:val="19"/>
               </w:rPr>
-              <w:t xml:space="preserve">3.41</w:t>
+              <w:t xml:space="preserve">2.51</w:t>
             </w:r>
           </w:p>
         </w:tc>
@@ -15433,7 +15423,7 @@
                 <w:sz w:val="19"/>
                 <w:szCs w:val="19"/>
               </w:rPr>
-              <w:t xml:space="preserve">1.28</w:t>
+              <w:t xml:space="preserve">0.90</w:t>
             </w:r>
           </w:p>
         </w:tc>
@@ -15487,7 +15477,7 @@
                 <w:sz w:val="19"/>
                 <w:szCs w:val="19"/>
               </w:rPr>
-              <w:t xml:space="preserve">5.78</w:t>
+              <w:t xml:space="preserve">3.51</w:t>
             </w:r>
           </w:p>
         </w:tc>
@@ -15513,7 +15503,7 @@
                 <w:sz w:val="19"/>
                 <w:szCs w:val="19"/>
               </w:rPr>
-              <w:t xml:space="preserve">0.95</w:t>
+              <w:t xml:space="preserve">0.72</w:t>
             </w:r>
           </w:p>
         </w:tc>
@@ -15539,7 +15529,7 @@
                 <w:sz w:val="19"/>
                 <w:szCs w:val="19"/>
               </w:rPr>
-              <w:t xml:space="preserve">0.99</w:t>
+              <w:t xml:space="preserve">0.73</w:t>
             </w:r>
           </w:p>
         </w:tc>
@@ -15593,7 +15583,7 @@
                 <w:sz w:val="19"/>
                 <w:szCs w:val="19"/>
               </w:rPr>
-              <w:t xml:space="preserve">7.34</w:t>
+              <w:t xml:space="preserve">4.38</w:t>
             </w:r>
           </w:p>
         </w:tc>
@@ -15619,7 +15609,7 @@
                 <w:sz w:val="19"/>
                 <w:szCs w:val="19"/>
               </w:rPr>
-              <w:t xml:space="preserve">1.93</w:t>
+              <w:t xml:space="preserve">1.30</w:t>
             </w:r>
           </w:p>
         </w:tc>
@@ -15645,7 +15635,7 @@
                 <w:sz w:val="19"/>
                 <w:szCs w:val="19"/>
               </w:rPr>
-              <w:t xml:space="preserve">0.98</w:t>
+              <w:t xml:space="preserve">0.81</w:t>
             </w:r>
           </w:p>
         </w:tc>
@@ -15656,7 +15646,7 @@
         <w:spacing w:after="120"/>
       </w:pPr>
       <w:r>
-        <w:t xml:space="preserve">The proposal cuts the wait in every stress test (by about 80–90%) and beats or ties queue information only in every one. With no stock-outs the food signal adds nothing (2 and 3 converge); with more stock-outs it matters most. The department tests show the timetable matters as much as any operational input: a day without MIT labs, when MIT and SMI break together at 12:00, is almost twice as bad as an average day; staggering one department by 15 minutes roughly halves the wait; the old single bell curve gave similar averages but hid the two surges.</w:t>
+        <w:t xml:space="preserve">The proposal cuts the wait in every stress test (by about 65–90%) and beats or ties queue information only in every one. With no stock-outs the food signal adds nothing (2 and 3 converge); with more stock-outs it matters most. The department tests show the timetable matters as much as any operational input: a day without MIT labs, when MIT and SMI break together at 12:00, is twice as bad as an average day; moving TAPMI 15 minutes later more than halves the wait; the old single bell curve gave similar averages but hid the two surges.</w:t>
       </w:r>
     </w:p>
     <w:p>
@@ -15672,7 +15662,7 @@
         <w:spacing w:after="120"/>
       </w:pPr>
       <w:r>
-        <w:t xml:space="preserve">The workbook's S15 tab (M/M/c + fluid queue) gives 6.43 → 0.66 minutes. We started the simulator with the spreadsheet's simplifications and added one real-world feature at a time:</w:t>
+        <w:t xml:space="preserve">The workbook's S15 tab (M/M/c + fluid queue) gives 3.52 → 0.47 minutes. We started the simulator with the spreadsheet's simplifications and added one real-world feature at a time:</w:t>
       </w:r>
     </w:p>
     <w:tbl>
@@ -15833,7 +15823,7 @@
                 <w:sz w:val="19"/>
                 <w:szCs w:val="19"/>
               </w:rPr>
-              <w:t xml:space="preserve">5.76</w:t>
+              <w:t xml:space="preserve">3.80</w:t>
             </w:r>
           </w:p>
         </w:tc>
@@ -15859,7 +15849,7 @@
                 <w:sz w:val="19"/>
                 <w:szCs w:val="19"/>
               </w:rPr>
-              <w:t xml:space="preserve">1.15</w:t>
+              <w:t xml:space="preserve">0.85</w:t>
             </w:r>
           </w:p>
         </w:tc>
@@ -15913,7 +15903,7 @@
                 <w:sz w:val="19"/>
                 <w:szCs w:val="19"/>
               </w:rPr>
-              <w:t xml:space="preserve">5.91</w:t>
+              <w:t xml:space="preserve">3.63</w:t>
             </w:r>
           </w:p>
         </w:tc>
@@ -15939,7 +15929,7 @@
                 <w:sz w:val="19"/>
                 <w:szCs w:val="19"/>
               </w:rPr>
-              <w:t xml:space="preserve">0.80</w:t>
+              <w:t xml:space="preserve">0.72</w:t>
             </w:r>
           </w:p>
         </w:tc>
@@ -15993,7 +15983,7 @@
                 <w:sz w:val="19"/>
                 <w:szCs w:val="19"/>
               </w:rPr>
-              <w:t xml:space="preserve">5.96</w:t>
+              <w:t xml:space="preserve">3.52</w:t>
             </w:r>
           </w:p>
         </w:tc>
@@ -16019,7 +16009,7 @@
                 <w:sz w:val="19"/>
                 <w:szCs w:val="19"/>
               </w:rPr>
-              <w:t xml:space="preserve">0.91</w:t>
+              <w:t xml:space="preserve">0.77</w:t>
             </w:r>
           </w:p>
         </w:tc>
@@ -16073,7 +16063,7 @@
                 <w:sz w:val="19"/>
                 <w:szCs w:val="19"/>
               </w:rPr>
-              <w:t xml:space="preserve">5.96</w:t>
+              <w:t xml:space="preserve">3.52</w:t>
             </w:r>
           </w:p>
         </w:tc>
@@ -16099,7 +16089,7 @@
                 <w:sz w:val="19"/>
                 <w:szCs w:val="19"/>
               </w:rPr>
-              <w:t xml:space="preserve">0.91</w:t>
+              <w:t xml:space="preserve">0.77</w:t>
             </w:r>
           </w:p>
         </w:tc>
@@ -16153,7 +16143,7 @@
                 <w:sz w:val="19"/>
                 <w:szCs w:val="19"/>
               </w:rPr>
-              <w:t xml:space="preserve">7.34</w:t>
+              <w:t xml:space="preserve">4.38</w:t>
             </w:r>
           </w:p>
         </w:tc>
@@ -16179,7 +16169,7 @@
                 <w:sz w:val="19"/>
                 <w:szCs w:val="19"/>
               </w:rPr>
-              <w:t xml:space="preserve">0.98</w:t>
+              <w:t xml:space="preserve">0.81</w:t>
             </w:r>
           </w:p>
         </w:tc>
@@ -16190,7 +16180,7 @@
         <w:spacing w:after="120"/>
       </w:pPr>
       <w:r>
-        <w:t xml:space="preserve">Under the same assumptions the two models agree without screens within 15% (6.43 vs 5.76). The spreadsheet is a little higher because it adds the steady-state M/M/c wait in every 10-minute slot, and near 100% busy a slot is too short for the queue to reach steady state; the department surge passes through several such slots. With screens the spreadsheet is optimistic because it routes with perfect knowledge every 10 minutes; the simulator routes on live estimates with a delay and the 2-minute rule. The headline numbers come from the full simulator because it includes randomness, live estimation, the scanner, seats and run-outs.</w:t>
+        <w:t xml:space="preserve">Under the same assumptions the two models agree without screens within 15% (3.52 vs 3.80). The small gap comes from the spreadsheet using the steady-state M/M/c wait in each 10-minute slot, which is only approximate when a slot is close to 100% busy. With screens the spreadsheet is optimistic because it routes with perfect knowledge every 10 minutes; the simulator routes on live estimates with a delay and the 2-minute rule. The headline numbers come from the full simulator because it includes randomness, live estimation, the scanner, seats and run-outs.</w:t>
       </w:r>
     </w:p>
     <w:p>
@@ -17378,7 +17368,7 @@
         <w:t xml:space="preserve">Status-quo / habit bias:</w:t>
       </w:r>
       <w:r>
-        <w:t xml:space="preserve"> students return to the same mess (we assume 85/15) even when the other is quicker. The screen design uses defaults, concrete gains ('Enough time for a chai') and fresh-food cues to counter this.</w:t>
+        <w:t xml:space="preserve"> students return to the same mess (about 80/20, measured) even when the other is quicker. The screen design uses defaults, concrete gains ('Enough time for a chai') and fresh-food cues to counter this.</w:t>
       </w:r>
     </w:p>
     <w:p>
@@ -19290,7 +19280,7 @@
         <w:t xml:space="preserve">Data:</w:t>
       </w:r>
       <w:r>
-        <w:t xml:space="preserve"> D_t = arrivals in slot t (the S15 arrival curve); h = share heading to Central by habit (85%, assumed); κ = share who follow the screen (60%); cap = stations × service rate (20/min per mess); walk = 0.5 min; F_B = Munch's star-dish portions for the lunch.</w:t>
+        <w:t xml:space="preserve"> D_t = arrivals in slot t (the S15 arrival curve); h = share heading to Central by habit (80%, measured); κ = share who follow the screen (60%); cap = stations × service rate (20/min per mess); walk = 0.5 min; F_B = Munch's star-dish portions for the lunch.</w:t>
       </w:r>
     </w:p>
     <w:p>
@@ -19357,7 +19347,7 @@
           <w:b/>
           <w:bCs/>
         </w:rPr>
-        <w:t xml:space="preserve">today 15,676 student-minutes (5.3 min per student) → 179 (0.06 min)</w:t>
+        <w:t xml:space="preserve">today 9,087 student-minutes (3.1 min per student) → 131 (0.04 min)</w:t>
       </w:r>
       <w:r>
         <w:t xml:space="preserve">, by redirecting </w:t>
@@ -19367,10 +19357,10 @@
           <w:b/>
           <w:bCs/>
         </w:rPr>
-        <w:t xml:space="preserve">358 students (12%)</w:t>
-      </w:r>
-      <w:r>
-        <w:t xml:space="preserve"> at the peaks. The simulator's proposal redirects about 385, close to this optimum. The LP is a lower bound: it has no randomness and perfect foresight.</w:t>
+        <w:t xml:space="preserve">261 students (9%)</w:t>
+      </w:r>
+      <w:r>
+        <w:t xml:space="preserve"> at the peaks. The simulator's proposal redirects about 286, close to this optimum. The LP is a lower bound: it has no randomness and perfect foresight.</w:t>
       </w:r>
     </w:p>
     <w:p>
@@ -19385,7 +19375,7 @@
         <w:t xml:space="preserve">Shadow price of food.</w:t>
       </w:r>
       <w:r>
-        <w:t xml:space="preserve"> Munch needs about 800 star-dish portions to carry the optimal flow. Below that, the food constraint binds: with 700 portions each extra portion saves about 30 student-minutes, with 600 about 50. Routing students and allocating food are one decision, not two.</w:t>
+        <w:t xml:space="preserve"> Munch needs about 860 star-dish portions to carry the optimal flow (about 600 for its habitual diners alone). Below that, the food constraint binds: with 800 portions each extra portion saves about 20 student-minutes, with 700 about 40. Routing students and allocating food are one decision, not two.</w:t>
       </w:r>
     </w:p>
     <w:p>
@@ -21972,7 +21962,7 @@
                 <w:sz w:val="19"/>
                 <w:szCs w:val="19"/>
               </w:rPr>
-              <w:t xml:space="preserve">85% Central / 15% Munch</w:t>
+              <w:t xml:space="preserve">80% Central / 20% Munch (~2,360 / ~600)</w:t>
             </w:r>
           </w:p>
         </w:tc>
@@ -21998,7 +21988,7 @@
                 <w:sz w:val="19"/>
                 <w:szCs w:val="19"/>
               </w:rPr>
-              <w:t xml:space="preserve">Assumed</w:t>
+              <w:t xml:space="preserve">Measured (group)</w:t>
             </w:r>
           </w:p>
         </w:tc>
@@ -22024,7 +22014,7 @@
                 <w:sz w:val="19"/>
                 <w:szCs w:val="19"/>
               </w:rPr>
-              <w:t xml:space="preserve">Biometric logs (a no-screen baseline)</w:t>
+              <w:t xml:space="preserve">Biometric logs confirm it (a no-screen baseline)</w:t>
             </w:r>
           </w:p>
         </w:tc>

</xml_diff>

<commit_message>
Queue, capacity and load-balancing workbook on simulated data; Munch seats 492
New docs/Queue_Capacity_LoadBalancing.xlsx (tools/queue_capacity_data.py +
tools/build_queue_capacity_workbook.py): M/M/1 for the face scanner and
M/M/c for the serving stations per 10-min slot with stability and Little's
Law checks, seats as M/G/c and disposal as M/G/inf, seat turnover and the
bottleneck, and dynamic Smart Scan routing against static rules (freshers
at Munch, department assignments, fixed shares) across kinds of day.
The simulator records service end times and can run static department
assignments. Munch seats recounted to 492 (results unchanged: seats never
bind).

Co-Authored-By: Claude Opus 5.5 <noreply@anthropic.com>
Claude-Session: https://claude.ai/code/session_013JwSYm4UV7vKHqaUukbU1G
</commit_message>
<xml_diff>
--- a/docs/MDS_Queuing_Theory_and_Simulation.docx
+++ b/docs/MDS_Queuing_Theory_and_Simulation.docx
@@ -1064,10 +1064,10 @@
           <w:b/>
           <w:bCs/>
         </w:rPr>
-        <w:t xml:space="preserve">Munch Mess ≈ 500</w:t>
-      </w:r>
-      <w:r>
-        <w:t xml:space="preserve"> (together ≈ 1,400, matching the deck's 1,400–1,600).</w:t>
+        <w:t xml:space="preserve">Munch Mess ≈ 492</w:t>
+      </w:r>
+      <w:r>
+        <w:t xml:space="preserve"> (together ≈ 1,392, matching the deck's 1,400–1,600).</w:t>
       </w:r>
     </w:p>
     <w:p>
@@ -6533,7 +6533,7 @@
                 <w:sz w:val="19"/>
                 <w:szCs w:val="19"/>
               </w:rPr>
-              <w:t xml:space="preserve">Central 900, Munch 500, </w:t>
+              <w:t xml:space="preserve">Central 900, Munch 492, </w:t>
             </w:r>
             <w:r>
               <w:rPr>
@@ -7933,7 +7933,7 @@
                 <w:sz w:val="19"/>
                 <w:szCs w:val="19"/>
               </w:rPr>
-              <w:t xml:space="preserve">500</w:t>
+              <w:t xml:space="preserve">492</w:t>
             </w:r>
           </w:p>
         </w:tc>
@@ -7987,7 +7987,7 @@
                 <w:sz w:val="19"/>
                 <w:szCs w:val="19"/>
               </w:rPr>
-              <w:t xml:space="preserve">≈ 37 students/min</w:t>
+              <w:t xml:space="preserve">≈ 36 students/min</w:t>
             </w:r>
           </w:p>
         </w:tc>
@@ -8041,7 +8041,7 @@
                 <w:sz w:val="19"/>
                 <w:szCs w:val="19"/>
               </w:rPr>
-              <w:t xml:space="preserve">1,400</w:t>
+              <w:t xml:space="preserve">1,392</w:t>
             </w:r>
           </w:p>
         </w:tc>
@@ -8093,7 +8093,7 @@
                 <w:sz w:val="19"/>
                 <w:szCs w:val="19"/>
               </w:rPr>
-              <w:t xml:space="preserve">≈ 104/min</w:t>
+              <w:t xml:space="preserve">≈ 103/min</w:t>
             </w:r>
           </w:p>
         </w:tc>
@@ -11135,7 +11135,7 @@
                 <w:sz w:val="19"/>
                 <w:szCs w:val="19"/>
               </w:rPr>
-              <w:t xml:space="preserve">900 (Central) and 500 (Munch) seats; if full, the student waits; eating takes 12–15 min (group estimate)</w:t>
+              <w:t xml:space="preserve">900 (Central) and 492 (Munch) seats; if full, the student waits; eating takes 12–15 min (group estimate)</w:t>
             </w:r>
           </w:p>
         </w:tc>
@@ -20647,7 +20647,7 @@
                 <w:sz w:val="19"/>
                 <w:szCs w:val="19"/>
               </w:rPr>
-              <w:t xml:space="preserve">Central 900, Munch 500</w:t>
+              <w:t xml:space="preserve">Central 900, Munch 492</w:t>
             </w:r>
           </w:p>
         </w:tc>
@@ -25562,6 +25562,102 @@
                 <w:szCs w:val="19"/>
               </w:rPr>
               <w:t xml:space="preserve">Lunch break, rough size and lab-day share per department; λ(t) = the breaks added up</w:t>
+            </w:r>
+          </w:p>
+        </w:tc>
+      </w:tr>
+      <w:tr>
+        <w:tc>
+          <w:tcPr>
+            <w:tcW w:type="dxa" w:w="3000"/>
+            <w:tcBorders>
+              <w:top w:val="single" w:color="D9D8D3" w:sz="4"/>
+              <w:left w:val="single" w:color="D9D8D3" w:sz="4"/>
+              <w:bottom w:val="single" w:color="D9D8D3" w:sz="4"/>
+              <w:right w:val="single" w:color="D9D8D3" w:sz="4"/>
+            </w:tcBorders>
+            <w:tcMar>
+              <w:top w:type="dxa" w:w="60"/>
+              <w:left w:type="dxa" w:w="100"/>
+              <w:bottom w:type="dxa" w:w="60"/>
+              <w:right w:type="dxa" w:w="100"/>
+            </w:tcMar>
+          </w:tcPr>
+          <w:p>
+            <w:r>
+              <w:rPr>
+                <w:sz w:val="19"/>
+                <w:szCs w:val="19"/>
+              </w:rPr>
+              <w:t xml:space="preserve">Queue, capacity and load-balancing workbook</w:t>
+            </w:r>
+          </w:p>
+        </w:tc>
+        <w:tc>
+          <w:tcPr>
+            <w:tcW w:type="dxa" w:w="2600"/>
+            <w:tcBorders>
+              <w:top w:val="single" w:color="D9D8D3" w:sz="4"/>
+              <w:left w:val="single" w:color="D9D8D3" w:sz="4"/>
+              <w:bottom w:val="single" w:color="D9D8D3" w:sz="4"/>
+              <w:right w:val="single" w:color="D9D8D3" w:sz="4"/>
+            </w:tcBorders>
+            <w:tcMar>
+              <w:top w:type="dxa" w:w="60"/>
+              <w:left w:type="dxa" w:w="100"/>
+              <w:bottom w:type="dxa" w:w="60"/>
+              <w:right w:type="dxa" w:w="100"/>
+            </w:tcMar>
+          </w:tcPr>
+          <w:p>
+            <w:r>
+              <w:rPr>
+                <w:rFonts w:ascii="Consolas" w:cs="Consolas" w:eastAsia="Consolas" w:hAnsi="Consolas"/>
+                <w:sz w:val="19"/>
+                <w:szCs w:val="19"/>
+              </w:rPr>
+              <w:t xml:space="preserve">tools/queue_capacity_data.py</w:t>
+            </w:r>
+            <w:r>
+              <w:rPr>
+                <w:sz w:val="19"/>
+                <w:szCs w:val="19"/>
+              </w:rPr>
+              <w:t xml:space="preserve">, </w:t>
+            </w:r>
+            <w:r>
+              <w:rPr>
+                <w:rFonts w:ascii="Consolas" w:cs="Consolas" w:eastAsia="Consolas" w:hAnsi="Consolas"/>
+                <w:sz w:val="19"/>
+                <w:szCs w:val="19"/>
+              </w:rPr>
+              <w:t xml:space="preserve">tools/build_queue_capacity_workbook.py</w:t>
+            </w:r>
+          </w:p>
+        </w:tc>
+        <w:tc>
+          <w:tcPr>
+            <w:tcW w:type="dxa" w:w="3426"/>
+            <w:tcBorders>
+              <w:top w:val="single" w:color="D9D8D3" w:sz="4"/>
+              <w:left w:val="single" w:color="D9D8D3" w:sz="4"/>
+              <w:bottom w:val="single" w:color="D9D8D3" w:sz="4"/>
+              <w:right w:val="single" w:color="D9D8D3" w:sz="4"/>
+            </w:tcBorders>
+            <w:tcMar>
+              <w:top w:type="dxa" w:w="60"/>
+              <w:left w:type="dxa" w:w="100"/>
+              <w:bottom w:type="dxa" w:w="60"/>
+              <w:right w:type="dxa" w:w="100"/>
+            </w:tcMar>
+          </w:tcPr>
+          <w:p>
+            <w:r>
+              <w:rPr>
+                <w:sz w:val="19"/>
+                <w:szCs w:val="19"/>
+              </w:rPr>
+              <w:t xml:space="preserve">docs/Queue_Capacity_LoadBalancing.xlsx: M/M/1 and M/M/c per process, Little's Law per slot, seat turnover, static vs dynamic routing</w:t>
             </w:r>
           </w:p>
         </w:tc>

</xml_diff>

<commit_message>
New stage timings from the group: scan + plate 30-45 s, collect food 1-2 min, eat 14-18 min, dispose 1-2 min, total 17-35 min
Simulator and engine use the new stage times; all scenarios, payoff,
reconciliation and the queue/capacity data are rerun. The queue/capacity
workbook gets a time-at-each-stage table matching the four stages and
carries over the group's edits (CT manager as the seat source, 0.2 min seat
changeover, statuses and notes). Main workbook, README and doc updated.

Co-Authored-By: Claude Opus 5.5 <noreply@anthropic.com>
Claude-Session: https://claude.ai/code/session_013JwSYm4UV7vKHqaUukbU1G
</commit_message>
<xml_diff>
--- a/docs/MDS_Queuing_Theory_and_Simulation.docx
+++ b/docs/MDS_Queuing_Theory_and_Simulation.docx
@@ -3374,7 +3374,7 @@
                 <w:sz w:val="19"/>
                 <w:szCs w:val="19"/>
               </w:rPr>
-              <w:t xml:space="preserve">Student eats (12–15 min), disposes of the plate (≤ 2 min) and leaves</w:t>
+              <w:t xml:space="preserve">Student eats (14–18 min), disposes of the plate (1–2 min) and leaves</w:t>
             </w:r>
           </w:p>
         </w:tc>
@@ -3400,7 +3400,7 @@
                 <w:sz w:val="19"/>
                 <w:szCs w:val="19"/>
               </w:rPr>
-              <w:t xml:space="preserve">Throughput 17–25 min door to exit (group estimate); ~18 min normal visit (measured)</w:t>
+              <w:t xml:space="preserve">Total 17–35 min door to exit (group estimate); ~20 min on a normal day</w:t>
             </w:r>
           </w:p>
         </w:tc>
@@ -6215,7 +6215,7 @@
                 <w:sz w:val="19"/>
                 <w:szCs w:val="19"/>
               </w:rPr>
-              <w:t xml:space="preserve">12–15 min (mean 13.5), group estimate</w:t>
+              <w:t xml:space="preserve">14–18 min (mean 16), group estimate</w:t>
             </w:r>
           </w:p>
         </w:tc>
@@ -7634,7 +7634,7 @@
         <w:spacing w:after="120"/>
       </w:pPr>
       <w:r>
-        <w:t xml:space="preserve">Rearranged, λ_max = N / W gives the highest arrival rate the seats can sustain. A seat is held only while eating (12–15 min, group estimate), so W here is the eating time, not the whole visit:</w:t>
+        <w:t xml:space="preserve">Rearranged, λ_max = N / W gives the highest arrival rate the seats can sustain. A seat is held only while eating (14–18 min, group estimate), so W here is the eating time, not the whole visit:</w:t>
       </w:r>
     </w:p>
     <w:tbl>
@@ -7851,7 +7851,7 @@
                 <w:sz w:val="19"/>
                 <w:szCs w:val="19"/>
               </w:rPr>
-              <w:t xml:space="preserve">13.5 min</w:t>
+              <w:t xml:space="preserve">16 min</w:t>
             </w:r>
           </w:p>
         </w:tc>
@@ -7879,7 +7879,7 @@
                 <w:sz w:val="19"/>
                 <w:szCs w:val="19"/>
               </w:rPr>
-              <w:t xml:space="preserve">≈ 67 students/min</w:t>
+              <w:t xml:space="preserve">≈ 56 students/min</w:t>
             </w:r>
           </w:p>
         </w:tc>
@@ -7959,7 +7959,7 @@
                 <w:sz w:val="19"/>
                 <w:szCs w:val="19"/>
               </w:rPr>
-              <w:t xml:space="preserve">13.5 min</w:t>
+              <w:t xml:space="preserve">16 min</w:t>
             </w:r>
           </w:p>
         </w:tc>
@@ -7987,7 +7987,7 @@
                 <w:sz w:val="19"/>
                 <w:szCs w:val="19"/>
               </w:rPr>
-              <w:t xml:space="preserve">≈ 36 students/min</w:t>
+              <w:t xml:space="preserve">≈ 31 students/min</w:t>
             </w:r>
           </w:p>
         </w:tc>
@@ -8067,7 +8067,7 @@
                 <w:sz w:val="19"/>
                 <w:szCs w:val="19"/>
               </w:rPr>
-              <w:t xml:space="preserve">13.5 min</w:t>
+              <w:t xml:space="preserve">16 min</w:t>
             </w:r>
           </w:p>
         </w:tc>
@@ -8093,7 +8093,7 @@
                 <w:sz w:val="19"/>
                 <w:szCs w:val="19"/>
               </w:rPr>
-              <w:t xml:space="preserve">≈ 103/min</w:t>
+              <w:t xml:space="preserve">≈ 87/min</w:t>
             </w:r>
           </w:p>
         </w:tc>
@@ -8130,14 +8130,14 @@
         <w:spacing w:after="120"/>
       </w:pPr>
       <w:r>
-        <w:t xml:space="preserve">In a surge, W grows because of queueing. If about 30 students/min arrive at Central CT at the 13:10 peak (80% of ~37/min; the single scanner's limit) and the visit stretches to about 23 minutes (simulated), L ≈ 30 × 23 ≈ </w:t>
+        <w:t xml:space="preserve">In a surge, W grows because of queueing. If about 30 students/min arrive at Central CT at the 13:10 peak (80% of ~37/min; the single scanner's limit) and the visit stretches to about 26 minutes (simulated), L ≈ 30 × 26 ≈ </w:t>
       </w:r>
       <w:r>
         <w:rPr>
           <w:b/>
           <w:bCs/>
         </w:rPr>
-        <w:t xml:space="preserve">690</w:t>
+        <w:t xml:space="preserve">780</w:t>
       </w:r>
       <w:r>
         <w:t xml:space="preserve"> people inside: below 900 seats. So with these inputs Central's bottleneck is the serving stations and the scanner, not the seats. If the visit stretched past 30 minutes, L would exceed 900 and the hall would fill (as in photo O1 at 13:18).</w:t>
@@ -8156,7 +8156,7 @@
         <w:spacing w:after="120"/>
       </w:pPr>
       <w:r>
-        <w:t xml:space="preserve">When the biometric logs arrive, we compute L = λ × W for each 10-minute slot (W = the throughput time, 17–25 min) and compare it with a headcount or photo. A large mismatch tells us either the stage times or the data need a second look.</w:t>
+        <w:t xml:space="preserve">When the biometric logs arrive, we compute L = λ × W for each 10-minute slot (W = the throughput time, 17–35 min) and compare it with a headcount or photo. A large mismatch tells us either the stage times or the data need a second look.</w:t>
       </w:r>
     </w:p>
     <w:p>
@@ -10815,7 +10815,7 @@
                 <w:sz w:val="19"/>
                 <w:szCs w:val="19"/>
               </w:rPr>
-              <w:t xml:space="preserve">1 face scanner per mess, 2 s per student (assumed), then collecting a plate (15–35 s, assumed; group: up to ~45 s with the queue). Students who cannot scan yet wait OUTSIDE, unseen by the system</w:t>
+              <w:t xml:space="preserve">1 face scanner per mess, 2 s per student (assumed), then collecting a plate (scan + plate = 30–45 s, group estimate). Students who cannot scan yet wait OUTSIDE, unseen by the system</w:t>
             </w:r>
           </w:p>
         </w:tc>
@@ -10895,7 +10895,7 @@
                 <w:sz w:val="19"/>
                 <w:szCs w:val="19"/>
               </w:rPr>
-              <w:t xml:space="preserve">c = 2 stations per mess (measured); service time random with mean 6 s (assumed) and cv 0.6; then walking the rest of the food line (40–80 s, assumed)</w:t>
+              <w:t xml:space="preserve">c = 2 stations per mess (measured); service time random with mean 6 s (assumed) and cv 0.6; then the rest of food collection (collecting food takes 1–2 min in all without a queue, group estimate)</w:t>
             </w:r>
           </w:p>
         </w:tc>
@@ -11135,7 +11135,7 @@
                 <w:sz w:val="19"/>
                 <w:szCs w:val="19"/>
               </w:rPr>
-              <w:t xml:space="preserve">900 (Central) and 492 (Munch) seats; if full, the student waits; eating takes 12–15 min (group estimate)</w:t>
+              <w:t xml:space="preserve">900 (Central) and 492 (Munch) seats; if full, the student waits; eating takes 14–18 min (group estimate)</w:t>
             </w:r>
           </w:p>
         </w:tc>
@@ -11295,7 +11295,7 @@
                 <w:sz w:val="19"/>
                 <w:szCs w:val="19"/>
               </w:rPr>
-              <w:t xml:space="preserve">Queue wait = time queueing for the scanner, a station and a seat. Throughput = door to leaving (group: 17–25 min). Simulated: ~16.7 min for students who meet no queue, ~26.7 min around today's 13:17 peak</w:t>
+              <w:t xml:space="preserve">Queue wait = time queueing for the scanner, a station and a seat. Throughput = door to leaving (group: 17–35 min). Simulated: ~19.8 min for students who meet no queue, ~25.6 min around today's 13:17 peak</w:t>
             </w:r>
           </w:p>
         </w:tc>
@@ -12356,7 +12356,7 @@
         <w:t xml:space="preserve">calibrated, not measured</w:t>
       </w:r>
       <w:r>
-        <w:t xml:space="preserve">: with it, the no-screen simulation gives a 17–23 minute visit and a ~13 minute 90th-percentile wait, close to the group's 17–25 minutes and the ~15 minutes seen in Phase 1; a tighter lag (15 ± 10, everyone rushing at the bell) gives ~30-minute peak visits and a 23-minute 90th percentile, above what was observed. The curve has two surges: about </w:t>
+        <w:t xml:space="preserve">: with it, the no-screen simulation gives a 20–26 minute visit and a ~14 minute 90th-percentile wait, close to the group's 17–35 minutes and the ~15 minutes seen in Phase 1; a tighter lag (15 ± 10, everyone rushing at the bell) gives ~30-minute peak visits and a 23-minute 90th percentile, above what was observed. The curve has two surges: about </w:t>
       </w:r>
       <w:r>
         <w:rPr>
@@ -12391,7 +12391,7 @@
         <w:t xml:space="preserve">What this adds to the decision:</w:t>
       </w:r>
       <w:r>
-        <w:t xml:space="preserve"> staggering one department's break by 15 minutes cuts today's average wait from 4.4 to 3.2 minutes (SMI to 11:45) or 1.9 minutes (TAPMI to 13:20) with no screens at all. That makes alternative A7 (stagger class end times) concrete, though it needs academic administration; the screens get further (0.8 minutes) without changing any timetable.</w:t>
+        <w:t xml:space="preserve"> staggering one department's break by 15 minutes cuts today's average wait from 4.3 to 3.3 minutes (SMI to 11:45) or 1.7 minutes (TAPMI to 13:20) with no screens at all. That makes alternative A7 (stagger class end times) concrete, though it needs academic administration; the screens get further (0.8 minutes) without changing any timetable.</w:t>
       </w:r>
     </w:p>
     <w:p>
@@ -12462,7 +12462,7 @@
           <w:sz w:val="24"/>
           <w:szCs w:val="24"/>
         </w:rPr>
-        <w:t xml:space="preserve">L̂(t) = B(t) + S(t),   where S(t) = students served in the last 16 minutes (food line + eating + disposal)</w:t>
+        <w:t xml:space="preserve">L̂(t) = B(t) + S(t),   where S(t) = students served in the last 19 minutes (rest of food collection + eating + disposal)</w:t>
       </w:r>
       <w:r>
         <w:rPr>
@@ -12760,7 +12760,7 @@
         <w:t xml:space="preserve">Simulated, not measured.  </w:t>
       </w:r>
       <w:r>
-        <w:t xml:space="preserve">20 simulated lunches per row, the same students in every scenario (paired comparison); ± is a 95% confidence interval across lunches. Measured: 2,960 students, the 80/20 habit split, seats, 2 stations and 1 scanner per mess, refill times. Group estimates: eating 12–15 min, disposal ≤ 2 min, food ready 70% of the time. </w:t>
+        <w:t xml:space="preserve">20 simulated lunches per row, the same students in every scenario (paired comparison); ± is a 95% confidence interval across lunches. Measured: 2,960 students, the 80/20 habit split, seats, 2 stations and 1 scanner per mess, refill times. Group estimates: scan + plate 30–45 s, collecting food 1–2 min plus the queue, eating 14–18 min, disposal 1–2 min, food ready 70% of the time. </w:t>
       </w:r>
       <w:r>
         <w:rPr>
@@ -13110,7 +13110,7 @@
                 <w:sz w:val="19"/>
                 <w:szCs w:val="19"/>
               </w:rPr>
-              <w:t xml:space="preserve">4.38 ± 0.53</w:t>
+              <w:t xml:space="preserve">4.31 ± 0.63</w:t>
             </w:r>
           </w:p>
         </w:tc>
@@ -13136,7 +13136,7 @@
                 <w:sz w:val="19"/>
                 <w:szCs w:val="19"/>
               </w:rPr>
-              <w:t xml:space="preserve">13.5</w:t>
+              <w:t xml:space="preserve">13.9</w:t>
             </w:r>
           </w:p>
         </w:tc>
@@ -13162,7 +13162,7 @@
                 <w:sz w:val="19"/>
                 <w:szCs w:val="19"/>
               </w:rPr>
-              <w:t xml:space="preserve">20.9</w:t>
+              <w:t xml:space="preserve">23.9</w:t>
             </w:r>
           </w:p>
         </w:tc>
@@ -13188,7 +13188,7 @@
                 <w:sz w:val="19"/>
                 <w:szCs w:val="19"/>
               </w:rPr>
-              <w:t xml:space="preserve">65% / 17%</w:t>
+              <w:t xml:space="preserve">66% / 16%</w:t>
             </w:r>
           </w:p>
         </w:tc>
@@ -13320,7 +13320,7 @@
                 <w:sz w:val="19"/>
                 <w:szCs w:val="19"/>
               </w:rPr>
-              <w:t xml:space="preserve">1.30 ± 0.33</w:t>
+              <w:t xml:space="preserve">1.19 ± 0.33</w:t>
             </w:r>
           </w:p>
         </w:tc>
@@ -13346,7 +13346,7 @@
                 <w:sz w:val="19"/>
                 <w:szCs w:val="19"/>
               </w:rPr>
-              <w:t xml:space="preserve">3.4</w:t>
+              <w:t xml:space="preserve">3.1</w:t>
             </w:r>
           </w:p>
         </w:tc>
@@ -13372,7 +13372,7 @@
                 <w:sz w:val="19"/>
                 <w:szCs w:val="19"/>
               </w:rPr>
-              <w:t xml:space="preserve">17.9</w:t>
+              <w:t xml:space="preserve">20.8</w:t>
             </w:r>
           </w:p>
         </w:tc>
@@ -13424,7 +13424,7 @@
                 <w:sz w:val="19"/>
                 <w:szCs w:val="19"/>
               </w:rPr>
-              <w:t xml:space="preserve">0.6</w:t>
+              <w:t xml:space="preserve">0.5</w:t>
             </w:r>
           </w:p>
         </w:tc>
@@ -13450,7 +13450,7 @@
                 <w:sz w:val="19"/>
                 <w:szCs w:val="19"/>
               </w:rPr>
-              <w:t xml:space="preserve">240</w:t>
+              <w:t xml:space="preserve">239</w:t>
             </w:r>
           </w:p>
         </w:tc>
@@ -13476,7 +13476,7 @@
                 <w:sz w:val="19"/>
                 <w:szCs w:val="19"/>
               </w:rPr>
-              <w:t xml:space="preserve">1%</w:t>
+              <w:t xml:space="preserve">2%</w:t>
             </w:r>
           </w:p>
         </w:tc>
@@ -13530,7 +13530,7 @@
                 <w:sz w:val="19"/>
                 <w:szCs w:val="19"/>
               </w:rPr>
-              <w:t xml:space="preserve">0.81 ± 0.09</w:t>
+              <w:t xml:space="preserve">0.80 ± 0.10</w:t>
             </w:r>
           </w:p>
         </w:tc>
@@ -13556,7 +13556,7 @@
                 <w:sz w:val="19"/>
                 <w:szCs w:val="19"/>
               </w:rPr>
-              <w:t xml:space="preserve">2.2</w:t>
+              <w:t xml:space="preserve">2.1</w:t>
             </w:r>
           </w:p>
         </w:tc>
@@ -13582,7 +13582,7 @@
                 <w:sz w:val="19"/>
                 <w:szCs w:val="19"/>
               </w:rPr>
-              <w:t xml:space="preserve">17.4</w:t>
+              <w:t xml:space="preserve">20.4</w:t>
             </w:r>
           </w:p>
         </w:tc>
@@ -13634,7 +13634,7 @@
                 <w:sz w:val="19"/>
                 <w:szCs w:val="19"/>
               </w:rPr>
-              <w:t xml:space="preserve">0.7</w:t>
+              <w:t xml:space="preserve">0.3</w:t>
             </w:r>
           </w:p>
         </w:tc>
@@ -13660,7 +13660,7 @@
                 <w:sz w:val="19"/>
                 <w:szCs w:val="19"/>
               </w:rPr>
-              <w:t xml:space="preserve">286</w:t>
+              <w:t xml:space="preserve">261</w:t>
             </w:r>
           </w:p>
         </w:tc>
@@ -13686,7 +13686,7 @@
                 <w:sz w:val="19"/>
                 <w:szCs w:val="19"/>
               </w:rPr>
-              <w:t xml:space="preserve">3%</w:t>
+              <w:t xml:space="preserve">2%</w:t>
             </w:r>
           </w:p>
         </w:tc>
@@ -13740,7 +13740,7 @@
                 <w:sz w:val="19"/>
                 <w:szCs w:val="19"/>
               </w:rPr>
-              <w:t xml:space="preserve">0.74 ± 0.07</w:t>
+              <w:t xml:space="preserve">0.76 ± 0.10</w:t>
             </w:r>
           </w:p>
         </w:tc>
@@ -13792,7 +13792,7 @@
                 <w:sz w:val="19"/>
                 <w:szCs w:val="19"/>
               </w:rPr>
-              <w:t xml:space="preserve">17.3</w:t>
+              <w:t xml:space="preserve">20.4</w:t>
             </w:r>
           </w:p>
         </w:tc>
@@ -13870,7 +13870,7 @@
                 <w:sz w:val="19"/>
                 <w:szCs w:val="19"/>
               </w:rPr>
-              <w:t xml:space="preserve">277</w:t>
+              <w:t xml:space="preserve">271</w:t>
             </w:r>
           </w:p>
         </w:tc>
@@ -13896,7 +13896,7 @@
                 <w:sz w:val="19"/>
                 <w:szCs w:val="19"/>
               </w:rPr>
-              <w:t xml:space="preserve">4%</w:t>
+              <w:t xml:space="preserve">5%</w:t>
             </w:r>
           </w:p>
         </w:tc>
@@ -13937,7 +13937,7 @@
           <w:b/>
           <w:bCs/>
         </w:rPr>
-        <w:t xml:space="preserve">4.4 to 0.8 minutes</w:t>
+        <w:t xml:space="preserve">4.3 to 0.8 minutes</w:t>
       </w:r>
       <w:r>
         <w:t xml:space="preserve"> and the 90th percentile from </w:t>
@@ -13947,10 +13947,10 @@
           <w:b/>
           <w:bCs/>
         </w:rPr>
-        <w:t xml:space="preserve">13.5 to 2.2 minutes</w:t>
-      </w:r>
-      <w:r>
-        <w:t xml:space="preserve">; throughput falls from 20.9 to 17.4 minutes.</w:t>
+        <w:t xml:space="preserve">13.9 to 2.1 minutes</w:t>
+      </w:r>
+      <w:r>
+        <w:t xml:space="preserve">; throughput falls from 23.9 to 20.4 minutes.</w:t>
       </w:r>
     </w:p>
     <w:p>
@@ -13970,7 +13970,7 @@
         <w:t xml:space="preserve">Food status helps</w:t>
       </w:r>
       <w:r>
-        <w:t xml:space="preserve">: queue information alone gives 1.3 minutes; adding the manager's food status gives 0.8. The 13:10 surge drains the trays just when the queue is longest, so knowing about a run-out matters.</w:t>
+        <w:t xml:space="preserve">: queue information alone gives 1.2 minutes; adding the manager's food status gives 0.8. The 13:10 surge drains the trays just when the queue is longest, so knowing about a run-out matters.</w:t>
       </w:r>
     </w:p>
     <w:p>
@@ -13990,10 +13990,10 @@
           <w:b/>
           <w:bCs/>
         </w:rPr>
-        <w:t xml:space="preserve">1 in 10 students</w:t>
-      </w:r>
-      <w:r>
-        <w:t xml:space="preserve"> walks to the other mess (286 of ~2,960). The LP optimum (section 7.6) moves 261, so the live system is close to the theoretical split.</w:t>
+        <w:t xml:space="preserve">1 in 11 students</w:t>
+      </w:r>
+      <w:r>
+        <w:t xml:space="preserve"> walks to the other mess (261 of ~2,960). The LP optimum (section 7.6) moves 261, so the live system matches the theoretical split.</w:t>
       </w:r>
     </w:p>
     <w:p>
@@ -14006,7 +14006,7 @@
         <w:spacing w:after="60"/>
       </w:pPr>
       <w:r>
-        <w:t xml:space="preserve">Without screens the simulated 90th-percentile wait (~13 min) is close to the ~15 min observed in Phase 1, and the simulated throughput (~16.7 min with no queue, ~22.7 min at the peak) sits in the group's 17–25 min range. This is partly by construction: the arrival lag was calibrated to it.</w:t>
+        <w:t xml:space="preserve">Without screens the simulated 90th-percentile wait (~14 min) is close to the ~15 min observed in Phase 1, and the simulated throughput (~19.8 min with no queue, ~25.6 min at the peak) sits in the group's 17–35 min range. This is partly by construction: the arrival lag was calibrated to it.</w:t>
       </w:r>
     </w:p>
     <w:p>
@@ -14205,7 +14205,7 @@
                 <w:sz w:val="19"/>
                 <w:szCs w:val="19"/>
               </w:rPr>
-              <w:t xml:space="preserve">11.41</w:t>
+              <w:t xml:space="preserve">12.05</w:t>
             </w:r>
           </w:p>
         </w:tc>
@@ -14231,7 +14231,7 @@
                 <w:sz w:val="19"/>
                 <w:szCs w:val="19"/>
               </w:rPr>
-              <w:t xml:space="preserve">2.81</w:t>
+              <w:t xml:space="preserve">2.17</w:t>
             </w:r>
           </w:p>
         </w:tc>
@@ -14257,7 +14257,7 @@
                 <w:sz w:val="19"/>
                 <w:szCs w:val="19"/>
               </w:rPr>
-              <w:t xml:space="preserve">2.04</w:t>
+              <w:t xml:space="preserve">2.02</w:t>
             </w:r>
           </w:p>
         </w:tc>
@@ -14311,7 +14311,7 @@
                 <w:sz w:val="19"/>
                 <w:szCs w:val="19"/>
               </w:rPr>
-              <w:t xml:space="preserve">8.86</w:t>
+              <w:t xml:space="preserve">8.52</w:t>
             </w:r>
           </w:p>
         </w:tc>
@@ -14337,7 +14337,7 @@
                 <w:sz w:val="19"/>
                 <w:szCs w:val="19"/>
               </w:rPr>
-              <w:t xml:space="preserve">1.93</w:t>
+              <w:t xml:space="preserve">2.05</w:t>
             </w:r>
           </w:p>
         </w:tc>
@@ -14363,7 +14363,7 @@
                 <w:sz w:val="19"/>
                 <w:szCs w:val="19"/>
               </w:rPr>
-              <w:t xml:space="preserve">1.78</w:t>
+              <w:t xml:space="preserve">1.68</w:t>
             </w:r>
           </w:p>
         </w:tc>
@@ -14417,7 +14417,7 @@
                 <w:sz w:val="19"/>
                 <w:szCs w:val="19"/>
               </w:rPr>
-              <w:t xml:space="preserve">6.00</w:t>
+              <w:t xml:space="preserve">5.96</w:t>
             </w:r>
           </w:p>
         </w:tc>
@@ -14443,7 +14443,7 @@
                 <w:sz w:val="19"/>
                 <w:szCs w:val="19"/>
               </w:rPr>
-              <w:t xml:space="preserve">1.40</w:t>
+              <w:t xml:space="preserve">1.41</w:t>
             </w:r>
           </w:p>
         </w:tc>
@@ -14469,7 +14469,7 @@
                 <w:sz w:val="19"/>
                 <w:szCs w:val="19"/>
               </w:rPr>
-              <w:t xml:space="preserve">1.13</w:t>
+              <w:t xml:space="preserve">1.34</w:t>
             </w:r>
           </w:p>
         </w:tc>
@@ -14523,7 +14523,7 @@
                 <w:sz w:val="19"/>
                 <w:szCs w:val="19"/>
               </w:rPr>
-              <w:t xml:space="preserve">8.86</w:t>
+              <w:t xml:space="preserve">8.78</w:t>
             </w:r>
           </w:p>
         </w:tc>
@@ -14549,7 +14549,7 @@
                 <w:sz w:val="19"/>
                 <w:szCs w:val="19"/>
               </w:rPr>
-              <w:t xml:space="preserve">1.27</w:t>
+              <w:t xml:space="preserve">1.20</w:t>
             </w:r>
           </w:p>
         </w:tc>
@@ -14575,7 +14575,7 @@
                 <w:sz w:val="19"/>
                 <w:szCs w:val="19"/>
               </w:rPr>
-              <w:t xml:space="preserve">1.29</w:t>
+              <w:t xml:space="preserve">0.95</w:t>
             </w:r>
           </w:p>
         </w:tc>
@@ -14629,7 +14629,7 @@
                 <w:sz w:val="19"/>
                 <w:szCs w:val="19"/>
               </w:rPr>
-              <w:t xml:space="preserve">3.16</w:t>
+              <w:t xml:space="preserve">3.27</w:t>
             </w:r>
           </w:p>
         </w:tc>
@@ -14655,7 +14655,7 @@
                 <w:sz w:val="19"/>
                 <w:szCs w:val="19"/>
               </w:rPr>
-              <w:t xml:space="preserve">0.65</w:t>
+              <w:t xml:space="preserve">0.69</w:t>
             </w:r>
           </w:p>
         </w:tc>
@@ -14681,7 +14681,7 @@
                 <w:sz w:val="19"/>
                 <w:szCs w:val="19"/>
               </w:rPr>
-              <w:t xml:space="preserve">0.62</w:t>
+              <w:t xml:space="preserve">0.56</w:t>
             </w:r>
           </w:p>
         </w:tc>
@@ -14735,7 +14735,7 @@
                 <w:sz w:val="19"/>
                 <w:szCs w:val="19"/>
               </w:rPr>
-              <w:t xml:space="preserve">1.90</w:t>
+              <w:t xml:space="preserve">1.65</w:t>
             </w:r>
           </w:p>
         </w:tc>
@@ -14761,7 +14761,7 @@
                 <w:sz w:val="19"/>
                 <w:szCs w:val="19"/>
               </w:rPr>
-              <w:t xml:space="preserve">0.90</w:t>
+              <w:t xml:space="preserve">0.85</w:t>
             </w:r>
           </w:p>
         </w:tc>
@@ -14787,7 +14787,7 @@
                 <w:sz w:val="19"/>
                 <w:szCs w:val="19"/>
               </w:rPr>
-              <w:t xml:space="preserve">0.56</w:t>
+              <w:t xml:space="preserve">0.55</w:t>
             </w:r>
           </w:p>
         </w:tc>
@@ -14841,7 +14841,7 @@
                 <w:sz w:val="19"/>
                 <w:szCs w:val="19"/>
               </w:rPr>
-              <w:t xml:space="preserve">5.19</w:t>
+              <w:t xml:space="preserve">5.76</w:t>
             </w:r>
           </w:p>
         </w:tc>
@@ -14867,7 +14867,7 @@
                 <w:sz w:val="19"/>
                 <w:szCs w:val="19"/>
               </w:rPr>
-              <w:t xml:space="preserve">1.03</w:t>
+              <w:t xml:space="preserve">1.57</w:t>
             </w:r>
           </w:p>
         </w:tc>
@@ -14893,7 +14893,7 @@
                 <w:sz w:val="19"/>
                 <w:szCs w:val="19"/>
               </w:rPr>
-              <w:t xml:space="preserve">0.86</w:t>
+              <w:t xml:space="preserve">0.88</w:t>
             </w:r>
           </w:p>
         </w:tc>
@@ -14947,7 +14947,7 @@
                 <w:sz w:val="19"/>
                 <w:szCs w:val="19"/>
               </w:rPr>
-              <w:t xml:space="preserve">4.38</w:t>
+              <w:t xml:space="preserve">4.31</w:t>
             </w:r>
           </w:p>
         </w:tc>
@@ -14973,7 +14973,7 @@
                 <w:sz w:val="19"/>
                 <w:szCs w:val="19"/>
               </w:rPr>
-              <w:t xml:space="preserve">1.49</w:t>
+              <w:t xml:space="preserve">1.18</w:t>
             </w:r>
           </w:p>
         </w:tc>
@@ -14999,7 +14999,7 @@
                 <w:sz w:val="19"/>
                 <w:szCs w:val="19"/>
               </w:rPr>
-              <w:t xml:space="preserve">1.00</w:t>
+              <w:t xml:space="preserve">1.10</w:t>
             </w:r>
           </w:p>
         </w:tc>
@@ -15053,7 +15053,7 @@
                 <w:sz w:val="19"/>
                 <w:szCs w:val="19"/>
               </w:rPr>
-              <w:t xml:space="preserve">4.38</w:t>
+              <w:t xml:space="preserve">4.31</w:t>
             </w:r>
           </w:p>
         </w:tc>
@@ -15079,7 +15079,7 @@
                 <w:sz w:val="19"/>
                 <w:szCs w:val="19"/>
               </w:rPr>
-              <w:t xml:space="preserve">1.12</w:t>
+              <w:t xml:space="preserve">1.16</w:t>
             </w:r>
           </w:p>
         </w:tc>
@@ -15105,7 +15105,7 @@
                 <w:sz w:val="19"/>
                 <w:szCs w:val="19"/>
               </w:rPr>
-              <w:t xml:space="preserve">0.70</w:t>
+              <w:t xml:space="preserve">0.76</w:t>
             </w:r>
           </w:p>
         </w:tc>
@@ -15185,7 +15185,7 @@
                 <w:sz w:val="19"/>
                 <w:szCs w:val="19"/>
               </w:rPr>
-              <w:t xml:space="preserve">1.96</w:t>
+              <w:t xml:space="preserve">1.83</w:t>
             </w:r>
           </w:p>
         </w:tc>
@@ -15211,7 +15211,7 @@
                 <w:sz w:val="19"/>
                 <w:szCs w:val="19"/>
               </w:rPr>
-              <w:t xml:space="preserve">1.78</w:t>
+              <w:t xml:space="preserve">1.86</w:t>
             </w:r>
           </w:p>
         </w:tc>
@@ -15265,7 +15265,7 @@
                 <w:sz w:val="19"/>
                 <w:szCs w:val="19"/>
               </w:rPr>
-              <w:t xml:space="preserve">2.11</w:t>
+              <w:t xml:space="preserve">1.79</w:t>
             </w:r>
           </w:p>
         </w:tc>
@@ -15291,7 +15291,7 @@
                 <w:sz w:val="19"/>
                 <w:szCs w:val="19"/>
               </w:rPr>
-              <w:t xml:space="preserve">1.18</w:t>
+              <w:t xml:space="preserve">1.03</w:t>
             </w:r>
           </w:p>
         </w:tc>
@@ -15317,7 +15317,7 @@
                 <w:sz w:val="19"/>
                 <w:szCs w:val="19"/>
               </w:rPr>
-              <w:t xml:space="preserve">0.69</w:t>
+              <w:t xml:space="preserve">0.56</w:t>
             </w:r>
           </w:p>
         </w:tc>
@@ -15371,7 +15371,7 @@
                 <w:sz w:val="19"/>
                 <w:szCs w:val="19"/>
               </w:rPr>
-              <w:t xml:space="preserve">6.40</w:t>
+              <w:t xml:space="preserve">6.52</w:t>
             </w:r>
           </w:p>
         </w:tc>
@@ -15397,7 +15397,7 @@
                 <w:sz w:val="19"/>
                 <w:szCs w:val="19"/>
               </w:rPr>
-              <w:t xml:space="preserve">2.51</w:t>
+              <w:t xml:space="preserve">2.56</w:t>
             </w:r>
           </w:p>
         </w:tc>
@@ -15423,7 +15423,7 @@
                 <w:sz w:val="19"/>
                 <w:szCs w:val="19"/>
               </w:rPr>
-              <w:t xml:space="preserve">0.90</w:t>
+              <w:t xml:space="preserve">0.94</w:t>
             </w:r>
           </w:p>
         </w:tc>
@@ -15477,7 +15477,7 @@
                 <w:sz w:val="19"/>
                 <w:szCs w:val="19"/>
               </w:rPr>
-              <w:t xml:space="preserve">3.51</w:t>
+              <w:t xml:space="preserve">3.61</w:t>
             </w:r>
           </w:p>
         </w:tc>
@@ -15503,7 +15503,7 @@
                 <w:sz w:val="19"/>
                 <w:szCs w:val="19"/>
               </w:rPr>
-              <w:t xml:space="preserve">0.72</w:t>
+              <w:t xml:space="preserve">0.78</w:t>
             </w:r>
           </w:p>
         </w:tc>
@@ -15529,7 +15529,7 @@
                 <w:sz w:val="19"/>
                 <w:szCs w:val="19"/>
               </w:rPr>
-              <w:t xml:space="preserve">0.73</w:t>
+              <w:t xml:space="preserve">0.76</w:t>
             </w:r>
           </w:p>
         </w:tc>
@@ -15557,7 +15557,7 @@
                 <w:sz w:val="19"/>
                 <w:szCs w:val="19"/>
               </w:rPr>
-              <w:t xml:space="preserve">Slower eating: 15-18 min</w:t>
+              <w:t xml:space="preserve">Slower eating: 17-21 min</w:t>
             </w:r>
           </w:p>
         </w:tc>
@@ -15583,7 +15583,7 @@
                 <w:sz w:val="19"/>
                 <w:szCs w:val="19"/>
               </w:rPr>
-              <w:t xml:space="preserve">4.38</w:t>
+              <w:t xml:space="preserve">4.31</w:t>
             </w:r>
           </w:p>
         </w:tc>
@@ -15609,7 +15609,7 @@
                 <w:sz w:val="19"/>
                 <w:szCs w:val="19"/>
               </w:rPr>
-              <w:t xml:space="preserve">1.30</w:t>
+              <w:t xml:space="preserve">1.19</w:t>
             </w:r>
           </w:p>
         </w:tc>
@@ -15635,7 +15635,7 @@
                 <w:sz w:val="19"/>
                 <w:szCs w:val="19"/>
               </w:rPr>
-              <w:t xml:space="preserve">0.81</w:t>
+              <w:t xml:space="preserve">0.80</w:t>
             </w:r>
           </w:p>
         </w:tc>
@@ -15823,7 +15823,7 @@
                 <w:sz w:val="19"/>
                 <w:szCs w:val="19"/>
               </w:rPr>
-              <w:t xml:space="preserve">3.80</w:t>
+              <w:t xml:space="preserve">3.77</w:t>
             </w:r>
           </w:p>
         </w:tc>
@@ -15849,7 +15849,7 @@
                 <w:sz w:val="19"/>
                 <w:szCs w:val="19"/>
               </w:rPr>
-              <w:t xml:space="preserve">0.85</w:t>
+              <w:t xml:space="preserve">0.84</w:t>
             </w:r>
           </w:p>
         </w:tc>
@@ -15903,7 +15903,7 @@
                 <w:sz w:val="19"/>
                 <w:szCs w:val="19"/>
               </w:rPr>
-              <w:t xml:space="preserve">3.63</w:t>
+              <w:t xml:space="preserve">3.50</w:t>
             </w:r>
           </w:p>
         </w:tc>
@@ -15929,7 +15929,7 @@
                 <w:sz w:val="19"/>
                 <w:szCs w:val="19"/>
               </w:rPr>
-              <w:t xml:space="preserve">0.72</w:t>
+              <w:t xml:space="preserve">0.66</w:t>
             </w:r>
           </w:p>
         </w:tc>
@@ -15983,7 +15983,7 @@
                 <w:sz w:val="19"/>
                 <w:szCs w:val="19"/>
               </w:rPr>
-              <w:t xml:space="preserve">3.52</w:t>
+              <w:t xml:space="preserve">3.62</w:t>
             </w:r>
           </w:p>
         </w:tc>
@@ -16009,7 +16009,7 @@
                 <w:sz w:val="19"/>
                 <w:szCs w:val="19"/>
               </w:rPr>
-              <w:t xml:space="preserve">0.77</w:t>
+              <w:t xml:space="preserve">0.75</w:t>
             </w:r>
           </w:p>
         </w:tc>
@@ -16063,7 +16063,7 @@
                 <w:sz w:val="19"/>
                 <w:szCs w:val="19"/>
               </w:rPr>
-              <w:t xml:space="preserve">3.52</w:t>
+              <w:t xml:space="preserve">3.62</w:t>
             </w:r>
           </w:p>
         </w:tc>
@@ -16089,7 +16089,7 @@
                 <w:sz w:val="19"/>
                 <w:szCs w:val="19"/>
               </w:rPr>
-              <w:t xml:space="preserve">0.77</w:t>
+              <w:t xml:space="preserve">0.75</w:t>
             </w:r>
           </w:p>
         </w:tc>
@@ -16143,7 +16143,7 @@
                 <w:sz w:val="19"/>
                 <w:szCs w:val="19"/>
               </w:rPr>
-              <w:t xml:space="preserve">4.38</w:t>
+              <w:t xml:space="preserve">4.31</w:t>
             </w:r>
           </w:p>
         </w:tc>
@@ -16169,7 +16169,7 @@
                 <w:sz w:val="19"/>
                 <w:szCs w:val="19"/>
               </w:rPr>
-              <w:t xml:space="preserve">0.81</w:t>
+              <w:t xml:space="preserve">0.80</w:t>
             </w:r>
           </w:p>
         </w:tc>
@@ -16180,7 +16180,7 @@
         <w:spacing w:after="120"/>
       </w:pPr>
       <w:r>
-        <w:t xml:space="preserve">Under the same assumptions the two models agree without screens within 15% (3.52 vs 3.80). The small gap comes from the spreadsheet using the steady-state M/M/c wait in each 10-minute slot, which is only approximate when a slot is close to 100% busy. With screens the spreadsheet is optimistic because it routes with perfect knowledge every 10 minutes; the simulator routes on live estimates with a delay and the 2-minute rule. The headline numbers come from the full simulator because it includes randomness, live estimation, the scanner, seats and run-outs.</w:t>
+        <w:t xml:space="preserve">Under the same assumptions the two models agree without screens within 15% (3.52 vs 3.77). The small gap comes from the spreadsheet using the steady-state M/M/c wait in each 10-minute slot, which is only approximate when a slot is close to 100% busy. With screens the spreadsheet is optimistic because it routes with perfect knowledge every 10 minutes; the simulator routes on live estimates with a delay and the 2-minute rule. The headline numbers come from the full simulator because it includes randomness, live estimation, the scanner, seats and run-outs.</w:t>
       </w:r>
     </w:p>
     <w:p>
@@ -19360,7 +19360,7 @@
         <w:t xml:space="preserve">261 students (9%)</w:t>
       </w:r>
       <w:r>
-        <w:t xml:space="preserve"> at the peaks. The simulator's proposal redirects about 286, close to this optimum. The LP is a lower bound: it has no randomness and perfect foresight.</w:t>
+        <w:t xml:space="preserve"> at the peaks. The simulator's proposal redirects about 261, the same as this optimum. The LP is a lower bound: it has no randomness and perfect foresight.</w:t>
       </w:r>
     </w:p>
     <w:p>
@@ -22386,7 +22386,7 @@
                 <w:sz w:val="19"/>
                 <w:szCs w:val="19"/>
               </w:rPr>
-              <w:t xml:space="preserve">17–25 min depending on the surge</w:t>
+              <w:t xml:space="preserve">17–35 min depending on the rush</w:t>
             </w:r>
           </w:p>
         </w:tc>
@@ -22494,7 +22494,7 @@
                 <w:sz w:val="19"/>
                 <w:szCs w:val="19"/>
               </w:rPr>
-              <w:t xml:space="preserve">2 s scan + 15–35 s plate (up to ~45 s)</w:t>
+              <w:t xml:space="preserve">30–45 s (2 s of it the face scan)</w:t>
             </w:r>
           </w:p>
         </w:tc>
@@ -22517,10 +22517,12 @@
           <w:p>
             <w:r>
               <w:rPr>
-                <w:sz w:val="19"/>
-                <w:szCs w:val="19"/>
-              </w:rPr>
-              <w:t xml:space="preserve">Group estimate / assumed</w:t>
+                <w:b/>
+                <w:bCs/>
+                <w:sz w:val="19"/>
+                <w:szCs w:val="19"/>
+              </w:rPr>
+              <w:t xml:space="preserve">Group estimate</w:t>
             </w:r>
           </w:p>
         </w:tc>
@@ -22574,7 +22576,7 @@
                 <w:sz w:val="19"/>
                 <w:szCs w:val="19"/>
               </w:rPr>
-              <w:t xml:space="preserve">Walk along the food line after the station</w:t>
+              <w:t xml:space="preserve">Collect food (no queue)</w:t>
             </w:r>
           </w:p>
         </w:tc>
@@ -22600,7 +22602,7 @@
                 <w:sz w:val="19"/>
                 <w:szCs w:val="19"/>
               </w:rPr>
-              <w:t xml:space="preserve">40–80 s</w:t>
+              <w:t xml:space="preserve">1–2 min (about 6 s of it at the serving station)</w:t>
             </w:r>
           </w:p>
         </w:tc>
@@ -22623,10 +22625,12 @@
           <w:p>
             <w:r>
               <w:rPr>
-                <w:sz w:val="19"/>
-                <w:szCs w:val="19"/>
-              </w:rPr>
-              <w:t xml:space="preserve">Assumed</w:t>
+                <w:b/>
+                <w:bCs/>
+                <w:sz w:val="19"/>
+                <w:szCs w:val="19"/>
+              </w:rPr>
+              <w:t xml:space="preserve">Group estimate</w:t>
             </w:r>
           </w:p>
         </w:tc>
@@ -22706,7 +22710,7 @@
                 <w:sz w:val="19"/>
                 <w:szCs w:val="19"/>
               </w:rPr>
-              <w:t xml:space="preserve">12–15 min</w:t>
+              <w:t xml:space="preserve">14–18 min</w:t>
             </w:r>
           </w:p>
         </w:tc>

</xml_diff>